<commit_message>
Phase 5 (no new quizzes): full Grade 10 re-render + PDFs with attribution
generate.js --all (85/85 link gates pass), build_quiz.js for the 27 existing
quizzes, generate_pdfs.js (309 PDFs, 0 failed), teacher index rebuilt.
PDFs now carry the Phase 2 links and attribution. Phase 6 checks recorded
in STATUS.md: schema 85/85, content unchanged, attribution everywhere.
Remaining quiz generation deferred pending partner review.

Co-Authored-By: Claude Opus 5.5 (1M context) <noreply@anthropic.com>
</commit_message>
<xml_diff>
--- a/data/outputs/v2/Biology/SS1.1_Cell_Structure/Biology_Cell_Structure_CBE_LessonSequence.docx
+++ b/data/outputs/v2/Biology/SS1.1_Cell_Structure/Biology_Cell_Structure_CBE_LessonSequence.docx
@@ -42,6 +42,177 @@
     </w:p>
     <w:p>
       <w:pPr>
+        <w:spacing w:after="80" w:before="120"/>
+      </w:pPr>
+      <w:r>
+        <w:rPr>
+          <w:rFonts w:ascii="Arial" w:cs="Arial" w:eastAsia="Arial" w:hAnsi="Arial"/>
+          <w:b/>
+          <w:bCs/>
+          <w:color w:val="1F3864"/>
+          <w:sz w:val="20"/>
+          <w:szCs w:val="20"/>
+        </w:rPr>
+        <w:t xml:space="preserve">ATTRIBUTION AND LICENSING</w:t>
+      </w:r>
+    </w:p>
+    <w:p>
+      <w:pPr>
+        <w:spacing w:after="60" w:before="0"/>
+      </w:pPr>
+      <w:r>
+        <w:rPr>
+          <w:rFonts w:ascii="Arial" w:cs="Arial" w:eastAsia="Arial" w:hAnsi="Arial"/>
+          <w:b/>
+          <w:bCs/>
+          <w:sz w:val="17"/>
+          <w:szCs w:val="17"/>
+        </w:rPr>
+        <w:t xml:space="preserve">Curriculum Alignment: </w:t>
+      </w:r>
+      <w:r>
+        <w:rPr>
+          <w:rFonts w:ascii="Arial" w:cs="Arial" w:eastAsia="Arial" w:hAnsi="Arial"/>
+          <w:sz w:val="17"/>
+          <w:szCs w:val="17"/>
+        </w:rPr>
+        <w:t xml:space="preserve">Structured in pedagogical alignment with the competence-based curriculum format and learning outcomes established by the Kenya Institute of Curriculum Development (KICD). This material is independently developed and is not officially endorsed or published by KICD.</w:t>
+      </w:r>
+    </w:p>
+    <w:p>
+      <w:pPr>
+        <w:spacing w:after="60" w:before="0"/>
+      </w:pPr>
+      <w:r>
+        <w:rPr>
+          <w:rFonts w:ascii="Arial" w:cs="Arial" w:eastAsia="Arial" w:hAnsi="Arial"/>
+          <w:b/>
+          <w:bCs/>
+          <w:sz w:val="17"/>
+          <w:szCs w:val="17"/>
+        </w:rPr>
+        <w:t xml:space="preserve">Content &amp; Pedagogy: </w:t>
+      </w:r>
+      <w:r>
+        <w:rPr>
+          <w:rFonts w:ascii="Arial" w:cs="Arial" w:eastAsia="Arial" w:hAnsi="Arial"/>
+          <w:sz w:val="17"/>
+          <w:szCs w:val="17"/>
+        </w:rPr>
+        <w:t xml:space="preserve">Developed and adapted by the educator team at SeaVuria (registered 501(c)(3) in the United States and registered NGO in Kenya, No. 872-850A-BF11), who designed the pedagogical framework, lesson templates and exemplar lessons on which this material is based.</w:t>
+      </w:r>
+    </w:p>
+    <w:p>
+      <w:pPr>
+        <w:spacing w:after="60" w:before="0"/>
+      </w:pPr>
+      <w:r>
+        <w:rPr>
+          <w:rFonts w:ascii="Arial" w:cs="Arial" w:eastAsia="Arial" w:hAnsi="Arial"/>
+          <w:b/>
+          <w:bCs/>
+          <w:sz w:val="17"/>
+          <w:szCs w:val="17"/>
+        </w:rPr>
+        <w:t xml:space="preserve">Production &amp; Layout: </w:t>
+      </w:r>
+      <w:r>
+        <w:rPr>
+          <w:rFonts w:ascii="Arial" w:cs="Arial" w:eastAsia="Arial" w:hAnsi="Arial"/>
+          <w:sz w:val="17"/>
+          <w:szCs w:val="17"/>
+        </w:rPr>
+        <w:t xml:space="preserve">Educational design and curriculum sequencing by SeaVuria. Technical layout, structural formatting, and digital optimization/implementation executed in partnership with ARES Education (registered 501(c)(3) in the United States and Canada (as Afretech Aid) and registered NGO in Kenya), with lesson drafting and compilation assisted by AI (Claude, Anthropic).</w:t>
+      </w:r>
+    </w:p>
+    <w:p>
+      <w:pPr>
+        <w:pBdr>
+          <w:bottom w:val="single" w:color="1F3864" w:sz="6" w:space="6"/>
+        </w:pBdr>
+        <w:spacing w:after="60" w:before="0"/>
+      </w:pPr>
+      <w:r>
+        <w:rPr>
+          <w:rFonts w:ascii="Arial" w:cs="Arial" w:eastAsia="Arial" w:hAnsi="Arial"/>
+          <w:b/>
+          <w:bCs/>
+          <w:sz w:val="17"/>
+          <w:szCs w:val="17"/>
+        </w:rPr>
+        <w:t xml:space="preserve">Licensing &amp; Copyright: </w:t>
+      </w:r>
+      <w:r>
+        <w:rPr>
+          <w:rFonts w:ascii="Arial" w:cs="Arial" w:eastAsia="Arial" w:hAnsi="Arial"/>
+          <w:sz w:val="17"/>
+          <w:szCs w:val="17"/>
+        </w:rPr>
+        <w:t xml:space="preserve">© 2026 SeaVuria and ARES. This work is licensed under a </w:t>
+      </w:r>
+      <w:hyperlink w:history="1" r:id="rIdzkvf8clxy2cbdekck4wib">
+        <w:r>
+          <w:rPr>
+            <w:rFonts w:ascii="Arial" w:cs="Arial" w:eastAsia="Arial" w:hAnsi="Arial"/>
+            <w:color w:val="1F6B75"/>
+            <w:sz w:val="17"/>
+            <w:szCs w:val="17"/>
+            <w:u w:val="single" w:color="1F6B75"/>
+          </w:rPr>
+          <w:t xml:space="preserve">Creative Commons Attribution-NonCommercial 4.0 International License</w:t>
+        </w:r>
+      </w:hyperlink>
+      <w:r>
+        <w:rPr>
+          <w:rFonts w:ascii="Arial" w:cs="Arial" w:eastAsia="Arial" w:hAnsi="Arial"/>
+          <w:sz w:val="17"/>
+          <w:szCs w:val="17"/>
+        </w:rPr>
+        <w:t xml:space="preserve"> (</w:t>
+      </w:r>
+      <w:hyperlink w:history="1" r:id="rIdnwcifuiujxebeshdf7t28">
+        <w:r>
+          <w:rPr>
+            <w:rFonts w:ascii="Arial" w:cs="Arial" w:eastAsia="Arial" w:hAnsi="Arial"/>
+            <w:color w:val="1F6B75"/>
+            <w:sz w:val="17"/>
+            <w:szCs w:val="17"/>
+            <w:u w:val="single" w:color="1F6B75"/>
+          </w:rPr>
+          <w:t xml:space="preserve">CC BY-NC 4.0</w:t>
+        </w:r>
+      </w:hyperlink>
+      <w:r>
+        <w:rPr>
+          <w:rFonts w:ascii="Arial" w:cs="Arial" w:eastAsia="Arial" w:hAnsi="Arial"/>
+          <w:sz w:val="17"/>
+          <w:szCs w:val="17"/>
+        </w:rPr>
+        <w:t xml:space="preserve">). To view a copy of this license, visit </w:t>
+      </w:r>
+      <w:hyperlink w:history="1" r:id="rId-gzyfd_pdioat7yfbiy3k">
+        <w:r>
+          <w:rPr>
+            <w:rFonts w:ascii="Arial" w:cs="Arial" w:eastAsia="Arial" w:hAnsi="Arial"/>
+            <w:color w:val="1F6B75"/>
+            <w:sz w:val="17"/>
+            <w:szCs w:val="17"/>
+            <w:u w:val="single" w:color="1F6B75"/>
+          </w:rPr>
+          <w:t xml:space="preserve">https://creativecommons.org/licenses/by-nc/4.0/</w:t>
+        </w:r>
+      </w:hyperlink>
+      <w:r>
+        <w:rPr>
+          <w:rFonts w:ascii="Arial" w:cs="Arial" w:eastAsia="Arial" w:hAnsi="Arial"/>
+          <w:sz w:val="17"/>
+          <w:szCs w:val="17"/>
+        </w:rPr>
+        <w:t xml:space="preserve">. You are free to copy, redistribute, and adapt this material in any medium or format, provided appropriate credit is given and the material is not used for commercial purposes. KICD learning outcomes and curriculum designations reproduced here for alignment purposes remain the property of KICD and are not covered by this license. Linked external resources (e.g. CK-12, Khan Academy, PhET) are subject to their own licenses.</w:t>
+      </w:r>
+    </w:p>
+    <w:p>
+      <w:pPr>
         <w:spacing w:after="120"/>
       </w:pPr>
       <w:r>
@@ -3477,7 +3648,7 @@
             <w:pPr>
               <w:spacing w:after="20" w:before="0"/>
             </w:pPr>
-            <w:hyperlink w:history="1" r:id="rIdbvldi-0v6sbm1rqzq3kma">
+            <w:hyperlink w:history="1" r:id="rIdnvz9ak6zvw7ozrk3byw1y">
               <w:r>
                 <w:rPr>
                   <w:rFonts w:ascii="Arial" w:cs="Arial" w:eastAsia="Arial" w:hAnsi="Arial"/>
@@ -3510,7 +3681,7 @@
               <w:spacing w:after="10" w:before="0"/>
               <w:ind w:left="120"/>
             </w:pPr>
-            <w:hyperlink w:history="1" r:id="rIdyoa2cffs58lwkjxuryaeh">
+            <w:hyperlink w:history="1" r:id="rIdiepnyc3bnlmj66fv50nxj">
               <w:r>
                 <w:rPr>
                   <w:rFonts w:ascii="Arial" w:cs="Arial" w:eastAsia="Arial" w:hAnsi="Arial"/>
@@ -3555,7 +3726,7 @@
             <w:pPr>
               <w:spacing w:after="20" w:before="0"/>
             </w:pPr>
-            <w:hyperlink w:history="1" r:id="rIdoisduqu9am-sjbjzhc_sb">
+            <w:hyperlink w:history="1" r:id="rIdnxlyag34zlwfk6lymdr8n">
               <w:r>
                 <w:rPr>
                   <w:rFonts w:ascii="Arial" w:cs="Arial" w:eastAsia="Arial" w:hAnsi="Arial"/>
@@ -3588,7 +3759,7 @@
               <w:spacing w:after="10" w:before="0"/>
               <w:ind w:left="120"/>
             </w:pPr>
-            <w:hyperlink w:history="1" r:id="rId6xxpqu7lmnmvr38me4pbx">
+            <w:hyperlink w:history="1" r:id="rIdxx9o80cbwtiwrkcot_sfw">
               <w:r>
                 <w:rPr>
                   <w:rFonts w:ascii="Arial" w:cs="Arial" w:eastAsia="Arial" w:hAnsi="Arial"/>
@@ -3783,7 +3954,7 @@
             <w:pPr>
               <w:spacing w:after="20" w:before="0"/>
             </w:pPr>
-            <w:hyperlink w:history="1" r:id="rIdxr1aba54mg4aoabwgnubj">
+            <w:hyperlink w:history="1" r:id="rIdirnhizphls5cdgovavatk">
               <w:r>
                 <w:rPr>
                   <w:rFonts w:ascii="Arial" w:cs="Arial" w:eastAsia="Arial" w:hAnsi="Arial"/>
@@ -3816,7 +3987,7 @@
               <w:spacing w:after="10" w:before="0"/>
               <w:ind w:left="120"/>
             </w:pPr>
-            <w:hyperlink w:history="1" r:id="rIdhvfy_hp0pqopqeoblc_0t">
+            <w:hyperlink w:history="1" r:id="rIda8xjky140tg05huc3e2xu">
               <w:r>
                 <w:rPr>
                   <w:rFonts w:ascii="Arial" w:cs="Arial" w:eastAsia="Arial" w:hAnsi="Arial"/>
@@ -3861,7 +4032,7 @@
             <w:pPr>
               <w:spacing w:after="20" w:before="0"/>
             </w:pPr>
-            <w:hyperlink w:history="1" r:id="rIdiv0mslcqpmcghpufkcnon">
+            <w:hyperlink w:history="1" r:id="rIdtun758b6rpo_zztbkg9hg">
               <w:r>
                 <w:rPr>
                   <w:rFonts w:ascii="Arial" w:cs="Arial" w:eastAsia="Arial" w:hAnsi="Arial"/>
@@ -3894,7 +4065,7 @@
               <w:spacing w:after="10" w:before="0"/>
               <w:ind w:left="120"/>
             </w:pPr>
-            <w:hyperlink w:history="1" r:id="rIdfnus0aqpuwqboiyj1eo0d">
+            <w:hyperlink w:history="1" r:id="rIduhiy9u0i-ln50sbaxcexc">
               <w:r>
                 <w:rPr>
                   <w:rFonts w:ascii="Arial" w:cs="Arial" w:eastAsia="Arial" w:hAnsi="Arial"/>
@@ -4089,7 +4260,7 @@
             <w:pPr>
               <w:spacing w:after="20" w:before="0"/>
             </w:pPr>
-            <w:hyperlink w:history="1" r:id="rIdwrgenz00dusycoxofyivy">
+            <w:hyperlink w:history="1" r:id="rIdyqzoqcxljpwnnw35ptc3m">
               <w:r>
                 <w:rPr>
                   <w:rFonts w:ascii="Arial" w:cs="Arial" w:eastAsia="Arial" w:hAnsi="Arial"/>
@@ -4122,7 +4293,7 @@
               <w:spacing w:after="10" w:before="0"/>
               <w:ind w:left="120"/>
             </w:pPr>
-            <w:hyperlink w:history="1" r:id="rIdasf9gbz0hj0h2c8uoqwle">
+            <w:hyperlink w:history="1" r:id="rIdp4x4jdoxaodtx3vdqsdzf">
               <w:r>
                 <w:rPr>
                   <w:rFonts w:ascii="Arial" w:cs="Arial" w:eastAsia="Arial" w:hAnsi="Arial"/>
@@ -4167,7 +4338,7 @@
             <w:pPr>
               <w:spacing w:after="20" w:before="0"/>
             </w:pPr>
-            <w:hyperlink w:history="1" r:id="rId1woicvpox-xq2d2j3u-ka">
+            <w:hyperlink w:history="1" r:id="rIdyolqcui7pnmfhd_jaye3v">
               <w:r>
                 <w:rPr>
                   <w:rFonts w:ascii="Arial" w:cs="Arial" w:eastAsia="Arial" w:hAnsi="Arial"/>
@@ -4200,7 +4371,7 @@
               <w:spacing w:after="10" w:before="0"/>
               <w:ind w:left="120"/>
             </w:pPr>
-            <w:hyperlink w:history="1" r:id="rIdsrx9xjplthcplo0atvl87">
+            <w:hyperlink w:history="1" r:id="rIdznu_wac702neptzfoj6rb">
               <w:r>
                 <w:rPr>
                   <w:rFonts w:ascii="Arial" w:cs="Arial" w:eastAsia="Arial" w:hAnsi="Arial"/>
@@ -4395,7 +4566,7 @@
             <w:pPr>
               <w:spacing w:after="20" w:before="0"/>
             </w:pPr>
-            <w:hyperlink w:history="1" r:id="rIdoqruv5wip0xnlwyucytxt">
+            <w:hyperlink w:history="1" r:id="rIddyrjxtyka8jmnhjvlmdjd">
               <w:r>
                 <w:rPr>
                   <w:rFonts w:ascii="Arial" w:cs="Arial" w:eastAsia="Arial" w:hAnsi="Arial"/>
@@ -4428,7 +4599,7 @@
               <w:spacing w:after="10" w:before="0"/>
               <w:ind w:left="120"/>
             </w:pPr>
-            <w:hyperlink w:history="1" r:id="rIdert74vqxokcal4wooffwo">
+            <w:hyperlink w:history="1" r:id="rIdhqt7ynqglhpu0jqjfouwt">
               <w:r>
                 <w:rPr>
                   <w:rFonts w:ascii="Arial" w:cs="Arial" w:eastAsia="Arial" w:hAnsi="Arial"/>
@@ -4473,7 +4644,7 @@
             <w:pPr>
               <w:spacing w:after="20" w:before="0"/>
             </w:pPr>
-            <w:hyperlink w:history="1" r:id="rIdiehjty_2rtt9figcbkvkj">
+            <w:hyperlink w:history="1" r:id="rId3x_w5m4nhwoluqalohtgc">
               <w:r>
                 <w:rPr>
                   <w:rFonts w:ascii="Arial" w:cs="Arial" w:eastAsia="Arial" w:hAnsi="Arial"/>
@@ -4506,7 +4677,7 @@
               <w:spacing w:after="10" w:before="0"/>
               <w:ind w:left="120"/>
             </w:pPr>
-            <w:hyperlink w:history="1" r:id="rIdedhhcsshx0j97ow-vd9ed">
+            <w:hyperlink w:history="1" r:id="rIdzjhstp6ht9tchiebiqpmg">
               <w:r>
                 <w:rPr>
                   <w:rFonts w:ascii="Arial" w:cs="Arial" w:eastAsia="Arial" w:hAnsi="Arial"/>
@@ -4701,7 +4872,7 @@
             <w:pPr>
               <w:spacing w:after="20" w:before="0"/>
             </w:pPr>
-            <w:hyperlink w:history="1" r:id="rIdf9zkjtiwlpo5xntznjzdu">
+            <w:hyperlink w:history="1" r:id="rIdhwjdpnjj2pxfbcbeeoo__">
               <w:r>
                 <w:rPr>
                   <w:rFonts w:ascii="Arial" w:cs="Arial" w:eastAsia="Arial" w:hAnsi="Arial"/>
@@ -4734,7 +4905,7 @@
               <w:spacing w:after="10" w:before="0"/>
               <w:ind w:left="120"/>
             </w:pPr>
-            <w:hyperlink w:history="1" r:id="rIdvf_-jyd29zbyirdtiw7lx">
+            <w:hyperlink w:history="1" r:id="rIdsfcvo1vlyqkkzzcrsxfep">
               <w:r>
                 <w:rPr>
                   <w:rFonts w:ascii="Arial" w:cs="Arial" w:eastAsia="Arial" w:hAnsi="Arial"/>
@@ -4779,7 +4950,7 @@
             <w:pPr>
               <w:spacing w:after="20" w:before="0"/>
             </w:pPr>
-            <w:hyperlink w:history="1" r:id="rIdualwxyq4s3hc2ywbbzh3f">
+            <w:hyperlink w:history="1" r:id="rId5ivedu0dk9btgnps9km1m">
               <w:r>
                 <w:rPr>
                   <w:rFonts w:ascii="Arial" w:cs="Arial" w:eastAsia="Arial" w:hAnsi="Arial"/>
@@ -4812,7 +4983,7 @@
               <w:spacing w:after="10" w:before="0"/>
               <w:ind w:left="120"/>
             </w:pPr>
-            <w:hyperlink w:history="1" r:id="rIdwlcpfbvcsy5jye35re0pr">
+            <w:hyperlink w:history="1" r:id="rIdjal5-ig-yluatjmkiiit-">
               <w:r>
                 <w:rPr>
                   <w:rFonts w:ascii="Arial" w:cs="Arial" w:eastAsia="Arial" w:hAnsi="Arial"/>
@@ -5308,6 +5479,65 @@
         </w:tc>
       </w:tr>
     </w:tbl>
+    <w:p>
+      <w:pPr>
+        <w:pBdr>
+          <w:top w:val="single" w:color="BBBBBB" w:sz="4" w:space="4"/>
+        </w:pBdr>
+        <w:spacing w:after="0" w:before="160"/>
+      </w:pPr>
+      <w:r>
+        <w:rPr>
+          <w:rFonts w:ascii="Arial" w:cs="Arial" w:eastAsia="Arial" w:hAnsi="Arial"/>
+          <w:color w:val="666666"/>
+          <w:sz w:val="14"/>
+          <w:szCs w:val="14"/>
+        </w:rPr>
+        <w:t xml:space="preserve">© 2026 SeaVuria and ARES. Aligned with KICD objectives. Developed by SeaVuria; technical implementation by ARES (with AI assistance from Claude). Licensed under </w:t>
+      </w:r>
+      <w:hyperlink w:history="1" r:id="rIddxbecntxpek4vp9z3rcy8">
+        <w:r>
+          <w:rPr>
+            <w:rFonts w:ascii="Arial" w:cs="Arial" w:eastAsia="Arial" w:hAnsi="Arial"/>
+            <w:color w:val="1F6B75"/>
+            <w:sz w:val="14"/>
+            <w:szCs w:val="14"/>
+            <w:u w:val="single" w:color="1F6B75"/>
+          </w:rPr>
+          <w:t xml:space="preserve">CC BY-NC 4.0</w:t>
+        </w:r>
+      </w:hyperlink>
+      <w:r>
+        <w:rPr>
+          <w:rFonts w:ascii="Arial" w:cs="Arial" w:eastAsia="Arial" w:hAnsi="Arial"/>
+          <w:color w:val="666666"/>
+          <w:sz w:val="14"/>
+          <w:szCs w:val="14"/>
+        </w:rPr>
+        <w:t xml:space="preserve"> (</w:t>
+      </w:r>
+      <w:hyperlink w:history="1" r:id="rIdgxrcwguximzndtpzprurk">
+        <w:r>
+          <w:rPr>
+            <w:rFonts w:ascii="Arial" w:cs="Arial" w:eastAsia="Arial" w:hAnsi="Arial"/>
+            <w:color w:val="1F6B75"/>
+            <w:sz w:val="14"/>
+            <w:szCs w:val="14"/>
+            <w:u w:val="single" w:color="1F6B75"/>
+          </w:rPr>
+          <w:t xml:space="preserve">https://creativecommons.org/licenses/by-nc/4.0/</w:t>
+        </w:r>
+      </w:hyperlink>
+      <w:r>
+        <w:rPr>
+          <w:rFonts w:ascii="Arial" w:cs="Arial" w:eastAsia="Arial" w:hAnsi="Arial"/>
+          <w:color w:val="666666"/>
+          <w:sz w:val="14"/>
+          <w:szCs w:val="14"/>
+        </w:rPr>
+        <w:t xml:space="preserve">).</w:t>
+      </w:r>
+    </w:p>
     <w:p>
       <w:r>
         <w:br w:type="page"/>
@@ -6299,7 +6529,7 @@
             <w:pPr>
               <w:spacing w:after="20" w:before="0"/>
             </w:pPr>
-            <w:hyperlink w:history="1" r:id="rIdqvd131y1899to3vjn6e_y">
+            <w:hyperlink w:history="1" r:id="rIdjtjp2raft7mf07tl7uaux">
               <w:r>
                 <w:rPr>
                   <w:rFonts w:ascii="Arial" w:cs="Arial" w:eastAsia="Arial" w:hAnsi="Arial"/>
@@ -6332,7 +6562,7 @@
               <w:spacing w:after="10" w:before="0"/>
               <w:ind w:left="120"/>
             </w:pPr>
-            <w:hyperlink w:history="1" r:id="rIdkqt0cokrczogk5_7o8o0g">
+            <w:hyperlink w:history="1" r:id="rIdnzgegzx3jawxwqmt-ffob">
               <w:r>
                 <w:rPr>
                   <w:rFonts w:ascii="Arial" w:cs="Arial" w:eastAsia="Arial" w:hAnsi="Arial"/>
@@ -6377,7 +6607,7 @@
             <w:pPr>
               <w:spacing w:after="20" w:before="0"/>
             </w:pPr>
-            <w:hyperlink w:history="1" r:id="rIddznrpcdise1bmt_bwtfnv">
+            <w:hyperlink w:history="1" r:id="rIdwymlec0-3kmn18njzykma">
               <w:r>
                 <w:rPr>
                   <w:rFonts w:ascii="Arial" w:cs="Arial" w:eastAsia="Arial" w:hAnsi="Arial"/>
@@ -6410,7 +6640,7 @@
               <w:spacing w:after="10" w:before="0"/>
               <w:ind w:left="120"/>
             </w:pPr>
-            <w:hyperlink w:history="1" r:id="rIdalarc3etcennnjlzv9thp">
+            <w:hyperlink w:history="1" r:id="rIdwafc0gtbxjazagfd5ibjf">
               <w:r>
                 <w:rPr>
                   <w:rFonts w:ascii="Arial" w:cs="Arial" w:eastAsia="Arial" w:hAnsi="Arial"/>
@@ -6605,7 +6835,7 @@
             <w:pPr>
               <w:spacing w:after="20" w:before="0"/>
             </w:pPr>
-            <w:hyperlink w:history="1" r:id="rIdfsguwm878ku0344e68nxq">
+            <w:hyperlink w:history="1" r:id="rIdd2iaiqx68v-ftfvlpmkuy">
               <w:r>
                 <w:rPr>
                   <w:rFonts w:ascii="Arial" w:cs="Arial" w:eastAsia="Arial" w:hAnsi="Arial"/>
@@ -6638,7 +6868,7 @@
               <w:spacing w:after="10" w:before="0"/>
               <w:ind w:left="120"/>
             </w:pPr>
-            <w:hyperlink w:history="1" r:id="rIdvcw3ppfntmh8s30wpynft">
+            <w:hyperlink w:history="1" r:id="rIdqf3olg4iwfttzvwsd81o1">
               <w:r>
                 <w:rPr>
                   <w:rFonts w:ascii="Arial" w:cs="Arial" w:eastAsia="Arial" w:hAnsi="Arial"/>
@@ -6683,7 +6913,7 @@
             <w:pPr>
               <w:spacing w:after="20" w:before="0"/>
             </w:pPr>
-            <w:hyperlink w:history="1" r:id="rIdqor-awrkuawegne_e6xvd">
+            <w:hyperlink w:history="1" r:id="rIdt9uiotbx1efbke-x6waln">
               <w:r>
                 <w:rPr>
                   <w:rFonts w:ascii="Arial" w:cs="Arial" w:eastAsia="Arial" w:hAnsi="Arial"/>
@@ -6716,7 +6946,7 @@
               <w:spacing w:after="10" w:before="0"/>
               <w:ind w:left="120"/>
             </w:pPr>
-            <w:hyperlink w:history="1" r:id="rIdpqr6fhwvtpnuypcrkmaeb">
+            <w:hyperlink w:history="1" r:id="rIdfva9ovis7kbqug8tir9mk">
               <w:r>
                 <w:rPr>
                   <w:rFonts w:ascii="Arial" w:cs="Arial" w:eastAsia="Arial" w:hAnsi="Arial"/>
@@ -6911,7 +7141,7 @@
             <w:pPr>
               <w:spacing w:after="20" w:before="0"/>
             </w:pPr>
-            <w:hyperlink w:history="1" r:id="rId8ms7ydfd-d-4jo34psfcn">
+            <w:hyperlink w:history="1" r:id="rIds4fuvoydlpisq6d1bnrlb">
               <w:r>
                 <w:rPr>
                   <w:rFonts w:ascii="Arial" w:cs="Arial" w:eastAsia="Arial" w:hAnsi="Arial"/>
@@ -6944,7 +7174,7 @@
               <w:spacing w:after="10" w:before="0"/>
               <w:ind w:left="120"/>
             </w:pPr>
-            <w:hyperlink w:history="1" r:id="rIdqld9qgtxxickdgkvg3tf-">
+            <w:hyperlink w:history="1" r:id="rIdyqfb-h34c5dbpdaz8chbs">
               <w:r>
                 <w:rPr>
                   <w:rFonts w:ascii="Arial" w:cs="Arial" w:eastAsia="Arial" w:hAnsi="Arial"/>
@@ -6989,7 +7219,7 @@
             <w:pPr>
               <w:spacing w:after="20" w:before="0"/>
             </w:pPr>
-            <w:hyperlink w:history="1" r:id="rId4jbxfc3b8a7xppjovkaj0">
+            <w:hyperlink w:history="1" r:id="rIdldiut_ehil3miq0slb-vr">
               <w:r>
                 <w:rPr>
                   <w:rFonts w:ascii="Arial" w:cs="Arial" w:eastAsia="Arial" w:hAnsi="Arial"/>
@@ -7022,7 +7252,7 @@
               <w:spacing w:after="10" w:before="0"/>
               <w:ind w:left="120"/>
             </w:pPr>
-            <w:hyperlink w:history="1" r:id="rId-nmlzeackc-2yz4uxz9b-">
+            <w:hyperlink w:history="1" r:id="rIdsrfb6iqgxcwuywtevry7x">
               <w:r>
                 <w:rPr>
                   <w:rFonts w:ascii="Arial" w:cs="Arial" w:eastAsia="Arial" w:hAnsi="Arial"/>
@@ -7217,7 +7447,7 @@
             <w:pPr>
               <w:spacing w:after="20" w:before="0"/>
             </w:pPr>
-            <w:hyperlink w:history="1" r:id="rIdcdlbkhxqjzvie-3cr7gjr">
+            <w:hyperlink w:history="1" r:id="rIdonalqdzdepirj13r1eq3d">
               <w:r>
                 <w:rPr>
                   <w:rFonts w:ascii="Arial" w:cs="Arial" w:eastAsia="Arial" w:hAnsi="Arial"/>
@@ -7250,7 +7480,7 @@
               <w:spacing w:after="10" w:before="0"/>
               <w:ind w:left="120"/>
             </w:pPr>
-            <w:hyperlink w:history="1" r:id="rId3-fbtcryccapjoa8hrzdf">
+            <w:hyperlink w:history="1" r:id="rId_81goyii9fjfy0i-g1rkx">
               <w:r>
                 <w:rPr>
                   <w:rFonts w:ascii="Arial" w:cs="Arial" w:eastAsia="Arial" w:hAnsi="Arial"/>
@@ -7295,7 +7525,7 @@
             <w:pPr>
               <w:spacing w:after="20" w:before="0"/>
             </w:pPr>
-            <w:hyperlink w:history="1" r:id="rIddulkvdau3hdbkasy_5e5a">
+            <w:hyperlink w:history="1" r:id="rIdj_vgjln3glrgorlccoalg">
               <w:r>
                 <w:rPr>
                   <w:rFonts w:ascii="Arial" w:cs="Arial" w:eastAsia="Arial" w:hAnsi="Arial"/>
@@ -7328,7 +7558,7 @@
               <w:spacing w:after="10" w:before="0"/>
               <w:ind w:left="120"/>
             </w:pPr>
-            <w:hyperlink w:history="1" r:id="rIdvixpvzeaklq7hbcvzaf80">
+            <w:hyperlink w:history="1" r:id="rIdfarianqyu7clu1rnnfbjd">
               <w:r>
                 <w:rPr>
                   <w:rFonts w:ascii="Arial" w:cs="Arial" w:eastAsia="Arial" w:hAnsi="Arial"/>
@@ -7523,7 +7753,7 @@
             <w:pPr>
               <w:spacing w:after="20" w:before="0"/>
             </w:pPr>
-            <w:hyperlink w:history="1" r:id="rIdzwyxrshoqokftlxaqntnq">
+            <w:hyperlink w:history="1" r:id="rId4oabbetx_46xxas5bnw7h">
               <w:r>
                 <w:rPr>
                   <w:rFonts w:ascii="Arial" w:cs="Arial" w:eastAsia="Arial" w:hAnsi="Arial"/>
@@ -7556,7 +7786,7 @@
               <w:spacing w:after="10" w:before="0"/>
               <w:ind w:left="120"/>
             </w:pPr>
-            <w:hyperlink w:history="1" r:id="rId3wsw-bccattyh49xtcqfd">
+            <w:hyperlink w:history="1" r:id="rIdthcpuljpqjiuk81mk2jk0">
               <w:r>
                 <w:rPr>
                   <w:rFonts w:ascii="Arial" w:cs="Arial" w:eastAsia="Arial" w:hAnsi="Arial"/>
@@ -7601,7 +7831,7 @@
             <w:pPr>
               <w:spacing w:after="20" w:before="0"/>
             </w:pPr>
-            <w:hyperlink w:history="1" r:id="rIdl-jwlavc6hboqga8wbhni">
+            <w:hyperlink w:history="1" r:id="rId1v3u5_m-g5qt_f8yovnac">
               <w:r>
                 <w:rPr>
                   <w:rFonts w:ascii="Arial" w:cs="Arial" w:eastAsia="Arial" w:hAnsi="Arial"/>
@@ -7634,7 +7864,7 @@
               <w:spacing w:after="10" w:before="0"/>
               <w:ind w:left="120"/>
             </w:pPr>
-            <w:hyperlink w:history="1" r:id="rIdqmymvm2k7tw0lw4d9h_aw">
+            <w:hyperlink w:history="1" r:id="rIdhl0mfyv4dehxwfeaz9csy">
               <w:r>
                 <w:rPr>
                   <w:rFonts w:ascii="Arial" w:cs="Arial" w:eastAsia="Arial" w:hAnsi="Arial"/>
@@ -8130,6 +8360,65 @@
         </w:tc>
       </w:tr>
     </w:tbl>
+    <w:p>
+      <w:pPr>
+        <w:pBdr>
+          <w:top w:val="single" w:color="BBBBBB" w:sz="4" w:space="4"/>
+        </w:pBdr>
+        <w:spacing w:after="0" w:before="160"/>
+      </w:pPr>
+      <w:r>
+        <w:rPr>
+          <w:rFonts w:ascii="Arial" w:cs="Arial" w:eastAsia="Arial" w:hAnsi="Arial"/>
+          <w:color w:val="666666"/>
+          <w:sz w:val="14"/>
+          <w:szCs w:val="14"/>
+        </w:rPr>
+        <w:t xml:space="preserve">© 2026 SeaVuria and ARES. Aligned with KICD objectives. Developed by SeaVuria; technical implementation by ARES (with AI assistance from Claude). Licensed under </w:t>
+      </w:r>
+      <w:hyperlink w:history="1" r:id="rIdoioo6n04b7uaxjlxmyzzr">
+        <w:r>
+          <w:rPr>
+            <w:rFonts w:ascii="Arial" w:cs="Arial" w:eastAsia="Arial" w:hAnsi="Arial"/>
+            <w:color w:val="1F6B75"/>
+            <w:sz w:val="14"/>
+            <w:szCs w:val="14"/>
+            <w:u w:val="single" w:color="1F6B75"/>
+          </w:rPr>
+          <w:t xml:space="preserve">CC BY-NC 4.0</w:t>
+        </w:r>
+      </w:hyperlink>
+      <w:r>
+        <w:rPr>
+          <w:rFonts w:ascii="Arial" w:cs="Arial" w:eastAsia="Arial" w:hAnsi="Arial"/>
+          <w:color w:val="666666"/>
+          <w:sz w:val="14"/>
+          <w:szCs w:val="14"/>
+        </w:rPr>
+        <w:t xml:space="preserve"> (</w:t>
+      </w:r>
+      <w:hyperlink w:history="1" r:id="rId8mexsvuvpo3annauj_vok">
+        <w:r>
+          <w:rPr>
+            <w:rFonts w:ascii="Arial" w:cs="Arial" w:eastAsia="Arial" w:hAnsi="Arial"/>
+            <w:color w:val="1F6B75"/>
+            <w:sz w:val="14"/>
+            <w:szCs w:val="14"/>
+            <w:u w:val="single" w:color="1F6B75"/>
+          </w:rPr>
+          <w:t xml:space="preserve">https://creativecommons.org/licenses/by-nc/4.0/</w:t>
+        </w:r>
+      </w:hyperlink>
+      <w:r>
+        <w:rPr>
+          <w:rFonts w:ascii="Arial" w:cs="Arial" w:eastAsia="Arial" w:hAnsi="Arial"/>
+          <w:color w:val="666666"/>
+          <w:sz w:val="14"/>
+          <w:szCs w:val="14"/>
+        </w:rPr>
+        <w:t xml:space="preserve">).</w:t>
+      </w:r>
+    </w:p>
     <w:p>
       <w:r>
         <w:br w:type="page"/>
@@ -9121,7 +9410,7 @@
             <w:pPr>
               <w:spacing w:after="20" w:before="0"/>
             </w:pPr>
-            <w:hyperlink w:history="1" r:id="rIdviv4nwrqknm8pdtqit2te">
+            <w:hyperlink w:history="1" r:id="rId2vrjbm0brf7hr_s3aspf3">
               <w:r>
                 <w:rPr>
                   <w:rFonts w:ascii="Arial" w:cs="Arial" w:eastAsia="Arial" w:hAnsi="Arial"/>
@@ -9154,7 +9443,7 @@
               <w:spacing w:after="10" w:before="0"/>
               <w:ind w:left="120"/>
             </w:pPr>
-            <w:hyperlink w:history="1" r:id="rIdrgvrl0qwz8a_w0pfkona1">
+            <w:hyperlink w:history="1" r:id="rIdf9zz1zf0oxjzhrccodpxs">
               <w:r>
                 <w:rPr>
                   <w:rFonts w:ascii="Arial" w:cs="Arial" w:eastAsia="Arial" w:hAnsi="Arial"/>
@@ -9199,7 +9488,7 @@
             <w:pPr>
               <w:spacing w:after="20" w:before="0"/>
             </w:pPr>
-            <w:hyperlink w:history="1" r:id="rIdurtuk0dyhefh9il6ebhac">
+            <w:hyperlink w:history="1" r:id="rId8ok4s6si55kvieeilq810">
               <w:r>
                 <w:rPr>
                   <w:rFonts w:ascii="Arial" w:cs="Arial" w:eastAsia="Arial" w:hAnsi="Arial"/>
@@ -9232,7 +9521,7 @@
               <w:spacing w:after="10" w:before="0"/>
               <w:ind w:left="120"/>
             </w:pPr>
-            <w:hyperlink w:history="1" r:id="rIdme5ji1vki7okn8qslgapd">
+            <w:hyperlink w:history="1" r:id="rIdkp5ya2zapg4vazzjk_t3g">
               <w:r>
                 <w:rPr>
                   <w:rFonts w:ascii="Arial" w:cs="Arial" w:eastAsia="Arial" w:hAnsi="Arial"/>
@@ -9427,7 +9716,7 @@
             <w:pPr>
               <w:spacing w:after="20" w:before="0"/>
             </w:pPr>
-            <w:hyperlink w:history="1" r:id="rId341cmi36vwssarbo9e-fw">
+            <w:hyperlink w:history="1" r:id="rId0xvu6e-dzgamyevr1l3dw">
               <w:r>
                 <w:rPr>
                   <w:rFonts w:ascii="Arial" w:cs="Arial" w:eastAsia="Arial" w:hAnsi="Arial"/>
@@ -9460,7 +9749,7 @@
               <w:spacing w:after="10" w:before="0"/>
               <w:ind w:left="120"/>
             </w:pPr>
-            <w:hyperlink w:history="1" r:id="rIdahltprkmbgitkgyfclzik">
+            <w:hyperlink w:history="1" r:id="rIduqvzre1sbqnipwr1dratj">
               <w:r>
                 <w:rPr>
                   <w:rFonts w:ascii="Arial" w:cs="Arial" w:eastAsia="Arial" w:hAnsi="Arial"/>
@@ -9505,7 +9794,7 @@
             <w:pPr>
               <w:spacing w:after="20" w:before="0"/>
             </w:pPr>
-            <w:hyperlink w:history="1" r:id="rId2tixe_tqyxx1ovvv-wpe9">
+            <w:hyperlink w:history="1" r:id="rIdwkabxyv61ls3w_ypvl40r">
               <w:r>
                 <w:rPr>
                   <w:rFonts w:ascii="Arial" w:cs="Arial" w:eastAsia="Arial" w:hAnsi="Arial"/>
@@ -9538,7 +9827,7 @@
               <w:spacing w:after="10" w:before="0"/>
               <w:ind w:left="120"/>
             </w:pPr>
-            <w:hyperlink w:history="1" r:id="rId3bpdcjg8iqkegu2oxttui">
+            <w:hyperlink w:history="1" r:id="rIdom-hwkvwrwuwdrfeboy-x">
               <w:r>
                 <w:rPr>
                   <w:rFonts w:ascii="Arial" w:cs="Arial" w:eastAsia="Arial" w:hAnsi="Arial"/>
@@ -9733,7 +10022,7 @@
             <w:pPr>
               <w:spacing w:after="20" w:before="0"/>
             </w:pPr>
-            <w:hyperlink w:history="1" r:id="rIdnhu1dcp-4hgetbano9ku8">
+            <w:hyperlink w:history="1" r:id="rIdcqtomckg2x1n8d-fnjt3l">
               <w:r>
                 <w:rPr>
                   <w:rFonts w:ascii="Arial" w:cs="Arial" w:eastAsia="Arial" w:hAnsi="Arial"/>
@@ -9766,7 +10055,7 @@
               <w:spacing w:after="10" w:before="0"/>
               <w:ind w:left="120"/>
             </w:pPr>
-            <w:hyperlink w:history="1" r:id="rId9v3xhtzwbevvfwbxdocoj">
+            <w:hyperlink w:history="1" r:id="rIdq2infuow5m_t7jujkiuov">
               <w:r>
                 <w:rPr>
                   <w:rFonts w:ascii="Arial" w:cs="Arial" w:eastAsia="Arial" w:hAnsi="Arial"/>
@@ -9811,7 +10100,7 @@
             <w:pPr>
               <w:spacing w:after="20" w:before="0"/>
             </w:pPr>
-            <w:hyperlink w:history="1" r:id="rIddti8_vpgmulivdsenv6yu">
+            <w:hyperlink w:history="1" r:id="rIdvkrkucdcfn1xsuwugj9au">
               <w:r>
                 <w:rPr>
                   <w:rFonts w:ascii="Arial" w:cs="Arial" w:eastAsia="Arial" w:hAnsi="Arial"/>
@@ -9844,7 +10133,7 @@
               <w:spacing w:after="10" w:before="0"/>
               <w:ind w:left="120"/>
             </w:pPr>
-            <w:hyperlink w:history="1" r:id="rIdeyenrrudtgdui_f89zdcy">
+            <w:hyperlink w:history="1" r:id="rIdbriajmtbxyvy7hgsqluuu">
               <w:r>
                 <w:rPr>
                   <w:rFonts w:ascii="Arial" w:cs="Arial" w:eastAsia="Arial" w:hAnsi="Arial"/>
@@ -10039,7 +10328,7 @@
             <w:pPr>
               <w:spacing w:after="20" w:before="0"/>
             </w:pPr>
-            <w:hyperlink w:history="1" r:id="rIdixkqrxyyl7xiikvmgwrfa">
+            <w:hyperlink w:history="1" r:id="rIdvc0__rr60iqknvlhn7dpw">
               <w:r>
                 <w:rPr>
                   <w:rFonts w:ascii="Arial" w:cs="Arial" w:eastAsia="Arial" w:hAnsi="Arial"/>
@@ -10072,7 +10361,7 @@
               <w:spacing w:after="10" w:before="0"/>
               <w:ind w:left="120"/>
             </w:pPr>
-            <w:hyperlink w:history="1" r:id="rIdo2scqioksrdhazcnlm9g5">
+            <w:hyperlink w:history="1" r:id="rIdmb3tsrhwpy-l3wm4iom9w">
               <w:r>
                 <w:rPr>
                   <w:rFonts w:ascii="Arial" w:cs="Arial" w:eastAsia="Arial" w:hAnsi="Arial"/>
@@ -10117,7 +10406,7 @@
             <w:pPr>
               <w:spacing w:after="20" w:before="0"/>
             </w:pPr>
-            <w:hyperlink w:history="1" r:id="rIdubyfl489yn40rb7r-icqb">
+            <w:hyperlink w:history="1" r:id="rIdsdn-f0m3ybwxa4bazoj2z">
               <w:r>
                 <w:rPr>
                   <w:rFonts w:ascii="Arial" w:cs="Arial" w:eastAsia="Arial" w:hAnsi="Arial"/>
@@ -10150,7 +10439,7 @@
               <w:spacing w:after="10" w:before="0"/>
               <w:ind w:left="120"/>
             </w:pPr>
-            <w:hyperlink w:history="1" r:id="rId8pkxkd8loxuadg6ie-msf">
+            <w:hyperlink w:history="1" r:id="rIdadi_0uxlqwjlaiprdajdj">
               <w:r>
                 <w:rPr>
                   <w:rFonts w:ascii="Arial" w:cs="Arial" w:eastAsia="Arial" w:hAnsi="Arial"/>
@@ -10345,7 +10634,7 @@
             <w:pPr>
               <w:spacing w:after="20" w:before="0"/>
             </w:pPr>
-            <w:hyperlink w:history="1" r:id="rIdbusoutgw46lemlrasas44">
+            <w:hyperlink w:history="1" r:id="rIdlrahi53pic55ohywr3med">
               <w:r>
                 <w:rPr>
                   <w:rFonts w:ascii="Arial" w:cs="Arial" w:eastAsia="Arial" w:hAnsi="Arial"/>
@@ -10378,7 +10667,7 @@
               <w:spacing w:after="10" w:before="0"/>
               <w:ind w:left="120"/>
             </w:pPr>
-            <w:hyperlink w:history="1" r:id="rIdss-lpzeqesy0puu_c87nz">
+            <w:hyperlink w:history="1" r:id="rIdbcar_3qsalhtj53pawfql">
               <w:r>
                 <w:rPr>
                   <w:rFonts w:ascii="Arial" w:cs="Arial" w:eastAsia="Arial" w:hAnsi="Arial"/>
@@ -10423,7 +10712,7 @@
             <w:pPr>
               <w:spacing w:after="20" w:before="0"/>
             </w:pPr>
-            <w:hyperlink w:history="1" r:id="rIdnkw3eeydt-d6qk_tulsmg">
+            <w:hyperlink w:history="1" r:id="rIda1amxnnpbcgvbepfm7v4k">
               <w:r>
                 <w:rPr>
                   <w:rFonts w:ascii="Arial" w:cs="Arial" w:eastAsia="Arial" w:hAnsi="Arial"/>
@@ -10456,7 +10745,7 @@
               <w:spacing w:after="10" w:before="0"/>
               <w:ind w:left="120"/>
             </w:pPr>
-            <w:hyperlink w:history="1" r:id="rIdbrozuvakitfk6xe2dodut">
+            <w:hyperlink w:history="1" r:id="rIdy5se0b11il0etfdlrsxxo">
               <w:r>
                 <w:rPr>
                   <w:rFonts w:ascii="Arial" w:cs="Arial" w:eastAsia="Arial" w:hAnsi="Arial"/>
@@ -10952,6 +11241,65 @@
         </w:tc>
       </w:tr>
     </w:tbl>
+    <w:p>
+      <w:pPr>
+        <w:pBdr>
+          <w:top w:val="single" w:color="BBBBBB" w:sz="4" w:space="4"/>
+        </w:pBdr>
+        <w:spacing w:after="0" w:before="160"/>
+      </w:pPr>
+      <w:r>
+        <w:rPr>
+          <w:rFonts w:ascii="Arial" w:cs="Arial" w:eastAsia="Arial" w:hAnsi="Arial"/>
+          <w:color w:val="666666"/>
+          <w:sz w:val="14"/>
+          <w:szCs w:val="14"/>
+        </w:rPr>
+        <w:t xml:space="preserve">© 2026 SeaVuria and ARES. Aligned with KICD objectives. Developed by SeaVuria; technical implementation by ARES (with AI assistance from Claude). Licensed under </w:t>
+      </w:r>
+      <w:hyperlink w:history="1" r:id="rIdfkovibeshemkax7cufn3p">
+        <w:r>
+          <w:rPr>
+            <w:rFonts w:ascii="Arial" w:cs="Arial" w:eastAsia="Arial" w:hAnsi="Arial"/>
+            <w:color w:val="1F6B75"/>
+            <w:sz w:val="14"/>
+            <w:szCs w:val="14"/>
+            <w:u w:val="single" w:color="1F6B75"/>
+          </w:rPr>
+          <w:t xml:space="preserve">CC BY-NC 4.0</w:t>
+        </w:r>
+      </w:hyperlink>
+      <w:r>
+        <w:rPr>
+          <w:rFonts w:ascii="Arial" w:cs="Arial" w:eastAsia="Arial" w:hAnsi="Arial"/>
+          <w:color w:val="666666"/>
+          <w:sz w:val="14"/>
+          <w:szCs w:val="14"/>
+        </w:rPr>
+        <w:t xml:space="preserve"> (</w:t>
+      </w:r>
+      <w:hyperlink w:history="1" r:id="rIdegu_mm9756rlpeg12gndo">
+        <w:r>
+          <w:rPr>
+            <w:rFonts w:ascii="Arial" w:cs="Arial" w:eastAsia="Arial" w:hAnsi="Arial"/>
+            <w:color w:val="1F6B75"/>
+            <w:sz w:val="14"/>
+            <w:szCs w:val="14"/>
+            <w:u w:val="single" w:color="1F6B75"/>
+          </w:rPr>
+          <w:t xml:space="preserve">https://creativecommons.org/licenses/by-nc/4.0/</w:t>
+        </w:r>
+      </w:hyperlink>
+      <w:r>
+        <w:rPr>
+          <w:rFonts w:ascii="Arial" w:cs="Arial" w:eastAsia="Arial" w:hAnsi="Arial"/>
+          <w:color w:val="666666"/>
+          <w:sz w:val="14"/>
+          <w:szCs w:val="14"/>
+        </w:rPr>
+        <w:t xml:space="preserve">).</w:t>
+      </w:r>
+    </w:p>
     <w:p>
       <w:r>
         <w:br w:type="page"/>
@@ -11943,7 +12291,7 @@
             <w:pPr>
               <w:spacing w:after="20" w:before="0"/>
             </w:pPr>
-            <w:hyperlink w:history="1" r:id="rIdii5b3_idhoualfxhapttq">
+            <w:hyperlink w:history="1" r:id="rIdt1rvfqub3hyxd6r3rnz4d">
               <w:r>
                 <w:rPr>
                   <w:rFonts w:ascii="Arial" w:cs="Arial" w:eastAsia="Arial" w:hAnsi="Arial"/>
@@ -11976,7 +12324,7 @@
               <w:spacing w:after="10" w:before="0"/>
               <w:ind w:left="120"/>
             </w:pPr>
-            <w:hyperlink w:history="1" r:id="rIdg_5nyufoncbznnxyjkmo3">
+            <w:hyperlink w:history="1" r:id="rIdp4277opg7dtau0un3bndp">
               <w:r>
                 <w:rPr>
                   <w:rFonts w:ascii="Arial" w:cs="Arial" w:eastAsia="Arial" w:hAnsi="Arial"/>
@@ -12021,7 +12369,7 @@
             <w:pPr>
               <w:spacing w:after="20" w:before="0"/>
             </w:pPr>
-            <w:hyperlink w:history="1" r:id="rIdqpcupae-ajogivfqwiy6b">
+            <w:hyperlink w:history="1" r:id="rIdxumuwerzsju7xpwhgfikx">
               <w:r>
                 <w:rPr>
                   <w:rFonts w:ascii="Arial" w:cs="Arial" w:eastAsia="Arial" w:hAnsi="Arial"/>
@@ -12054,7 +12402,7 @@
               <w:spacing w:after="10" w:before="0"/>
               <w:ind w:left="120"/>
             </w:pPr>
-            <w:hyperlink w:history="1" r:id="rIdypcj61miqcdmisshbghv2">
+            <w:hyperlink w:history="1" r:id="rIdimxlpo0cxeiyiqqqnz9kv">
               <w:r>
                 <w:rPr>
                   <w:rFonts w:ascii="Arial" w:cs="Arial" w:eastAsia="Arial" w:hAnsi="Arial"/>
@@ -12249,7 +12597,7 @@
             <w:pPr>
               <w:spacing w:after="20" w:before="0"/>
             </w:pPr>
-            <w:hyperlink w:history="1" r:id="rIdvuswmsg9ucw96d1ef0ph0">
+            <w:hyperlink w:history="1" r:id="rIdrzl4gisanusidzymraiqy">
               <w:r>
                 <w:rPr>
                   <w:rFonts w:ascii="Arial" w:cs="Arial" w:eastAsia="Arial" w:hAnsi="Arial"/>
@@ -12282,7 +12630,7 @@
               <w:spacing w:after="10" w:before="0"/>
               <w:ind w:left="120"/>
             </w:pPr>
-            <w:hyperlink w:history="1" r:id="rIdsq92jhkd53vgbyhqls25y">
+            <w:hyperlink w:history="1" r:id="rIdnzeqsxhv7wh8uayblhteh">
               <w:r>
                 <w:rPr>
                   <w:rFonts w:ascii="Arial" w:cs="Arial" w:eastAsia="Arial" w:hAnsi="Arial"/>
@@ -12327,7 +12675,7 @@
             <w:pPr>
               <w:spacing w:after="20" w:before="0"/>
             </w:pPr>
-            <w:hyperlink w:history="1" r:id="rIdcqfityjzqoiqxiajw2_3q">
+            <w:hyperlink w:history="1" r:id="rIdhnxvqim04d0aoluhl1vse">
               <w:r>
                 <w:rPr>
                   <w:rFonts w:ascii="Arial" w:cs="Arial" w:eastAsia="Arial" w:hAnsi="Arial"/>
@@ -12360,7 +12708,7 @@
               <w:spacing w:after="10" w:before="0"/>
               <w:ind w:left="120"/>
             </w:pPr>
-            <w:hyperlink w:history="1" r:id="rIda2d5v4fx77_xfebnnnhjz">
+            <w:hyperlink w:history="1" r:id="rIdzzjbngzrucrjxvlalcf61">
               <w:r>
                 <w:rPr>
                   <w:rFonts w:ascii="Arial" w:cs="Arial" w:eastAsia="Arial" w:hAnsi="Arial"/>
@@ -12555,7 +12903,7 @@
             <w:pPr>
               <w:spacing w:after="20" w:before="0"/>
             </w:pPr>
-            <w:hyperlink w:history="1" r:id="rIdup2bphgyp8bweqdasdxl3">
+            <w:hyperlink w:history="1" r:id="rIdpxzytv2j5prxvcgbnm1wi">
               <w:r>
                 <w:rPr>
                   <w:rFonts w:ascii="Arial" w:cs="Arial" w:eastAsia="Arial" w:hAnsi="Arial"/>
@@ -12588,7 +12936,7 @@
               <w:spacing w:after="10" w:before="0"/>
               <w:ind w:left="120"/>
             </w:pPr>
-            <w:hyperlink w:history="1" r:id="rIdpnrhcxffpckzq1u9k1agk">
+            <w:hyperlink w:history="1" r:id="rIda5blocfgjum4x6exxkrei">
               <w:r>
                 <w:rPr>
                   <w:rFonts w:ascii="Arial" w:cs="Arial" w:eastAsia="Arial" w:hAnsi="Arial"/>
@@ -12633,7 +12981,7 @@
             <w:pPr>
               <w:spacing w:after="20" w:before="0"/>
             </w:pPr>
-            <w:hyperlink w:history="1" r:id="rIdbzkoqvjbpaxnuuebzsqmt">
+            <w:hyperlink w:history="1" r:id="rIdz6ffwxxm1jdrzrwapxzri">
               <w:r>
                 <w:rPr>
                   <w:rFonts w:ascii="Arial" w:cs="Arial" w:eastAsia="Arial" w:hAnsi="Arial"/>
@@ -12666,7 +13014,7 @@
               <w:spacing w:after="10" w:before="0"/>
               <w:ind w:left="120"/>
             </w:pPr>
-            <w:hyperlink w:history="1" r:id="rIdvwue92xgjblwdyq_muq3p">
+            <w:hyperlink w:history="1" r:id="rIdbpmwuucnmv45ksg3_96ho">
               <w:r>
                 <w:rPr>
                   <w:rFonts w:ascii="Arial" w:cs="Arial" w:eastAsia="Arial" w:hAnsi="Arial"/>
@@ -13250,7 +13598,7 @@
             <w:pPr>
               <w:spacing w:after="20" w:before="0"/>
             </w:pPr>
-            <w:hyperlink w:history="1" r:id="rId3hxtlhdmkkmm35hqnc3dp">
+            <w:hyperlink w:history="1" r:id="rId-gpp4_90m9-57a1ihu_hq">
               <w:r>
                 <w:rPr>
                   <w:rFonts w:ascii="Arial" w:cs="Arial" w:eastAsia="Arial" w:hAnsi="Arial"/>
@@ -13283,7 +13631,7 @@
               <w:spacing w:after="10" w:before="0"/>
               <w:ind w:left="120"/>
             </w:pPr>
-            <w:hyperlink w:history="1" r:id="rIdtlto8njwudefmmti0a3cp">
+            <w:hyperlink w:history="1" r:id="rIdybytckjrzotsfqhjenqxt">
               <w:r>
                 <w:rPr>
                   <w:rFonts w:ascii="Arial" w:cs="Arial" w:eastAsia="Arial" w:hAnsi="Arial"/>
@@ -13328,7 +13676,7 @@
             <w:pPr>
               <w:spacing w:after="20" w:before="0"/>
             </w:pPr>
-            <w:hyperlink w:history="1" r:id="rIdseqm0wqxb_zlxmv6c0nvg">
+            <w:hyperlink w:history="1" r:id="rIdbt2ajcc3e7w_9hx9e0vdf">
               <w:r>
                 <w:rPr>
                   <w:rFonts w:ascii="Arial" w:cs="Arial" w:eastAsia="Arial" w:hAnsi="Arial"/>
@@ -13361,7 +13709,7 @@
               <w:spacing w:after="10" w:before="0"/>
               <w:ind w:left="120"/>
             </w:pPr>
-            <w:hyperlink w:history="1" r:id="rIdbracl6wi0owp-9at5kovq">
+            <w:hyperlink w:history="1" r:id="rIdak8duq64c5h7ocgrizcml">
               <w:r>
                 <w:rPr>
                   <w:rFonts w:ascii="Arial" w:cs="Arial" w:eastAsia="Arial" w:hAnsi="Arial"/>
@@ -13556,7 +13904,7 @@
             <w:pPr>
               <w:spacing w:after="20" w:before="0"/>
             </w:pPr>
-            <w:hyperlink w:history="1" r:id="rIdqf7imacf4csdbsf0h5q2y">
+            <w:hyperlink w:history="1" r:id="rIdotlu813zusluwnbcj16se">
               <w:r>
                 <w:rPr>
                   <w:rFonts w:ascii="Arial" w:cs="Arial" w:eastAsia="Arial" w:hAnsi="Arial"/>
@@ -13589,7 +13937,7 @@
               <w:spacing w:after="10" w:before="0"/>
               <w:ind w:left="120"/>
             </w:pPr>
-            <w:hyperlink w:history="1" r:id="rIduhwl56xg-ilqnhmxa38u4">
+            <w:hyperlink w:history="1" r:id="rIdsvl7c2txkezgl-z5wxquy">
               <w:r>
                 <w:rPr>
                   <w:rFonts w:ascii="Arial" w:cs="Arial" w:eastAsia="Arial" w:hAnsi="Arial"/>
@@ -13634,7 +13982,7 @@
             <w:pPr>
               <w:spacing w:after="20" w:before="0"/>
             </w:pPr>
-            <w:hyperlink w:history="1" r:id="rIdytc3s5zwd9wicxvtc4num">
+            <w:hyperlink w:history="1" r:id="rIdjlpq4m0pjru-gc86el1tt">
               <w:r>
                 <w:rPr>
                   <w:rFonts w:ascii="Arial" w:cs="Arial" w:eastAsia="Arial" w:hAnsi="Arial"/>
@@ -13667,7 +14015,7 @@
               <w:spacing w:after="10" w:before="0"/>
               <w:ind w:left="120"/>
             </w:pPr>
-            <w:hyperlink w:history="1" r:id="rId2dzoeuizjhf2jhktnk8ik">
+            <w:hyperlink w:history="1" r:id="rIdjeobwlweros7hz0rpr_rz">
               <w:r>
                 <w:rPr>
                   <w:rFonts w:ascii="Arial" w:cs="Arial" w:eastAsia="Arial" w:hAnsi="Arial"/>
@@ -14163,6 +14511,65 @@
         </w:tc>
       </w:tr>
     </w:tbl>
+    <w:p>
+      <w:pPr>
+        <w:pBdr>
+          <w:top w:val="single" w:color="BBBBBB" w:sz="4" w:space="4"/>
+        </w:pBdr>
+        <w:spacing w:after="0" w:before="160"/>
+      </w:pPr>
+      <w:r>
+        <w:rPr>
+          <w:rFonts w:ascii="Arial" w:cs="Arial" w:eastAsia="Arial" w:hAnsi="Arial"/>
+          <w:color w:val="666666"/>
+          <w:sz w:val="14"/>
+          <w:szCs w:val="14"/>
+        </w:rPr>
+        <w:t xml:space="preserve">© 2026 SeaVuria and ARES. Aligned with KICD objectives. Developed by SeaVuria; technical implementation by ARES (with AI assistance from Claude). Licensed under </w:t>
+      </w:r>
+      <w:hyperlink w:history="1" r:id="rIdlhkacz8qggpu3h2fs7cc8">
+        <w:r>
+          <w:rPr>
+            <w:rFonts w:ascii="Arial" w:cs="Arial" w:eastAsia="Arial" w:hAnsi="Arial"/>
+            <w:color w:val="1F6B75"/>
+            <w:sz w:val="14"/>
+            <w:szCs w:val="14"/>
+            <w:u w:val="single" w:color="1F6B75"/>
+          </w:rPr>
+          <w:t xml:space="preserve">CC BY-NC 4.0</w:t>
+        </w:r>
+      </w:hyperlink>
+      <w:r>
+        <w:rPr>
+          <w:rFonts w:ascii="Arial" w:cs="Arial" w:eastAsia="Arial" w:hAnsi="Arial"/>
+          <w:color w:val="666666"/>
+          <w:sz w:val="14"/>
+          <w:szCs w:val="14"/>
+        </w:rPr>
+        <w:t xml:space="preserve"> (</w:t>
+      </w:r>
+      <w:hyperlink w:history="1" r:id="rIdpuep-xzo22xukmtauczsy">
+        <w:r>
+          <w:rPr>
+            <w:rFonts w:ascii="Arial" w:cs="Arial" w:eastAsia="Arial" w:hAnsi="Arial"/>
+            <w:color w:val="1F6B75"/>
+            <w:sz w:val="14"/>
+            <w:szCs w:val="14"/>
+            <w:u w:val="single" w:color="1F6B75"/>
+          </w:rPr>
+          <w:t xml:space="preserve">https://creativecommons.org/licenses/by-nc/4.0/</w:t>
+        </w:r>
+      </w:hyperlink>
+      <w:r>
+        <w:rPr>
+          <w:rFonts w:ascii="Arial" w:cs="Arial" w:eastAsia="Arial" w:hAnsi="Arial"/>
+          <w:color w:val="666666"/>
+          <w:sz w:val="14"/>
+          <w:szCs w:val="14"/>
+        </w:rPr>
+        <w:t xml:space="preserve">).</w:t>
+      </w:r>
+    </w:p>
     <w:p>
       <w:r>
         <w:br w:type="page"/>
@@ -15154,7 +15561,7 @@
             <w:pPr>
               <w:spacing w:after="20" w:before="0"/>
             </w:pPr>
-            <w:hyperlink w:history="1" r:id="rIdvhkqsgbrqwn7baxuitpct">
+            <w:hyperlink w:history="1" r:id="rIdzddubpygdiitl5wrae-wk">
               <w:r>
                 <w:rPr>
                   <w:rFonts w:ascii="Arial" w:cs="Arial" w:eastAsia="Arial" w:hAnsi="Arial"/>
@@ -15187,7 +15594,7 @@
               <w:spacing w:after="10" w:before="0"/>
               <w:ind w:left="120"/>
             </w:pPr>
-            <w:hyperlink w:history="1" r:id="rIdbgm-kduq5h4h8xexqkots">
+            <w:hyperlink w:history="1" r:id="rIdlbuds--7xgx3ucrvmimnb">
               <w:r>
                 <w:rPr>
                   <w:rFonts w:ascii="Arial" w:cs="Arial" w:eastAsia="Arial" w:hAnsi="Arial"/>
@@ -15232,7 +15639,7 @@
             <w:pPr>
               <w:spacing w:after="20" w:before="0"/>
             </w:pPr>
-            <w:hyperlink w:history="1" r:id="rIdtejyd9wkmjw8-ymso5ol8">
+            <w:hyperlink w:history="1" r:id="rIdqoyns7rmauee_zhzpxhxs">
               <w:r>
                 <w:rPr>
                   <w:rFonts w:ascii="Arial" w:cs="Arial" w:eastAsia="Arial" w:hAnsi="Arial"/>
@@ -15265,7 +15672,7 @@
               <w:spacing w:after="10" w:before="0"/>
               <w:ind w:left="120"/>
             </w:pPr>
-            <w:hyperlink w:history="1" r:id="rIdrlvb2draygxt7niyf01zi">
+            <w:hyperlink w:history="1" r:id="rId4l5v4zm79r0y7rdaglcrp">
               <w:r>
                 <w:rPr>
                   <w:rFonts w:ascii="Arial" w:cs="Arial" w:eastAsia="Arial" w:hAnsi="Arial"/>
@@ -15460,7 +15867,7 @@
             <w:pPr>
               <w:spacing w:after="20" w:before="0"/>
             </w:pPr>
-            <w:hyperlink w:history="1" r:id="rIdb6hbpra92f-cdk__bpecw">
+            <w:hyperlink w:history="1" r:id="rIdf0cuodwuj2hzivzxceswz">
               <w:r>
                 <w:rPr>
                   <w:rFonts w:ascii="Arial" w:cs="Arial" w:eastAsia="Arial" w:hAnsi="Arial"/>
@@ -15493,7 +15900,7 @@
               <w:spacing w:after="10" w:before="0"/>
               <w:ind w:left="120"/>
             </w:pPr>
-            <w:hyperlink w:history="1" r:id="rId0eyk2dubg4gjkaukutc8i">
+            <w:hyperlink w:history="1" r:id="rIdc-yphb0macf4w76omdc-l">
               <w:r>
                 <w:rPr>
                   <w:rFonts w:ascii="Arial" w:cs="Arial" w:eastAsia="Arial" w:hAnsi="Arial"/>
@@ -15538,7 +15945,7 @@
             <w:pPr>
               <w:spacing w:after="20" w:before="0"/>
             </w:pPr>
-            <w:hyperlink w:history="1" r:id="rIdnnhxf11r6xdcwjdawgjou">
+            <w:hyperlink w:history="1" r:id="rIdhbk8h1eq9gopa7qmecvgm">
               <w:r>
                 <w:rPr>
                   <w:rFonts w:ascii="Arial" w:cs="Arial" w:eastAsia="Arial" w:hAnsi="Arial"/>
@@ -15571,7 +15978,7 @@
               <w:spacing w:after="10" w:before="0"/>
               <w:ind w:left="120"/>
             </w:pPr>
-            <w:hyperlink w:history="1" r:id="rIdftsjar0hj384epsviic5-">
+            <w:hyperlink w:history="1" r:id="rIdyiix3qks7r4vxc9z96hj0">
               <w:r>
                 <w:rPr>
                   <w:rFonts w:ascii="Arial" w:cs="Arial" w:eastAsia="Arial" w:hAnsi="Arial"/>
@@ -15766,7 +16173,7 @@
             <w:pPr>
               <w:spacing w:after="20" w:before="0"/>
             </w:pPr>
-            <w:hyperlink w:history="1" r:id="rIdn-5qsfyvaiyfaiwpyyzmb">
+            <w:hyperlink w:history="1" r:id="rId2jyluslg64o1hp0pbf74m">
               <w:r>
                 <w:rPr>
                   <w:rFonts w:ascii="Arial" w:cs="Arial" w:eastAsia="Arial" w:hAnsi="Arial"/>
@@ -15799,7 +16206,7 @@
               <w:spacing w:after="10" w:before="0"/>
               <w:ind w:left="120"/>
             </w:pPr>
-            <w:hyperlink w:history="1" r:id="rId6fgjem1a6skvqrd3bk1do">
+            <w:hyperlink w:history="1" r:id="rIdxngvq1rh1pco1cejk2s0b">
               <w:r>
                 <w:rPr>
                   <w:rFonts w:ascii="Arial" w:cs="Arial" w:eastAsia="Arial" w:hAnsi="Arial"/>
@@ -15844,7 +16251,7 @@
             <w:pPr>
               <w:spacing w:after="20" w:before="0"/>
             </w:pPr>
-            <w:hyperlink w:history="1" r:id="rIdzgm2uq6fkerj6peu_mrza">
+            <w:hyperlink w:history="1" r:id="rIdu1w-qhkayyiyh-ovf4mgh">
               <w:r>
                 <w:rPr>
                   <w:rFonts w:ascii="Arial" w:cs="Arial" w:eastAsia="Arial" w:hAnsi="Arial"/>
@@ -15877,7 +16284,7 @@
               <w:spacing w:after="10" w:before="0"/>
               <w:ind w:left="120"/>
             </w:pPr>
-            <w:hyperlink w:history="1" r:id="rIdgju1uace6uulyu0jbvnt2">
+            <w:hyperlink w:history="1" r:id="rIdpvcwam_5f4kng5263sxav">
               <w:r>
                 <w:rPr>
                   <w:rFonts w:ascii="Arial" w:cs="Arial" w:eastAsia="Arial" w:hAnsi="Arial"/>
@@ -16072,7 +16479,7 @@
             <w:pPr>
               <w:spacing w:after="20" w:before="0"/>
             </w:pPr>
-            <w:hyperlink w:history="1" r:id="rId_md_wit9lj3p7ecysrgyu">
+            <w:hyperlink w:history="1" r:id="rIdwp4uuck18msejmyz0umg4">
               <w:r>
                 <w:rPr>
                   <w:rFonts w:ascii="Arial" w:cs="Arial" w:eastAsia="Arial" w:hAnsi="Arial"/>
@@ -16105,7 +16512,7 @@
               <w:spacing w:after="10" w:before="0"/>
               <w:ind w:left="120"/>
             </w:pPr>
-            <w:hyperlink w:history="1" r:id="rIdknbhtkqtpr9zy4npxpboq">
+            <w:hyperlink w:history="1" r:id="rIdu6vkhcnntwrrzzbuazt8a">
               <w:r>
                 <w:rPr>
                   <w:rFonts w:ascii="Arial" w:cs="Arial" w:eastAsia="Arial" w:hAnsi="Arial"/>
@@ -16150,7 +16557,7 @@
             <w:pPr>
               <w:spacing w:after="20" w:before="0"/>
             </w:pPr>
-            <w:hyperlink w:history="1" r:id="rIdwiadcxrzqapm-pxtplsdz">
+            <w:hyperlink w:history="1" r:id="rId113qwdfufusx2bcqqyjcx">
               <w:r>
                 <w:rPr>
                   <w:rFonts w:ascii="Arial" w:cs="Arial" w:eastAsia="Arial" w:hAnsi="Arial"/>
@@ -16183,7 +16590,7 @@
               <w:spacing w:after="10" w:before="0"/>
               <w:ind w:left="120"/>
             </w:pPr>
-            <w:hyperlink w:history="1" r:id="rIdic8kcvju5ubi8pralbjay">
+            <w:hyperlink w:history="1" r:id="rIdsntpyhy8bvcmg0eyfgoc0">
               <w:r>
                 <w:rPr>
                   <w:rFonts w:ascii="Arial" w:cs="Arial" w:eastAsia="Arial" w:hAnsi="Arial"/>
@@ -16378,7 +16785,7 @@
             <w:pPr>
               <w:spacing w:after="20" w:before="0"/>
             </w:pPr>
-            <w:hyperlink w:history="1" r:id="rId4t608y65pqd32ak-xube2">
+            <w:hyperlink w:history="1" r:id="rIdad17gwdi4pthpp3wtsq2z">
               <w:r>
                 <w:rPr>
                   <w:rFonts w:ascii="Arial" w:cs="Arial" w:eastAsia="Arial" w:hAnsi="Arial"/>
@@ -16411,7 +16818,7 @@
               <w:spacing w:after="10" w:before="0"/>
               <w:ind w:left="120"/>
             </w:pPr>
-            <w:hyperlink w:history="1" r:id="rIdzuhipabhu-oz2198-jvcg">
+            <w:hyperlink w:history="1" r:id="rIdiyvoprf6jeaxitv3_kgsv">
               <w:r>
                 <w:rPr>
                   <w:rFonts w:ascii="Arial" w:cs="Arial" w:eastAsia="Arial" w:hAnsi="Arial"/>
@@ -16456,7 +16863,7 @@
             <w:pPr>
               <w:spacing w:after="20" w:before="0"/>
             </w:pPr>
-            <w:hyperlink w:history="1" r:id="rIdlbso1n53t2qc_qoxl8ra6">
+            <w:hyperlink w:history="1" r:id="rIdkudmrwdb4aaxhvpzz-il4">
               <w:r>
                 <w:rPr>
                   <w:rFonts w:ascii="Arial" w:cs="Arial" w:eastAsia="Arial" w:hAnsi="Arial"/>
@@ -16489,7 +16896,7 @@
               <w:spacing w:after="10" w:before="0"/>
               <w:ind w:left="120"/>
             </w:pPr>
-            <w:hyperlink w:history="1" r:id="rIdox-6xgiu5dkl__ajhmqzy">
+            <w:hyperlink w:history="1" r:id="rIdegoujnybovq9mvliqnyuw">
               <w:r>
                 <w:rPr>
                   <w:rFonts w:ascii="Arial" w:cs="Arial" w:eastAsia="Arial" w:hAnsi="Arial"/>
@@ -16985,6 +17392,65 @@
         </w:tc>
       </w:tr>
     </w:tbl>
+    <w:p>
+      <w:pPr>
+        <w:pBdr>
+          <w:top w:val="single" w:color="BBBBBB" w:sz="4" w:space="4"/>
+        </w:pBdr>
+        <w:spacing w:after="0" w:before="160"/>
+      </w:pPr>
+      <w:r>
+        <w:rPr>
+          <w:rFonts w:ascii="Arial" w:cs="Arial" w:eastAsia="Arial" w:hAnsi="Arial"/>
+          <w:color w:val="666666"/>
+          <w:sz w:val="14"/>
+          <w:szCs w:val="14"/>
+        </w:rPr>
+        <w:t xml:space="preserve">© 2026 SeaVuria and ARES. Aligned with KICD objectives. Developed by SeaVuria; technical implementation by ARES (with AI assistance from Claude). Licensed under </w:t>
+      </w:r>
+      <w:hyperlink w:history="1" r:id="rIdftqfcxi6vfx3snaa7c8l4">
+        <w:r>
+          <w:rPr>
+            <w:rFonts w:ascii="Arial" w:cs="Arial" w:eastAsia="Arial" w:hAnsi="Arial"/>
+            <w:color w:val="1F6B75"/>
+            <w:sz w:val="14"/>
+            <w:szCs w:val="14"/>
+            <w:u w:val="single" w:color="1F6B75"/>
+          </w:rPr>
+          <w:t xml:space="preserve">CC BY-NC 4.0</w:t>
+        </w:r>
+      </w:hyperlink>
+      <w:r>
+        <w:rPr>
+          <w:rFonts w:ascii="Arial" w:cs="Arial" w:eastAsia="Arial" w:hAnsi="Arial"/>
+          <w:color w:val="666666"/>
+          <w:sz w:val="14"/>
+          <w:szCs w:val="14"/>
+        </w:rPr>
+        <w:t xml:space="preserve"> (</w:t>
+      </w:r>
+      <w:hyperlink w:history="1" r:id="rId2mhkngyuky_t4y2rrigmn">
+        <w:r>
+          <w:rPr>
+            <w:rFonts w:ascii="Arial" w:cs="Arial" w:eastAsia="Arial" w:hAnsi="Arial"/>
+            <w:color w:val="1F6B75"/>
+            <w:sz w:val="14"/>
+            <w:szCs w:val="14"/>
+            <w:u w:val="single" w:color="1F6B75"/>
+          </w:rPr>
+          <w:t xml:space="preserve">https://creativecommons.org/licenses/by-nc/4.0/</w:t>
+        </w:r>
+      </w:hyperlink>
+      <w:r>
+        <w:rPr>
+          <w:rFonts w:ascii="Arial" w:cs="Arial" w:eastAsia="Arial" w:hAnsi="Arial"/>
+          <w:color w:val="666666"/>
+          <w:sz w:val="14"/>
+          <w:szCs w:val="14"/>
+        </w:rPr>
+        <w:t xml:space="preserve">).</w:t>
+      </w:r>
+    </w:p>
     <w:p>
       <w:r>
         <w:br w:type="page"/>
@@ -17976,7 +18442,7 @@
             <w:pPr>
               <w:spacing w:after="20" w:before="0"/>
             </w:pPr>
-            <w:hyperlink w:history="1" r:id="rIdu6zhctlfoum9wvfudcxyk">
+            <w:hyperlink w:history="1" r:id="rIdgjgu0prhr9p6dk3npkae3">
               <w:r>
                 <w:rPr>
                   <w:rFonts w:ascii="Arial" w:cs="Arial" w:eastAsia="Arial" w:hAnsi="Arial"/>
@@ -18009,7 +18475,7 @@
               <w:spacing w:after="10" w:before="0"/>
               <w:ind w:left="120"/>
             </w:pPr>
-            <w:hyperlink w:history="1" r:id="rIdo_fw1dxkxag6orsdznpnm">
+            <w:hyperlink w:history="1" r:id="rId0sohbitswudx7sq2br4-b">
               <w:r>
                 <w:rPr>
                   <w:rFonts w:ascii="Arial" w:cs="Arial" w:eastAsia="Arial" w:hAnsi="Arial"/>
@@ -18054,7 +18520,7 @@
             <w:pPr>
               <w:spacing w:after="20" w:before="0"/>
             </w:pPr>
-            <w:hyperlink w:history="1" r:id="rIdndhpblcmkq5jv-wlyr0r2">
+            <w:hyperlink w:history="1" r:id="rId2abdzbtkmcuzlp759gljq">
               <w:r>
                 <w:rPr>
                   <w:rFonts w:ascii="Arial" w:cs="Arial" w:eastAsia="Arial" w:hAnsi="Arial"/>
@@ -18087,7 +18553,7 @@
               <w:spacing w:after="10" w:before="0"/>
               <w:ind w:left="120"/>
             </w:pPr>
-            <w:hyperlink w:history="1" r:id="rId_sz46ni107b74e0g0f2nc">
+            <w:hyperlink w:history="1" r:id="rIdcoitkoyyxtsyxqzb4zq0e">
               <w:r>
                 <w:rPr>
                   <w:rFonts w:ascii="Arial" w:cs="Arial" w:eastAsia="Arial" w:hAnsi="Arial"/>
@@ -18282,7 +18748,7 @@
             <w:pPr>
               <w:spacing w:after="20" w:before="0"/>
             </w:pPr>
-            <w:hyperlink w:history="1" r:id="rIdjaxiwz3zncgxonrcafwsi">
+            <w:hyperlink w:history="1" r:id="rIdehimevt2mgpe_lo7sqzep">
               <w:r>
                 <w:rPr>
                   <w:rFonts w:ascii="Arial" w:cs="Arial" w:eastAsia="Arial" w:hAnsi="Arial"/>
@@ -18315,7 +18781,7 @@
               <w:spacing w:after="10" w:before="0"/>
               <w:ind w:left="120"/>
             </w:pPr>
-            <w:hyperlink w:history="1" r:id="rIdham_9oll15546wekrufyq">
+            <w:hyperlink w:history="1" r:id="rId5nnzjva5klubuiaxggy8m">
               <w:r>
                 <w:rPr>
                   <w:rFonts w:ascii="Arial" w:cs="Arial" w:eastAsia="Arial" w:hAnsi="Arial"/>
@@ -18360,7 +18826,7 @@
             <w:pPr>
               <w:spacing w:after="20" w:before="0"/>
             </w:pPr>
-            <w:hyperlink w:history="1" r:id="rIdmohzzqcdbq1j1kvoqigh5">
+            <w:hyperlink w:history="1" r:id="rIdoe_25cl0g2n-wu6jzlgt3">
               <w:r>
                 <w:rPr>
                   <w:rFonts w:ascii="Arial" w:cs="Arial" w:eastAsia="Arial" w:hAnsi="Arial"/>
@@ -18393,7 +18859,7 @@
               <w:spacing w:after="10" w:before="0"/>
               <w:ind w:left="120"/>
             </w:pPr>
-            <w:hyperlink w:history="1" r:id="rIdmnkono6gho92umytl-gqz">
+            <w:hyperlink w:history="1" r:id="rId4ob6qm_vq1ybgead5z0ew">
               <w:r>
                 <w:rPr>
                   <w:rFonts w:ascii="Arial" w:cs="Arial" w:eastAsia="Arial" w:hAnsi="Arial"/>
@@ -18588,7 +19054,7 @@
             <w:pPr>
               <w:spacing w:after="20" w:before="0"/>
             </w:pPr>
-            <w:hyperlink w:history="1" r:id="rIdqcw7ao6zt_a7jngcezula">
+            <w:hyperlink w:history="1" r:id="rIdvxwv9gicdbf9ljkdegnz7">
               <w:r>
                 <w:rPr>
                   <w:rFonts w:ascii="Arial" w:cs="Arial" w:eastAsia="Arial" w:hAnsi="Arial"/>
@@ -18621,7 +19087,7 @@
               <w:spacing w:after="10" w:before="0"/>
               <w:ind w:left="120"/>
             </w:pPr>
-            <w:hyperlink w:history="1" r:id="rIdtcered6f4mgr2fyzqdbmt">
+            <w:hyperlink w:history="1" r:id="rId_7dm_vijibhkqxvulx_9r">
               <w:r>
                 <w:rPr>
                   <w:rFonts w:ascii="Arial" w:cs="Arial" w:eastAsia="Arial" w:hAnsi="Arial"/>
@@ -18666,7 +19132,7 @@
             <w:pPr>
               <w:spacing w:after="20" w:before="0"/>
             </w:pPr>
-            <w:hyperlink w:history="1" r:id="rIdl6qag6yxnsczklelajqno">
+            <w:hyperlink w:history="1" r:id="rIdlzbxzuxz4ojlc5zaqzvjw">
               <w:r>
                 <w:rPr>
                   <w:rFonts w:ascii="Arial" w:cs="Arial" w:eastAsia="Arial" w:hAnsi="Arial"/>
@@ -18699,7 +19165,7 @@
               <w:spacing w:after="10" w:before="0"/>
               <w:ind w:left="120"/>
             </w:pPr>
-            <w:hyperlink w:history="1" r:id="rIdteefoekydz1g7b6feootm">
+            <w:hyperlink w:history="1" r:id="rIdhmgytketkoxgytbgup9yk">
               <w:r>
                 <w:rPr>
                   <w:rFonts w:ascii="Arial" w:cs="Arial" w:eastAsia="Arial" w:hAnsi="Arial"/>
@@ -18894,7 +19360,7 @@
             <w:pPr>
               <w:spacing w:after="20" w:before="0"/>
             </w:pPr>
-            <w:hyperlink w:history="1" r:id="rId-saiy2rwrvmj9wfq2n2w_">
+            <w:hyperlink w:history="1" r:id="rIdlr_pwjraxnqqlov0ahex1">
               <w:r>
                 <w:rPr>
                   <w:rFonts w:ascii="Arial" w:cs="Arial" w:eastAsia="Arial" w:hAnsi="Arial"/>
@@ -18927,7 +19393,7 @@
               <w:spacing w:after="10" w:before="0"/>
               <w:ind w:left="120"/>
             </w:pPr>
-            <w:hyperlink w:history="1" r:id="rIdoy2o99-r_15u6anyc_wis">
+            <w:hyperlink w:history="1" r:id="rIdrzts009nc8nuquz_tmora">
               <w:r>
                 <w:rPr>
                   <w:rFonts w:ascii="Arial" w:cs="Arial" w:eastAsia="Arial" w:hAnsi="Arial"/>
@@ -18972,7 +19438,7 @@
             <w:pPr>
               <w:spacing w:after="20" w:before="0"/>
             </w:pPr>
-            <w:hyperlink w:history="1" r:id="rIdum0q1stqpnqaalqii7w78">
+            <w:hyperlink w:history="1" r:id="rId3r7l3ojgabzlgpc1c54hl">
               <w:r>
                 <w:rPr>
                   <w:rFonts w:ascii="Arial" w:cs="Arial" w:eastAsia="Arial" w:hAnsi="Arial"/>
@@ -19005,7 +19471,7 @@
               <w:spacing w:after="10" w:before="0"/>
               <w:ind w:left="120"/>
             </w:pPr>
-            <w:hyperlink w:history="1" r:id="rId6bz2se_wnj5xrdu8_dmtn">
+            <w:hyperlink w:history="1" r:id="rIdmpolyvibaysgynjc9gef4">
               <w:r>
                 <w:rPr>
                   <w:rFonts w:ascii="Arial" w:cs="Arial" w:eastAsia="Arial" w:hAnsi="Arial"/>
@@ -19200,7 +19666,7 @@
             <w:pPr>
               <w:spacing w:after="20" w:before="0"/>
             </w:pPr>
-            <w:hyperlink w:history="1" r:id="rIdplj-jznm5vjofhhe72gfo">
+            <w:hyperlink w:history="1" r:id="rIdly-fxabysiuypsylidqin">
               <w:r>
                 <w:rPr>
                   <w:rFonts w:ascii="Arial" w:cs="Arial" w:eastAsia="Arial" w:hAnsi="Arial"/>
@@ -19233,7 +19699,7 @@
               <w:spacing w:after="10" w:before="0"/>
               <w:ind w:left="120"/>
             </w:pPr>
-            <w:hyperlink w:history="1" r:id="rId_70lmrdgtexyng8cw9kwu">
+            <w:hyperlink w:history="1" r:id="rIdjvwxpjsgbtjsoiafm06an">
               <w:r>
                 <w:rPr>
                   <w:rFonts w:ascii="Arial" w:cs="Arial" w:eastAsia="Arial" w:hAnsi="Arial"/>
@@ -19278,7 +19744,7 @@
             <w:pPr>
               <w:spacing w:after="20" w:before="0"/>
             </w:pPr>
-            <w:hyperlink w:history="1" r:id="rIdmpwnd34thlfp0j8xyiwcn">
+            <w:hyperlink w:history="1" r:id="rIdtyx46o_h3aadm0ckleug-">
               <w:r>
                 <w:rPr>
                   <w:rFonts w:ascii="Arial" w:cs="Arial" w:eastAsia="Arial" w:hAnsi="Arial"/>
@@ -19311,7 +19777,7 @@
               <w:spacing w:after="10" w:before="0"/>
               <w:ind w:left="120"/>
             </w:pPr>
-            <w:hyperlink w:history="1" r:id="rIdppirpacj8ryrdsg4nyjzw">
+            <w:hyperlink w:history="1" r:id="rIdg4q-s2ianmqwp6suaupev">
               <w:r>
                 <w:rPr>
                   <w:rFonts w:ascii="Arial" w:cs="Arial" w:eastAsia="Arial" w:hAnsi="Arial"/>
@@ -19902,6 +20368,65 @@
         </w:tc>
       </w:tr>
     </w:tbl>
+    <w:p>
+      <w:pPr>
+        <w:pBdr>
+          <w:top w:val="single" w:color="BBBBBB" w:sz="4" w:space="4"/>
+        </w:pBdr>
+        <w:spacing w:after="0" w:before="160"/>
+      </w:pPr>
+      <w:r>
+        <w:rPr>
+          <w:rFonts w:ascii="Arial" w:cs="Arial" w:eastAsia="Arial" w:hAnsi="Arial"/>
+          <w:color w:val="666666"/>
+          <w:sz w:val="14"/>
+          <w:szCs w:val="14"/>
+        </w:rPr>
+        <w:t xml:space="preserve">© 2026 SeaVuria and ARES. Aligned with KICD objectives. Developed by SeaVuria; technical implementation by ARES (with AI assistance from Claude). Licensed under </w:t>
+      </w:r>
+      <w:hyperlink w:history="1" r:id="rId9zp7faysvlqncql4y-a5k">
+        <w:r>
+          <w:rPr>
+            <w:rFonts w:ascii="Arial" w:cs="Arial" w:eastAsia="Arial" w:hAnsi="Arial"/>
+            <w:color w:val="1F6B75"/>
+            <w:sz w:val="14"/>
+            <w:szCs w:val="14"/>
+            <w:u w:val="single" w:color="1F6B75"/>
+          </w:rPr>
+          <w:t xml:space="preserve">CC BY-NC 4.0</w:t>
+        </w:r>
+      </w:hyperlink>
+      <w:r>
+        <w:rPr>
+          <w:rFonts w:ascii="Arial" w:cs="Arial" w:eastAsia="Arial" w:hAnsi="Arial"/>
+          <w:color w:val="666666"/>
+          <w:sz w:val="14"/>
+          <w:szCs w:val="14"/>
+        </w:rPr>
+        <w:t xml:space="preserve"> (</w:t>
+      </w:r>
+      <w:hyperlink w:history="1" r:id="rIdvpf066xmvc49m-v5nsg2k">
+        <w:r>
+          <w:rPr>
+            <w:rFonts w:ascii="Arial" w:cs="Arial" w:eastAsia="Arial" w:hAnsi="Arial"/>
+            <w:color w:val="1F6B75"/>
+            <w:sz w:val="14"/>
+            <w:szCs w:val="14"/>
+            <w:u w:val="single" w:color="1F6B75"/>
+          </w:rPr>
+          <w:t xml:space="preserve">https://creativecommons.org/licenses/by-nc/4.0/</w:t>
+        </w:r>
+      </w:hyperlink>
+      <w:r>
+        <w:rPr>
+          <w:rFonts w:ascii="Arial" w:cs="Arial" w:eastAsia="Arial" w:hAnsi="Arial"/>
+          <w:color w:val="666666"/>
+          <w:sz w:val="14"/>
+          <w:szCs w:val="14"/>
+        </w:rPr>
+        <w:t xml:space="preserve">).</w:t>
+      </w:r>
+    </w:p>
     <w:p>
       <w:r>
         <w:br w:type="page"/>
@@ -20893,7 +21418,7 @@
             <w:pPr>
               <w:spacing w:after="20" w:before="0"/>
             </w:pPr>
-            <w:hyperlink w:history="1" r:id="rId0ammiz8hlyrqfmh-rev7d">
+            <w:hyperlink w:history="1" r:id="rIdoovm_mdy3ji8zzpb8pcj5">
               <w:r>
                 <w:rPr>
                   <w:rFonts w:ascii="Arial" w:cs="Arial" w:eastAsia="Arial" w:hAnsi="Arial"/>
@@ -20926,7 +21451,7 @@
               <w:spacing w:after="10" w:before="0"/>
               <w:ind w:left="120"/>
             </w:pPr>
-            <w:hyperlink w:history="1" r:id="rId9eymjhrphhnoraoohodfz">
+            <w:hyperlink w:history="1" r:id="rId5ban3djfrdwo60yc6apug">
               <w:r>
                 <w:rPr>
                   <w:rFonts w:ascii="Arial" w:cs="Arial" w:eastAsia="Arial" w:hAnsi="Arial"/>
@@ -20971,7 +21496,7 @@
             <w:pPr>
               <w:spacing w:after="20" w:before="0"/>
             </w:pPr>
-            <w:hyperlink w:history="1" r:id="rId9oaffhphbzi3j_fjvhd7o">
+            <w:hyperlink w:history="1" r:id="rIdx0avxsevbxmm79xfznmdn">
               <w:r>
                 <w:rPr>
                   <w:rFonts w:ascii="Arial" w:cs="Arial" w:eastAsia="Arial" w:hAnsi="Arial"/>
@@ -21004,7 +21529,7 @@
               <w:spacing w:after="10" w:before="0"/>
               <w:ind w:left="120"/>
             </w:pPr>
-            <w:hyperlink w:history="1" r:id="rIdhqiesbivt5mlw9admzdcx">
+            <w:hyperlink w:history="1" r:id="rIds5wnwweep_mkggu0rnt4w">
               <w:r>
                 <w:rPr>
                   <w:rFonts w:ascii="Arial" w:cs="Arial" w:eastAsia="Arial" w:hAnsi="Arial"/>
@@ -21199,7 +21724,7 @@
             <w:pPr>
               <w:spacing w:after="20" w:before="0"/>
             </w:pPr>
-            <w:hyperlink w:history="1" r:id="rIdwvp_qnhnyqiwm7xs7bkko">
+            <w:hyperlink w:history="1" r:id="rIdr57xufcsb9io7tukikgoz">
               <w:r>
                 <w:rPr>
                   <w:rFonts w:ascii="Arial" w:cs="Arial" w:eastAsia="Arial" w:hAnsi="Arial"/>
@@ -21232,7 +21757,7 @@
               <w:spacing w:after="10" w:before="0"/>
               <w:ind w:left="120"/>
             </w:pPr>
-            <w:hyperlink w:history="1" r:id="rId1tehqpa9aju0b8zzv2moo">
+            <w:hyperlink w:history="1" r:id="rIdffp6zxna0rrqpalbabbxx">
               <w:r>
                 <w:rPr>
                   <w:rFonts w:ascii="Arial" w:cs="Arial" w:eastAsia="Arial" w:hAnsi="Arial"/>
@@ -21277,7 +21802,7 @@
             <w:pPr>
               <w:spacing w:after="20" w:before="0"/>
             </w:pPr>
-            <w:hyperlink w:history="1" r:id="rIdpevb_equnl74nlzojiwro">
+            <w:hyperlink w:history="1" r:id="rIdv4qgcoligydwwceido_v2">
               <w:r>
                 <w:rPr>
                   <w:rFonts w:ascii="Arial" w:cs="Arial" w:eastAsia="Arial" w:hAnsi="Arial"/>
@@ -21310,7 +21835,7 @@
               <w:spacing w:after="10" w:before="0"/>
               <w:ind w:left="120"/>
             </w:pPr>
-            <w:hyperlink w:history="1" r:id="rIdp0dmf7pmputsjcoag49mo">
+            <w:hyperlink w:history="1" r:id="rId_-dmvxlyemmy5stxnrvnr">
               <w:r>
                 <w:rPr>
                   <w:rFonts w:ascii="Arial" w:cs="Arial" w:eastAsia="Arial" w:hAnsi="Arial"/>
@@ -21505,7 +22030,7 @@
             <w:pPr>
               <w:spacing w:after="20" w:before="0"/>
             </w:pPr>
-            <w:hyperlink w:history="1" r:id="rIdes47dyilkq8mxqlni_9dz">
+            <w:hyperlink w:history="1" r:id="rId0-aukw67nftsf_wssipw3">
               <w:r>
                 <w:rPr>
                   <w:rFonts w:ascii="Arial" w:cs="Arial" w:eastAsia="Arial" w:hAnsi="Arial"/>
@@ -21538,7 +22063,7 @@
               <w:spacing w:after="10" w:before="0"/>
               <w:ind w:left="120"/>
             </w:pPr>
-            <w:hyperlink w:history="1" r:id="rIdlu2afdwf2endq4n9sugmi">
+            <w:hyperlink w:history="1" r:id="rId3h1yy9shvn6bmkm2a-73v">
               <w:r>
                 <w:rPr>
                   <w:rFonts w:ascii="Arial" w:cs="Arial" w:eastAsia="Arial" w:hAnsi="Arial"/>
@@ -21583,7 +22108,7 @@
             <w:pPr>
               <w:spacing w:after="20" w:before="0"/>
             </w:pPr>
-            <w:hyperlink w:history="1" r:id="rIdxulwsii_glfban746cluc">
+            <w:hyperlink w:history="1" r:id="rIdcvqapwxaboqwwb6sqbz8n">
               <w:r>
                 <w:rPr>
                   <w:rFonts w:ascii="Arial" w:cs="Arial" w:eastAsia="Arial" w:hAnsi="Arial"/>
@@ -21616,7 +22141,7 @@
               <w:spacing w:after="10" w:before="0"/>
               <w:ind w:left="120"/>
             </w:pPr>
-            <w:hyperlink w:history="1" r:id="rIddgqe8w9jyocx11rlgtj07">
+            <w:hyperlink w:history="1" r:id="rIdh1-xntignkxqanimrs9ik">
               <w:r>
                 <w:rPr>
                   <w:rFonts w:ascii="Arial" w:cs="Arial" w:eastAsia="Arial" w:hAnsi="Arial"/>
@@ -21811,7 +22336,7 @@
             <w:pPr>
               <w:spacing w:after="20" w:before="0"/>
             </w:pPr>
-            <w:hyperlink w:history="1" r:id="rIdtbkfr_4m68tdjl9ysymua">
+            <w:hyperlink w:history="1" r:id="rIdnzj6w2zkkhgukcxnfdrbp">
               <w:r>
                 <w:rPr>
                   <w:rFonts w:ascii="Arial" w:cs="Arial" w:eastAsia="Arial" w:hAnsi="Arial"/>
@@ -21844,7 +22369,7 @@
               <w:spacing w:after="10" w:before="0"/>
               <w:ind w:left="120"/>
             </w:pPr>
-            <w:hyperlink w:history="1" r:id="rId4qmvrrcttfdrnmphgrw50">
+            <w:hyperlink w:history="1" r:id="rIdxz7kcvqrinwtzzbrizdm5">
               <w:r>
                 <w:rPr>
                   <w:rFonts w:ascii="Arial" w:cs="Arial" w:eastAsia="Arial" w:hAnsi="Arial"/>
@@ -21889,7 +22414,7 @@
             <w:pPr>
               <w:spacing w:after="20" w:before="0"/>
             </w:pPr>
-            <w:hyperlink w:history="1" r:id="rIdt-gz2czokl0v-yyhrnb78">
+            <w:hyperlink w:history="1" r:id="rIdgnxkbmpk2irdbfwwkdeus">
               <w:r>
                 <w:rPr>
                   <w:rFonts w:ascii="Arial" w:cs="Arial" w:eastAsia="Arial" w:hAnsi="Arial"/>
@@ -21922,7 +22447,7 @@
               <w:spacing w:after="10" w:before="0"/>
               <w:ind w:left="120"/>
             </w:pPr>
-            <w:hyperlink w:history="1" r:id="rIdtrlkz5dkdgyf75pg0vyoo">
+            <w:hyperlink w:history="1" r:id="rIdtt2nc0pf3wgthqwbu3gin">
               <w:r>
                 <w:rPr>
                   <w:rFonts w:ascii="Arial" w:cs="Arial" w:eastAsia="Arial" w:hAnsi="Arial"/>
@@ -22117,7 +22642,7 @@
             <w:pPr>
               <w:spacing w:after="20" w:before="0"/>
             </w:pPr>
-            <w:hyperlink w:history="1" r:id="rId0db2lbllkgytu28pz6s96">
+            <w:hyperlink w:history="1" r:id="rId-p5kgczjwsm7esdcndu0c">
               <w:r>
                 <w:rPr>
                   <w:rFonts w:ascii="Arial" w:cs="Arial" w:eastAsia="Arial" w:hAnsi="Arial"/>
@@ -22150,7 +22675,7 @@
               <w:spacing w:after="10" w:before="0"/>
               <w:ind w:left="120"/>
             </w:pPr>
-            <w:hyperlink w:history="1" r:id="rIdxhnriitv4oo_22h7islbg">
+            <w:hyperlink w:history="1" r:id="rIdzsnudqhkck-_gq88bgeup">
               <w:r>
                 <w:rPr>
                   <w:rFonts w:ascii="Arial" w:cs="Arial" w:eastAsia="Arial" w:hAnsi="Arial"/>
@@ -22195,7 +22720,7 @@
             <w:pPr>
               <w:spacing w:after="20" w:before="0"/>
             </w:pPr>
-            <w:hyperlink w:history="1" r:id="rIdgzlccegdprj4utcbl5ulf">
+            <w:hyperlink w:history="1" r:id="rIdhwlgf5rwhh8zm0rjhrrdu">
               <w:r>
                 <w:rPr>
                   <w:rFonts w:ascii="Arial" w:cs="Arial" w:eastAsia="Arial" w:hAnsi="Arial"/>
@@ -22228,7 +22753,7 @@
               <w:spacing w:after="10" w:before="0"/>
               <w:ind w:left="120"/>
             </w:pPr>
-            <w:hyperlink w:history="1" r:id="rId6cmtayirg__hew0yyazos">
+            <w:hyperlink w:history="1" r:id="rIdaaunnuc-s2y2qct4-jckv">
               <w:r>
                 <w:rPr>
                   <w:rFonts w:ascii="Arial" w:cs="Arial" w:eastAsia="Arial" w:hAnsi="Arial"/>
@@ -22838,6 +23363,65 @@
         </w:tc>
       </w:tr>
     </w:tbl>
+    <w:p>
+      <w:pPr>
+        <w:pBdr>
+          <w:top w:val="single" w:color="BBBBBB" w:sz="4" w:space="4"/>
+        </w:pBdr>
+        <w:spacing w:after="0" w:before="160"/>
+      </w:pPr>
+      <w:r>
+        <w:rPr>
+          <w:rFonts w:ascii="Arial" w:cs="Arial" w:eastAsia="Arial" w:hAnsi="Arial"/>
+          <w:color w:val="666666"/>
+          <w:sz w:val="14"/>
+          <w:szCs w:val="14"/>
+        </w:rPr>
+        <w:t xml:space="preserve">© 2026 SeaVuria and ARES. Aligned with KICD objectives. Developed by SeaVuria; technical implementation by ARES (with AI assistance from Claude). Licensed under </w:t>
+      </w:r>
+      <w:hyperlink w:history="1" r:id="rId7glssrov_manxmk2p2ann">
+        <w:r>
+          <w:rPr>
+            <w:rFonts w:ascii="Arial" w:cs="Arial" w:eastAsia="Arial" w:hAnsi="Arial"/>
+            <w:color w:val="1F6B75"/>
+            <w:sz w:val="14"/>
+            <w:szCs w:val="14"/>
+            <w:u w:val="single" w:color="1F6B75"/>
+          </w:rPr>
+          <w:t xml:space="preserve">CC BY-NC 4.0</w:t>
+        </w:r>
+      </w:hyperlink>
+      <w:r>
+        <w:rPr>
+          <w:rFonts w:ascii="Arial" w:cs="Arial" w:eastAsia="Arial" w:hAnsi="Arial"/>
+          <w:color w:val="666666"/>
+          <w:sz w:val="14"/>
+          <w:szCs w:val="14"/>
+        </w:rPr>
+        <w:t xml:space="preserve"> (</w:t>
+      </w:r>
+      <w:hyperlink w:history="1" r:id="rId1vl-9pl1g7izohovb2pvf">
+        <w:r>
+          <w:rPr>
+            <w:rFonts w:ascii="Arial" w:cs="Arial" w:eastAsia="Arial" w:hAnsi="Arial"/>
+            <w:color w:val="1F6B75"/>
+            <w:sz w:val="14"/>
+            <w:szCs w:val="14"/>
+            <w:u w:val="single" w:color="1F6B75"/>
+          </w:rPr>
+          <w:t xml:space="preserve">https://creativecommons.org/licenses/by-nc/4.0/</w:t>
+        </w:r>
+      </w:hyperlink>
+      <w:r>
+        <w:rPr>
+          <w:rFonts w:ascii="Arial" w:cs="Arial" w:eastAsia="Arial" w:hAnsi="Arial"/>
+          <w:color w:val="666666"/>
+          <w:sz w:val="14"/>
+          <w:szCs w:val="14"/>
+        </w:rPr>
+        <w:t xml:space="preserve">).</w:t>
+      </w:r>
+    </w:p>
     <w:p>
       <w:r>
         <w:br w:type="page"/>
@@ -23829,7 +24413,7 @@
             <w:pPr>
               <w:spacing w:after="20" w:before="0"/>
             </w:pPr>
-            <w:hyperlink w:history="1" r:id="rIddgd67nmoosjz3vtfucjgv">
+            <w:hyperlink w:history="1" r:id="rId8t8mrs2guzaiskm61dpk5">
               <w:r>
                 <w:rPr>
                   <w:rFonts w:ascii="Arial" w:cs="Arial" w:eastAsia="Arial" w:hAnsi="Arial"/>
@@ -23862,7 +24446,7 @@
               <w:spacing w:after="10" w:before="0"/>
               <w:ind w:left="120"/>
             </w:pPr>
-            <w:hyperlink w:history="1" r:id="rIdoluzmgrmob8piy3chk5cg">
+            <w:hyperlink w:history="1" r:id="rIds1dippkvwzqjf3rrvgndc">
               <w:r>
                 <w:rPr>
                   <w:rFonts w:ascii="Arial" w:cs="Arial" w:eastAsia="Arial" w:hAnsi="Arial"/>
@@ -23907,7 +24491,7 @@
             <w:pPr>
               <w:spacing w:after="20" w:before="0"/>
             </w:pPr>
-            <w:hyperlink w:history="1" r:id="rIdjzbomkwfai8qpi2ibhxgm">
+            <w:hyperlink w:history="1" r:id="rId6m8b-fnqyqhf7_rue655y">
               <w:r>
                 <w:rPr>
                   <w:rFonts w:ascii="Arial" w:cs="Arial" w:eastAsia="Arial" w:hAnsi="Arial"/>
@@ -23940,7 +24524,7 @@
               <w:spacing w:after="10" w:before="0"/>
               <w:ind w:left="120"/>
             </w:pPr>
-            <w:hyperlink w:history="1" r:id="rIdtwaxpjii4wbdh3oz0vbal">
+            <w:hyperlink w:history="1" r:id="rIdtbnxoi3cufugamxrnqggy">
               <w:r>
                 <w:rPr>
                   <w:rFonts w:ascii="Arial" w:cs="Arial" w:eastAsia="Arial" w:hAnsi="Arial"/>
@@ -24135,7 +24719,7 @@
             <w:pPr>
               <w:spacing w:after="20" w:before="0"/>
             </w:pPr>
-            <w:hyperlink w:history="1" r:id="rId82uizjnqaoj0yqhtoq94t">
+            <w:hyperlink w:history="1" r:id="rIdtm1gydjfxy9dy1xmsgtvc">
               <w:r>
                 <w:rPr>
                   <w:rFonts w:ascii="Arial" w:cs="Arial" w:eastAsia="Arial" w:hAnsi="Arial"/>
@@ -24168,7 +24752,7 @@
               <w:spacing w:after="10" w:before="0"/>
               <w:ind w:left="120"/>
             </w:pPr>
-            <w:hyperlink w:history="1" r:id="rIdz4lvjva-dzm2u0dgxvjdb">
+            <w:hyperlink w:history="1" r:id="rIdpqx0hxuwl7kgtwvsnofjz">
               <w:r>
                 <w:rPr>
                   <w:rFonts w:ascii="Arial" w:cs="Arial" w:eastAsia="Arial" w:hAnsi="Arial"/>
@@ -24213,7 +24797,7 @@
             <w:pPr>
               <w:spacing w:after="20" w:before="0"/>
             </w:pPr>
-            <w:hyperlink w:history="1" r:id="rIdaiwatprz0ehtzpbpnacea">
+            <w:hyperlink w:history="1" r:id="rIdecyhohxcw7jw5or3yidtl">
               <w:r>
                 <w:rPr>
                   <w:rFonts w:ascii="Arial" w:cs="Arial" w:eastAsia="Arial" w:hAnsi="Arial"/>
@@ -24246,7 +24830,7 @@
               <w:spacing w:after="10" w:before="0"/>
               <w:ind w:left="120"/>
             </w:pPr>
-            <w:hyperlink w:history="1" r:id="rIdm7txvuqulm42jogzy4yag">
+            <w:hyperlink w:history="1" r:id="rIdvbbtxjqbue_uxs--eryjw">
               <w:r>
                 <w:rPr>
                   <w:rFonts w:ascii="Arial" w:cs="Arial" w:eastAsia="Arial" w:hAnsi="Arial"/>
@@ -24441,7 +25025,7 @@
             <w:pPr>
               <w:spacing w:after="20" w:before="0"/>
             </w:pPr>
-            <w:hyperlink w:history="1" r:id="rId6npvvir-8njjsmw_4gifz">
+            <w:hyperlink w:history="1" r:id="rIdm_nwn6yrcgmjr1_94dfsq">
               <w:r>
                 <w:rPr>
                   <w:rFonts w:ascii="Arial" w:cs="Arial" w:eastAsia="Arial" w:hAnsi="Arial"/>
@@ -24474,7 +25058,7 @@
               <w:spacing w:after="10" w:before="0"/>
               <w:ind w:left="120"/>
             </w:pPr>
-            <w:hyperlink w:history="1" r:id="rIdw2tsuzbrphphjx1v5pkv1">
+            <w:hyperlink w:history="1" r:id="rIdejot9-o0e3yqw9pc7pfu_">
               <w:r>
                 <w:rPr>
                   <w:rFonts w:ascii="Arial" w:cs="Arial" w:eastAsia="Arial" w:hAnsi="Arial"/>
@@ -24519,7 +25103,7 @@
             <w:pPr>
               <w:spacing w:after="20" w:before="0"/>
             </w:pPr>
-            <w:hyperlink w:history="1" r:id="rIdcargofzju7wueca4nm0gr">
+            <w:hyperlink w:history="1" r:id="rIdclw3_hdl9q8zffzy8k6e3">
               <w:r>
                 <w:rPr>
                   <w:rFonts w:ascii="Arial" w:cs="Arial" w:eastAsia="Arial" w:hAnsi="Arial"/>
@@ -24552,7 +25136,7 @@
               <w:spacing w:after="10" w:before="0"/>
               <w:ind w:left="120"/>
             </w:pPr>
-            <w:hyperlink w:history="1" r:id="rIdbv5bdxpuqtwrt-hvxpsin">
+            <w:hyperlink w:history="1" r:id="rIdabqspkeqcdczadhc0i7xt">
               <w:r>
                 <w:rPr>
                   <w:rFonts w:ascii="Arial" w:cs="Arial" w:eastAsia="Arial" w:hAnsi="Arial"/>
@@ -24747,7 +25331,7 @@
             <w:pPr>
               <w:spacing w:after="20" w:before="0"/>
             </w:pPr>
-            <w:hyperlink w:history="1" r:id="rIdml-scdi1otlpmqvmbw2d6">
+            <w:hyperlink w:history="1" r:id="rIdxsufywd3qm5lnpdf6rzc-">
               <w:r>
                 <w:rPr>
                   <w:rFonts w:ascii="Arial" w:cs="Arial" w:eastAsia="Arial" w:hAnsi="Arial"/>
@@ -24780,7 +25364,7 @@
               <w:spacing w:after="10" w:before="0"/>
               <w:ind w:left="120"/>
             </w:pPr>
-            <w:hyperlink w:history="1" r:id="rId1qycp6jjuancg6dlubd-n">
+            <w:hyperlink w:history="1" r:id="rIdxqcyig9rkn7tvx7b-45l3">
               <w:r>
                 <w:rPr>
                   <w:rFonts w:ascii="Arial" w:cs="Arial" w:eastAsia="Arial" w:hAnsi="Arial"/>
@@ -24825,7 +25409,7 @@
             <w:pPr>
               <w:spacing w:after="20" w:before="0"/>
             </w:pPr>
-            <w:hyperlink w:history="1" r:id="rIdqlmuix3zy4gfns9fzdv4d">
+            <w:hyperlink w:history="1" r:id="rIdubs2u65urlfskt7hn8bs8">
               <w:r>
                 <w:rPr>
                   <w:rFonts w:ascii="Arial" w:cs="Arial" w:eastAsia="Arial" w:hAnsi="Arial"/>
@@ -24858,7 +25442,7 @@
               <w:spacing w:after="10" w:before="0"/>
               <w:ind w:left="120"/>
             </w:pPr>
-            <w:hyperlink w:history="1" r:id="rIddg2occlhyxdflt2qpijrp">
+            <w:hyperlink w:history="1" r:id="rIdrse0so0ark9nifyqof8wp">
               <w:r>
                 <w:rPr>
                   <w:rFonts w:ascii="Arial" w:cs="Arial" w:eastAsia="Arial" w:hAnsi="Arial"/>
@@ -25053,7 +25637,7 @@
             <w:pPr>
               <w:spacing w:after="20" w:before="0"/>
             </w:pPr>
-            <w:hyperlink w:history="1" r:id="rIdt5toc-rcblyknpia9038d">
+            <w:hyperlink w:history="1" r:id="rId-fxdq4nc9zvjq1vab_4c3">
               <w:r>
                 <w:rPr>
                   <w:rFonts w:ascii="Arial" w:cs="Arial" w:eastAsia="Arial" w:hAnsi="Arial"/>
@@ -25086,7 +25670,7 @@
               <w:spacing w:after="10" w:before="0"/>
               <w:ind w:left="120"/>
             </w:pPr>
-            <w:hyperlink w:history="1" r:id="rIdu3mhuzxzqamjh_qnzixwm">
+            <w:hyperlink w:history="1" r:id="rIddbpbicqg-tcbpxzcc13cf">
               <w:r>
                 <w:rPr>
                   <w:rFonts w:ascii="Arial" w:cs="Arial" w:eastAsia="Arial" w:hAnsi="Arial"/>
@@ -25131,7 +25715,7 @@
             <w:pPr>
               <w:spacing w:after="20" w:before="0"/>
             </w:pPr>
-            <w:hyperlink w:history="1" r:id="rId8imi4zqlstiw-fv-yqkde">
+            <w:hyperlink w:history="1" r:id="rIdabjbmizqvwpabn_wlnzmp">
               <w:r>
                 <w:rPr>
                   <w:rFonts w:ascii="Arial" w:cs="Arial" w:eastAsia="Arial" w:hAnsi="Arial"/>
@@ -25164,7 +25748,7 @@
               <w:spacing w:after="10" w:before="0"/>
               <w:ind w:left="120"/>
             </w:pPr>
-            <w:hyperlink w:history="1" r:id="rId94sfuamrwrfm5aqezop2x">
+            <w:hyperlink w:history="1" r:id="rIdc_dijfxzwfkipnuliuhk9">
               <w:r>
                 <w:rPr>
                   <w:rFonts w:ascii="Arial" w:cs="Arial" w:eastAsia="Arial" w:hAnsi="Arial"/>
@@ -25755,6 +26339,65 @@
         </w:tc>
       </w:tr>
     </w:tbl>
+    <w:p>
+      <w:pPr>
+        <w:pBdr>
+          <w:top w:val="single" w:color="BBBBBB" w:sz="4" w:space="4"/>
+        </w:pBdr>
+        <w:spacing w:after="0" w:before="160"/>
+      </w:pPr>
+      <w:r>
+        <w:rPr>
+          <w:rFonts w:ascii="Arial" w:cs="Arial" w:eastAsia="Arial" w:hAnsi="Arial"/>
+          <w:color w:val="666666"/>
+          <w:sz w:val="14"/>
+          <w:szCs w:val="14"/>
+        </w:rPr>
+        <w:t xml:space="preserve">© 2026 SeaVuria and ARES. Aligned with KICD objectives. Developed by SeaVuria; technical implementation by ARES (with AI assistance from Claude). Licensed under </w:t>
+      </w:r>
+      <w:hyperlink w:history="1" r:id="rIdymvbm4hlaq8ncx4wnmltd">
+        <w:r>
+          <w:rPr>
+            <w:rFonts w:ascii="Arial" w:cs="Arial" w:eastAsia="Arial" w:hAnsi="Arial"/>
+            <w:color w:val="1F6B75"/>
+            <w:sz w:val="14"/>
+            <w:szCs w:val="14"/>
+            <w:u w:val="single" w:color="1F6B75"/>
+          </w:rPr>
+          <w:t xml:space="preserve">CC BY-NC 4.0</w:t>
+        </w:r>
+      </w:hyperlink>
+      <w:r>
+        <w:rPr>
+          <w:rFonts w:ascii="Arial" w:cs="Arial" w:eastAsia="Arial" w:hAnsi="Arial"/>
+          <w:color w:val="666666"/>
+          <w:sz w:val="14"/>
+          <w:szCs w:val="14"/>
+        </w:rPr>
+        <w:t xml:space="preserve"> (</w:t>
+      </w:r>
+      <w:hyperlink w:history="1" r:id="rIdvxqqkb4jsemdpu2m3nqhu">
+        <w:r>
+          <w:rPr>
+            <w:rFonts w:ascii="Arial" w:cs="Arial" w:eastAsia="Arial" w:hAnsi="Arial"/>
+            <w:color w:val="1F6B75"/>
+            <w:sz w:val="14"/>
+            <w:szCs w:val="14"/>
+            <w:u w:val="single" w:color="1F6B75"/>
+          </w:rPr>
+          <w:t xml:space="preserve">https://creativecommons.org/licenses/by-nc/4.0/</w:t>
+        </w:r>
+      </w:hyperlink>
+      <w:r>
+        <w:rPr>
+          <w:rFonts w:ascii="Arial" w:cs="Arial" w:eastAsia="Arial" w:hAnsi="Arial"/>
+          <w:color w:val="666666"/>
+          <w:sz w:val="14"/>
+          <w:szCs w:val="14"/>
+        </w:rPr>
+        <w:t xml:space="preserve">).</w:t>
+      </w:r>
+    </w:p>
     <w:p>
       <w:r>
         <w:br w:type="page"/>
@@ -26746,7 +27389,7 @@
             <w:pPr>
               <w:spacing w:after="20" w:before="0"/>
             </w:pPr>
-            <w:hyperlink w:history="1" r:id="rIdcgbn5kwbzrb9bnyvsiypz">
+            <w:hyperlink w:history="1" r:id="rIdam3ltspv1k7shvcevogwx">
               <w:r>
                 <w:rPr>
                   <w:rFonts w:ascii="Arial" w:cs="Arial" w:eastAsia="Arial" w:hAnsi="Arial"/>
@@ -26779,7 +27422,7 @@
               <w:spacing w:after="10" w:before="0"/>
               <w:ind w:left="120"/>
             </w:pPr>
-            <w:hyperlink w:history="1" r:id="rId7sbdlazjlghtaxtprirmq">
+            <w:hyperlink w:history="1" r:id="rIdag4hb3cn7toqugllgd-bk">
               <w:r>
                 <w:rPr>
                   <w:rFonts w:ascii="Arial" w:cs="Arial" w:eastAsia="Arial" w:hAnsi="Arial"/>
@@ -26824,7 +27467,7 @@
             <w:pPr>
               <w:spacing w:after="20" w:before="0"/>
             </w:pPr>
-            <w:hyperlink w:history="1" r:id="rId_rycxjohx3wn1ahkgpjic">
+            <w:hyperlink w:history="1" r:id="rId-l_nsuwrglqunb6n1rou9">
               <w:r>
                 <w:rPr>
                   <w:rFonts w:ascii="Arial" w:cs="Arial" w:eastAsia="Arial" w:hAnsi="Arial"/>
@@ -26857,7 +27500,7 @@
               <w:spacing w:after="10" w:before="0"/>
               <w:ind w:left="120"/>
             </w:pPr>
-            <w:hyperlink w:history="1" r:id="rIdmcaadsv3m3iyurtqkfalx">
+            <w:hyperlink w:history="1" r:id="rId_tksbbf1di4esvbjj_ren">
               <w:r>
                 <w:rPr>
                   <w:rFonts w:ascii="Arial" w:cs="Arial" w:eastAsia="Arial" w:hAnsi="Arial"/>
@@ -27052,7 +27695,7 @@
             <w:pPr>
               <w:spacing w:after="20" w:before="0"/>
             </w:pPr>
-            <w:hyperlink w:history="1" r:id="rIdwakm_fj2uwaibqucuu4p7">
+            <w:hyperlink w:history="1" r:id="rIdpr1hsxtnxdtiaddtuse9h">
               <w:r>
                 <w:rPr>
                   <w:rFonts w:ascii="Arial" w:cs="Arial" w:eastAsia="Arial" w:hAnsi="Arial"/>
@@ -27085,7 +27728,7 @@
               <w:spacing w:after="10" w:before="0"/>
               <w:ind w:left="120"/>
             </w:pPr>
-            <w:hyperlink w:history="1" r:id="rIdyfcjegx8xc4_ko6bjzfjw">
+            <w:hyperlink w:history="1" r:id="rIdzngr4kx7bpi879kneod6c">
               <w:r>
                 <w:rPr>
                   <w:rFonts w:ascii="Arial" w:cs="Arial" w:eastAsia="Arial" w:hAnsi="Arial"/>
@@ -27130,7 +27773,7 @@
             <w:pPr>
               <w:spacing w:after="20" w:before="0"/>
             </w:pPr>
-            <w:hyperlink w:history="1" r:id="rIdvi7miwup9s3880idzbl0u">
+            <w:hyperlink w:history="1" r:id="rIdvsod7qt12o9gmayjbiryk">
               <w:r>
                 <w:rPr>
                   <w:rFonts w:ascii="Arial" w:cs="Arial" w:eastAsia="Arial" w:hAnsi="Arial"/>
@@ -27163,7 +27806,7 @@
               <w:spacing w:after="10" w:before="0"/>
               <w:ind w:left="120"/>
             </w:pPr>
-            <w:hyperlink w:history="1" r:id="rId505jwco13bvkttxzli33z">
+            <w:hyperlink w:history="1" r:id="rIdphhjm7ci3gx79dxyqfls_">
               <w:r>
                 <w:rPr>
                   <w:rFonts w:ascii="Arial" w:cs="Arial" w:eastAsia="Arial" w:hAnsi="Arial"/>
@@ -27358,7 +28001,7 @@
             <w:pPr>
               <w:spacing w:after="20" w:before="0"/>
             </w:pPr>
-            <w:hyperlink w:history="1" r:id="rIddu2adajb4gbzyumqor2vf">
+            <w:hyperlink w:history="1" r:id="rIdf5mjgmochcltn65zsvqnu">
               <w:r>
                 <w:rPr>
                   <w:rFonts w:ascii="Arial" w:cs="Arial" w:eastAsia="Arial" w:hAnsi="Arial"/>
@@ -27391,7 +28034,7 @@
               <w:spacing w:after="10" w:before="0"/>
               <w:ind w:left="120"/>
             </w:pPr>
-            <w:hyperlink w:history="1" r:id="rIdw5rbcngflugp-6m7ydiml">
+            <w:hyperlink w:history="1" r:id="rId4_lqptjhgl8vfmvk0oyol">
               <w:r>
                 <w:rPr>
                   <w:rFonts w:ascii="Arial" w:cs="Arial" w:eastAsia="Arial" w:hAnsi="Arial"/>
@@ -27436,7 +28079,7 @@
             <w:pPr>
               <w:spacing w:after="20" w:before="0"/>
             </w:pPr>
-            <w:hyperlink w:history="1" r:id="rIdmcpays_s9bpargibr0ld8">
+            <w:hyperlink w:history="1" r:id="rIdpjjrq5iqqpw1djq248qzh">
               <w:r>
                 <w:rPr>
                   <w:rFonts w:ascii="Arial" w:cs="Arial" w:eastAsia="Arial" w:hAnsi="Arial"/>
@@ -27469,7 +28112,7 @@
               <w:spacing w:after="10" w:before="0"/>
               <w:ind w:left="120"/>
             </w:pPr>
-            <w:hyperlink w:history="1" r:id="rId8kyqaiqlsrzx16lchkonj">
+            <w:hyperlink w:history="1" r:id="rIdseyw81o6fm5pawaucfcqx">
               <w:r>
                 <w:rPr>
                   <w:rFonts w:ascii="Arial" w:cs="Arial" w:eastAsia="Arial" w:hAnsi="Arial"/>
@@ -27664,7 +28307,7 @@
             <w:pPr>
               <w:spacing w:after="20" w:before="0"/>
             </w:pPr>
-            <w:hyperlink w:history="1" r:id="rIdsd8bv2qalzckabczwytwx">
+            <w:hyperlink w:history="1" r:id="rIdl4xtirjbcwijmgrzbnpdv">
               <w:r>
                 <w:rPr>
                   <w:rFonts w:ascii="Arial" w:cs="Arial" w:eastAsia="Arial" w:hAnsi="Arial"/>
@@ -27697,7 +28340,7 @@
               <w:spacing w:after="10" w:before="0"/>
               <w:ind w:left="120"/>
             </w:pPr>
-            <w:hyperlink w:history="1" r:id="rId3ejzkoroyz9ejlrohedd8">
+            <w:hyperlink w:history="1" r:id="rIdj2silevqq9qse5d-twcjx">
               <w:r>
                 <w:rPr>
                   <w:rFonts w:ascii="Arial" w:cs="Arial" w:eastAsia="Arial" w:hAnsi="Arial"/>
@@ -27742,7 +28385,7 @@
             <w:pPr>
               <w:spacing w:after="20" w:before="0"/>
             </w:pPr>
-            <w:hyperlink w:history="1" r:id="rIdswkjyg2px2ntrf7p9nuvy">
+            <w:hyperlink w:history="1" r:id="rIdmbiunizjoksevpdfihmtt">
               <w:r>
                 <w:rPr>
                   <w:rFonts w:ascii="Arial" w:cs="Arial" w:eastAsia="Arial" w:hAnsi="Arial"/>
@@ -27775,7 +28418,7 @@
               <w:spacing w:after="10" w:before="0"/>
               <w:ind w:left="120"/>
             </w:pPr>
-            <w:hyperlink w:history="1" r:id="rIduzf6ekoev15ggmg51-aoc">
+            <w:hyperlink w:history="1" r:id="rIdlfj_2e7x-mkk3cwvnsgd5">
               <w:r>
                 <w:rPr>
                   <w:rFonts w:ascii="Arial" w:cs="Arial" w:eastAsia="Arial" w:hAnsi="Arial"/>
@@ -27970,7 +28613,7 @@
             <w:pPr>
               <w:spacing w:after="20" w:before="0"/>
             </w:pPr>
-            <w:hyperlink w:history="1" r:id="rIdim7vvkedycbuzhwd297qn">
+            <w:hyperlink w:history="1" r:id="rIdet31ccwir96kwg70cvwiy">
               <w:r>
                 <w:rPr>
                   <w:rFonts w:ascii="Arial" w:cs="Arial" w:eastAsia="Arial" w:hAnsi="Arial"/>
@@ -28003,7 +28646,7 @@
               <w:spacing w:after="10" w:before="0"/>
               <w:ind w:left="120"/>
             </w:pPr>
-            <w:hyperlink w:history="1" r:id="rIder0zyzab09qnnacpeuz_t">
+            <w:hyperlink w:history="1" r:id="rIdzwqcqqnojfo-dyvuq2tsu">
               <w:r>
                 <w:rPr>
                   <w:rFonts w:ascii="Arial" w:cs="Arial" w:eastAsia="Arial" w:hAnsi="Arial"/>
@@ -28048,7 +28691,7 @@
             <w:pPr>
               <w:spacing w:after="20" w:before="0"/>
             </w:pPr>
-            <w:hyperlink w:history="1" r:id="rId2voa6jsldowhhr11xzrcd">
+            <w:hyperlink w:history="1" r:id="rIdvr9biuvo-nqtxeniakj2p">
               <w:r>
                 <w:rPr>
                   <w:rFonts w:ascii="Arial" w:cs="Arial" w:eastAsia="Arial" w:hAnsi="Arial"/>
@@ -28081,7 +28724,7 @@
               <w:spacing w:after="10" w:before="0"/>
               <w:ind w:left="120"/>
             </w:pPr>
-            <w:hyperlink w:history="1" r:id="rIdnwrnrq3hsmjlsaydnhury">
+            <w:hyperlink w:history="1" r:id="rIdqwtdnimc3g9gkwgksybo9">
               <w:r>
                 <w:rPr>
                   <w:rFonts w:ascii="Arial" w:cs="Arial" w:eastAsia="Arial" w:hAnsi="Arial"/>
@@ -28577,6 +29220,65 @@
         </w:tc>
       </w:tr>
     </w:tbl>
+    <w:p>
+      <w:pPr>
+        <w:pBdr>
+          <w:top w:val="single" w:color="BBBBBB" w:sz="4" w:space="4"/>
+        </w:pBdr>
+        <w:spacing w:after="0" w:before="160"/>
+      </w:pPr>
+      <w:r>
+        <w:rPr>
+          <w:rFonts w:ascii="Arial" w:cs="Arial" w:eastAsia="Arial" w:hAnsi="Arial"/>
+          <w:color w:val="666666"/>
+          <w:sz w:val="14"/>
+          <w:szCs w:val="14"/>
+        </w:rPr>
+        <w:t xml:space="preserve">© 2026 SeaVuria and ARES. Aligned with KICD objectives. Developed by SeaVuria; technical implementation by ARES (with AI assistance from Claude). Licensed under </w:t>
+      </w:r>
+      <w:hyperlink w:history="1" r:id="rIds2roa_082keqv9lkyslwm">
+        <w:r>
+          <w:rPr>
+            <w:rFonts w:ascii="Arial" w:cs="Arial" w:eastAsia="Arial" w:hAnsi="Arial"/>
+            <w:color w:val="1F6B75"/>
+            <w:sz w:val="14"/>
+            <w:szCs w:val="14"/>
+            <w:u w:val="single" w:color="1F6B75"/>
+          </w:rPr>
+          <w:t xml:space="preserve">CC BY-NC 4.0</w:t>
+        </w:r>
+      </w:hyperlink>
+      <w:r>
+        <w:rPr>
+          <w:rFonts w:ascii="Arial" w:cs="Arial" w:eastAsia="Arial" w:hAnsi="Arial"/>
+          <w:color w:val="666666"/>
+          <w:sz w:val="14"/>
+          <w:szCs w:val="14"/>
+        </w:rPr>
+        <w:t xml:space="preserve"> (</w:t>
+      </w:r>
+      <w:hyperlink w:history="1" r:id="rIdan8wrazy-j-fptesketvu">
+        <w:r>
+          <w:rPr>
+            <w:rFonts w:ascii="Arial" w:cs="Arial" w:eastAsia="Arial" w:hAnsi="Arial"/>
+            <w:color w:val="1F6B75"/>
+            <w:sz w:val="14"/>
+            <w:szCs w:val="14"/>
+            <w:u w:val="single" w:color="1F6B75"/>
+          </w:rPr>
+          <w:t xml:space="preserve">https://creativecommons.org/licenses/by-nc/4.0/</w:t>
+        </w:r>
+      </w:hyperlink>
+      <w:r>
+        <w:rPr>
+          <w:rFonts w:ascii="Arial" w:cs="Arial" w:eastAsia="Arial" w:hAnsi="Arial"/>
+          <w:color w:val="666666"/>
+          <w:sz w:val="14"/>
+          <w:szCs w:val="14"/>
+        </w:rPr>
+        <w:t xml:space="preserve">).</w:t>
+      </w:r>
+    </w:p>
     <w:p>
       <w:r>
         <w:br w:type="page"/>
@@ -29568,7 +30270,7 @@
             <w:pPr>
               <w:spacing w:after="20" w:before="0"/>
             </w:pPr>
-            <w:hyperlink w:history="1" r:id="rIdeoq_g9ikvbtcexlztutr9">
+            <w:hyperlink w:history="1" r:id="rId0kgdaoqs0yweyddull-01">
               <w:r>
                 <w:rPr>
                   <w:rFonts w:ascii="Arial" w:cs="Arial" w:eastAsia="Arial" w:hAnsi="Arial"/>
@@ -29601,7 +30303,7 @@
               <w:spacing w:after="10" w:before="0"/>
               <w:ind w:left="120"/>
             </w:pPr>
-            <w:hyperlink w:history="1" r:id="rIdypyzcitedaqhfwddchkcm">
+            <w:hyperlink w:history="1" r:id="rId6bvzbjn7socy6akhmk08l">
               <w:r>
                 <w:rPr>
                   <w:rFonts w:ascii="Arial" w:cs="Arial" w:eastAsia="Arial" w:hAnsi="Arial"/>
@@ -29646,7 +30348,7 @@
             <w:pPr>
               <w:spacing w:after="20" w:before="0"/>
             </w:pPr>
-            <w:hyperlink w:history="1" r:id="rIdnwelvyldbjl-s40zs4zry">
+            <w:hyperlink w:history="1" r:id="rIdb4eu8umhk0mfmchmg5rk3">
               <w:r>
                 <w:rPr>
                   <w:rFonts w:ascii="Arial" w:cs="Arial" w:eastAsia="Arial" w:hAnsi="Arial"/>
@@ -29679,7 +30381,7 @@
               <w:spacing w:after="10" w:before="0"/>
               <w:ind w:left="120"/>
             </w:pPr>
-            <w:hyperlink w:history="1" r:id="rIdfxisecoiwwvmbpdwms-_z">
+            <w:hyperlink w:history="1" r:id="rIdzbcjhzejwfm3-tryyfo9i">
               <w:r>
                 <w:rPr>
                   <w:rFonts w:ascii="Arial" w:cs="Arial" w:eastAsia="Arial" w:hAnsi="Arial"/>
@@ -29874,7 +30576,7 @@
             <w:pPr>
               <w:spacing w:after="20" w:before="0"/>
             </w:pPr>
-            <w:hyperlink w:history="1" r:id="rIddzci1kqm-zzyrnnd8nebg">
+            <w:hyperlink w:history="1" r:id="rIda4pfszojv113aopwx8kkf">
               <w:r>
                 <w:rPr>
                   <w:rFonts w:ascii="Arial" w:cs="Arial" w:eastAsia="Arial" w:hAnsi="Arial"/>
@@ -29907,7 +30609,7 @@
               <w:spacing w:after="10" w:before="0"/>
               <w:ind w:left="120"/>
             </w:pPr>
-            <w:hyperlink w:history="1" r:id="rIdkhjedqbqjhdwrschjvnlk">
+            <w:hyperlink w:history="1" r:id="rId1ei7usnerdkrapefscubq">
               <w:r>
                 <w:rPr>
                   <w:rFonts w:ascii="Arial" w:cs="Arial" w:eastAsia="Arial" w:hAnsi="Arial"/>
@@ -29952,7 +30654,7 @@
             <w:pPr>
               <w:spacing w:after="20" w:before="0"/>
             </w:pPr>
-            <w:hyperlink w:history="1" r:id="rIdpe2ehwbewetaxpkmve2tu">
+            <w:hyperlink w:history="1" r:id="rIdv6rp7vy9ojkzwajtwmm0n">
               <w:r>
                 <w:rPr>
                   <w:rFonts w:ascii="Arial" w:cs="Arial" w:eastAsia="Arial" w:hAnsi="Arial"/>
@@ -29985,7 +30687,7 @@
               <w:spacing w:after="10" w:before="0"/>
               <w:ind w:left="120"/>
             </w:pPr>
-            <w:hyperlink w:history="1" r:id="rIda1epjcqxx8cadqitkjqfv">
+            <w:hyperlink w:history="1" r:id="rIdrvjq3yrlvupgfcxvcv5vx">
               <w:r>
                 <w:rPr>
                   <w:rFonts w:ascii="Arial" w:cs="Arial" w:eastAsia="Arial" w:hAnsi="Arial"/>
@@ -30180,7 +30882,7 @@
             <w:pPr>
               <w:spacing w:after="20" w:before="0"/>
             </w:pPr>
-            <w:hyperlink w:history="1" r:id="rId4zqrswhvlivzoxxijk1dv">
+            <w:hyperlink w:history="1" r:id="rIdqn_wqnl5i3joe4fm2rrpq">
               <w:r>
                 <w:rPr>
                   <w:rFonts w:ascii="Arial" w:cs="Arial" w:eastAsia="Arial" w:hAnsi="Arial"/>
@@ -30213,7 +30915,7 @@
               <w:spacing w:after="10" w:before="0"/>
               <w:ind w:left="120"/>
             </w:pPr>
-            <w:hyperlink w:history="1" r:id="rIdlwob6wuxp_pybhednhd6s">
+            <w:hyperlink w:history="1" r:id="rIdj6npkcp2tvelg6_j-gcet">
               <w:r>
                 <w:rPr>
                   <w:rFonts w:ascii="Arial" w:cs="Arial" w:eastAsia="Arial" w:hAnsi="Arial"/>
@@ -30258,7 +30960,7 @@
             <w:pPr>
               <w:spacing w:after="20" w:before="0"/>
             </w:pPr>
-            <w:hyperlink w:history="1" r:id="rIdp4khty2spvyp3vvtid0i8">
+            <w:hyperlink w:history="1" r:id="rIdimidi89qpiefvprqu2ce8">
               <w:r>
                 <w:rPr>
                   <w:rFonts w:ascii="Arial" w:cs="Arial" w:eastAsia="Arial" w:hAnsi="Arial"/>
@@ -30291,7 +30993,7 @@
               <w:spacing w:after="10" w:before="0"/>
               <w:ind w:left="120"/>
             </w:pPr>
-            <w:hyperlink w:history="1" r:id="rIdovfolvak_uwn7_duqbjg3">
+            <w:hyperlink w:history="1" r:id="rIdjmlq8rccwq627k0y1qxpe">
               <w:r>
                 <w:rPr>
                   <w:rFonts w:ascii="Arial" w:cs="Arial" w:eastAsia="Arial" w:hAnsi="Arial"/>
@@ -30486,7 +31188,7 @@
             <w:pPr>
               <w:spacing w:after="20" w:before="0"/>
             </w:pPr>
-            <w:hyperlink w:history="1" r:id="rIdgqhjbn7gylrmukplzm8qy">
+            <w:hyperlink w:history="1" r:id="rId1nyzwmjfxrokbezhqrhey">
               <w:r>
                 <w:rPr>
                   <w:rFonts w:ascii="Arial" w:cs="Arial" w:eastAsia="Arial" w:hAnsi="Arial"/>
@@ -30519,7 +31221,7 @@
               <w:spacing w:after="10" w:before="0"/>
               <w:ind w:left="120"/>
             </w:pPr>
-            <w:hyperlink w:history="1" r:id="rIdp7but4ur0nlaebbzhwotx">
+            <w:hyperlink w:history="1" r:id="rIdcqzi96kha3vqpnl6jhaqv">
               <w:r>
                 <w:rPr>
                   <w:rFonts w:ascii="Arial" w:cs="Arial" w:eastAsia="Arial" w:hAnsi="Arial"/>
@@ -30564,7 +31266,7 @@
             <w:pPr>
               <w:spacing w:after="20" w:before="0"/>
             </w:pPr>
-            <w:hyperlink w:history="1" r:id="rIdkvpnpocu_r8f0dmf42n2l">
+            <w:hyperlink w:history="1" r:id="rIdwxvxca_4kaioqauxwbhxx">
               <w:r>
                 <w:rPr>
                   <w:rFonts w:ascii="Arial" w:cs="Arial" w:eastAsia="Arial" w:hAnsi="Arial"/>
@@ -30597,7 +31299,7 @@
               <w:spacing w:after="10" w:before="0"/>
               <w:ind w:left="120"/>
             </w:pPr>
-            <w:hyperlink w:history="1" r:id="rIdagccwsvqmrdcevmtilb56">
+            <w:hyperlink w:history="1" r:id="rIdigaozeq1tm2shwjh4rvwp">
               <w:r>
                 <w:rPr>
                   <w:rFonts w:ascii="Arial" w:cs="Arial" w:eastAsia="Arial" w:hAnsi="Arial"/>
@@ -30792,7 +31494,7 @@
             <w:pPr>
               <w:spacing w:after="20" w:before="0"/>
             </w:pPr>
-            <w:hyperlink w:history="1" r:id="rIdvqcv7vv6gtlsmfymhxosn">
+            <w:hyperlink w:history="1" r:id="rIda8niafnr5ecnh52aqrl4r">
               <w:r>
                 <w:rPr>
                   <w:rFonts w:ascii="Arial" w:cs="Arial" w:eastAsia="Arial" w:hAnsi="Arial"/>
@@ -30825,7 +31527,7 @@
               <w:spacing w:after="10" w:before="0"/>
               <w:ind w:left="120"/>
             </w:pPr>
-            <w:hyperlink w:history="1" r:id="rId8uaj8zbmhh5w7vqxsqh0n">
+            <w:hyperlink w:history="1" r:id="rIdx9-jwstakaoqvxlqbtx30">
               <w:r>
                 <w:rPr>
                   <w:rFonts w:ascii="Arial" w:cs="Arial" w:eastAsia="Arial" w:hAnsi="Arial"/>
@@ -30870,7 +31572,7 @@
             <w:pPr>
               <w:spacing w:after="20" w:before="0"/>
             </w:pPr>
-            <w:hyperlink w:history="1" r:id="rIdyaadz39bssla382xm6vmh">
+            <w:hyperlink w:history="1" r:id="rIdgx7xrtv33dzoiazfhsvgh">
               <w:r>
                 <w:rPr>
                   <w:rFonts w:ascii="Arial" w:cs="Arial" w:eastAsia="Arial" w:hAnsi="Arial"/>
@@ -30903,7 +31605,7 @@
               <w:spacing w:after="10" w:before="0"/>
               <w:ind w:left="120"/>
             </w:pPr>
-            <w:hyperlink w:history="1" r:id="rIdoicto5eaq0d1skmlaz8mo">
+            <w:hyperlink w:history="1" r:id="rIdto0yvldyhuh90qpnyywwe">
               <w:r>
                 <w:rPr>
                   <w:rFonts w:ascii="Arial" w:cs="Arial" w:eastAsia="Arial" w:hAnsi="Arial"/>
@@ -31494,6 +32196,65 @@
         </w:tc>
       </w:tr>
     </w:tbl>
+    <w:p>
+      <w:pPr>
+        <w:pBdr>
+          <w:top w:val="single" w:color="BBBBBB" w:sz="4" w:space="4"/>
+        </w:pBdr>
+        <w:spacing w:after="0" w:before="160"/>
+      </w:pPr>
+      <w:r>
+        <w:rPr>
+          <w:rFonts w:ascii="Arial" w:cs="Arial" w:eastAsia="Arial" w:hAnsi="Arial"/>
+          <w:color w:val="666666"/>
+          <w:sz w:val="14"/>
+          <w:szCs w:val="14"/>
+        </w:rPr>
+        <w:t xml:space="preserve">© 2026 SeaVuria and ARES. Aligned with KICD objectives. Developed by SeaVuria; technical implementation by ARES (with AI assistance from Claude). Licensed under </w:t>
+      </w:r>
+      <w:hyperlink w:history="1" r:id="rId8izycrnfojcinomwdgbwh">
+        <w:r>
+          <w:rPr>
+            <w:rFonts w:ascii="Arial" w:cs="Arial" w:eastAsia="Arial" w:hAnsi="Arial"/>
+            <w:color w:val="1F6B75"/>
+            <w:sz w:val="14"/>
+            <w:szCs w:val="14"/>
+            <w:u w:val="single" w:color="1F6B75"/>
+          </w:rPr>
+          <w:t xml:space="preserve">CC BY-NC 4.0</w:t>
+        </w:r>
+      </w:hyperlink>
+      <w:r>
+        <w:rPr>
+          <w:rFonts w:ascii="Arial" w:cs="Arial" w:eastAsia="Arial" w:hAnsi="Arial"/>
+          <w:color w:val="666666"/>
+          <w:sz w:val="14"/>
+          <w:szCs w:val="14"/>
+        </w:rPr>
+        <w:t xml:space="preserve"> (</w:t>
+      </w:r>
+      <w:hyperlink w:history="1" r:id="rIdkhtdabhe7ttulgepi-2lp">
+        <w:r>
+          <w:rPr>
+            <w:rFonts w:ascii="Arial" w:cs="Arial" w:eastAsia="Arial" w:hAnsi="Arial"/>
+            <w:color w:val="1F6B75"/>
+            <w:sz w:val="14"/>
+            <w:szCs w:val="14"/>
+            <w:u w:val="single" w:color="1F6B75"/>
+          </w:rPr>
+          <w:t xml:space="preserve">https://creativecommons.org/licenses/by-nc/4.0/</w:t>
+        </w:r>
+      </w:hyperlink>
+      <w:r>
+        <w:rPr>
+          <w:rFonts w:ascii="Arial" w:cs="Arial" w:eastAsia="Arial" w:hAnsi="Arial"/>
+          <w:color w:val="666666"/>
+          <w:sz w:val="14"/>
+          <w:szCs w:val="14"/>
+        </w:rPr>
+        <w:t xml:space="preserve">).</w:t>
+      </w:r>
+    </w:p>
     <w:p>
       <w:r>
         <w:br w:type="page"/>
@@ -32485,7 +33246,7 @@
             <w:pPr>
               <w:spacing w:after="20" w:before="0"/>
             </w:pPr>
-            <w:hyperlink w:history="1" r:id="rIdcwyf5jxrmr2fchmwkrvl6">
+            <w:hyperlink w:history="1" r:id="rIdjibyauqirfamhemuc24ao">
               <w:r>
                 <w:rPr>
                   <w:rFonts w:ascii="Arial" w:cs="Arial" w:eastAsia="Arial" w:hAnsi="Arial"/>
@@ -32518,7 +33279,7 @@
               <w:spacing w:after="10" w:before="0"/>
               <w:ind w:left="120"/>
             </w:pPr>
-            <w:hyperlink w:history="1" r:id="rIdteefura2ckvze6age4gxt">
+            <w:hyperlink w:history="1" r:id="rId04bctcn_-19g7wwdtdalg">
               <w:r>
                 <w:rPr>
                   <w:rFonts w:ascii="Arial" w:cs="Arial" w:eastAsia="Arial" w:hAnsi="Arial"/>
@@ -32563,7 +33324,7 @@
             <w:pPr>
               <w:spacing w:after="20" w:before="0"/>
             </w:pPr>
-            <w:hyperlink w:history="1" r:id="rIduakd-ztqgkoinlwrsrdab">
+            <w:hyperlink w:history="1" r:id="rIdsu_eoj0jtetp2fg8opnxr">
               <w:r>
                 <w:rPr>
                   <w:rFonts w:ascii="Arial" w:cs="Arial" w:eastAsia="Arial" w:hAnsi="Arial"/>
@@ -32596,7 +33357,7 @@
               <w:spacing w:after="10" w:before="0"/>
               <w:ind w:left="120"/>
             </w:pPr>
-            <w:hyperlink w:history="1" r:id="rIdihza133un5xbad_aisrbg">
+            <w:hyperlink w:history="1" r:id="rIdzj063mhe-sconxf0qjxj7">
               <w:r>
                 <w:rPr>
                   <w:rFonts w:ascii="Arial" w:cs="Arial" w:eastAsia="Arial" w:hAnsi="Arial"/>
@@ -32791,7 +33552,7 @@
             <w:pPr>
               <w:spacing w:after="20" w:before="0"/>
             </w:pPr>
-            <w:hyperlink w:history="1" r:id="rIdilcgrxbizvgv9eq_8jque">
+            <w:hyperlink w:history="1" r:id="rId0museb6k6qnz8kjqyckgd">
               <w:r>
                 <w:rPr>
                   <w:rFonts w:ascii="Arial" w:cs="Arial" w:eastAsia="Arial" w:hAnsi="Arial"/>
@@ -32824,7 +33585,7 @@
               <w:spacing w:after="10" w:before="0"/>
               <w:ind w:left="120"/>
             </w:pPr>
-            <w:hyperlink w:history="1" r:id="rIdrun1hhchnljalhmgimkbs">
+            <w:hyperlink w:history="1" r:id="rIdzvihp6eq9gy-pt2kb6sje">
               <w:r>
                 <w:rPr>
                   <w:rFonts w:ascii="Arial" w:cs="Arial" w:eastAsia="Arial" w:hAnsi="Arial"/>
@@ -32869,7 +33630,7 @@
             <w:pPr>
               <w:spacing w:after="20" w:before="0"/>
             </w:pPr>
-            <w:hyperlink w:history="1" r:id="rId4t84prmveeqq5w1oruohw">
+            <w:hyperlink w:history="1" r:id="rIdbyw-rgc1v4j0nvby9t9jo">
               <w:r>
                 <w:rPr>
                   <w:rFonts w:ascii="Arial" w:cs="Arial" w:eastAsia="Arial" w:hAnsi="Arial"/>
@@ -32902,7 +33663,7 @@
               <w:spacing w:after="10" w:before="0"/>
               <w:ind w:left="120"/>
             </w:pPr>
-            <w:hyperlink w:history="1" r:id="rIdqu3k64dywtuw498towlga">
+            <w:hyperlink w:history="1" r:id="rIdfyelswssflzb14wxvydt4">
               <w:r>
                 <w:rPr>
                   <w:rFonts w:ascii="Arial" w:cs="Arial" w:eastAsia="Arial" w:hAnsi="Arial"/>
@@ -33097,7 +33858,7 @@
             <w:pPr>
               <w:spacing w:after="20" w:before="0"/>
             </w:pPr>
-            <w:hyperlink w:history="1" r:id="rIdwcmkeu0jj6mpzf2uqqmjt">
+            <w:hyperlink w:history="1" r:id="rIdp_apq_srlvi_7p8lel_bu">
               <w:r>
                 <w:rPr>
                   <w:rFonts w:ascii="Arial" w:cs="Arial" w:eastAsia="Arial" w:hAnsi="Arial"/>
@@ -33130,7 +33891,7 @@
               <w:spacing w:after="10" w:before="0"/>
               <w:ind w:left="120"/>
             </w:pPr>
-            <w:hyperlink w:history="1" r:id="rIddlnfqardprp-ce7tt6bmr">
+            <w:hyperlink w:history="1" r:id="rIdmmgzpnlgxtfudcfcjvzep">
               <w:r>
                 <w:rPr>
                   <w:rFonts w:ascii="Arial" w:cs="Arial" w:eastAsia="Arial" w:hAnsi="Arial"/>
@@ -33175,7 +33936,7 @@
             <w:pPr>
               <w:spacing w:after="20" w:before="0"/>
             </w:pPr>
-            <w:hyperlink w:history="1" r:id="rIdl61ameu8wfqftw14v6dk3">
+            <w:hyperlink w:history="1" r:id="rIdp_ygf1y7u-wtjwwreqn4h">
               <w:r>
                 <w:rPr>
                   <w:rFonts w:ascii="Arial" w:cs="Arial" w:eastAsia="Arial" w:hAnsi="Arial"/>
@@ -33208,7 +33969,7 @@
               <w:spacing w:after="10" w:before="0"/>
               <w:ind w:left="120"/>
             </w:pPr>
-            <w:hyperlink w:history="1" r:id="rIdcpfxqldpyalni8yk4c5vv">
+            <w:hyperlink w:history="1" r:id="rId8shsfseg6k9eyjwnoqbzi">
               <w:r>
                 <w:rPr>
                   <w:rFonts w:ascii="Arial" w:cs="Arial" w:eastAsia="Arial" w:hAnsi="Arial"/>
@@ -33403,7 +34164,7 @@
             <w:pPr>
               <w:spacing w:after="20" w:before="0"/>
             </w:pPr>
-            <w:hyperlink w:history="1" r:id="rIdzfqe9nlmw2pejn1qu_6tf">
+            <w:hyperlink w:history="1" r:id="rIduockvuikwkn1tkh3ms-u_">
               <w:r>
                 <w:rPr>
                   <w:rFonts w:ascii="Arial" w:cs="Arial" w:eastAsia="Arial" w:hAnsi="Arial"/>
@@ -33436,7 +34197,7 @@
               <w:spacing w:after="10" w:before="0"/>
               <w:ind w:left="120"/>
             </w:pPr>
-            <w:hyperlink w:history="1" r:id="rIdmnkw4hedoeruyowthozie">
+            <w:hyperlink w:history="1" r:id="rIdhwwmncx4xvlug72iprx3u">
               <w:r>
                 <w:rPr>
                   <w:rFonts w:ascii="Arial" w:cs="Arial" w:eastAsia="Arial" w:hAnsi="Arial"/>
@@ -33481,7 +34242,7 @@
             <w:pPr>
               <w:spacing w:after="20" w:before="0"/>
             </w:pPr>
-            <w:hyperlink w:history="1" r:id="rId-iordfh5yybfqusjuaje3">
+            <w:hyperlink w:history="1" r:id="rId5vcpuy_o32bwxdsmacw2h">
               <w:r>
                 <w:rPr>
                   <w:rFonts w:ascii="Arial" w:cs="Arial" w:eastAsia="Arial" w:hAnsi="Arial"/>
@@ -33514,7 +34275,7 @@
               <w:spacing w:after="10" w:before="0"/>
               <w:ind w:left="120"/>
             </w:pPr>
-            <w:hyperlink w:history="1" r:id="rIdbl3i4h3ehrv5xeaqbxtca">
+            <w:hyperlink w:history="1" r:id="rId3vl17ekzjun_ufiaduiju">
               <w:r>
                 <w:rPr>
                   <w:rFonts w:ascii="Arial" w:cs="Arial" w:eastAsia="Arial" w:hAnsi="Arial"/>
@@ -33709,7 +34470,7 @@
             <w:pPr>
               <w:spacing w:after="20" w:before="0"/>
             </w:pPr>
-            <w:hyperlink w:history="1" r:id="rIdbwntn399oo2y5e8u4y7oh">
+            <w:hyperlink w:history="1" r:id="rIdysqyklzotxydbgxim2iny">
               <w:r>
                 <w:rPr>
                   <w:rFonts w:ascii="Arial" w:cs="Arial" w:eastAsia="Arial" w:hAnsi="Arial"/>
@@ -33742,7 +34503,7 @@
               <w:spacing w:after="10" w:before="0"/>
               <w:ind w:left="120"/>
             </w:pPr>
-            <w:hyperlink w:history="1" r:id="rIdgewf1dy2n2tvxxce-0rks">
+            <w:hyperlink w:history="1" r:id="rIdpwizfodaclf0ef3wxohxz">
               <w:r>
                 <w:rPr>
                   <w:rFonts w:ascii="Arial" w:cs="Arial" w:eastAsia="Arial" w:hAnsi="Arial"/>
@@ -33787,7 +34548,7 @@
             <w:pPr>
               <w:spacing w:after="20" w:before="0"/>
             </w:pPr>
-            <w:hyperlink w:history="1" r:id="rIdsctugivo_sm4c4nnpcuzq">
+            <w:hyperlink w:history="1" r:id="rId18w2pqrqcu9btoo06ujli">
               <w:r>
                 <w:rPr>
                   <w:rFonts w:ascii="Arial" w:cs="Arial" w:eastAsia="Arial" w:hAnsi="Arial"/>
@@ -33820,7 +34581,7 @@
               <w:spacing w:after="10" w:before="0"/>
               <w:ind w:left="120"/>
             </w:pPr>
-            <w:hyperlink w:history="1" r:id="rIdgrnpcvwnqp9rcynsdis3s">
+            <w:hyperlink w:history="1" r:id="rIdz0jtxh8jpkmu4gzova-ma">
               <w:r>
                 <w:rPr>
                   <w:rFonts w:ascii="Arial" w:cs="Arial" w:eastAsia="Arial" w:hAnsi="Arial"/>
@@ -34316,6 +35077,65 @@
         </w:tc>
       </w:tr>
     </w:tbl>
+    <w:p>
+      <w:pPr>
+        <w:pBdr>
+          <w:top w:val="single" w:color="BBBBBB" w:sz="4" w:space="4"/>
+        </w:pBdr>
+        <w:spacing w:after="0" w:before="160"/>
+      </w:pPr>
+      <w:r>
+        <w:rPr>
+          <w:rFonts w:ascii="Arial" w:cs="Arial" w:eastAsia="Arial" w:hAnsi="Arial"/>
+          <w:color w:val="666666"/>
+          <w:sz w:val="14"/>
+          <w:szCs w:val="14"/>
+        </w:rPr>
+        <w:t xml:space="preserve">© 2026 SeaVuria and ARES. Aligned with KICD objectives. Developed by SeaVuria; technical implementation by ARES (with AI assistance from Claude). Licensed under </w:t>
+      </w:r>
+      <w:hyperlink w:history="1" r:id="rIdmd9g4zm8d61vgkaqoq-0f">
+        <w:r>
+          <w:rPr>
+            <w:rFonts w:ascii="Arial" w:cs="Arial" w:eastAsia="Arial" w:hAnsi="Arial"/>
+            <w:color w:val="1F6B75"/>
+            <w:sz w:val="14"/>
+            <w:szCs w:val="14"/>
+            <w:u w:val="single" w:color="1F6B75"/>
+          </w:rPr>
+          <w:t xml:space="preserve">CC BY-NC 4.0</w:t>
+        </w:r>
+      </w:hyperlink>
+      <w:r>
+        <w:rPr>
+          <w:rFonts w:ascii="Arial" w:cs="Arial" w:eastAsia="Arial" w:hAnsi="Arial"/>
+          <w:color w:val="666666"/>
+          <w:sz w:val="14"/>
+          <w:szCs w:val="14"/>
+        </w:rPr>
+        <w:t xml:space="preserve"> (</w:t>
+      </w:r>
+      <w:hyperlink w:history="1" r:id="rIdhf-eoqyzjcov6xqtj-dle">
+        <w:r>
+          <w:rPr>
+            <w:rFonts w:ascii="Arial" w:cs="Arial" w:eastAsia="Arial" w:hAnsi="Arial"/>
+            <w:color w:val="1F6B75"/>
+            <w:sz w:val="14"/>
+            <w:szCs w:val="14"/>
+            <w:u w:val="single" w:color="1F6B75"/>
+          </w:rPr>
+          <w:t xml:space="preserve">https://creativecommons.org/licenses/by-nc/4.0/</w:t>
+        </w:r>
+      </w:hyperlink>
+      <w:r>
+        <w:rPr>
+          <w:rFonts w:ascii="Arial" w:cs="Arial" w:eastAsia="Arial" w:hAnsi="Arial"/>
+          <w:color w:val="666666"/>
+          <w:sz w:val="14"/>
+          <w:szCs w:val="14"/>
+        </w:rPr>
+        <w:t xml:space="preserve">).</w:t>
+      </w:r>
+    </w:p>
     <w:p>
       <w:r>
         <w:br w:type="page"/>
@@ -35307,7 +36127,7 @@
             <w:pPr>
               <w:spacing w:after="20" w:before="0"/>
             </w:pPr>
-            <w:hyperlink w:history="1" r:id="rIdandorepfbrheqarxj3j-3">
+            <w:hyperlink w:history="1" r:id="rIdkpoebtmb0tkic3emj6xir">
               <w:r>
                 <w:rPr>
                   <w:rFonts w:ascii="Arial" w:cs="Arial" w:eastAsia="Arial" w:hAnsi="Arial"/>
@@ -35340,7 +36160,7 @@
               <w:spacing w:after="10" w:before="0"/>
               <w:ind w:left="120"/>
             </w:pPr>
-            <w:hyperlink w:history="1" r:id="rId4mc_creebpl0hr0ejf38e">
+            <w:hyperlink w:history="1" r:id="rId0rohyzeogiwdipu1p8hhw">
               <w:r>
                 <w:rPr>
                   <w:rFonts w:ascii="Arial" w:cs="Arial" w:eastAsia="Arial" w:hAnsi="Arial"/>
@@ -35385,7 +36205,7 @@
             <w:pPr>
               <w:spacing w:after="20" w:before="0"/>
             </w:pPr>
-            <w:hyperlink w:history="1" r:id="rIdhq40gkyju1lgxgwj6jbub">
+            <w:hyperlink w:history="1" r:id="rIdoliaxqqbjug0qdfhgfawr">
               <w:r>
                 <w:rPr>
                   <w:rFonts w:ascii="Arial" w:cs="Arial" w:eastAsia="Arial" w:hAnsi="Arial"/>
@@ -35418,7 +36238,7 @@
               <w:spacing w:after="10" w:before="0"/>
               <w:ind w:left="120"/>
             </w:pPr>
-            <w:hyperlink w:history="1" r:id="rIdibpjoiqyoqdkuhqba9bfz">
+            <w:hyperlink w:history="1" r:id="rIddhmvexujmt6pwa0iz6i7u">
               <w:r>
                 <w:rPr>
                   <w:rFonts w:ascii="Arial" w:cs="Arial" w:eastAsia="Arial" w:hAnsi="Arial"/>
@@ -35765,7 +36585,7 @@
             <w:pPr>
               <w:spacing w:after="20" w:before="0"/>
             </w:pPr>
-            <w:hyperlink w:history="1" r:id="rIdbuyiwbpatk-xbng_0w8ln">
+            <w:hyperlink w:history="1" r:id="rIdp7hquwzyw3whjva4hb71o">
               <w:r>
                 <w:rPr>
                   <w:rFonts w:ascii="Arial" w:cs="Arial" w:eastAsia="Arial" w:hAnsi="Arial"/>
@@ -35798,7 +36618,7 @@
               <w:spacing w:after="10" w:before="0"/>
               <w:ind w:left="120"/>
             </w:pPr>
-            <w:hyperlink w:history="1" r:id="rId2ydue5pyumcjgwthsnol5">
+            <w:hyperlink w:history="1" r:id="rId5tcpid4fnwosntqlshibq">
               <w:r>
                 <w:rPr>
                   <w:rFonts w:ascii="Arial" w:cs="Arial" w:eastAsia="Arial" w:hAnsi="Arial"/>
@@ -35843,7 +36663,7 @@
             <w:pPr>
               <w:spacing w:after="20" w:before="0"/>
             </w:pPr>
-            <w:hyperlink w:history="1" r:id="rIdrxs9ypzzmwbmoequ62aaw">
+            <w:hyperlink w:history="1" r:id="rIdrwlpbwrbxdrazarfxodpm">
               <w:r>
                 <w:rPr>
                   <w:rFonts w:ascii="Arial" w:cs="Arial" w:eastAsia="Arial" w:hAnsi="Arial"/>
@@ -35876,7 +36696,7 @@
               <w:spacing w:after="10" w:before="0"/>
               <w:ind w:left="120"/>
             </w:pPr>
-            <w:hyperlink w:history="1" r:id="rIdiuoglsjosbqruhp0cgdmz">
+            <w:hyperlink w:history="1" r:id="rIdzf6kwlbvln8d-17oxdzj_">
               <w:r>
                 <w:rPr>
                   <w:rFonts w:ascii="Arial" w:cs="Arial" w:eastAsia="Arial" w:hAnsi="Arial"/>
@@ -36375,7 +37195,7 @@
             <w:pPr>
               <w:spacing w:after="20" w:before="0"/>
             </w:pPr>
-            <w:hyperlink w:history="1" r:id="rId0t19wz2s4hz1mvrsbfqke">
+            <w:hyperlink w:history="1" r:id="rIdixbufkd2acff_liii1mj_">
               <w:r>
                 <w:rPr>
                   <w:rFonts w:ascii="Arial" w:cs="Arial" w:eastAsia="Arial" w:hAnsi="Arial"/>
@@ -36408,7 +37228,7 @@
               <w:spacing w:after="10" w:before="0"/>
               <w:ind w:left="120"/>
             </w:pPr>
-            <w:hyperlink w:history="1" r:id="rIdekpwvzpefvfd7lggnha3p">
+            <w:hyperlink w:history="1" r:id="rIdmait-wqgw4eydbntnjk09">
               <w:r>
                 <w:rPr>
                   <w:rFonts w:ascii="Arial" w:cs="Arial" w:eastAsia="Arial" w:hAnsi="Arial"/>
@@ -36453,7 +37273,7 @@
             <w:pPr>
               <w:spacing w:after="20" w:before="0"/>
             </w:pPr>
-            <w:hyperlink w:history="1" r:id="rIdahnfqwhwuvl8zfezokxyi">
+            <w:hyperlink w:history="1" r:id="rId56adyzgjy6gjjnwltxxxz">
               <w:r>
                 <w:rPr>
                   <w:rFonts w:ascii="Arial" w:cs="Arial" w:eastAsia="Arial" w:hAnsi="Arial"/>
@@ -36486,7 +37306,7 @@
               <w:spacing w:after="10" w:before="0"/>
               <w:ind w:left="120"/>
             </w:pPr>
-            <w:hyperlink w:history="1" r:id="rId1fjqjjmllpb5xgv3fcrj5">
+            <w:hyperlink w:history="1" r:id="rIdcai0p3wto-jdlcuwebzsx">
               <w:r>
                 <w:rPr>
                   <w:rFonts w:ascii="Arial" w:cs="Arial" w:eastAsia="Arial" w:hAnsi="Arial"/>
@@ -36890,7 +37710,7 @@
             <w:pPr>
               <w:spacing w:after="20" w:before="0"/>
             </w:pPr>
-            <w:hyperlink w:history="1" r:id="rIded6keyaaat_-pssk0lvxe">
+            <w:hyperlink w:history="1" r:id="rIdjx3ogadhan6wtd0pivph_">
               <w:r>
                 <w:rPr>
                   <w:rFonts w:ascii="Arial" w:cs="Arial" w:eastAsia="Arial" w:hAnsi="Arial"/>
@@ -36923,7 +37743,7 @@
               <w:spacing w:after="10" w:before="0"/>
               <w:ind w:left="120"/>
             </w:pPr>
-            <w:hyperlink w:history="1" r:id="rIdse9x9pxhyn5pl87smlswu">
+            <w:hyperlink w:history="1" r:id="rIdr7f38oh4i0ksmuwu_2btw">
               <w:r>
                 <w:rPr>
                   <w:rFonts w:ascii="Arial" w:cs="Arial" w:eastAsia="Arial" w:hAnsi="Arial"/>
@@ -36968,7 +37788,7 @@
             <w:pPr>
               <w:spacing w:after="20" w:before="0"/>
             </w:pPr>
-            <w:hyperlink w:history="1" r:id="rIdtukj547thsinij3dxarod">
+            <w:hyperlink w:history="1" r:id="rIdwyw5zfmw-8g9oupla3zdv">
               <w:r>
                 <w:rPr>
                   <w:rFonts w:ascii="Arial" w:cs="Arial" w:eastAsia="Arial" w:hAnsi="Arial"/>
@@ -37001,7 +37821,7 @@
               <w:spacing w:after="10" w:before="0"/>
               <w:ind w:left="120"/>
             </w:pPr>
-            <w:hyperlink w:history="1" r:id="rIdgaetle_aencakqcwspnp1">
+            <w:hyperlink w:history="1" r:id="rIdxoabt7wowbzhrsf-qvpm4">
               <w:r>
                 <w:rPr>
                   <w:rFonts w:ascii="Arial" w:cs="Arial" w:eastAsia="Arial" w:hAnsi="Arial"/>
@@ -37443,7 +38263,7 @@
             <w:pPr>
               <w:spacing w:after="20" w:before="0"/>
             </w:pPr>
-            <w:hyperlink w:history="1" r:id="rIdwrvp9ilwkul4o_9vknqtz">
+            <w:hyperlink w:history="1" r:id="rIdil7jnqd4c5ml7bvt7ulka">
               <w:r>
                 <w:rPr>
                   <w:rFonts w:ascii="Arial" w:cs="Arial" w:eastAsia="Arial" w:hAnsi="Arial"/>
@@ -37476,7 +38296,7 @@
               <w:spacing w:after="10" w:before="0"/>
               <w:ind w:left="120"/>
             </w:pPr>
-            <w:hyperlink w:history="1" r:id="rIdadsewutr4jpopo1boim66">
+            <w:hyperlink w:history="1" r:id="rId_-kcjal9zuhgxx2whi_a0">
               <w:r>
                 <w:rPr>
                   <w:rFonts w:ascii="Arial" w:cs="Arial" w:eastAsia="Arial" w:hAnsi="Arial"/>
@@ -37521,7 +38341,7 @@
             <w:pPr>
               <w:spacing w:after="20" w:before="0"/>
             </w:pPr>
-            <w:hyperlink w:history="1" r:id="rIdlaoypquqn2mbjdlwihi6y">
+            <w:hyperlink w:history="1" r:id="rId80q-1mhsefifseu9xh5wt">
               <w:r>
                 <w:rPr>
                   <w:rFonts w:ascii="Arial" w:cs="Arial" w:eastAsia="Arial" w:hAnsi="Arial"/>
@@ -37554,7 +38374,7 @@
               <w:spacing w:after="10" w:before="0"/>
               <w:ind w:left="120"/>
             </w:pPr>
-            <w:hyperlink w:history="1" r:id="rIdrsi3x0wlk-pzus79tpbgy">
+            <w:hyperlink w:history="1" r:id="rIdvmucqwl1sro-vszkdeicz">
               <w:r>
                 <w:rPr>
                   <w:rFonts w:ascii="Arial" w:cs="Arial" w:eastAsia="Arial" w:hAnsi="Arial"/>
@@ -38202,6 +39022,65 @@
         </w:tc>
       </w:tr>
     </w:tbl>
+    <w:p>
+      <w:pPr>
+        <w:pBdr>
+          <w:top w:val="single" w:color="BBBBBB" w:sz="4" w:space="4"/>
+        </w:pBdr>
+        <w:spacing w:after="0" w:before="160"/>
+      </w:pPr>
+      <w:r>
+        <w:rPr>
+          <w:rFonts w:ascii="Arial" w:cs="Arial" w:eastAsia="Arial" w:hAnsi="Arial"/>
+          <w:color w:val="666666"/>
+          <w:sz w:val="14"/>
+          <w:szCs w:val="14"/>
+        </w:rPr>
+        <w:t xml:space="preserve">© 2026 SeaVuria and ARES. Aligned with KICD objectives. Developed by SeaVuria; technical implementation by ARES (with AI assistance from Claude). Licensed under </w:t>
+      </w:r>
+      <w:hyperlink w:history="1" r:id="rIdo4-g6udefsfocsx53tftf">
+        <w:r>
+          <w:rPr>
+            <w:rFonts w:ascii="Arial" w:cs="Arial" w:eastAsia="Arial" w:hAnsi="Arial"/>
+            <w:color w:val="1F6B75"/>
+            <w:sz w:val="14"/>
+            <w:szCs w:val="14"/>
+            <w:u w:val="single" w:color="1F6B75"/>
+          </w:rPr>
+          <w:t xml:space="preserve">CC BY-NC 4.0</w:t>
+        </w:r>
+      </w:hyperlink>
+      <w:r>
+        <w:rPr>
+          <w:rFonts w:ascii="Arial" w:cs="Arial" w:eastAsia="Arial" w:hAnsi="Arial"/>
+          <w:color w:val="666666"/>
+          <w:sz w:val="14"/>
+          <w:szCs w:val="14"/>
+        </w:rPr>
+        <w:t xml:space="preserve"> (</w:t>
+      </w:r>
+      <w:hyperlink w:history="1" r:id="rId5vatmjgyl-efvx-uv3xhc">
+        <w:r>
+          <w:rPr>
+            <w:rFonts w:ascii="Arial" w:cs="Arial" w:eastAsia="Arial" w:hAnsi="Arial"/>
+            <w:color w:val="1F6B75"/>
+            <w:sz w:val="14"/>
+            <w:szCs w:val="14"/>
+            <w:u w:val="single" w:color="1F6B75"/>
+          </w:rPr>
+          <w:t xml:space="preserve">https://creativecommons.org/licenses/by-nc/4.0/</w:t>
+        </w:r>
+      </w:hyperlink>
+      <w:r>
+        <w:rPr>
+          <w:rFonts w:ascii="Arial" w:cs="Arial" w:eastAsia="Arial" w:hAnsi="Arial"/>
+          <w:color w:val="666666"/>
+          <w:sz w:val="14"/>
+          <w:szCs w:val="14"/>
+        </w:rPr>
+        <w:t xml:space="preserve">).</w:t>
+      </w:r>
+    </w:p>
     <w:p>
       <w:r>
         <w:br w:type="page"/>

</xml_diff>

<commit_message>
Verification pass on lesson-drift findings; deduplicated teacher list
- 8 Claude Code agents (no API) checked all 230 current major drift findings
  against the lesson text: 63 false positive, 96 already listed, 39 real
  cross-reference/dataset conflicts fixed (94 edits via apply_edits.py, 0
  rejected), 21 new science and 11 new structural items.
- TEACHER_REVIEW_LIST_2026-10-04.md rebuilt and deduplicated: 207 verified
  items in 83 sub-strands (128 science, 79 structural).
- Summary Tables re-derived (9), all 95 re-rendered, PDFs + index rebuilt.

Co-Authored-By: Claude Opus 5.5 <noreply@anthropic.com>
</commit_message>
<xml_diff>
--- a/data/outputs/v2/Biology/SS1.1_Cell_Structure/Biology_Cell_Structure_CBE_LessonSequence.docx
+++ b/data/outputs/v2/Biology/SS1.1_Cell_Structure/Biology_Cell_Structure_CBE_LessonSequence.docx
@@ -2596,7 +2596,7 @@
         </w:rPr>
         <w:t xml:space="preserve">© 2026 SeaVuria and ARES. This work is licensed under a </w:t>
       </w:r>
-      <w:hyperlink w:history="1" r:id="rIdhtfwtmn1ipvopmsdatnbb">
+      <w:hyperlink w:history="1" r:id="rIdxwlkwmg1vipblouigiy-i">
         <w:r>
           <w:rPr>
             <w:rFonts w:ascii="Arial" w:cs="Arial" w:eastAsia="Arial" w:hAnsi="Arial"/>
@@ -2616,7 +2616,7 @@
         </w:rPr>
         <w:t xml:space="preserve"> (</w:t>
       </w:r>
-      <w:hyperlink w:history="1" r:id="rIdkyxnjtqt2_-sb2unsrdma">
+      <w:hyperlink w:history="1" r:id="rIdbzuic0q7vzsno7dvf9kjg">
         <w:r>
           <w:rPr>
             <w:rFonts w:ascii="Arial" w:cs="Arial" w:eastAsia="Arial" w:hAnsi="Arial"/>
@@ -2636,7 +2636,7 @@
         </w:rPr>
         <w:t xml:space="preserve">). To view a copy of this license, visit </w:t>
       </w:r>
-      <w:hyperlink w:history="1" r:id="rIdv-zbfqyrpl9spatzpsnbd">
+      <w:hyperlink w:history="1" r:id="rIdv0cjzyxtyak7e5_boph55">
         <w:r>
           <w:rPr>
             <w:rFonts w:ascii="Arial" w:cs="Arial" w:eastAsia="Arial" w:hAnsi="Arial"/>
@@ -3648,7 +3648,7 @@
             <w:pPr>
               <w:spacing w:after="20" w:before="0"/>
             </w:pPr>
-            <w:hyperlink w:history="1" r:id="rIdqgk6sgto0pjeg7aojgl6q">
+            <w:hyperlink w:history="1" r:id="rId2vynzpm6h81zncq55jzw9">
               <w:r>
                 <w:rPr>
                   <w:rFonts w:ascii="Arial" w:cs="Arial" w:eastAsia="Arial" w:hAnsi="Arial"/>
@@ -3681,7 +3681,7 @@
               <w:spacing w:after="10" w:before="0"/>
               <w:ind w:left="120"/>
             </w:pPr>
-            <w:hyperlink w:history="1" r:id="rIdkvttihcpvprnk3nez6kiy">
+            <w:hyperlink w:history="1" r:id="rId1_yvpdoj92lywtlpkvgic">
               <w:r>
                 <w:rPr>
                   <w:rFonts w:ascii="Arial" w:cs="Arial" w:eastAsia="Arial" w:hAnsi="Arial"/>
@@ -3726,7 +3726,7 @@
             <w:pPr>
               <w:spacing w:after="20" w:before="0"/>
             </w:pPr>
-            <w:hyperlink w:history="1" r:id="rIdfzyowmrmrbxmfks5bn4sq">
+            <w:hyperlink w:history="1" r:id="rIdi4_f37vjefteapfhkowzn">
               <w:r>
                 <w:rPr>
                   <w:rFonts w:ascii="Arial" w:cs="Arial" w:eastAsia="Arial" w:hAnsi="Arial"/>
@@ -3759,7 +3759,7 @@
               <w:spacing w:after="10" w:before="0"/>
               <w:ind w:left="120"/>
             </w:pPr>
-            <w:hyperlink w:history="1" r:id="rIdnz1qpqdq5lr1nkgm1rmmn">
+            <w:hyperlink w:history="1" r:id="rId4wq0fdptzocatomlzx_zq">
               <w:r>
                 <w:rPr>
                   <w:rFonts w:ascii="Arial" w:cs="Arial" w:eastAsia="Arial" w:hAnsi="Arial"/>
@@ -3954,7 +3954,7 @@
             <w:pPr>
               <w:spacing w:after="20" w:before="0"/>
             </w:pPr>
-            <w:hyperlink w:history="1" r:id="rIdqh74oensdiukn6iuwc38-">
+            <w:hyperlink w:history="1" r:id="rId4oqb08dfswx_xhzkz0qvw">
               <w:r>
                 <w:rPr>
                   <w:rFonts w:ascii="Arial" w:cs="Arial" w:eastAsia="Arial" w:hAnsi="Arial"/>
@@ -3987,7 +3987,7 @@
               <w:spacing w:after="10" w:before="0"/>
               <w:ind w:left="120"/>
             </w:pPr>
-            <w:hyperlink w:history="1" r:id="rId-swzaoeynranxe6kg2nqg">
+            <w:hyperlink w:history="1" r:id="rIdeb4wp5i_doc-1myxwpumv">
               <w:r>
                 <w:rPr>
                   <w:rFonts w:ascii="Arial" w:cs="Arial" w:eastAsia="Arial" w:hAnsi="Arial"/>
@@ -4032,7 +4032,7 @@
             <w:pPr>
               <w:spacing w:after="20" w:before="0"/>
             </w:pPr>
-            <w:hyperlink w:history="1" r:id="rIdwxdd0gycmrv36t_-gf0us">
+            <w:hyperlink w:history="1" r:id="rIdueulhgage86ados77cynu">
               <w:r>
                 <w:rPr>
                   <w:rFonts w:ascii="Arial" w:cs="Arial" w:eastAsia="Arial" w:hAnsi="Arial"/>
@@ -4065,7 +4065,7 @@
               <w:spacing w:after="10" w:before="0"/>
               <w:ind w:left="120"/>
             </w:pPr>
-            <w:hyperlink w:history="1" r:id="rIduhrrhoycepi2emhkan93w">
+            <w:hyperlink w:history="1" r:id="rIdrdhzs_jlzpmoduaa4m_pt">
               <w:r>
                 <w:rPr>
                   <w:rFonts w:ascii="Arial" w:cs="Arial" w:eastAsia="Arial" w:hAnsi="Arial"/>
@@ -4260,7 +4260,7 @@
             <w:pPr>
               <w:spacing w:after="20" w:before="0"/>
             </w:pPr>
-            <w:hyperlink w:history="1" r:id="rIdejkflaxrf4ygqybbatalm">
+            <w:hyperlink w:history="1" r:id="rIducuypvc_zjlq00eaul-eg">
               <w:r>
                 <w:rPr>
                   <w:rFonts w:ascii="Arial" w:cs="Arial" w:eastAsia="Arial" w:hAnsi="Arial"/>
@@ -4309,7 +4309,7 @@
               <w:spacing w:after="10" w:before="0"/>
               <w:ind w:left="120"/>
             </w:pPr>
-            <w:hyperlink w:history="1" r:id="rIdno4th4nxnoulrc8um4ivx">
+            <w:hyperlink w:history="1" r:id="rId647b4jx3c8ehfkkhczzq6">
               <w:r>
                 <w:rPr>
                   <w:rFonts w:ascii="Arial" w:cs="Arial" w:eastAsia="Arial" w:hAnsi="Arial"/>
@@ -4354,7 +4354,7 @@
             <w:pPr>
               <w:spacing w:after="20" w:before="0"/>
             </w:pPr>
-            <w:hyperlink w:history="1" r:id="rIdvketuhcx3wwe2t5xniypj">
+            <w:hyperlink w:history="1" r:id="rId16rwph-_zdopuyiza4f_c">
               <w:r>
                 <w:rPr>
                   <w:rFonts w:ascii="Arial" w:cs="Arial" w:eastAsia="Arial" w:hAnsi="Arial"/>
@@ -4403,7 +4403,7 @@
               <w:spacing w:after="10" w:before="0"/>
               <w:ind w:left="120"/>
             </w:pPr>
-            <w:hyperlink w:history="1" r:id="rIdfvenzyobp6tudkmp3vdmg">
+            <w:hyperlink w:history="1" r:id="rIdviavcyhwg4oi-k_3bhcl4">
               <w:r>
                 <w:rPr>
                   <w:rFonts w:ascii="Arial" w:cs="Arial" w:eastAsia="Arial" w:hAnsi="Arial"/>
@@ -4598,7 +4598,7 @@
             <w:pPr>
               <w:spacing w:after="20" w:before="0"/>
             </w:pPr>
-            <w:hyperlink w:history="1" r:id="rIdzp7kbgwlvuk5cd8zd0uek">
+            <w:hyperlink w:history="1" r:id="rId6owbnija6a0cil55pq_qh">
               <w:r>
                 <w:rPr>
                   <w:rFonts w:ascii="Arial" w:cs="Arial" w:eastAsia="Arial" w:hAnsi="Arial"/>
@@ -4647,7 +4647,7 @@
               <w:spacing w:after="10" w:before="0"/>
               <w:ind w:left="120"/>
             </w:pPr>
-            <w:hyperlink w:history="1" r:id="rId639dyg6kj1crvahviztf6">
+            <w:hyperlink w:history="1" r:id="rId_vaaznwiwmhvz_9zgvizd">
               <w:r>
                 <w:rPr>
                   <w:rFonts w:ascii="Arial" w:cs="Arial" w:eastAsia="Arial" w:hAnsi="Arial"/>
@@ -4692,7 +4692,7 @@
             <w:pPr>
               <w:spacing w:after="20" w:before="0"/>
             </w:pPr>
-            <w:hyperlink w:history="1" r:id="rIdeaca49mmnuah2jplp8p6i">
+            <w:hyperlink w:history="1" r:id="rIdjtucbne408ih5duwdzmmo">
               <w:r>
                 <w:rPr>
                   <w:rFonts w:ascii="Arial" w:cs="Arial" w:eastAsia="Arial" w:hAnsi="Arial"/>
@@ -4741,7 +4741,7 @@
               <w:spacing w:after="10" w:before="0"/>
               <w:ind w:left="120"/>
             </w:pPr>
-            <w:hyperlink w:history="1" r:id="rId-na7zoh1-pbdlmvvthcvg">
+            <w:hyperlink w:history="1" r:id="rId0vuxt7tekkrx6zgtgjjgl">
               <w:r>
                 <w:rPr>
                   <w:rFonts w:ascii="Arial" w:cs="Arial" w:eastAsia="Arial" w:hAnsi="Arial"/>
@@ -4936,7 +4936,7 @@
             <w:pPr>
               <w:spacing w:after="20" w:before="0"/>
             </w:pPr>
-            <w:hyperlink w:history="1" r:id="rIdhj6mhq5ni7aidmlso0h1y">
+            <w:hyperlink w:history="1" r:id="rIdwpnqi2ikqg7h01thbu-hw">
               <w:r>
                 <w:rPr>
                   <w:rFonts w:ascii="Arial" w:cs="Arial" w:eastAsia="Arial" w:hAnsi="Arial"/>
@@ -4985,7 +4985,7 @@
               <w:spacing w:after="10" w:before="0"/>
               <w:ind w:left="120"/>
             </w:pPr>
-            <w:hyperlink w:history="1" r:id="rId_2b_4y3otok9qufzrqolc">
+            <w:hyperlink w:history="1" r:id="rIdda94ssb6jmreebrpzw21i">
               <w:r>
                 <w:rPr>
                   <w:rFonts w:ascii="Arial" w:cs="Arial" w:eastAsia="Arial" w:hAnsi="Arial"/>
@@ -5030,7 +5030,7 @@
             <w:pPr>
               <w:spacing w:after="20" w:before="0"/>
             </w:pPr>
-            <w:hyperlink w:history="1" r:id="rIdohm-krblsgvqejygbsq0j">
+            <w:hyperlink w:history="1" r:id="rId3avqryor-9aok8kzghywa">
               <w:r>
                 <w:rPr>
                   <w:rFonts w:ascii="Arial" w:cs="Arial" w:eastAsia="Arial" w:hAnsi="Arial"/>
@@ -5079,7 +5079,7 @@
               <w:spacing w:after="10" w:before="0"/>
               <w:ind w:left="120"/>
             </w:pPr>
-            <w:hyperlink w:history="1" r:id="rIdq8vxllvipz_zxpiyvdl68">
+            <w:hyperlink w:history="1" r:id="rIdukamjwdnjco8qs3ultxwq">
               <w:r>
                 <w:rPr>
                   <w:rFonts w:ascii="Arial" w:cs="Arial" w:eastAsia="Arial" w:hAnsi="Arial"/>
@@ -5591,7 +5591,7 @@
         </w:rPr>
         <w:t xml:space="preserve">© 2026 SeaVuria and ARES. Aligned with KICD objectives. Developed by SeaVuria; technical implementation by ARES (with AI assistance from Claude). Licensed under </w:t>
       </w:r>
-      <w:hyperlink w:history="1" r:id="rIddvrzd4c4nuhsq00pxd9iz">
+      <w:hyperlink w:history="1" r:id="rIdjpj5gwpzd2by7prn17j_x">
         <w:r>
           <w:rPr>
             <w:rFonts w:ascii="Arial" w:cs="Arial" w:eastAsia="Arial" w:hAnsi="Arial"/>
@@ -5612,7 +5612,7 @@
         </w:rPr>
         <w:t xml:space="preserve"> (</w:t>
       </w:r>
-      <w:hyperlink w:history="1" r:id="rIdw7hcpypt_doyrjbohlfug">
+      <w:hyperlink w:history="1" r:id="rId-w_xtw8sf-tciepvgy7ux">
         <w:r>
           <w:rPr>
             <w:rFonts w:ascii="Arial" w:cs="Arial" w:eastAsia="Arial" w:hAnsi="Arial"/>
@@ -6625,7 +6625,7 @@
             <w:pPr>
               <w:spacing w:after="20" w:before="0"/>
             </w:pPr>
-            <w:hyperlink w:history="1" r:id="rIdvvaeosx-tgcsnoqxne1yn">
+            <w:hyperlink w:history="1" r:id="rIdmk56bi90ecq1luqgtdajx">
               <w:r>
                 <w:rPr>
                   <w:rFonts w:ascii="Arial" w:cs="Arial" w:eastAsia="Arial" w:hAnsi="Arial"/>
@@ -6658,7 +6658,7 @@
               <w:spacing w:after="10" w:before="0"/>
               <w:ind w:left="120"/>
             </w:pPr>
-            <w:hyperlink w:history="1" r:id="rIdkbppagkmwtakfhtahuc-j">
+            <w:hyperlink w:history="1" r:id="rIdpcildyk9rmoi4g9nwiwfz">
               <w:r>
                 <w:rPr>
                   <w:rFonts w:ascii="Arial" w:cs="Arial" w:eastAsia="Arial" w:hAnsi="Arial"/>
@@ -6703,7 +6703,7 @@
             <w:pPr>
               <w:spacing w:after="20" w:before="0"/>
             </w:pPr>
-            <w:hyperlink w:history="1" r:id="rIdtjh3fu39ej5s4j5xi28mq">
+            <w:hyperlink w:history="1" r:id="rId38zuddh4d550hi875yvcv">
               <w:r>
                 <w:rPr>
                   <w:rFonts w:ascii="Arial" w:cs="Arial" w:eastAsia="Arial" w:hAnsi="Arial"/>
@@ -6736,7 +6736,7 @@
               <w:spacing w:after="10" w:before="0"/>
               <w:ind w:left="120"/>
             </w:pPr>
-            <w:hyperlink w:history="1" r:id="rIdjm51mu2ieqiiznisgy2cs">
+            <w:hyperlink w:history="1" r:id="rIdcj1rlnjdkflbvzlnxlqah">
               <w:r>
                 <w:rPr>
                   <w:rFonts w:ascii="Arial" w:cs="Arial" w:eastAsia="Arial" w:hAnsi="Arial"/>
@@ -6931,7 +6931,7 @@
             <w:pPr>
               <w:spacing w:after="20" w:before="0"/>
             </w:pPr>
-            <w:hyperlink w:history="1" r:id="rId1gkstc02qgxtjawy6tyky">
+            <w:hyperlink w:history="1" r:id="rIdxm2hqqrmx_sz15n-lexfo">
               <w:r>
                 <w:rPr>
                   <w:rFonts w:ascii="Arial" w:cs="Arial" w:eastAsia="Arial" w:hAnsi="Arial"/>
@@ -6964,7 +6964,7 @@
               <w:spacing w:after="10" w:before="0"/>
               <w:ind w:left="120"/>
             </w:pPr>
-            <w:hyperlink w:history="1" r:id="rIdzylpqquw5jzr-7cpknjcc">
+            <w:hyperlink w:history="1" r:id="rId6fr3mcdwkm5gcyl3o2n6w">
               <w:r>
                 <w:rPr>
                   <w:rFonts w:ascii="Arial" w:cs="Arial" w:eastAsia="Arial" w:hAnsi="Arial"/>
@@ -7009,7 +7009,7 @@
             <w:pPr>
               <w:spacing w:after="20" w:before="0"/>
             </w:pPr>
-            <w:hyperlink w:history="1" r:id="rIdpcynzufq0myd7cfuor43f">
+            <w:hyperlink w:history="1" r:id="rIdysph3pd6j1ysngfp5yq3m">
               <w:r>
                 <w:rPr>
                   <w:rFonts w:ascii="Arial" w:cs="Arial" w:eastAsia="Arial" w:hAnsi="Arial"/>
@@ -7042,7 +7042,7 @@
               <w:spacing w:after="10" w:before="0"/>
               <w:ind w:left="120"/>
             </w:pPr>
-            <w:hyperlink w:history="1" r:id="rIdkblabczqkeeyee8uoky_j">
+            <w:hyperlink w:history="1" r:id="rId7s3fa4xmqmjtuguw3bxic">
               <w:r>
                 <w:rPr>
                   <w:rFonts w:ascii="Arial" w:cs="Arial" w:eastAsia="Arial" w:hAnsi="Arial"/>
@@ -7237,7 +7237,7 @@
             <w:pPr>
               <w:spacing w:after="20" w:before="0"/>
             </w:pPr>
-            <w:hyperlink w:history="1" r:id="rId34yz1sup3auvsdmrgfdvc">
+            <w:hyperlink w:history="1" r:id="rIda06oknasnmbvafg_5zu5s">
               <w:r>
                 <w:rPr>
                   <w:rFonts w:ascii="Arial" w:cs="Arial" w:eastAsia="Arial" w:hAnsi="Arial"/>
@@ -7286,7 +7286,7 @@
               <w:spacing w:after="10" w:before="0"/>
               <w:ind w:left="120"/>
             </w:pPr>
-            <w:hyperlink w:history="1" r:id="rIdpmepwbcesbmz19b3x84ep">
+            <w:hyperlink w:history="1" r:id="rId5jdb2uum9jk_v3zqki7c3">
               <w:r>
                 <w:rPr>
                   <w:rFonts w:ascii="Arial" w:cs="Arial" w:eastAsia="Arial" w:hAnsi="Arial"/>
@@ -7331,7 +7331,7 @@
             <w:pPr>
               <w:spacing w:after="20" w:before="0"/>
             </w:pPr>
-            <w:hyperlink w:history="1" r:id="rId-pg-tzmqhkzmdwn8o9ho_">
+            <w:hyperlink w:history="1" r:id="rIdvjvoqa1rqjooqlj7v5i8r">
               <w:r>
                 <w:rPr>
                   <w:rFonts w:ascii="Arial" w:cs="Arial" w:eastAsia="Arial" w:hAnsi="Arial"/>
@@ -7364,7 +7364,7 @@
               <w:spacing w:after="10" w:before="0"/>
               <w:ind w:left="120"/>
             </w:pPr>
-            <w:hyperlink w:history="1" r:id="rIdt1ycn_pmvwpfedrcqtirr">
+            <w:hyperlink w:history="1" r:id="rIdzeof59r3jliul489spf9b">
               <w:r>
                 <w:rPr>
                   <w:rFonts w:ascii="Arial" w:cs="Arial" w:eastAsia="Arial" w:hAnsi="Arial"/>
@@ -7559,7 +7559,7 @@
             <w:pPr>
               <w:spacing w:after="20" w:before="0"/>
             </w:pPr>
-            <w:hyperlink w:history="1" r:id="rIdrmxtn-jywbaifcco6kx98">
+            <w:hyperlink w:history="1" r:id="rIdawwoms9fxonwiunuh-bfi">
               <w:r>
                 <w:rPr>
                   <w:rFonts w:ascii="Arial" w:cs="Arial" w:eastAsia="Arial" w:hAnsi="Arial"/>
@@ -7608,7 +7608,7 @@
               <w:spacing w:after="10" w:before="0"/>
               <w:ind w:left="120"/>
             </w:pPr>
-            <w:hyperlink w:history="1" r:id="rIdmrl2kj4q8gzhjxua_4qxj">
+            <w:hyperlink w:history="1" r:id="rIdw4phrgcrswsyfv5sgziwc">
               <w:r>
                 <w:rPr>
                   <w:rFonts w:ascii="Arial" w:cs="Arial" w:eastAsia="Arial" w:hAnsi="Arial"/>
@@ -7653,7 +7653,7 @@
             <w:pPr>
               <w:spacing w:after="20" w:before="0"/>
             </w:pPr>
-            <w:hyperlink w:history="1" r:id="rIdm5zjrkqe5p-h3azwtyahz">
+            <w:hyperlink w:history="1" r:id="rIdjvfblzrkhrvgshwnd4odu">
               <w:r>
                 <w:rPr>
                   <w:rFonts w:ascii="Arial" w:cs="Arial" w:eastAsia="Arial" w:hAnsi="Arial"/>
@@ -7686,7 +7686,7 @@
               <w:spacing w:after="10" w:before="0"/>
               <w:ind w:left="120"/>
             </w:pPr>
-            <w:hyperlink w:history="1" r:id="rId3txkymwtfc2fi0miuxnsw">
+            <w:hyperlink w:history="1" r:id="rIdepiwv4ddfvcyaz2alwrc9">
               <w:r>
                 <w:rPr>
                   <w:rFonts w:ascii="Arial" w:cs="Arial" w:eastAsia="Arial" w:hAnsi="Arial"/>
@@ -7881,7 +7881,7 @@
             <w:pPr>
               <w:spacing w:after="20" w:before="0"/>
             </w:pPr>
-            <w:hyperlink w:history="1" r:id="rIdpctaoitpymrw-invs75df">
+            <w:hyperlink w:history="1" r:id="rId80dtebvwjaolmkrrxripq">
               <w:r>
                 <w:rPr>
                   <w:rFonts w:ascii="Arial" w:cs="Arial" w:eastAsia="Arial" w:hAnsi="Arial"/>
@@ -7930,7 +7930,7 @@
               <w:spacing w:after="10" w:before="0"/>
               <w:ind w:left="120"/>
             </w:pPr>
-            <w:hyperlink w:history="1" r:id="rIdpndjf0rsky-0qj3b-9gb-">
+            <w:hyperlink w:history="1" r:id="rId6z_yu2hydlxbr6t8ni-zl">
               <w:r>
                 <w:rPr>
                   <w:rFonts w:ascii="Arial" w:cs="Arial" w:eastAsia="Arial" w:hAnsi="Arial"/>
@@ -7975,7 +7975,7 @@
             <w:pPr>
               <w:spacing w:after="20" w:before="0"/>
             </w:pPr>
-            <w:hyperlink w:history="1" r:id="rId5f0yilnv5rs7dqrs6imbf">
+            <w:hyperlink w:history="1" r:id="rIdgxwsgwty47k2ejy8zlmac">
               <w:r>
                 <w:rPr>
                   <w:rFonts w:ascii="Arial" w:cs="Arial" w:eastAsia="Arial" w:hAnsi="Arial"/>
@@ -8008,7 +8008,7 @@
               <w:spacing w:after="10" w:before="0"/>
               <w:ind w:left="120"/>
             </w:pPr>
-            <w:hyperlink w:history="1" r:id="rId6e72goe9nradqadj8uimm">
+            <w:hyperlink w:history="1" r:id="rIdxfeqqmr07tubsbeaqsfhr">
               <w:r>
                 <w:rPr>
                   <w:rFonts w:ascii="Arial" w:cs="Arial" w:eastAsia="Arial" w:hAnsi="Arial"/>
@@ -8520,7 +8520,7 @@
         </w:rPr>
         <w:t xml:space="preserve">© 2026 SeaVuria and ARES. Aligned with KICD objectives. Developed by SeaVuria; technical implementation by ARES (with AI assistance from Claude). Licensed under </w:t>
       </w:r>
-      <w:hyperlink w:history="1" r:id="rIdptdujoccyo0s07nwn5qhh">
+      <w:hyperlink w:history="1" r:id="rIdufidnm9cyy30cdmlh5mul">
         <w:r>
           <w:rPr>
             <w:rFonts w:ascii="Arial" w:cs="Arial" w:eastAsia="Arial" w:hAnsi="Arial"/>
@@ -8541,7 +8541,7 @@
         </w:rPr>
         <w:t xml:space="preserve"> (</w:t>
       </w:r>
-      <w:hyperlink w:history="1" r:id="rIdanp3_n8rqfhg2ath0rson">
+      <w:hyperlink w:history="1" r:id="rIdre8q15dvwidyir5vypkv-">
         <w:r>
           <w:rPr>
             <w:rFonts w:ascii="Arial" w:cs="Arial" w:eastAsia="Arial" w:hAnsi="Arial"/>
@@ -9554,7 +9554,7 @@
             <w:pPr>
               <w:spacing w:after="20" w:before="0"/>
             </w:pPr>
-            <w:hyperlink w:history="1" r:id="rIdj5yeybv_gnksa50y35kag">
+            <w:hyperlink w:history="1" r:id="rIdwjbhzig_phcmdy5nawrqp">
               <w:r>
                 <w:rPr>
                   <w:rFonts w:ascii="Arial" w:cs="Arial" w:eastAsia="Arial" w:hAnsi="Arial"/>
@@ -9587,7 +9587,7 @@
               <w:spacing w:after="10" w:before="0"/>
               <w:ind w:left="120"/>
             </w:pPr>
-            <w:hyperlink w:history="1" r:id="rIdvnagw6hsrsslcucogy34a">
+            <w:hyperlink w:history="1" r:id="rId6f5t1xqb4jugl4lmzoa6f">
               <w:r>
                 <w:rPr>
                   <w:rFonts w:ascii="Arial" w:cs="Arial" w:eastAsia="Arial" w:hAnsi="Arial"/>
@@ -9632,7 +9632,7 @@
             <w:pPr>
               <w:spacing w:after="20" w:before="0"/>
             </w:pPr>
-            <w:hyperlink w:history="1" r:id="rId6e6fork8g1sm4rullltwe">
+            <w:hyperlink w:history="1" r:id="rIdjhvppw_-sf0r5pkig9mtx">
               <w:r>
                 <w:rPr>
                   <w:rFonts w:ascii="Arial" w:cs="Arial" w:eastAsia="Arial" w:hAnsi="Arial"/>
@@ -9665,7 +9665,7 @@
               <w:spacing w:after="10" w:before="0"/>
               <w:ind w:left="120"/>
             </w:pPr>
-            <w:hyperlink w:history="1" r:id="rIdbi9mwppqndmr5gmx6s1j-">
+            <w:hyperlink w:history="1" r:id="rIdv2h5yb7wmfvor5nv5eplg">
               <w:r>
                 <w:rPr>
                   <w:rFonts w:ascii="Arial" w:cs="Arial" w:eastAsia="Arial" w:hAnsi="Arial"/>
@@ -9860,7 +9860,7 @@
             <w:pPr>
               <w:spacing w:after="20" w:before="0"/>
             </w:pPr>
-            <w:hyperlink w:history="1" r:id="rIdu1as-xyzompguzmk7ky2t">
+            <w:hyperlink w:history="1" r:id="rId3fnjrqxmvbdtnhbif8esk">
               <w:r>
                 <w:rPr>
                   <w:rFonts w:ascii="Arial" w:cs="Arial" w:eastAsia="Arial" w:hAnsi="Arial"/>
@@ -9893,7 +9893,7 @@
               <w:spacing w:after="10" w:before="0"/>
               <w:ind w:left="120"/>
             </w:pPr>
-            <w:hyperlink w:history="1" r:id="rId6wmsdkycejr7tg0rstsra">
+            <w:hyperlink w:history="1" r:id="rIdvzf3xn0lhiz2uwyc7dsdn">
               <w:r>
                 <w:rPr>
                   <w:rFonts w:ascii="Arial" w:cs="Arial" w:eastAsia="Arial" w:hAnsi="Arial"/>
@@ -9938,7 +9938,7 @@
             <w:pPr>
               <w:spacing w:after="20" w:before="0"/>
             </w:pPr>
-            <w:hyperlink w:history="1" r:id="rIdq5zdejizcw7bdkyulfh41">
+            <w:hyperlink w:history="1" r:id="rIdytjwuaumxl-6isfiiz_lp">
               <w:r>
                 <w:rPr>
                   <w:rFonts w:ascii="Arial" w:cs="Arial" w:eastAsia="Arial" w:hAnsi="Arial"/>
@@ -9971,7 +9971,7 @@
               <w:spacing w:after="10" w:before="0"/>
               <w:ind w:left="120"/>
             </w:pPr>
-            <w:hyperlink w:history="1" r:id="rIdmk9iraakctwardrlosspj">
+            <w:hyperlink w:history="1" r:id="rIdma9ori4lforlwlesh4tya">
               <w:r>
                 <w:rPr>
                   <w:rFonts w:ascii="Arial" w:cs="Arial" w:eastAsia="Arial" w:hAnsi="Arial"/>
@@ -10166,7 +10166,7 @@
             <w:pPr>
               <w:spacing w:after="20" w:before="0"/>
             </w:pPr>
-            <w:hyperlink w:history="1" r:id="rIdv1g8-5vtnlddtkxrkdauk">
+            <w:hyperlink w:history="1" r:id="rId-vbmjijpg-nxkljhjwwqc">
               <w:r>
                 <w:rPr>
                   <w:rFonts w:ascii="Arial" w:cs="Arial" w:eastAsia="Arial" w:hAnsi="Arial"/>
@@ -10215,7 +10215,7 @@
               <w:spacing w:after="10" w:before="0"/>
               <w:ind w:left="120"/>
             </w:pPr>
-            <w:hyperlink w:history="1" r:id="rIdnjfhsz--clio6xj000rr_">
+            <w:hyperlink w:history="1" r:id="rIdqut91aj7h3bziyps1lxnz">
               <w:r>
                 <w:rPr>
                   <w:rFonts w:ascii="Arial" w:cs="Arial" w:eastAsia="Arial" w:hAnsi="Arial"/>
@@ -10260,7 +10260,7 @@
             <w:pPr>
               <w:spacing w:after="20" w:before="0"/>
             </w:pPr>
-            <w:hyperlink w:history="1" r:id="rIdxup3d565knv0766dbnwx4">
+            <w:hyperlink w:history="1" r:id="rIdt9arcs4uq4yuc6ayibt3y">
               <w:r>
                 <w:rPr>
                   <w:rFonts w:ascii="Arial" w:cs="Arial" w:eastAsia="Arial" w:hAnsi="Arial"/>
@@ -10293,7 +10293,7 @@
               <w:spacing w:after="10" w:before="0"/>
               <w:ind w:left="120"/>
             </w:pPr>
-            <w:hyperlink w:history="1" r:id="rIduydhh3y_-qgrsaznjokdo">
+            <w:hyperlink w:history="1" r:id="rIddlbhrbf8w-opo3h6ppmzi">
               <w:r>
                 <w:rPr>
                   <w:rFonts w:ascii="Arial" w:cs="Arial" w:eastAsia="Arial" w:hAnsi="Arial"/>
@@ -10488,7 +10488,7 @@
             <w:pPr>
               <w:spacing w:after="20" w:before="0"/>
             </w:pPr>
-            <w:hyperlink w:history="1" r:id="rIda8grz932an76kbbf-_v-a">
+            <w:hyperlink w:history="1" r:id="rIdo8mpv48g0hhyoleuzkixx">
               <w:r>
                 <w:rPr>
                   <w:rFonts w:ascii="Arial" w:cs="Arial" w:eastAsia="Arial" w:hAnsi="Arial"/>
@@ -10537,7 +10537,7 @@
               <w:spacing w:after="10" w:before="0"/>
               <w:ind w:left="120"/>
             </w:pPr>
-            <w:hyperlink w:history="1" r:id="rIdezu5mbfipxmrkqvjlwxuz">
+            <w:hyperlink w:history="1" r:id="rId0vsb2pp4stt5ds4hxa3p5">
               <w:r>
                 <w:rPr>
                   <w:rFonts w:ascii="Arial" w:cs="Arial" w:eastAsia="Arial" w:hAnsi="Arial"/>
@@ -10582,7 +10582,7 @@
             <w:pPr>
               <w:spacing w:after="20" w:before="0"/>
             </w:pPr>
-            <w:hyperlink w:history="1" r:id="rIdnjazdmrnxknqruditafkb">
+            <w:hyperlink w:history="1" r:id="rIdyxcpbiksb6mrbypdiojbo">
               <w:r>
                 <w:rPr>
                   <w:rFonts w:ascii="Arial" w:cs="Arial" w:eastAsia="Arial" w:hAnsi="Arial"/>
@@ -10615,7 +10615,7 @@
               <w:spacing w:after="10" w:before="0"/>
               <w:ind w:left="120"/>
             </w:pPr>
-            <w:hyperlink w:history="1" r:id="rIdz8ie9wtnt4ylcag4zx43b">
+            <w:hyperlink w:history="1" r:id="rIdezn7mfnfrlzgl362wu5mc">
               <w:r>
                 <w:rPr>
                   <w:rFonts w:ascii="Arial" w:cs="Arial" w:eastAsia="Arial" w:hAnsi="Arial"/>
@@ -10810,7 +10810,7 @@
             <w:pPr>
               <w:spacing w:after="20" w:before="0"/>
             </w:pPr>
-            <w:hyperlink w:history="1" r:id="rIdchivgkbm_r5tsm0nmfnq8">
+            <w:hyperlink w:history="1" r:id="rIdklnlwfcpo9d1eqwjdnlf7">
               <w:r>
                 <w:rPr>
                   <w:rFonts w:ascii="Arial" w:cs="Arial" w:eastAsia="Arial" w:hAnsi="Arial"/>
@@ -10859,7 +10859,7 @@
               <w:spacing w:after="10" w:before="0"/>
               <w:ind w:left="120"/>
             </w:pPr>
-            <w:hyperlink w:history="1" r:id="rIdof-f1td33ydcqgil1e7ep">
+            <w:hyperlink w:history="1" r:id="rIdae4wq_sxwuadctxuitwxl">
               <w:r>
                 <w:rPr>
                   <w:rFonts w:ascii="Arial" w:cs="Arial" w:eastAsia="Arial" w:hAnsi="Arial"/>
@@ -10904,7 +10904,7 @@
             <w:pPr>
               <w:spacing w:after="20" w:before="0"/>
             </w:pPr>
-            <w:hyperlink w:history="1" r:id="rIdryqpak0reaovu8yci4g-e">
+            <w:hyperlink w:history="1" r:id="rId7ek76kyfmoe9fay3njoeu">
               <w:r>
                 <w:rPr>
                   <w:rFonts w:ascii="Arial" w:cs="Arial" w:eastAsia="Arial" w:hAnsi="Arial"/>
@@ -10937,7 +10937,7 @@
               <w:spacing w:after="10" w:before="0"/>
               <w:ind w:left="120"/>
             </w:pPr>
-            <w:hyperlink w:history="1" r:id="rId5flxld-mfw1si1hnd5vsk">
+            <w:hyperlink w:history="1" r:id="rIdgobngcnl6wuel7pycf-zk">
               <w:r>
                 <w:rPr>
                   <w:rFonts w:ascii="Arial" w:cs="Arial" w:eastAsia="Arial" w:hAnsi="Arial"/>
@@ -11449,7 +11449,7 @@
         </w:rPr>
         <w:t xml:space="preserve">© 2026 SeaVuria and ARES. Aligned with KICD objectives. Developed by SeaVuria; technical implementation by ARES (with AI assistance from Claude). Licensed under </w:t>
       </w:r>
-      <w:hyperlink w:history="1" r:id="rId4qmqszs2-w2ueauha6i-k">
+      <w:hyperlink w:history="1" r:id="rIdhwcakvosai8uwsf-dh1me">
         <w:r>
           <w:rPr>
             <w:rFonts w:ascii="Arial" w:cs="Arial" w:eastAsia="Arial" w:hAnsi="Arial"/>
@@ -11470,7 +11470,7 @@
         </w:rPr>
         <w:t xml:space="preserve"> (</w:t>
       </w:r>
-      <w:hyperlink w:history="1" r:id="rIdxm-xpy51zthouhigyrzdx">
+      <w:hyperlink w:history="1" r:id="rIdmrh_upnbzuqmemq4ifi-q">
         <w:r>
           <w:rPr>
             <w:rFonts w:ascii="Arial" w:cs="Arial" w:eastAsia="Arial" w:hAnsi="Arial"/>
@@ -12483,7 +12483,7 @@
             <w:pPr>
               <w:spacing w:after="20" w:before="0"/>
             </w:pPr>
-            <w:hyperlink w:history="1" r:id="rIdojllidgxwnpabijxeqmhm">
+            <w:hyperlink w:history="1" r:id="rIdermg5wfxkvqgh3timboyg">
               <w:r>
                 <w:rPr>
                   <w:rFonts w:ascii="Arial" w:cs="Arial" w:eastAsia="Arial" w:hAnsi="Arial"/>
@@ -12516,7 +12516,7 @@
               <w:spacing w:after="10" w:before="0"/>
               <w:ind w:left="120"/>
             </w:pPr>
-            <w:hyperlink w:history="1" r:id="rIdj44752l9hsh0z0p82pko4">
+            <w:hyperlink w:history="1" r:id="rIdgaylbctf0vtlnzp2ir1yb">
               <w:r>
                 <w:rPr>
                   <w:rFonts w:ascii="Arial" w:cs="Arial" w:eastAsia="Arial" w:hAnsi="Arial"/>
@@ -12561,7 +12561,7 @@
             <w:pPr>
               <w:spacing w:after="20" w:before="0"/>
             </w:pPr>
-            <w:hyperlink w:history="1" r:id="rIdnhj9dibdigrv_x1uonxqb">
+            <w:hyperlink w:history="1" r:id="rIdy2lfzxnyjk4leqltgsaoe">
               <w:r>
                 <w:rPr>
                   <w:rFonts w:ascii="Arial" w:cs="Arial" w:eastAsia="Arial" w:hAnsi="Arial"/>
@@ -12594,7 +12594,7 @@
               <w:spacing w:after="10" w:before="0"/>
               <w:ind w:left="120"/>
             </w:pPr>
-            <w:hyperlink w:history="1" r:id="rIdz4j2gigfj5p3_xmrgaqrv">
+            <w:hyperlink w:history="1" r:id="rIdoc-9qlveg_buodafc_cwb">
               <w:r>
                 <w:rPr>
                   <w:rFonts w:ascii="Arial" w:cs="Arial" w:eastAsia="Arial" w:hAnsi="Arial"/>
@@ -12789,7 +12789,7 @@
             <w:pPr>
               <w:spacing w:after="20" w:before="0"/>
             </w:pPr>
-            <w:hyperlink w:history="1" r:id="rId982uj43xrwoeairkth8up">
+            <w:hyperlink w:history="1" r:id="rIdy5ko-45dsnwqtkxpg7vup">
               <w:r>
                 <w:rPr>
                   <w:rFonts w:ascii="Arial" w:cs="Arial" w:eastAsia="Arial" w:hAnsi="Arial"/>
@@ -12822,7 +12822,7 @@
               <w:spacing w:after="10" w:before="0"/>
               <w:ind w:left="120"/>
             </w:pPr>
-            <w:hyperlink w:history="1" r:id="rIdbcqjea121dtnqr3rn3du-">
+            <w:hyperlink w:history="1" r:id="rIdwyvtlwl0wrzx-thhreoip">
               <w:r>
                 <w:rPr>
                   <w:rFonts w:ascii="Arial" w:cs="Arial" w:eastAsia="Arial" w:hAnsi="Arial"/>
@@ -12867,7 +12867,7 @@
             <w:pPr>
               <w:spacing w:after="20" w:before="0"/>
             </w:pPr>
-            <w:hyperlink w:history="1" r:id="rId0grt6nzvegiat9f4h0jlu">
+            <w:hyperlink w:history="1" r:id="rIdtivi7higi9f6l7o-dkw3i">
               <w:r>
                 <w:rPr>
                   <w:rFonts w:ascii="Arial" w:cs="Arial" w:eastAsia="Arial" w:hAnsi="Arial"/>
@@ -12900,7 +12900,7 @@
               <w:spacing w:after="10" w:before="0"/>
               <w:ind w:left="120"/>
             </w:pPr>
-            <w:hyperlink w:history="1" r:id="rIdmr6anyjhpajmm9j8lkzkv">
+            <w:hyperlink w:history="1" r:id="rIdkjab6nchci3btcc2iwqgh">
               <w:r>
                 <w:rPr>
                   <w:rFonts w:ascii="Arial" w:cs="Arial" w:eastAsia="Arial" w:hAnsi="Arial"/>
@@ -13095,7 +13095,7 @@
             <w:pPr>
               <w:spacing w:after="20" w:before="0"/>
             </w:pPr>
-            <w:hyperlink w:history="1" r:id="rIdwcyohxwo2yiafxhaipclj">
+            <w:hyperlink w:history="1" r:id="rIdde-ebezewhvui9dkl_nsd">
               <w:r>
                 <w:rPr>
                   <w:rFonts w:ascii="Arial" w:cs="Arial" w:eastAsia="Arial" w:hAnsi="Arial"/>
@@ -13128,7 +13128,7 @@
               <w:spacing w:after="10" w:before="0"/>
               <w:ind w:left="120"/>
             </w:pPr>
-            <w:hyperlink w:history="1" r:id="rIdbg4dgp4bceamnsn5powx9">
+            <w:hyperlink w:history="1" r:id="rIdsd1e5akkeizgzqnpimfqq">
               <w:r>
                 <w:rPr>
                   <w:rFonts w:ascii="Arial" w:cs="Arial" w:eastAsia="Arial" w:hAnsi="Arial"/>
@@ -13173,7 +13173,7 @@
             <w:pPr>
               <w:spacing w:after="20" w:before="0"/>
             </w:pPr>
-            <w:hyperlink w:history="1" r:id="rIdj_fwajfauibbkysgeh0tf">
+            <w:hyperlink w:history="1" r:id="rIdtj6nmgp2h9rhrvtwlc1jr">
               <w:r>
                 <w:rPr>
                   <w:rFonts w:ascii="Arial" w:cs="Arial" w:eastAsia="Arial" w:hAnsi="Arial"/>
@@ -13206,7 +13206,7 @@
               <w:spacing w:after="10" w:before="0"/>
               <w:ind w:left="120"/>
             </w:pPr>
-            <w:hyperlink w:history="1" r:id="rIduhbq2gooensdvjx-x5vq8">
+            <w:hyperlink w:history="1" r:id="rIds7nyopcw4cvxtm_bzjh0k">
               <w:r>
                 <w:rPr>
                   <w:rFonts w:ascii="Arial" w:cs="Arial" w:eastAsia="Arial" w:hAnsi="Arial"/>
@@ -13790,7 +13790,7 @@
             <w:pPr>
               <w:spacing w:after="20" w:before="0"/>
             </w:pPr>
-            <w:hyperlink w:history="1" r:id="rIdanj0sdzzk6o34pqlbmmhc">
+            <w:hyperlink w:history="1" r:id="rIdit7env6n5lv2a9pshxu02">
               <w:r>
                 <w:rPr>
                   <w:rFonts w:ascii="Arial" w:cs="Arial" w:eastAsia="Arial" w:hAnsi="Arial"/>
@@ -13823,7 +13823,7 @@
               <w:spacing w:after="10" w:before="0"/>
               <w:ind w:left="120"/>
             </w:pPr>
-            <w:hyperlink w:history="1" r:id="rIdwcyavbxxvpbv8kd45nrmm">
+            <w:hyperlink w:history="1" r:id="rIdygup8dckabb2fisx30mew">
               <w:r>
                 <w:rPr>
                   <w:rFonts w:ascii="Arial" w:cs="Arial" w:eastAsia="Arial" w:hAnsi="Arial"/>
@@ -13868,7 +13868,7 @@
             <w:pPr>
               <w:spacing w:after="20" w:before="0"/>
             </w:pPr>
-            <w:hyperlink w:history="1" r:id="rIdyzrjtqmxtxqocue-94ojf">
+            <w:hyperlink w:history="1" r:id="rId_di0s9epurldm3isfvomd">
               <w:r>
                 <w:rPr>
                   <w:rFonts w:ascii="Arial" w:cs="Arial" w:eastAsia="Arial" w:hAnsi="Arial"/>
@@ -13901,7 +13901,7 @@
               <w:spacing w:after="10" w:before="0"/>
               <w:ind w:left="120"/>
             </w:pPr>
-            <w:hyperlink w:history="1" r:id="rIdxwgvcwkmtapnmtmnsfnvz">
+            <w:hyperlink w:history="1" r:id="rIdlkiwx5v0tpp4uascmmqle">
               <w:r>
                 <w:rPr>
                   <w:rFonts w:ascii="Arial" w:cs="Arial" w:eastAsia="Arial" w:hAnsi="Arial"/>
@@ -14096,7 +14096,7 @@
             <w:pPr>
               <w:spacing w:after="20" w:before="0"/>
             </w:pPr>
-            <w:hyperlink w:history="1" r:id="rIdh_nynmco-1ccvz-ngszdj">
+            <w:hyperlink w:history="1" r:id="rIdon0b1lxg75nozfzcfbkum">
               <w:r>
                 <w:rPr>
                   <w:rFonts w:ascii="Arial" w:cs="Arial" w:eastAsia="Arial" w:hAnsi="Arial"/>
@@ -14129,7 +14129,7 @@
               <w:spacing w:after="10" w:before="0"/>
               <w:ind w:left="120"/>
             </w:pPr>
-            <w:hyperlink w:history="1" r:id="rIdxz8z-g4zldqdu-f5ayh2i">
+            <w:hyperlink w:history="1" r:id="rIdhbl-tfb4x4qvwiicnibxq">
               <w:r>
                 <w:rPr>
                   <w:rFonts w:ascii="Arial" w:cs="Arial" w:eastAsia="Arial" w:hAnsi="Arial"/>
@@ -14174,7 +14174,7 @@
             <w:pPr>
               <w:spacing w:after="20" w:before="0"/>
             </w:pPr>
-            <w:hyperlink w:history="1" r:id="rIdlec93qiltdqwaz3kvipcf">
+            <w:hyperlink w:history="1" r:id="rIdpsldz7s14n4mhhcnnyt93">
               <w:r>
                 <w:rPr>
                   <w:rFonts w:ascii="Arial" w:cs="Arial" w:eastAsia="Arial" w:hAnsi="Arial"/>
@@ -14207,7 +14207,7 @@
               <w:spacing w:after="10" w:before="0"/>
               <w:ind w:left="120"/>
             </w:pPr>
-            <w:hyperlink w:history="1" r:id="rIdmeklpattc_tlzb4wteerc">
+            <w:hyperlink w:history="1" r:id="rIdtasushm7rb-qpgq4tbrfy">
               <w:r>
                 <w:rPr>
                   <w:rFonts w:ascii="Arial" w:cs="Arial" w:eastAsia="Arial" w:hAnsi="Arial"/>
@@ -14719,7 +14719,7 @@
         </w:rPr>
         <w:t xml:space="preserve">© 2026 SeaVuria and ARES. Aligned with KICD objectives. Developed by SeaVuria; technical implementation by ARES (with AI assistance from Claude). Licensed under </w:t>
       </w:r>
-      <w:hyperlink w:history="1" r:id="rIdva6bmlkl95p8dxujawzog">
+      <w:hyperlink w:history="1" r:id="rIdoekjn5jgtwgr-zwwqyyty">
         <w:r>
           <w:rPr>
             <w:rFonts w:ascii="Arial" w:cs="Arial" w:eastAsia="Arial" w:hAnsi="Arial"/>
@@ -14740,7 +14740,7 @@
         </w:rPr>
         <w:t xml:space="preserve"> (</w:t>
       </w:r>
-      <w:hyperlink w:history="1" r:id="rIdnsnujzj4y_hrq_nhdi_sd">
+      <w:hyperlink w:history="1" r:id="rIdbtq-nkw1vkdu3nxlvbren">
         <w:r>
           <w:rPr>
             <w:rFonts w:ascii="Arial" w:cs="Arial" w:eastAsia="Arial" w:hAnsi="Arial"/>
@@ -15753,7 +15753,7 @@
             <w:pPr>
               <w:spacing w:after="20" w:before="0"/>
             </w:pPr>
-            <w:hyperlink w:history="1" r:id="rIde64lrnirahbu_elxxston">
+            <w:hyperlink w:history="1" r:id="rIdzf-4cvp2-qzsblcv7ah4t">
               <w:r>
                 <w:rPr>
                   <w:rFonts w:ascii="Arial" w:cs="Arial" w:eastAsia="Arial" w:hAnsi="Arial"/>
@@ -15786,7 +15786,7 @@
               <w:spacing w:after="10" w:before="0"/>
               <w:ind w:left="120"/>
             </w:pPr>
-            <w:hyperlink w:history="1" r:id="rIde87vpathgrep3dnlape9s">
+            <w:hyperlink w:history="1" r:id="rIdmsenaw8kqixtijbijv8n0">
               <w:r>
                 <w:rPr>
                   <w:rFonts w:ascii="Arial" w:cs="Arial" w:eastAsia="Arial" w:hAnsi="Arial"/>
@@ -15831,7 +15831,7 @@
             <w:pPr>
               <w:spacing w:after="20" w:before="0"/>
             </w:pPr>
-            <w:hyperlink w:history="1" r:id="rId-ywgcj5qx0o3pitxdxqr4">
+            <w:hyperlink w:history="1" r:id="rId2uku6k6sf_tax6fz9t-yr">
               <w:r>
                 <w:rPr>
                   <w:rFonts w:ascii="Arial" w:cs="Arial" w:eastAsia="Arial" w:hAnsi="Arial"/>
@@ -15864,7 +15864,7 @@
               <w:spacing w:after="10" w:before="0"/>
               <w:ind w:left="120"/>
             </w:pPr>
-            <w:hyperlink w:history="1" r:id="rIdrx0bes15en0xclmglop_f">
+            <w:hyperlink w:history="1" r:id="rIdv_1w0kcrhde2zr8swdixe">
               <w:r>
                 <w:rPr>
                   <w:rFonts w:ascii="Arial" w:cs="Arial" w:eastAsia="Arial" w:hAnsi="Arial"/>
@@ -16059,7 +16059,7 @@
             <w:pPr>
               <w:spacing w:after="20" w:before="0"/>
             </w:pPr>
-            <w:hyperlink w:history="1" r:id="rIdtrkhx_lnnf_jme47i4_lb">
+            <w:hyperlink w:history="1" r:id="rIdvjce1pqviyt5mulwew6mq">
               <w:r>
                 <w:rPr>
                   <w:rFonts w:ascii="Arial" w:cs="Arial" w:eastAsia="Arial" w:hAnsi="Arial"/>
@@ -16092,7 +16092,7 @@
               <w:spacing w:after="10" w:before="0"/>
               <w:ind w:left="120"/>
             </w:pPr>
-            <w:hyperlink w:history="1" r:id="rIdyknisz73jix2cy9c2ju2v">
+            <w:hyperlink w:history="1" r:id="rIdv2owytwl8sxaevja31dml">
               <w:r>
                 <w:rPr>
                   <w:rFonts w:ascii="Arial" w:cs="Arial" w:eastAsia="Arial" w:hAnsi="Arial"/>
@@ -16137,7 +16137,7 @@
             <w:pPr>
               <w:spacing w:after="20" w:before="0"/>
             </w:pPr>
-            <w:hyperlink w:history="1" r:id="rIduijx8cwvz20nlbc8vivfr">
+            <w:hyperlink w:history="1" r:id="rIdq2hy1eltdhrri1tqsugqn">
               <w:r>
                 <w:rPr>
                   <w:rFonts w:ascii="Arial" w:cs="Arial" w:eastAsia="Arial" w:hAnsi="Arial"/>
@@ -16170,7 +16170,7 @@
               <w:spacing w:after="10" w:before="0"/>
               <w:ind w:left="120"/>
             </w:pPr>
-            <w:hyperlink w:history="1" r:id="rIdafh4adha55_ro7z_sfhfv">
+            <w:hyperlink w:history="1" r:id="rIdapblq_br74gjq5md-2-ct">
               <w:r>
                 <w:rPr>
                   <w:rFonts w:ascii="Arial" w:cs="Arial" w:eastAsia="Arial" w:hAnsi="Arial"/>
@@ -16365,7 +16365,7 @@
             <w:pPr>
               <w:spacing w:after="20" w:before="0"/>
             </w:pPr>
-            <w:hyperlink w:history="1" r:id="rId2qex9kscz-frh-d1iauor">
+            <w:hyperlink w:history="1" r:id="rIdx7d3sb41z1_xy5kwahha6">
               <w:r>
                 <w:rPr>
                   <w:rFonts w:ascii="Arial" w:cs="Arial" w:eastAsia="Arial" w:hAnsi="Arial"/>
@@ -16398,7 +16398,7 @@
               <w:spacing w:after="10" w:before="0"/>
               <w:ind w:left="120"/>
             </w:pPr>
-            <w:hyperlink w:history="1" r:id="rIdk-czm_fd7nban2vr6vblq">
+            <w:hyperlink w:history="1" r:id="rIdshjh52h19d9rkpkdhmluz">
               <w:r>
                 <w:rPr>
                   <w:rFonts w:ascii="Arial" w:cs="Arial" w:eastAsia="Arial" w:hAnsi="Arial"/>
@@ -16443,7 +16443,7 @@
             <w:pPr>
               <w:spacing w:after="20" w:before="0"/>
             </w:pPr>
-            <w:hyperlink w:history="1" r:id="rId3u_0wylrmvdj_ak2wu6n0">
+            <w:hyperlink w:history="1" r:id="rIdbpc3nsedqxn91ohawim6f">
               <w:r>
                 <w:rPr>
                   <w:rFonts w:ascii="Arial" w:cs="Arial" w:eastAsia="Arial" w:hAnsi="Arial"/>
@@ -16492,7 +16492,7 @@
               <w:spacing w:after="10" w:before="0"/>
               <w:ind w:left="120"/>
             </w:pPr>
-            <w:hyperlink w:history="1" r:id="rId8bdksntx5iozwkzka4k8v">
+            <w:hyperlink w:history="1" r:id="rIdzy6yl_bbu4l--hum1nufj">
               <w:r>
                 <w:rPr>
                   <w:rFonts w:ascii="Arial" w:cs="Arial" w:eastAsia="Arial" w:hAnsi="Arial"/>
@@ -16687,7 +16687,7 @@
             <w:pPr>
               <w:spacing w:after="20" w:before="0"/>
             </w:pPr>
-            <w:hyperlink w:history="1" r:id="rIdesaviuzjxrq6pnl2-csis">
+            <w:hyperlink w:history="1" r:id="rIdqw-k0hjhftqwoi0qixw8n">
               <w:r>
                 <w:rPr>
                   <w:rFonts w:ascii="Arial" w:cs="Arial" w:eastAsia="Arial" w:hAnsi="Arial"/>
@@ -16720,7 +16720,7 @@
               <w:spacing w:after="10" w:before="0"/>
               <w:ind w:left="120"/>
             </w:pPr>
-            <w:hyperlink w:history="1" r:id="rIdbkk1y2mspdnycohswpsct">
+            <w:hyperlink w:history="1" r:id="rIdtqo99bkij2jwhcwq0rwcu">
               <w:r>
                 <w:rPr>
                   <w:rFonts w:ascii="Arial" w:cs="Arial" w:eastAsia="Arial" w:hAnsi="Arial"/>
@@ -16765,7 +16765,7 @@
             <w:pPr>
               <w:spacing w:after="20" w:before="0"/>
             </w:pPr>
-            <w:hyperlink w:history="1" r:id="rId5j7hw0bucc9ghqri0ov1q">
+            <w:hyperlink w:history="1" r:id="rIdm-rihmfgvdzlgzqy9spow">
               <w:r>
                 <w:rPr>
                   <w:rFonts w:ascii="Arial" w:cs="Arial" w:eastAsia="Arial" w:hAnsi="Arial"/>
@@ -16814,7 +16814,7 @@
               <w:spacing w:after="10" w:before="0"/>
               <w:ind w:left="120"/>
             </w:pPr>
-            <w:hyperlink w:history="1" r:id="rId1cao6pfahwee6vbvqz-kk">
+            <w:hyperlink w:history="1" r:id="rIdkpazhoktn23m3eif6ilff">
               <w:r>
                 <w:rPr>
                   <w:rFonts w:ascii="Arial" w:cs="Arial" w:eastAsia="Arial" w:hAnsi="Arial"/>
@@ -17009,7 +17009,7 @@
             <w:pPr>
               <w:spacing w:after="20" w:before="0"/>
             </w:pPr>
-            <w:hyperlink w:history="1" r:id="rIdq5zrio8zzjamoczcvaoz3">
+            <w:hyperlink w:history="1" r:id="rIduz51trxrijzfymsgadv7d">
               <w:r>
                 <w:rPr>
                   <w:rFonts w:ascii="Arial" w:cs="Arial" w:eastAsia="Arial" w:hAnsi="Arial"/>
@@ -17058,7 +17058,7 @@
               <w:spacing w:after="10" w:before="0"/>
               <w:ind w:left="120"/>
             </w:pPr>
-            <w:hyperlink w:history="1" r:id="rId_kiihrkdtudveddn2vfxq">
+            <w:hyperlink w:history="1" r:id="rId0q3escn05vqwsvujgdy5c">
               <w:r>
                 <w:rPr>
                   <w:rFonts w:ascii="Arial" w:cs="Arial" w:eastAsia="Arial" w:hAnsi="Arial"/>
@@ -17103,7 +17103,7 @@
             <w:pPr>
               <w:spacing w:after="20" w:before="0"/>
             </w:pPr>
-            <w:hyperlink w:history="1" r:id="rIdyiimphccrjeqhla67ggzk">
+            <w:hyperlink w:history="1" r:id="rIdvyud0iu9583hcnbxga9qr">
               <w:r>
                 <w:rPr>
                   <w:rFonts w:ascii="Arial" w:cs="Arial" w:eastAsia="Arial" w:hAnsi="Arial"/>
@@ -17152,7 +17152,7 @@
               <w:spacing w:after="10" w:before="0"/>
               <w:ind w:left="120"/>
             </w:pPr>
-            <w:hyperlink w:history="1" r:id="rIdf6a1utnxlrjw25fwwpt3y">
+            <w:hyperlink w:history="1" r:id="rIdlbpn8jwjijjqoce9esmam">
               <w:r>
                 <w:rPr>
                   <w:rFonts w:ascii="Arial" w:cs="Arial" w:eastAsia="Arial" w:hAnsi="Arial"/>
@@ -17664,7 +17664,7 @@
         </w:rPr>
         <w:t xml:space="preserve">© 2026 SeaVuria and ARES. Aligned with KICD objectives. Developed by SeaVuria; technical implementation by ARES (with AI assistance from Claude). Licensed under </w:t>
       </w:r>
-      <w:hyperlink w:history="1" r:id="rIduea7px6zf_ythcg-a7gf6">
+      <w:hyperlink w:history="1" r:id="rId-xjq_o-8kabdf7w61ednc">
         <w:r>
           <w:rPr>
             <w:rFonts w:ascii="Arial" w:cs="Arial" w:eastAsia="Arial" w:hAnsi="Arial"/>
@@ -17685,7 +17685,7 @@
         </w:rPr>
         <w:t xml:space="preserve"> (</w:t>
       </w:r>
-      <w:hyperlink w:history="1" r:id="rIdmeea31shwa0mzhlre6yvy">
+      <w:hyperlink w:history="1" r:id="rIdlaldp2sic2snf3v0pgpm8">
         <w:r>
           <w:rPr>
             <w:rFonts w:ascii="Arial" w:cs="Arial" w:eastAsia="Arial" w:hAnsi="Arial"/>
@@ -18698,7 +18698,7 @@
             <w:pPr>
               <w:spacing w:after="20" w:before="0"/>
             </w:pPr>
-            <w:hyperlink w:history="1" r:id="rIdqp3mppilduxlpwd4phdv7">
+            <w:hyperlink w:history="1" r:id="rIdxl_yjy0bqa4d56bbnm0hn">
               <w:r>
                 <w:rPr>
                   <w:rFonts w:ascii="Arial" w:cs="Arial" w:eastAsia="Arial" w:hAnsi="Arial"/>
@@ -18747,7 +18747,7 @@
               <w:spacing w:after="10" w:before="0"/>
               <w:ind w:left="120"/>
             </w:pPr>
-            <w:hyperlink w:history="1" r:id="rIdjh_kpz0skqlwvlbzhulzg">
+            <w:hyperlink w:history="1" r:id="rIdy7s0gvwexxj-gnrcpeafh">
               <w:r>
                 <w:rPr>
                   <w:rFonts w:ascii="Arial" w:cs="Arial" w:eastAsia="Arial" w:hAnsi="Arial"/>
@@ -18792,7 +18792,7 @@
             <w:pPr>
               <w:spacing w:after="20" w:before="0"/>
             </w:pPr>
-            <w:hyperlink w:history="1" r:id="rId6pkdl-jyxcxn3v58uumoq">
+            <w:hyperlink w:history="1" r:id="rIdtsc4csscoulwryve94cee">
               <w:r>
                 <w:rPr>
                   <w:rFonts w:ascii="Arial" w:cs="Arial" w:eastAsia="Arial" w:hAnsi="Arial"/>
@@ -18825,7 +18825,7 @@
               <w:spacing w:after="10" w:before="0"/>
               <w:ind w:left="120"/>
             </w:pPr>
-            <w:hyperlink w:history="1" r:id="rIdb033rmc661crjxhhb6wbe">
+            <w:hyperlink w:history="1" r:id="rIdjslgwgu_7ojyz-amlr6a5">
               <w:r>
                 <w:rPr>
                   <w:rFonts w:ascii="Arial" w:cs="Arial" w:eastAsia="Arial" w:hAnsi="Arial"/>
@@ -19020,7 +19020,7 @@
             <w:pPr>
               <w:spacing w:after="20" w:before="0"/>
             </w:pPr>
-            <w:hyperlink w:history="1" r:id="rIdzsg0kx6rnjx2k4buf0rd_">
+            <w:hyperlink w:history="1" r:id="rIdcvpugx3ija2pvbxgoowen">
               <w:r>
                 <w:rPr>
                   <w:rFonts w:ascii="Arial" w:cs="Arial" w:eastAsia="Arial" w:hAnsi="Arial"/>
@@ -19069,7 +19069,7 @@
               <w:spacing w:after="10" w:before="0"/>
               <w:ind w:left="120"/>
             </w:pPr>
-            <w:hyperlink w:history="1" r:id="rIdkvamkvrjtvyoaoqfl2i15">
+            <w:hyperlink w:history="1" r:id="rIdz7eantenwqgsgzmnsscsd">
               <w:r>
                 <w:rPr>
                   <w:rFonts w:ascii="Arial" w:cs="Arial" w:eastAsia="Arial" w:hAnsi="Arial"/>
@@ -19114,7 +19114,7 @@
             <w:pPr>
               <w:spacing w:after="20" w:before="0"/>
             </w:pPr>
-            <w:hyperlink w:history="1" r:id="rIdnwo_5mand8o4kvz90_7lf">
+            <w:hyperlink w:history="1" r:id="rIdcb57mikradv_nh-o-3bng">
               <w:r>
                 <w:rPr>
                   <w:rFonts w:ascii="Arial" w:cs="Arial" w:eastAsia="Arial" w:hAnsi="Arial"/>
@@ -19147,7 +19147,7 @@
               <w:spacing w:after="10" w:before="0"/>
               <w:ind w:left="120"/>
             </w:pPr>
-            <w:hyperlink w:history="1" r:id="rIdb8exbmb6kh5gcorz4avk3">
+            <w:hyperlink w:history="1" r:id="rIdjedpq_-4jgnn_updyqnjh">
               <w:r>
                 <w:rPr>
                   <w:rFonts w:ascii="Arial" w:cs="Arial" w:eastAsia="Arial" w:hAnsi="Arial"/>
@@ -19342,7 +19342,7 @@
             <w:pPr>
               <w:spacing w:after="20" w:before="0"/>
             </w:pPr>
-            <w:hyperlink w:history="1" r:id="rIdmlv57drlybuzq36bo4dp-">
+            <w:hyperlink w:history="1" r:id="rIdil8lae0ltzyzzs_izhnpp">
               <w:r>
                 <w:rPr>
                   <w:rFonts w:ascii="Arial" w:cs="Arial" w:eastAsia="Arial" w:hAnsi="Arial"/>
@@ -19391,7 +19391,7 @@
               <w:spacing w:after="10" w:before="0"/>
               <w:ind w:left="120"/>
             </w:pPr>
-            <w:hyperlink w:history="1" r:id="rIdduigznqbebydu3kgak0pr">
+            <w:hyperlink w:history="1" r:id="rIdkazxgv8gyr-ccoatiqqtt">
               <w:r>
                 <w:rPr>
                   <w:rFonts w:ascii="Arial" w:cs="Arial" w:eastAsia="Arial" w:hAnsi="Arial"/>
@@ -19436,7 +19436,7 @@
             <w:pPr>
               <w:spacing w:after="20" w:before="0"/>
             </w:pPr>
-            <w:hyperlink w:history="1" r:id="rIdlyjohbvxpccqnvbevpdnn">
+            <w:hyperlink w:history="1" r:id="rId5jc98bgbun1yl_tiptcnn">
               <w:r>
                 <w:rPr>
                   <w:rFonts w:ascii="Arial" w:cs="Arial" w:eastAsia="Arial" w:hAnsi="Arial"/>
@@ -19469,7 +19469,7 @@
               <w:spacing w:after="10" w:before="0"/>
               <w:ind w:left="120"/>
             </w:pPr>
-            <w:hyperlink w:history="1" r:id="rIdg_xmoxxmvqxlmipo6glnp">
+            <w:hyperlink w:history="1" r:id="rIdqhurfbmuc9pe8w8kkzorg">
               <w:r>
                 <w:rPr>
                   <w:rFonts w:ascii="Arial" w:cs="Arial" w:eastAsia="Arial" w:hAnsi="Arial"/>
@@ -19664,7 +19664,7 @@
             <w:pPr>
               <w:spacing w:after="20" w:before="0"/>
             </w:pPr>
-            <w:hyperlink w:history="1" r:id="rIduv4gwlt5i--ddcifwaz3v">
+            <w:hyperlink w:history="1" r:id="rId89ehys5v_c0mjdyghsbk-">
               <w:r>
                 <w:rPr>
                   <w:rFonts w:ascii="Arial" w:cs="Arial" w:eastAsia="Arial" w:hAnsi="Arial"/>
@@ -19713,7 +19713,7 @@
               <w:spacing w:after="10" w:before="0"/>
               <w:ind w:left="120"/>
             </w:pPr>
-            <w:hyperlink w:history="1" r:id="rIdszsoz2n3lv1zr22-roijs">
+            <w:hyperlink w:history="1" r:id="rIdl5ky-icypzlqetot8y6c4">
               <w:r>
                 <w:rPr>
                   <w:rFonts w:ascii="Arial" w:cs="Arial" w:eastAsia="Arial" w:hAnsi="Arial"/>
@@ -19758,7 +19758,7 @@
             <w:pPr>
               <w:spacing w:after="20" w:before="0"/>
             </w:pPr>
-            <w:hyperlink w:history="1" r:id="rIdglo4tdvtaaf6nkolskjhl">
+            <w:hyperlink w:history="1" r:id="rIdccmc0hvh51qx1ohcwdrti">
               <w:r>
                 <w:rPr>
                   <w:rFonts w:ascii="Arial" w:cs="Arial" w:eastAsia="Arial" w:hAnsi="Arial"/>
@@ -19791,7 +19791,7 @@
               <w:spacing w:after="10" w:before="0"/>
               <w:ind w:left="120"/>
             </w:pPr>
-            <w:hyperlink w:history="1" r:id="rIdnvgtofske5msrcdwhswwy">
+            <w:hyperlink w:history="1" r:id="rId11mddrrrdadnqkhwz7iyh">
               <w:r>
                 <w:rPr>
                   <w:rFonts w:ascii="Arial" w:cs="Arial" w:eastAsia="Arial" w:hAnsi="Arial"/>
@@ -19986,7 +19986,7 @@
             <w:pPr>
               <w:spacing w:after="20" w:before="0"/>
             </w:pPr>
-            <w:hyperlink w:history="1" r:id="rIdyicss5u_wi8-_tz4kcqg4">
+            <w:hyperlink w:history="1" r:id="rIdhjogyduzlhttq1yfvgpkl">
               <w:r>
                 <w:rPr>
                   <w:rFonts w:ascii="Arial" w:cs="Arial" w:eastAsia="Arial" w:hAnsi="Arial"/>
@@ -20035,7 +20035,7 @@
               <w:spacing w:after="10" w:before="0"/>
               <w:ind w:left="120"/>
             </w:pPr>
-            <w:hyperlink w:history="1" r:id="rIdfeaz8whuhctc_4pcelv4_">
+            <w:hyperlink w:history="1" r:id="rIdbkvqsrymh6q2x_bmsmhjc">
               <w:r>
                 <w:rPr>
                   <w:rFonts w:ascii="Arial" w:cs="Arial" w:eastAsia="Arial" w:hAnsi="Arial"/>
@@ -20080,7 +20080,7 @@
             <w:pPr>
               <w:spacing w:after="20" w:before="0"/>
             </w:pPr>
-            <w:hyperlink w:history="1" r:id="rIdgixqdcan3was4x6npsgna">
+            <w:hyperlink w:history="1" r:id="rIdbwx1t-kvqtgmgdalsc5kw">
               <w:r>
                 <w:rPr>
                   <w:rFonts w:ascii="Arial" w:cs="Arial" w:eastAsia="Arial" w:hAnsi="Arial"/>
@@ -20113,7 +20113,7 @@
               <w:spacing w:after="10" w:before="0"/>
               <w:ind w:left="120"/>
             </w:pPr>
-            <w:hyperlink w:history="1" r:id="rIdb8y_agzcubjyieqeuhgzz">
+            <w:hyperlink w:history="1" r:id="rIdsfuwzkczxaffan9jwkbf1">
               <w:r>
                 <w:rPr>
                   <w:rFonts w:ascii="Arial" w:cs="Arial" w:eastAsia="Arial" w:hAnsi="Arial"/>
@@ -20720,7 +20720,7 @@
         </w:rPr>
         <w:t xml:space="preserve">© 2026 SeaVuria and ARES. Aligned with KICD objectives. Developed by SeaVuria; technical implementation by ARES (with AI assistance from Claude). Licensed under </w:t>
       </w:r>
-      <w:hyperlink w:history="1" r:id="rIdzn6r0dnl2t35hbetyy3xp">
+      <w:hyperlink w:history="1" r:id="rIdisrhepgewrtn3krd3btrq">
         <w:r>
           <w:rPr>
             <w:rFonts w:ascii="Arial" w:cs="Arial" w:eastAsia="Arial" w:hAnsi="Arial"/>
@@ -20741,7 +20741,7 @@
         </w:rPr>
         <w:t xml:space="preserve"> (</w:t>
       </w:r>
-      <w:hyperlink w:history="1" r:id="rIde3qcjjfl89sh5rftwks5k">
+      <w:hyperlink w:history="1" r:id="rIdk07kqq-4-vxb9c1buhpk4">
         <w:r>
           <w:rPr>
             <w:rFonts w:ascii="Arial" w:cs="Arial" w:eastAsia="Arial" w:hAnsi="Arial"/>
@@ -21754,7 +21754,7 @@
             <w:pPr>
               <w:spacing w:after="20" w:before="0"/>
             </w:pPr>
-            <w:hyperlink w:history="1" r:id="rIddofyp7t9vnsjrxbhd_kuu">
+            <w:hyperlink w:history="1" r:id="rIdz4wtp1zlki-rapdwahmun">
               <w:r>
                 <w:rPr>
                   <w:rFonts w:ascii="Arial" w:cs="Arial" w:eastAsia="Arial" w:hAnsi="Arial"/>
@@ -21787,7 +21787,7 @@
               <w:spacing w:after="10" w:before="0"/>
               <w:ind w:left="120"/>
             </w:pPr>
-            <w:hyperlink w:history="1" r:id="rIdrj6hlhyes9qfcfe-4hxv1">
+            <w:hyperlink w:history="1" r:id="rIdyh-qzip56eibahae-spsp">
               <w:r>
                 <w:rPr>
                   <w:rFonts w:ascii="Arial" w:cs="Arial" w:eastAsia="Arial" w:hAnsi="Arial"/>
@@ -21832,7 +21832,7 @@
             <w:pPr>
               <w:spacing w:after="20" w:before="0"/>
             </w:pPr>
-            <w:hyperlink w:history="1" r:id="rIdqngxp5mnfory7ips6vhva">
+            <w:hyperlink w:history="1" r:id="rId3i-ecuqs6lvtsqmwwdtrt">
               <w:r>
                 <w:rPr>
                   <w:rFonts w:ascii="Arial" w:cs="Arial" w:eastAsia="Arial" w:hAnsi="Arial"/>
@@ -21865,7 +21865,7 @@
               <w:spacing w:after="10" w:before="0"/>
               <w:ind w:left="120"/>
             </w:pPr>
-            <w:hyperlink w:history="1" r:id="rIdnct-czsnibevgsdvxenjq">
+            <w:hyperlink w:history="1" r:id="rIddlwbxiljadey7treuo1fa">
               <w:r>
                 <w:rPr>
                   <w:rFonts w:ascii="Arial" w:cs="Arial" w:eastAsia="Arial" w:hAnsi="Arial"/>
@@ -22060,7 +22060,7 @@
             <w:pPr>
               <w:spacing w:after="20" w:before="0"/>
             </w:pPr>
-            <w:hyperlink w:history="1" r:id="rIdmgmgfzfxjaqzzxbeaks7y">
+            <w:hyperlink w:history="1" r:id="rIdhqa5cvyswu-ufdhm8vjsr">
               <w:r>
                 <w:rPr>
                   <w:rFonts w:ascii="Arial" w:cs="Arial" w:eastAsia="Arial" w:hAnsi="Arial"/>
@@ -22093,7 +22093,7 @@
               <w:spacing w:after="10" w:before="0"/>
               <w:ind w:left="120"/>
             </w:pPr>
-            <w:hyperlink w:history="1" r:id="rIdu4a8e_k5aae26cfglwwu1">
+            <w:hyperlink w:history="1" r:id="rId2xvwh6i0alaqksx413v15">
               <w:r>
                 <w:rPr>
                   <w:rFonts w:ascii="Arial" w:cs="Arial" w:eastAsia="Arial" w:hAnsi="Arial"/>
@@ -22138,7 +22138,7 @@
             <w:pPr>
               <w:spacing w:after="20" w:before="0"/>
             </w:pPr>
-            <w:hyperlink w:history="1" r:id="rIdptyolkdxrsgornxmdscbv">
+            <w:hyperlink w:history="1" r:id="rIdftovpcsbrj11resjvqeof">
               <w:r>
                 <w:rPr>
                   <w:rFonts w:ascii="Arial" w:cs="Arial" w:eastAsia="Arial" w:hAnsi="Arial"/>
@@ -22171,7 +22171,7 @@
               <w:spacing w:after="10" w:before="0"/>
               <w:ind w:left="120"/>
             </w:pPr>
-            <w:hyperlink w:history="1" r:id="rId0nqjkv_kwfyml4zwqpbm1">
+            <w:hyperlink w:history="1" r:id="rIdzgblq9gib-bozhspriiqs">
               <w:r>
                 <w:rPr>
                   <w:rFonts w:ascii="Arial" w:cs="Arial" w:eastAsia="Arial" w:hAnsi="Arial"/>
@@ -22366,7 +22366,7 @@
             <w:pPr>
               <w:spacing w:after="20" w:before="0"/>
             </w:pPr>
-            <w:hyperlink w:history="1" r:id="rId0p2-qqmdbjrfrbygrkipg">
+            <w:hyperlink w:history="1" r:id="rIdmll0xo4enj2jlv3qxafzy">
               <w:r>
                 <w:rPr>
                   <w:rFonts w:ascii="Arial" w:cs="Arial" w:eastAsia="Arial" w:hAnsi="Arial"/>
@@ -22415,7 +22415,7 @@
               <w:spacing w:after="10" w:before="0"/>
               <w:ind w:left="120"/>
             </w:pPr>
-            <w:hyperlink w:history="1" r:id="rId7tm2rta8rhjcyyxzf-q-g">
+            <w:hyperlink w:history="1" r:id="rIdbt3sqnsxbwxn_49s3eohl">
               <w:r>
                 <w:rPr>
                   <w:rFonts w:ascii="Arial" w:cs="Arial" w:eastAsia="Arial" w:hAnsi="Arial"/>
@@ -22460,7 +22460,7 @@
             <w:pPr>
               <w:spacing w:after="20" w:before="0"/>
             </w:pPr>
-            <w:hyperlink w:history="1" r:id="rId7isbghc9d2eq5cwsx7pii">
+            <w:hyperlink w:history="1" r:id="rIdkr7crspmfcqlpk3ys4n58">
               <w:r>
                 <w:rPr>
                   <w:rFonts w:ascii="Arial" w:cs="Arial" w:eastAsia="Arial" w:hAnsi="Arial"/>
@@ -22509,7 +22509,7 @@
               <w:spacing w:after="10" w:before="0"/>
               <w:ind w:left="120"/>
             </w:pPr>
-            <w:hyperlink w:history="1" r:id="rId9jslhkc16gidvsq-329dw">
+            <w:hyperlink w:history="1" r:id="rId_njwnoxhwk22chnfry0zu">
               <w:r>
                 <w:rPr>
                   <w:rFonts w:ascii="Arial" w:cs="Arial" w:eastAsia="Arial" w:hAnsi="Arial"/>
@@ -22704,7 +22704,7 @@
             <w:pPr>
               <w:spacing w:after="20" w:before="0"/>
             </w:pPr>
-            <w:hyperlink w:history="1" r:id="rIdjnj3g9y2xgvvoxxyax2gm">
+            <w:hyperlink w:history="1" r:id="rIdun61cyshy8ay4pgry_c5z">
               <w:r>
                 <w:rPr>
                   <w:rFonts w:ascii="Arial" w:cs="Arial" w:eastAsia="Arial" w:hAnsi="Arial"/>
@@ -22753,7 +22753,7 @@
               <w:spacing w:after="10" w:before="0"/>
               <w:ind w:left="120"/>
             </w:pPr>
-            <w:hyperlink w:history="1" r:id="rIdzxy0pgupu2_6bddm6mqm7">
+            <w:hyperlink w:history="1" r:id="rIdlya2tec-qiicuud0didpm">
               <w:r>
                 <w:rPr>
                   <w:rFonts w:ascii="Arial" w:cs="Arial" w:eastAsia="Arial" w:hAnsi="Arial"/>
@@ -22798,7 +22798,7 @@
             <w:pPr>
               <w:spacing w:after="20" w:before="0"/>
             </w:pPr>
-            <w:hyperlink w:history="1" r:id="rIdmrd6v-s9jvyojt3ykvj-o">
+            <w:hyperlink w:history="1" r:id="rIdzck3wxremfor6sbyem120">
               <w:r>
                 <w:rPr>
                   <w:rFonts w:ascii="Arial" w:cs="Arial" w:eastAsia="Arial" w:hAnsi="Arial"/>
@@ -22847,7 +22847,7 @@
               <w:spacing w:after="10" w:before="0"/>
               <w:ind w:left="120"/>
             </w:pPr>
-            <w:hyperlink w:history="1" r:id="rIdzqrnnr84fjnvhlxzzcuut">
+            <w:hyperlink w:history="1" r:id="rId-yxexkwace1z3nwf9ehvl">
               <w:r>
                 <w:rPr>
                   <w:rFonts w:ascii="Arial" w:cs="Arial" w:eastAsia="Arial" w:hAnsi="Arial"/>
@@ -23042,7 +23042,7 @@
             <w:pPr>
               <w:spacing w:after="20" w:before="0"/>
             </w:pPr>
-            <w:hyperlink w:history="1" r:id="rIdp23tiqhedbwgvax54muzy">
+            <w:hyperlink w:history="1" r:id="rId_4ytdmwmivtjkypys8e-m">
               <w:r>
                 <w:rPr>
                   <w:rFonts w:ascii="Arial" w:cs="Arial" w:eastAsia="Arial" w:hAnsi="Arial"/>
@@ -23091,7 +23091,7 @@
               <w:spacing w:after="10" w:before="0"/>
               <w:ind w:left="120"/>
             </w:pPr>
-            <w:hyperlink w:history="1" r:id="rIdjz3iry7cbwqdrniiw5xpo">
+            <w:hyperlink w:history="1" r:id="rId43twvicemzaaqqxuklumd">
               <w:r>
                 <w:rPr>
                   <w:rFonts w:ascii="Arial" w:cs="Arial" w:eastAsia="Arial" w:hAnsi="Arial"/>
@@ -23136,7 +23136,7 @@
             <w:pPr>
               <w:spacing w:after="20" w:before="0"/>
             </w:pPr>
-            <w:hyperlink w:history="1" r:id="rIdubbkombd4arxa7spia9o0">
+            <w:hyperlink w:history="1" r:id="rIdxpvnholio8c-ebpe-dwqu">
               <w:r>
                 <w:rPr>
                   <w:rFonts w:ascii="Arial" w:cs="Arial" w:eastAsia="Arial" w:hAnsi="Arial"/>
@@ -23185,7 +23185,7 @@
               <w:spacing w:after="10" w:before="0"/>
               <w:ind w:left="120"/>
             </w:pPr>
-            <w:hyperlink w:history="1" r:id="rId_eikbqkple_hhi_fv3ooi">
+            <w:hyperlink w:history="1" r:id="rIdc0qwavcq638tblk85qqsr">
               <w:r>
                 <w:rPr>
                   <w:rFonts w:ascii="Arial" w:cs="Arial" w:eastAsia="Arial" w:hAnsi="Arial"/>
@@ -23811,7 +23811,7 @@
         </w:rPr>
         <w:t xml:space="preserve">© 2026 SeaVuria and ARES. Aligned with KICD objectives. Developed by SeaVuria; technical implementation by ARES (with AI assistance from Claude). Licensed under </w:t>
       </w:r>
-      <w:hyperlink w:history="1" r:id="rId0mtczvqrlp2htfgalc9jm">
+      <w:hyperlink w:history="1" r:id="rIdwfhi2wmhssu7ldskzsfp-">
         <w:r>
           <w:rPr>
             <w:rFonts w:ascii="Arial" w:cs="Arial" w:eastAsia="Arial" w:hAnsi="Arial"/>
@@ -23832,7 +23832,7 @@
         </w:rPr>
         <w:t xml:space="preserve"> (</w:t>
       </w:r>
-      <w:hyperlink w:history="1" r:id="rIdf6zgxcdgk9moa9g9kfyub">
+      <w:hyperlink w:history="1" r:id="rIds1ii-ipug968qm0pda7sz">
         <w:r>
           <w:rPr>
             <w:rFonts w:ascii="Arial" w:cs="Arial" w:eastAsia="Arial" w:hAnsi="Arial"/>
@@ -24845,7 +24845,7 @@
             <w:pPr>
               <w:spacing w:after="20" w:before="0"/>
             </w:pPr>
-            <w:hyperlink w:history="1" r:id="rIdcndtykbmao-llz5anvbj6">
+            <w:hyperlink w:history="1" r:id="rIdxb2iqfumn1q_bvkjslvrx">
               <w:r>
                 <w:rPr>
                   <w:rFonts w:ascii="Arial" w:cs="Arial" w:eastAsia="Arial" w:hAnsi="Arial"/>
@@ -24878,7 +24878,7 @@
               <w:spacing w:after="10" w:before="0"/>
               <w:ind w:left="120"/>
             </w:pPr>
-            <w:hyperlink w:history="1" r:id="rIdoshd-gcpoe1cowlte8k4c">
+            <w:hyperlink w:history="1" r:id="rId-wceeswws0m66j8f9ukyh">
               <w:r>
                 <w:rPr>
                   <w:rFonts w:ascii="Arial" w:cs="Arial" w:eastAsia="Arial" w:hAnsi="Arial"/>
@@ -24923,7 +24923,7 @@
             <w:pPr>
               <w:spacing w:after="20" w:before="0"/>
             </w:pPr>
-            <w:hyperlink w:history="1" r:id="rId9uj-yiwvymyp0sjzbvhxo">
+            <w:hyperlink w:history="1" r:id="rIdldcpxsl0r9fc02ql4faof">
               <w:r>
                 <w:rPr>
                   <w:rFonts w:ascii="Arial" w:cs="Arial" w:eastAsia="Arial" w:hAnsi="Arial"/>
@@ -24956,7 +24956,7 @@
               <w:spacing w:after="10" w:before="0"/>
               <w:ind w:left="120"/>
             </w:pPr>
-            <w:hyperlink w:history="1" r:id="rId5f_xxq0ly7chjcawevfiv">
+            <w:hyperlink w:history="1" r:id="rIdm45ecqvervzavdir6uox2">
               <w:r>
                 <w:rPr>
                   <w:rFonts w:ascii="Arial" w:cs="Arial" w:eastAsia="Arial" w:hAnsi="Arial"/>
@@ -25151,7 +25151,7 @@
             <w:pPr>
               <w:spacing w:after="20" w:before="0"/>
             </w:pPr>
-            <w:hyperlink w:history="1" r:id="rId0wr3kdtlqjwxqnxxkeepj">
+            <w:hyperlink w:history="1" r:id="rId2fuh_lcy0gsw2lufztjg3">
               <w:r>
                 <w:rPr>
                   <w:rFonts w:ascii="Arial" w:cs="Arial" w:eastAsia="Arial" w:hAnsi="Arial"/>
@@ -25184,7 +25184,7 @@
               <w:spacing w:after="10" w:before="0"/>
               <w:ind w:left="120"/>
             </w:pPr>
-            <w:hyperlink w:history="1" r:id="rId_pexgvtykfs6y3h4tn28w">
+            <w:hyperlink w:history="1" r:id="rId0yqi9oopcu7aebt5q7wym">
               <w:r>
                 <w:rPr>
                   <w:rFonts w:ascii="Arial" w:cs="Arial" w:eastAsia="Arial" w:hAnsi="Arial"/>
@@ -25229,7 +25229,7 @@
             <w:pPr>
               <w:spacing w:after="20" w:before="0"/>
             </w:pPr>
-            <w:hyperlink w:history="1" r:id="rId6-ttwbeibhx8bz6e4tzl_">
+            <w:hyperlink w:history="1" r:id="rIdxsq9luji_ht6_rgf4x0kk">
               <w:r>
                 <w:rPr>
                   <w:rFonts w:ascii="Arial" w:cs="Arial" w:eastAsia="Arial" w:hAnsi="Arial"/>
@@ -25262,7 +25262,7 @@
               <w:spacing w:after="10" w:before="0"/>
               <w:ind w:left="120"/>
             </w:pPr>
-            <w:hyperlink w:history="1" r:id="rIdra1itzfarhbpzve8slbsh">
+            <w:hyperlink w:history="1" r:id="rIdkbhrlrsbrzr33q0xsd3fr">
               <w:r>
                 <w:rPr>
                   <w:rFonts w:ascii="Arial" w:cs="Arial" w:eastAsia="Arial" w:hAnsi="Arial"/>
@@ -25457,7 +25457,7 @@
             <w:pPr>
               <w:spacing w:after="20" w:before="0"/>
             </w:pPr>
-            <w:hyperlink w:history="1" r:id="rIdcj1r0uscq2vsdjmbc50tt">
+            <w:hyperlink w:history="1" r:id="rIdrykvtqthr5on75fiod5zm">
               <w:r>
                 <w:rPr>
                   <w:rFonts w:ascii="Arial" w:cs="Arial" w:eastAsia="Arial" w:hAnsi="Arial"/>
@@ -25490,7 +25490,7 @@
               <w:spacing w:after="10" w:before="0"/>
               <w:ind w:left="120"/>
             </w:pPr>
-            <w:hyperlink w:history="1" r:id="rIdznoty5nqhddk23swop9wi">
+            <w:hyperlink w:history="1" r:id="rIdcrvj1l5onmjgdgwbkdwfb">
               <w:r>
                 <w:rPr>
                   <w:rFonts w:ascii="Arial" w:cs="Arial" w:eastAsia="Arial" w:hAnsi="Arial"/>
@@ -25535,7 +25535,7 @@
             <w:pPr>
               <w:spacing w:after="20" w:before="0"/>
             </w:pPr>
-            <w:hyperlink w:history="1" r:id="rIdawvsrsweilak1plydt1_8">
+            <w:hyperlink w:history="1" r:id="rIdypl2xxoty4nhsj19bhcvf">
               <w:r>
                 <w:rPr>
                   <w:rFonts w:ascii="Arial" w:cs="Arial" w:eastAsia="Arial" w:hAnsi="Arial"/>
@@ -25568,7 +25568,7 @@
               <w:spacing w:after="10" w:before="0"/>
               <w:ind w:left="120"/>
             </w:pPr>
-            <w:hyperlink w:history="1" r:id="rIdfdttwukykwjf_elj3hdfz">
+            <w:hyperlink w:history="1" r:id="rIddq61fyqxha9vfcy91kmq-">
               <w:r>
                 <w:rPr>
                   <w:rFonts w:ascii="Arial" w:cs="Arial" w:eastAsia="Arial" w:hAnsi="Arial"/>
@@ -25763,7 +25763,7 @@
             <w:pPr>
               <w:spacing w:after="20" w:before="0"/>
             </w:pPr>
-            <w:hyperlink w:history="1" r:id="rIdp-lx-3c1rpn9uuysxo--1">
+            <w:hyperlink w:history="1" r:id="rIdectofetmjqogcancpewzw">
               <w:r>
                 <w:rPr>
                   <w:rFonts w:ascii="Arial" w:cs="Arial" w:eastAsia="Arial" w:hAnsi="Arial"/>
@@ -25796,7 +25796,7 @@
               <w:spacing w:after="10" w:before="0"/>
               <w:ind w:left="120"/>
             </w:pPr>
-            <w:hyperlink w:history="1" r:id="rId7imvc8ovibwvlpv8wmyky">
+            <w:hyperlink w:history="1" r:id="rIdwcn_d-gso0vmzcmgbkfqz">
               <w:r>
                 <w:rPr>
                   <w:rFonts w:ascii="Arial" w:cs="Arial" w:eastAsia="Arial" w:hAnsi="Arial"/>
@@ -25841,7 +25841,7 @@
             <w:pPr>
               <w:spacing w:after="20" w:before="0"/>
             </w:pPr>
-            <w:hyperlink w:history="1" r:id="rIdh7tksz1mwpsjx74bryoqq">
+            <w:hyperlink w:history="1" r:id="rIdk1hwj6o1faiisi3nm2lin">
               <w:r>
                 <w:rPr>
                   <w:rFonts w:ascii="Arial" w:cs="Arial" w:eastAsia="Arial" w:hAnsi="Arial"/>
@@ -25874,7 +25874,7 @@
               <w:spacing w:after="10" w:before="0"/>
               <w:ind w:left="120"/>
             </w:pPr>
-            <w:hyperlink w:history="1" r:id="rId_e9ex9othw_wgn3oc_nzs">
+            <w:hyperlink w:history="1" r:id="rIdowmzbcnsuogz_reaavnkb">
               <w:r>
                 <w:rPr>
                   <w:rFonts w:ascii="Arial" w:cs="Arial" w:eastAsia="Arial" w:hAnsi="Arial"/>
@@ -26069,7 +26069,7 @@
             <w:pPr>
               <w:spacing w:after="20" w:before="0"/>
             </w:pPr>
-            <w:hyperlink w:history="1" r:id="rIdo-h_m0yxymzy_qno3gv3b">
+            <w:hyperlink w:history="1" r:id="rIdas68hsxy84idzfeff3qsj">
               <w:r>
                 <w:rPr>
                   <w:rFonts w:ascii="Arial" w:cs="Arial" w:eastAsia="Arial" w:hAnsi="Arial"/>
@@ -26102,7 +26102,7 @@
               <w:spacing w:after="10" w:before="0"/>
               <w:ind w:left="120"/>
             </w:pPr>
-            <w:hyperlink w:history="1" r:id="rIdzkylqk94fhv-lc0avvbgf">
+            <w:hyperlink w:history="1" r:id="rIdxzhgjejlpxtohu75ju00v">
               <w:r>
                 <w:rPr>
                   <w:rFonts w:ascii="Arial" w:cs="Arial" w:eastAsia="Arial" w:hAnsi="Arial"/>
@@ -26147,7 +26147,7 @@
             <w:pPr>
               <w:spacing w:after="20" w:before="0"/>
             </w:pPr>
-            <w:hyperlink w:history="1" r:id="rIdunqyxcjrxmx4svqczfkxj">
+            <w:hyperlink w:history="1" r:id="rIdr0fjqsv5mvuyqradycets">
               <w:r>
                 <w:rPr>
                   <w:rFonts w:ascii="Arial" w:cs="Arial" w:eastAsia="Arial" w:hAnsi="Arial"/>
@@ -26196,7 +26196,7 @@
               <w:spacing w:after="10" w:before="0"/>
               <w:ind w:left="120"/>
             </w:pPr>
-            <w:hyperlink w:history="1" r:id="rIdkgjcutpv1kyg-gwn35d_m">
+            <w:hyperlink w:history="1" r:id="rIdugcpa1exr7phz9yywndtp">
               <w:r>
                 <w:rPr>
                   <w:rFonts w:ascii="Arial" w:cs="Arial" w:eastAsia="Arial" w:hAnsi="Arial"/>
@@ -26803,7 +26803,7 @@
         </w:rPr>
         <w:t xml:space="preserve">© 2026 SeaVuria and ARES. Aligned with KICD objectives. Developed by SeaVuria; technical implementation by ARES (with AI assistance from Claude). Licensed under </w:t>
       </w:r>
-      <w:hyperlink w:history="1" r:id="rId1kfrmakex9ovk7s--uk5g">
+      <w:hyperlink w:history="1" r:id="rIdbmdwd7eh8je8k80gn7x-b">
         <w:r>
           <w:rPr>
             <w:rFonts w:ascii="Arial" w:cs="Arial" w:eastAsia="Arial" w:hAnsi="Arial"/>
@@ -26824,7 +26824,7 @@
         </w:rPr>
         <w:t xml:space="preserve"> (</w:t>
       </w:r>
-      <w:hyperlink w:history="1" r:id="rIdzifxonxm6ucttq0906d6w">
+      <w:hyperlink w:history="1" r:id="rIdmgk114nhvqjaxcczzx4ef">
         <w:r>
           <w:rPr>
             <w:rFonts w:ascii="Arial" w:cs="Arial" w:eastAsia="Arial" w:hAnsi="Arial"/>
@@ -27837,7 +27837,7 @@
             <w:pPr>
               <w:spacing w:after="20" w:before="0"/>
             </w:pPr>
-            <w:hyperlink w:history="1" r:id="rId4oxljkbfogh8rkjxgo29f">
+            <w:hyperlink w:history="1" r:id="rIdqtfhckw28vbgvjkhekjil">
               <w:r>
                 <w:rPr>
                   <w:rFonts w:ascii="Arial" w:cs="Arial" w:eastAsia="Arial" w:hAnsi="Arial"/>
@@ -27886,7 +27886,7 @@
               <w:spacing w:after="10" w:before="0"/>
               <w:ind w:left="120"/>
             </w:pPr>
-            <w:hyperlink w:history="1" r:id="rId5d0w1dkkoqdiujasfisyq">
+            <w:hyperlink w:history="1" r:id="rIdplkjav3dr28x3zun5e9cs">
               <w:r>
                 <w:rPr>
                   <w:rFonts w:ascii="Arial" w:cs="Arial" w:eastAsia="Arial" w:hAnsi="Arial"/>
@@ -27931,7 +27931,7 @@
             <w:pPr>
               <w:spacing w:after="20" w:before="0"/>
             </w:pPr>
-            <w:hyperlink w:history="1" r:id="rId8lsdn4gdvujimep4dz_hb">
+            <w:hyperlink w:history="1" r:id="rIdyvk49dchxis_gvmnl6gqs">
               <w:r>
                 <w:rPr>
                   <w:rFonts w:ascii="Arial" w:cs="Arial" w:eastAsia="Arial" w:hAnsi="Arial"/>
@@ -27980,7 +27980,7 @@
               <w:spacing w:after="10" w:before="0"/>
               <w:ind w:left="120"/>
             </w:pPr>
-            <w:hyperlink w:history="1" r:id="rId_qezzjgktsz1hwv1xoiq6">
+            <w:hyperlink w:history="1" r:id="rIdiostib0fzwubc586jloph">
               <w:r>
                 <w:rPr>
                   <w:rFonts w:ascii="Arial" w:cs="Arial" w:eastAsia="Arial" w:hAnsi="Arial"/>
@@ -28175,7 +28175,7 @@
             <w:pPr>
               <w:spacing w:after="20" w:before="0"/>
             </w:pPr>
-            <w:hyperlink w:history="1" r:id="rIddtnikpymbkkwcqaze0lha">
+            <w:hyperlink w:history="1" r:id="rIdfnauscwtvuf7ymqphuoko">
               <w:r>
                 <w:rPr>
                   <w:rFonts w:ascii="Arial" w:cs="Arial" w:eastAsia="Arial" w:hAnsi="Arial"/>
@@ -28224,7 +28224,7 @@
               <w:spacing w:after="10" w:before="0"/>
               <w:ind w:left="120"/>
             </w:pPr>
-            <w:hyperlink w:history="1" r:id="rId3tsepry-tlrotncsc8u-t">
+            <w:hyperlink w:history="1" r:id="rIdn9k-hbram4rj0k5x0rq2z">
               <w:r>
                 <w:rPr>
                   <w:rFonts w:ascii="Arial" w:cs="Arial" w:eastAsia="Arial" w:hAnsi="Arial"/>
@@ -28269,7 +28269,7 @@
             <w:pPr>
               <w:spacing w:after="20" w:before="0"/>
             </w:pPr>
-            <w:hyperlink w:history="1" r:id="rIdhqa50m96hs29cgife77pf">
+            <w:hyperlink w:history="1" r:id="rIdbiwgvuc5r75rhgi18f9d7">
               <w:r>
                 <w:rPr>
                   <w:rFonts w:ascii="Arial" w:cs="Arial" w:eastAsia="Arial" w:hAnsi="Arial"/>
@@ -28318,7 +28318,7 @@
               <w:spacing w:after="10" w:before="0"/>
               <w:ind w:left="120"/>
             </w:pPr>
-            <w:hyperlink w:history="1" r:id="rIdsluz3zibduwk2pfm4khlj">
+            <w:hyperlink w:history="1" r:id="rIdrqi73ai2kqnaa-sijm3gk">
               <w:r>
                 <w:rPr>
                   <w:rFonts w:ascii="Arial" w:cs="Arial" w:eastAsia="Arial" w:hAnsi="Arial"/>
@@ -28513,7 +28513,7 @@
             <w:pPr>
               <w:spacing w:after="20" w:before="0"/>
             </w:pPr>
-            <w:hyperlink w:history="1" r:id="rIdk_oaqu32uh0pxnhfmqrds">
+            <w:hyperlink w:history="1" r:id="rIdnhlqec_tx6sqx81ynevqa">
               <w:r>
                 <w:rPr>
                   <w:rFonts w:ascii="Arial" w:cs="Arial" w:eastAsia="Arial" w:hAnsi="Arial"/>
@@ -28562,7 +28562,7 @@
               <w:spacing w:after="10" w:before="0"/>
               <w:ind w:left="120"/>
             </w:pPr>
-            <w:hyperlink w:history="1" r:id="rIdpt4nlrokwodxwnvp-sgdc">
+            <w:hyperlink w:history="1" r:id="rId_di9fzpzayyuvnklbwsdb">
               <w:r>
                 <w:rPr>
                   <w:rFonts w:ascii="Arial" w:cs="Arial" w:eastAsia="Arial" w:hAnsi="Arial"/>
@@ -28607,7 +28607,7 @@
             <w:pPr>
               <w:spacing w:after="20" w:before="0"/>
             </w:pPr>
-            <w:hyperlink w:history="1" r:id="rIdx5icmvbshg9vlira62c0o">
+            <w:hyperlink w:history="1" r:id="rIdtnvjl4wwcs8vb0fiiig9z">
               <w:r>
                 <w:rPr>
                   <w:rFonts w:ascii="Arial" w:cs="Arial" w:eastAsia="Arial" w:hAnsi="Arial"/>
@@ -28656,7 +28656,7 @@
               <w:spacing w:after="10" w:before="0"/>
               <w:ind w:left="120"/>
             </w:pPr>
-            <w:hyperlink w:history="1" r:id="rId7gxupelrroqb2mbtw6fi6">
+            <w:hyperlink w:history="1" r:id="rIdceho61l-eucwtaeldeiuz">
               <w:r>
                 <w:rPr>
                   <w:rFonts w:ascii="Arial" w:cs="Arial" w:eastAsia="Arial" w:hAnsi="Arial"/>
@@ -28851,7 +28851,7 @@
             <w:pPr>
               <w:spacing w:after="20" w:before="0"/>
             </w:pPr>
-            <w:hyperlink w:history="1" r:id="rId1xamw1_1zlyw6akkrnmpv">
+            <w:hyperlink w:history="1" r:id="rIdubz06m4ppjhugwlft-_ut">
               <w:r>
                 <w:rPr>
                   <w:rFonts w:ascii="Arial" w:cs="Arial" w:eastAsia="Arial" w:hAnsi="Arial"/>
@@ -28900,7 +28900,7 @@
               <w:spacing w:after="10" w:before="0"/>
               <w:ind w:left="120"/>
             </w:pPr>
-            <w:hyperlink w:history="1" r:id="rIdjuczk6ad70bsvh0jtqbzr">
+            <w:hyperlink w:history="1" r:id="rIdfn0plcw31bwfcx4vhwwqf">
               <w:r>
                 <w:rPr>
                   <w:rFonts w:ascii="Arial" w:cs="Arial" w:eastAsia="Arial" w:hAnsi="Arial"/>
@@ -28945,7 +28945,7 @@
             <w:pPr>
               <w:spacing w:after="20" w:before="0"/>
             </w:pPr>
-            <w:hyperlink w:history="1" r:id="rIdr8oqjuhnifmkw6hoimowa">
+            <w:hyperlink w:history="1" r:id="rId4yv5p4491wslldqwkydgj">
               <w:r>
                 <w:rPr>
                   <w:rFonts w:ascii="Arial" w:cs="Arial" w:eastAsia="Arial" w:hAnsi="Arial"/>
@@ -28994,7 +28994,7 @@
               <w:spacing w:after="10" w:before="0"/>
               <w:ind w:left="120"/>
             </w:pPr>
-            <w:hyperlink w:history="1" r:id="rIdrcch76bdazl21mpkaa5_k">
+            <w:hyperlink w:history="1" r:id="rIdkkszpvhooakbeldliheti">
               <w:r>
                 <w:rPr>
                   <w:rFonts w:ascii="Arial" w:cs="Arial" w:eastAsia="Arial" w:hAnsi="Arial"/>
@@ -29189,7 +29189,7 @@
             <w:pPr>
               <w:spacing w:after="20" w:before="0"/>
             </w:pPr>
-            <w:hyperlink w:history="1" r:id="rIdcp_5_ku43z9pldpk-5ygs">
+            <w:hyperlink w:history="1" r:id="rIdjejwa9lzzlapmjnuaw4-i">
               <w:r>
                 <w:rPr>
                   <w:rFonts w:ascii="Arial" w:cs="Arial" w:eastAsia="Arial" w:hAnsi="Arial"/>
@@ -29238,7 +29238,7 @@
               <w:spacing w:after="10" w:before="0"/>
               <w:ind w:left="120"/>
             </w:pPr>
-            <w:hyperlink w:history="1" r:id="rIdwqnei6_ya5vsnolnvvjwy">
+            <w:hyperlink w:history="1" r:id="rIdbko1bhycfv3mb4rvn_ebh">
               <w:r>
                 <w:rPr>
                   <w:rFonts w:ascii="Arial" w:cs="Arial" w:eastAsia="Arial" w:hAnsi="Arial"/>
@@ -29283,7 +29283,7 @@
             <w:pPr>
               <w:spacing w:after="20" w:before="0"/>
             </w:pPr>
-            <w:hyperlink w:history="1" r:id="rIdsvpmm5yntpusf-uwex7fo">
+            <w:hyperlink w:history="1" r:id="rIdexfqltsh5l58gfnka6ivl">
               <w:r>
                 <w:rPr>
                   <w:rFonts w:ascii="Arial" w:cs="Arial" w:eastAsia="Arial" w:hAnsi="Arial"/>
@@ -29332,7 +29332,7 @@
               <w:spacing w:after="10" w:before="0"/>
               <w:ind w:left="120"/>
             </w:pPr>
-            <w:hyperlink w:history="1" r:id="rId7chh4nnvs5beqn_ehudh9">
+            <w:hyperlink w:history="1" r:id="rIdlaqxqoisgopwhzcxubll-">
               <w:r>
                 <w:rPr>
                   <w:rFonts w:ascii="Arial" w:cs="Arial" w:eastAsia="Arial" w:hAnsi="Arial"/>
@@ -29844,7 +29844,7 @@
         </w:rPr>
         <w:t xml:space="preserve">© 2026 SeaVuria and ARES. Aligned with KICD objectives. Developed by SeaVuria; technical implementation by ARES (with AI assistance from Claude). Licensed under </w:t>
       </w:r>
-      <w:hyperlink w:history="1" r:id="rIdcq00tt0bcmx54s4h18csy">
+      <w:hyperlink w:history="1" r:id="rId4ts4bmnvuxstja94xfun8">
         <w:r>
           <w:rPr>
             <w:rFonts w:ascii="Arial" w:cs="Arial" w:eastAsia="Arial" w:hAnsi="Arial"/>
@@ -29865,7 +29865,7 @@
         </w:rPr>
         <w:t xml:space="preserve"> (</w:t>
       </w:r>
-      <w:hyperlink w:history="1" r:id="rId4xsbhe5xljdkfib_8mlsd">
+      <w:hyperlink w:history="1" r:id="rIduhn9tqo_cihn_s65r4cdt">
         <w:r>
           <w:rPr>
             <w:rFonts w:ascii="Arial" w:cs="Arial" w:eastAsia="Arial" w:hAnsi="Arial"/>
@@ -30878,7 +30878,7 @@
             <w:pPr>
               <w:spacing w:after="20" w:before="0"/>
             </w:pPr>
-            <w:hyperlink w:history="1" r:id="rId9u4nmgfwdosmorfe30tsw">
+            <w:hyperlink w:history="1" r:id="rIdyoyprgfxbcknjgmzsff74">
               <w:r>
                 <w:rPr>
                   <w:rFonts w:ascii="Arial" w:cs="Arial" w:eastAsia="Arial" w:hAnsi="Arial"/>
@@ -30911,7 +30911,7 @@
               <w:spacing w:after="10" w:before="0"/>
               <w:ind w:left="120"/>
             </w:pPr>
-            <w:hyperlink w:history="1" r:id="rIdd6q2ymn_e0zv1t14uwyo9">
+            <w:hyperlink w:history="1" r:id="rId6vd4wxg_euzc-xqky9cty">
               <w:r>
                 <w:rPr>
                   <w:rFonts w:ascii="Arial" w:cs="Arial" w:eastAsia="Arial" w:hAnsi="Arial"/>
@@ -30956,7 +30956,7 @@
             <w:pPr>
               <w:spacing w:after="20" w:before="0"/>
             </w:pPr>
-            <w:hyperlink w:history="1" r:id="rId5yc5gp5reud8qwvonjphb">
+            <w:hyperlink w:history="1" r:id="rIdh-4idsm57qfitghzoj5ze">
               <w:r>
                 <w:rPr>
                   <w:rFonts w:ascii="Arial" w:cs="Arial" w:eastAsia="Arial" w:hAnsi="Arial"/>
@@ -31005,7 +31005,7 @@
               <w:spacing w:after="10" w:before="0"/>
               <w:ind w:left="120"/>
             </w:pPr>
-            <w:hyperlink w:history="1" r:id="rIdv3p7qfpmyofazqg0zdpb2">
+            <w:hyperlink w:history="1" r:id="rIdhx-vufmpeicwdjo-zcusr">
               <w:r>
                 <w:rPr>
                   <w:rFonts w:ascii="Arial" w:cs="Arial" w:eastAsia="Arial" w:hAnsi="Arial"/>
@@ -31200,7 +31200,7 @@
             <w:pPr>
               <w:spacing w:after="20" w:before="0"/>
             </w:pPr>
-            <w:hyperlink w:history="1" r:id="rIdwpvwu9yaz6cbmq5lcesml">
+            <w:hyperlink w:history="1" r:id="rIdzof3gabkw8l0kqob3kbop">
               <w:r>
                 <w:rPr>
                   <w:rFonts w:ascii="Arial" w:cs="Arial" w:eastAsia="Arial" w:hAnsi="Arial"/>
@@ -31233,7 +31233,7 @@
               <w:spacing w:after="10" w:before="0"/>
               <w:ind w:left="120"/>
             </w:pPr>
-            <w:hyperlink w:history="1" r:id="rIdljfk0duub3viv8xafidix">
+            <w:hyperlink w:history="1" r:id="rIdgrws4vsxvn1njgmjgrxqo">
               <w:r>
                 <w:rPr>
                   <w:rFonts w:ascii="Arial" w:cs="Arial" w:eastAsia="Arial" w:hAnsi="Arial"/>
@@ -31278,7 +31278,7 @@
             <w:pPr>
               <w:spacing w:after="20" w:before="0"/>
             </w:pPr>
-            <w:hyperlink w:history="1" r:id="rIdk9y3o292qmllj9w57yvon">
+            <w:hyperlink w:history="1" r:id="rIdplephai1hgkewztwtg_x4">
               <w:r>
                 <w:rPr>
                   <w:rFonts w:ascii="Arial" w:cs="Arial" w:eastAsia="Arial" w:hAnsi="Arial"/>
@@ -31327,7 +31327,7 @@
               <w:spacing w:after="10" w:before="0"/>
               <w:ind w:left="120"/>
             </w:pPr>
-            <w:hyperlink w:history="1" r:id="rIddjj9vlma42fhlm9dx0qaa">
+            <w:hyperlink w:history="1" r:id="rIdyiz-2i8ybqpd2cl4q72td">
               <w:r>
                 <w:rPr>
                   <w:rFonts w:ascii="Arial" w:cs="Arial" w:eastAsia="Arial" w:hAnsi="Arial"/>
@@ -31522,7 +31522,7 @@
             <w:pPr>
               <w:spacing w:after="20" w:before="0"/>
             </w:pPr>
-            <w:hyperlink w:history="1" r:id="rId30hkfassljsgjeufjnx7w">
+            <w:hyperlink w:history="1" r:id="rId10lhytyoodem73nccptjm">
               <w:r>
                 <w:rPr>
                   <w:rFonts w:ascii="Arial" w:cs="Arial" w:eastAsia="Arial" w:hAnsi="Arial"/>
@@ -31571,7 +31571,7 @@
               <w:spacing w:after="10" w:before="0"/>
               <w:ind w:left="120"/>
             </w:pPr>
-            <w:hyperlink w:history="1" r:id="rIdfiyxpk-zyjukt3qtv-4ur">
+            <w:hyperlink w:history="1" r:id="rIdo3bhdjabws5_ogqtkashi">
               <w:r>
                 <w:rPr>
                   <w:rFonts w:ascii="Arial" w:cs="Arial" w:eastAsia="Arial" w:hAnsi="Arial"/>
@@ -31616,7 +31616,7 @@
             <w:pPr>
               <w:spacing w:after="20" w:before="0"/>
             </w:pPr>
-            <w:hyperlink w:history="1" r:id="rIdc6rt_fq0ziorjcu0zp9ed">
+            <w:hyperlink w:history="1" r:id="rIdw8it-lfiarur-gf7akukg">
               <w:r>
                 <w:rPr>
                   <w:rFonts w:ascii="Arial" w:cs="Arial" w:eastAsia="Arial" w:hAnsi="Arial"/>
@@ -31665,7 +31665,7 @@
               <w:spacing w:after="10" w:before="0"/>
               <w:ind w:left="120"/>
             </w:pPr>
-            <w:hyperlink w:history="1" r:id="rIdtg2hmtgz3jabbyysn3ewa">
+            <w:hyperlink w:history="1" r:id="rId82quydno2sdzhk_pahrnn">
               <w:r>
                 <w:rPr>
                   <w:rFonts w:ascii="Arial" w:cs="Arial" w:eastAsia="Arial" w:hAnsi="Arial"/>
@@ -31860,7 +31860,7 @@
             <w:pPr>
               <w:spacing w:after="20" w:before="0"/>
             </w:pPr>
-            <w:hyperlink w:history="1" r:id="rIdumhf90hrns1julzfqwizz">
+            <w:hyperlink w:history="1" r:id="rIdppzx6_czqj2s1-srz0tnt">
               <w:r>
                 <w:rPr>
                   <w:rFonts w:ascii="Arial" w:cs="Arial" w:eastAsia="Arial" w:hAnsi="Arial"/>
@@ -31909,7 +31909,7 @@
               <w:spacing w:after="10" w:before="0"/>
               <w:ind w:left="120"/>
             </w:pPr>
-            <w:hyperlink w:history="1" r:id="rIdbfnnjjauzz8xpetnmkab3">
+            <w:hyperlink w:history="1" r:id="rIddno3zqu_mbj5gebu-2vus">
               <w:r>
                 <w:rPr>
                   <w:rFonts w:ascii="Arial" w:cs="Arial" w:eastAsia="Arial" w:hAnsi="Arial"/>
@@ -31954,7 +31954,7 @@
             <w:pPr>
               <w:spacing w:after="20" w:before="0"/>
             </w:pPr>
-            <w:hyperlink w:history="1" r:id="rId2gnpzsb4nqkgqq3fbof7t">
+            <w:hyperlink w:history="1" r:id="rIdwemfkt8nupnz4-zfvyl0m">
               <w:r>
                 <w:rPr>
                   <w:rFonts w:ascii="Arial" w:cs="Arial" w:eastAsia="Arial" w:hAnsi="Arial"/>
@@ -32003,7 +32003,7 @@
               <w:spacing w:after="10" w:before="0"/>
               <w:ind w:left="120"/>
             </w:pPr>
-            <w:hyperlink w:history="1" r:id="rIdfyvzzcyvkp6snejdqm5fu">
+            <w:hyperlink w:history="1" r:id="rIdxi2ikhgtm4kpiohunpolx">
               <w:r>
                 <w:rPr>
                   <w:rFonts w:ascii="Arial" w:cs="Arial" w:eastAsia="Arial" w:hAnsi="Arial"/>
@@ -32198,7 +32198,7 @@
             <w:pPr>
               <w:spacing w:after="20" w:before="0"/>
             </w:pPr>
-            <w:hyperlink w:history="1" r:id="rIdwdmraadbenma2fzsjcbo_">
+            <w:hyperlink w:history="1" r:id="rIdtpnm_c3j-frimiqxtfmvp">
               <w:r>
                 <w:rPr>
                   <w:rFonts w:ascii="Arial" w:cs="Arial" w:eastAsia="Arial" w:hAnsi="Arial"/>
@@ -32247,7 +32247,7 @@
               <w:spacing w:after="10" w:before="0"/>
               <w:ind w:left="120"/>
             </w:pPr>
-            <w:hyperlink w:history="1" r:id="rIdms1t4feuuo--41rhek8ea">
+            <w:hyperlink w:history="1" r:id="rIdkirhxvsjs35uco8qceid8">
               <w:r>
                 <w:rPr>
                   <w:rFonts w:ascii="Arial" w:cs="Arial" w:eastAsia="Arial" w:hAnsi="Arial"/>
@@ -32292,7 +32292,7 @@
             <w:pPr>
               <w:spacing w:after="20" w:before="0"/>
             </w:pPr>
-            <w:hyperlink w:history="1" r:id="rIdsmsphmcqrclwmsocgw-tt">
+            <w:hyperlink w:history="1" r:id="rIdn_v8db1dnxmub0iczpja9">
               <w:r>
                 <w:rPr>
                   <w:rFonts w:ascii="Arial" w:cs="Arial" w:eastAsia="Arial" w:hAnsi="Arial"/>
@@ -32341,7 +32341,7 @@
               <w:spacing w:after="10" w:before="0"/>
               <w:ind w:left="120"/>
             </w:pPr>
-            <w:hyperlink w:history="1" r:id="rIdftb_nmffosyh4lcdnonir">
+            <w:hyperlink w:history="1" r:id="rIdjmqe3tevjkjhuucjbippa">
               <w:r>
                 <w:rPr>
                   <w:rFonts w:ascii="Arial" w:cs="Arial" w:eastAsia="Arial" w:hAnsi="Arial"/>
@@ -32948,7 +32948,7 @@
         </w:rPr>
         <w:t xml:space="preserve">© 2026 SeaVuria and ARES. Aligned with KICD objectives. Developed by SeaVuria; technical implementation by ARES (with AI assistance from Claude). Licensed under </w:t>
       </w:r>
-      <w:hyperlink w:history="1" r:id="rIdoxkapnvdiuotymasfmjzh">
+      <w:hyperlink w:history="1" r:id="rIdo3xofkz9nlshap5tf3v8k">
         <w:r>
           <w:rPr>
             <w:rFonts w:ascii="Arial" w:cs="Arial" w:eastAsia="Arial" w:hAnsi="Arial"/>
@@ -32969,7 +32969,7 @@
         </w:rPr>
         <w:t xml:space="preserve"> (</w:t>
       </w:r>
-      <w:hyperlink w:history="1" r:id="rId-b5s7qc1mqmhjsep81xhh">
+      <w:hyperlink w:history="1" r:id="rIdqpm1mti4iodk8pnjeas3j">
         <w:r>
           <w:rPr>
             <w:rFonts w:ascii="Arial" w:cs="Arial" w:eastAsia="Arial" w:hAnsi="Arial"/>
@@ -33982,7 +33982,7 @@
             <w:pPr>
               <w:spacing w:after="20" w:before="0"/>
             </w:pPr>
-            <w:hyperlink w:history="1" r:id="rIdtdxvlz2x3ckkw65ss8p55">
+            <w:hyperlink w:history="1" r:id="rIdvt9buma-albj051j57z7e">
               <w:r>
                 <w:rPr>
                   <w:rFonts w:ascii="Arial" w:cs="Arial" w:eastAsia="Arial" w:hAnsi="Arial"/>
@@ -34015,7 +34015,7 @@
               <w:spacing w:after="10" w:before="0"/>
               <w:ind w:left="120"/>
             </w:pPr>
-            <w:hyperlink w:history="1" r:id="rIddkx2ugbmftlpmorq1soao">
+            <w:hyperlink w:history="1" r:id="rIdziyicpo6v3fr7ihpz852z">
               <w:r>
                 <w:rPr>
                   <w:rFonts w:ascii="Arial" w:cs="Arial" w:eastAsia="Arial" w:hAnsi="Arial"/>
@@ -34060,7 +34060,7 @@
             <w:pPr>
               <w:spacing w:after="20" w:before="0"/>
             </w:pPr>
-            <w:hyperlink w:history="1" r:id="rIdliqovjdden7kusubbttgq">
+            <w:hyperlink w:history="1" r:id="rId32z1jnnregwyvf7yd7d7a">
               <w:r>
                 <w:rPr>
                   <w:rFonts w:ascii="Arial" w:cs="Arial" w:eastAsia="Arial" w:hAnsi="Arial"/>
@@ -34093,7 +34093,7 @@
               <w:spacing w:after="10" w:before="0"/>
               <w:ind w:left="120"/>
             </w:pPr>
-            <w:hyperlink w:history="1" r:id="rIdaxbl3i3yqurbl_myvhndk">
+            <w:hyperlink w:history="1" r:id="rIdljx62bv2khucu71cgowpv">
               <w:r>
                 <w:rPr>
                   <w:rFonts w:ascii="Arial" w:cs="Arial" w:eastAsia="Arial" w:hAnsi="Arial"/>
@@ -34288,7 +34288,7 @@
             <w:pPr>
               <w:spacing w:after="20" w:before="0"/>
             </w:pPr>
-            <w:hyperlink w:history="1" r:id="rIdonqqitumamhgcyky1udf1">
+            <w:hyperlink w:history="1" r:id="rIdzudseqmt__rloq7fdmx9i">
               <w:r>
                 <w:rPr>
                   <w:rFonts w:ascii="Arial" w:cs="Arial" w:eastAsia="Arial" w:hAnsi="Arial"/>
@@ -34321,7 +34321,7 @@
               <w:spacing w:after="10" w:before="0"/>
               <w:ind w:left="120"/>
             </w:pPr>
-            <w:hyperlink w:history="1" r:id="rIdhg59uuhjypzkx7_hvsclb">
+            <w:hyperlink w:history="1" r:id="rIdsbsfhpibp1bmojeevovrz">
               <w:r>
                 <w:rPr>
                   <w:rFonts w:ascii="Arial" w:cs="Arial" w:eastAsia="Arial" w:hAnsi="Arial"/>
@@ -34366,7 +34366,7 @@
             <w:pPr>
               <w:spacing w:after="20" w:before="0"/>
             </w:pPr>
-            <w:hyperlink w:history="1" r:id="rId-jurnrdqepgal4_9pqqpj">
+            <w:hyperlink w:history="1" r:id="rIdgkjvyjcp91jiuucejm-7x">
               <w:r>
                 <w:rPr>
                   <w:rFonts w:ascii="Arial" w:cs="Arial" w:eastAsia="Arial" w:hAnsi="Arial"/>
@@ -34399,7 +34399,7 @@
               <w:spacing w:after="10" w:before="0"/>
               <w:ind w:left="120"/>
             </w:pPr>
-            <w:hyperlink w:history="1" r:id="rIds1dqswahpbrlx1w7qmzwj">
+            <w:hyperlink w:history="1" r:id="rId2f9oy2fqt-_hxs67fthd7">
               <w:r>
                 <w:rPr>
                   <w:rFonts w:ascii="Arial" w:cs="Arial" w:eastAsia="Arial" w:hAnsi="Arial"/>
@@ -34594,7 +34594,7 @@
             <w:pPr>
               <w:spacing w:after="20" w:before="0"/>
             </w:pPr>
-            <w:hyperlink w:history="1" r:id="rIdwoxlzqswbe5otjawrpt6l">
+            <w:hyperlink w:history="1" r:id="rIduevaogbglhlxyxzbtbzhm">
               <w:r>
                 <w:rPr>
                   <w:rFonts w:ascii="Arial" w:cs="Arial" w:eastAsia="Arial" w:hAnsi="Arial"/>
@@ -34627,7 +34627,7 @@
               <w:spacing w:after="10" w:before="0"/>
               <w:ind w:left="120"/>
             </w:pPr>
-            <w:hyperlink w:history="1" r:id="rIdtcpzwlqrgugdvcyuoi1tp">
+            <w:hyperlink w:history="1" r:id="rIdrjpg6gexxmvyfzhojglm_">
               <w:r>
                 <w:rPr>
                   <w:rFonts w:ascii="Arial" w:cs="Arial" w:eastAsia="Arial" w:hAnsi="Arial"/>
@@ -34672,7 +34672,7 @@
             <w:pPr>
               <w:spacing w:after="20" w:before="0"/>
             </w:pPr>
-            <w:hyperlink w:history="1" r:id="rIdtlwv2vnmyodo05cixbyg8">
+            <w:hyperlink w:history="1" r:id="rIdukrjttz0nobmt6u0dv2ds">
               <w:r>
                 <w:rPr>
                   <w:rFonts w:ascii="Arial" w:cs="Arial" w:eastAsia="Arial" w:hAnsi="Arial"/>
@@ -34721,7 +34721,7 @@
               <w:spacing w:after="10" w:before="0"/>
               <w:ind w:left="120"/>
             </w:pPr>
-            <w:hyperlink w:history="1" r:id="rIdeemfxqpr3anls9kl0yqee">
+            <w:hyperlink w:history="1" r:id="rIdrr5ecpdvidl6gslczvgbe">
               <w:r>
                 <w:rPr>
                   <w:rFonts w:ascii="Arial" w:cs="Arial" w:eastAsia="Arial" w:hAnsi="Arial"/>
@@ -34916,7 +34916,7 @@
             <w:pPr>
               <w:spacing w:after="20" w:before="0"/>
             </w:pPr>
-            <w:hyperlink w:history="1" r:id="rIdizf_wmpcxlpzfsbpvijhv">
+            <w:hyperlink w:history="1" r:id="rIdvdcydrqe91fhzlogsebuw">
               <w:r>
                 <w:rPr>
                   <w:rFonts w:ascii="Arial" w:cs="Arial" w:eastAsia="Arial" w:hAnsi="Arial"/>
@@ -34949,7 +34949,7 @@
               <w:spacing w:after="10" w:before="0"/>
               <w:ind w:left="120"/>
             </w:pPr>
-            <w:hyperlink w:history="1" r:id="rIdxl0bcv2kvxpjwehxckjqc">
+            <w:hyperlink w:history="1" r:id="rIdp2esiso8-9lvp4cdw7e9z">
               <w:r>
                 <w:rPr>
                   <w:rFonts w:ascii="Arial" w:cs="Arial" w:eastAsia="Arial" w:hAnsi="Arial"/>
@@ -34994,7 +34994,7 @@
             <w:pPr>
               <w:spacing w:after="20" w:before="0"/>
             </w:pPr>
-            <w:hyperlink w:history="1" r:id="rIdjbd1sac61ebx-uuo12qpg">
+            <w:hyperlink w:history="1" r:id="rIdzhoqpbsjgpbliol3hg4rt">
               <w:r>
                 <w:rPr>
                   <w:rFonts w:ascii="Arial" w:cs="Arial" w:eastAsia="Arial" w:hAnsi="Arial"/>
@@ -35043,7 +35043,7 @@
               <w:spacing w:after="10" w:before="0"/>
               <w:ind w:left="120"/>
             </w:pPr>
-            <w:hyperlink w:history="1" r:id="rIdourrfhn4-xidcecn32nnw">
+            <w:hyperlink w:history="1" r:id="rIddj1myio3zzw_abuvnowei">
               <w:r>
                 <w:rPr>
                   <w:rFonts w:ascii="Arial" w:cs="Arial" w:eastAsia="Arial" w:hAnsi="Arial"/>
@@ -35238,7 +35238,7 @@
             <w:pPr>
               <w:spacing w:after="20" w:before="0"/>
             </w:pPr>
-            <w:hyperlink w:history="1" r:id="rIds3js74mxcuxcsi77thoeq">
+            <w:hyperlink w:history="1" r:id="rIdm2rf5i3vqy7n2qpvfc1i7">
               <w:r>
                 <w:rPr>
                   <w:rFonts w:ascii="Arial" w:cs="Arial" w:eastAsia="Arial" w:hAnsi="Arial"/>
@@ -35271,7 +35271,7 @@
               <w:spacing w:after="10" w:before="0"/>
               <w:ind w:left="120"/>
             </w:pPr>
-            <w:hyperlink w:history="1" r:id="rId-bns2aoensik7ey4sqgrw">
+            <w:hyperlink w:history="1" r:id="rIdo_eqy0ua6p0cybkhnumuq">
               <w:r>
                 <w:rPr>
                   <w:rFonts w:ascii="Arial" w:cs="Arial" w:eastAsia="Arial" w:hAnsi="Arial"/>
@@ -35316,7 +35316,7 @@
             <w:pPr>
               <w:spacing w:after="20" w:before="0"/>
             </w:pPr>
-            <w:hyperlink w:history="1" r:id="rIdyd8bqtexmzgukymqcdsdv">
+            <w:hyperlink w:history="1" r:id="rIdykqg1vvl6x_ec1o7k7dy4">
               <w:r>
                 <w:rPr>
                   <w:rFonts w:ascii="Arial" w:cs="Arial" w:eastAsia="Arial" w:hAnsi="Arial"/>
@@ -35365,7 +35365,7 @@
               <w:spacing w:after="10" w:before="0"/>
               <w:ind w:left="120"/>
             </w:pPr>
-            <w:hyperlink w:history="1" r:id="rIdrplhv1g5x-s3j96c2sl86">
+            <w:hyperlink w:history="1" r:id="rIdwc_vcywvehl_3odi_kaj6">
               <w:r>
                 <w:rPr>
                   <w:rFonts w:ascii="Arial" w:cs="Arial" w:eastAsia="Arial" w:hAnsi="Arial"/>
@@ -35877,7 +35877,7 @@
         </w:rPr>
         <w:t xml:space="preserve">© 2026 SeaVuria and ARES. Aligned with KICD objectives. Developed by SeaVuria; technical implementation by ARES (with AI assistance from Claude). Licensed under </w:t>
       </w:r>
-      <w:hyperlink w:history="1" r:id="rIddggit1cmni6hxlftpqqlh">
+      <w:hyperlink w:history="1" r:id="rId9egujj7-v07lxufdlcjg2">
         <w:r>
           <w:rPr>
             <w:rFonts w:ascii="Arial" w:cs="Arial" w:eastAsia="Arial" w:hAnsi="Arial"/>
@@ -35898,7 +35898,7 @@
         </w:rPr>
         <w:t xml:space="preserve"> (</w:t>
       </w:r>
-      <w:hyperlink w:history="1" r:id="rIdf3nlrqmd1kbhzl-jkqgt_">
+      <w:hyperlink w:history="1" r:id="rId4mndsl1jenykxom6nfjuq">
         <w:r>
           <w:rPr>
             <w:rFonts w:ascii="Arial" w:cs="Arial" w:eastAsia="Arial" w:hAnsi="Arial"/>
@@ -36911,7 +36911,7 @@
             <w:pPr>
               <w:spacing w:after="20" w:before="0"/>
             </w:pPr>
-            <w:hyperlink w:history="1" r:id="rId2fadb3geenk--ppts8nuq">
+            <w:hyperlink w:history="1" r:id="rId58p3fbcqfwddalt20pic-">
               <w:r>
                 <w:rPr>
                   <w:rFonts w:ascii="Arial" w:cs="Arial" w:eastAsia="Arial" w:hAnsi="Arial"/>
@@ -36944,7 +36944,7 @@
               <w:spacing w:after="10" w:before="0"/>
               <w:ind w:left="120"/>
             </w:pPr>
-            <w:hyperlink w:history="1" r:id="rIdnp_m6osjmw-hbhjodpew-">
+            <w:hyperlink w:history="1" r:id="rIdbjqz8bbhi0sva9cz9mvtu">
               <w:r>
                 <w:rPr>
                   <w:rFonts w:ascii="Arial" w:cs="Arial" w:eastAsia="Arial" w:hAnsi="Arial"/>
@@ -36989,7 +36989,7 @@
             <w:pPr>
               <w:spacing w:after="20" w:before="0"/>
             </w:pPr>
-            <w:hyperlink w:history="1" r:id="rIdkdoimy-tpmji0zw9arkep">
+            <w:hyperlink w:history="1" r:id="rIda8c8fk1usj2xp0hwqb7jv">
               <w:r>
                 <w:rPr>
                   <w:rFonts w:ascii="Arial" w:cs="Arial" w:eastAsia="Arial" w:hAnsi="Arial"/>
@@ -37022,7 +37022,7 @@
               <w:spacing w:after="10" w:before="0"/>
               <w:ind w:left="120"/>
             </w:pPr>
-            <w:hyperlink w:history="1" r:id="rIdnzkcel63cxioept5uwtv5">
+            <w:hyperlink w:history="1" r:id="rIdyyqb2p9ykga8rmgoy_nu-">
               <w:r>
                 <w:rPr>
                   <w:rFonts w:ascii="Arial" w:cs="Arial" w:eastAsia="Arial" w:hAnsi="Arial"/>
@@ -37369,7 +37369,7 @@
             <w:pPr>
               <w:spacing w:after="20" w:before="0"/>
             </w:pPr>
-            <w:hyperlink w:history="1" r:id="rIdnkeeqbaghjmggydjthe2w">
+            <w:hyperlink w:history="1" r:id="rIdkyvljdgbhcvg06dgtl7de">
               <w:r>
                 <w:rPr>
                   <w:rFonts w:ascii="Arial" w:cs="Arial" w:eastAsia="Arial" w:hAnsi="Arial"/>
@@ -37402,7 +37402,7 @@
               <w:spacing w:after="10" w:before="0"/>
               <w:ind w:left="120"/>
             </w:pPr>
-            <w:hyperlink w:history="1" r:id="rIdji_gdfaah94zvynmkvzbb">
+            <w:hyperlink w:history="1" r:id="rIdcyc-snzbzelxoqtq6dk0b">
               <w:r>
                 <w:rPr>
                   <w:rFonts w:ascii="Arial" w:cs="Arial" w:eastAsia="Arial" w:hAnsi="Arial"/>
@@ -37447,7 +37447,7 @@
             <w:pPr>
               <w:spacing w:after="20" w:before="0"/>
             </w:pPr>
-            <w:hyperlink w:history="1" r:id="rIduxqkznwwogj3rupofv4qd">
+            <w:hyperlink w:history="1" r:id="rIdwpzlz_ornuvknggfqnpe4">
               <w:r>
                 <w:rPr>
                   <w:rFonts w:ascii="Arial" w:cs="Arial" w:eastAsia="Arial" w:hAnsi="Arial"/>
@@ -37480,7 +37480,7 @@
               <w:spacing w:after="10" w:before="0"/>
               <w:ind w:left="120"/>
             </w:pPr>
-            <w:hyperlink w:history="1" r:id="rIdw_froqy2ntjgeyohpkvsn">
+            <w:hyperlink w:history="1" r:id="rIdqin4ec6dzpo77ejkdxd6k">
               <w:r>
                 <w:rPr>
                   <w:rFonts w:ascii="Arial" w:cs="Arial" w:eastAsia="Arial" w:hAnsi="Arial"/>
@@ -37979,7 +37979,7 @@
             <w:pPr>
               <w:spacing w:after="20" w:before="0"/>
             </w:pPr>
-            <w:hyperlink w:history="1" r:id="rId6egqljicgadxjzhey97rw">
+            <w:hyperlink w:history="1" r:id="rId96zgqgu4cyph4stqrnrgs">
               <w:r>
                 <w:rPr>
                   <w:rFonts w:ascii="Arial" w:cs="Arial" w:eastAsia="Arial" w:hAnsi="Arial"/>
@@ -38012,7 +38012,7 @@
               <w:spacing w:after="10" w:before="0"/>
               <w:ind w:left="120"/>
             </w:pPr>
-            <w:hyperlink w:history="1" r:id="rIdbkofcfb07kvktnpbqwady">
+            <w:hyperlink w:history="1" r:id="rIdjyhalkalty37tw3cp5ldp">
               <w:r>
                 <w:rPr>
                   <w:rFonts w:ascii="Arial" w:cs="Arial" w:eastAsia="Arial" w:hAnsi="Arial"/>
@@ -38057,7 +38057,7 @@
             <w:pPr>
               <w:spacing w:after="20" w:before="0"/>
             </w:pPr>
-            <w:hyperlink w:history="1" r:id="rIdatd8x90gcqobnz_sb0po3">
+            <w:hyperlink w:history="1" r:id="rIduwm6fhcvj3wcosyf5alju">
               <w:r>
                 <w:rPr>
                   <w:rFonts w:ascii="Arial" w:cs="Arial" w:eastAsia="Arial" w:hAnsi="Arial"/>
@@ -38106,7 +38106,7 @@
               <w:spacing w:after="10" w:before="0"/>
               <w:ind w:left="120"/>
             </w:pPr>
-            <w:hyperlink w:history="1" r:id="rIdsxg1fxrrkjnsdce61bbbs">
+            <w:hyperlink w:history="1" r:id="rId4behc-fzkg3-htvcp3amk">
               <w:r>
                 <w:rPr>
                   <w:rFonts w:ascii="Arial" w:cs="Arial" w:eastAsia="Arial" w:hAnsi="Arial"/>
@@ -38510,7 +38510,7 @@
             <w:pPr>
               <w:spacing w:after="20" w:before="0"/>
             </w:pPr>
-            <w:hyperlink w:history="1" r:id="rId9vx8ow12fqhvyc98mo-sw">
+            <w:hyperlink w:history="1" r:id="rId8jvfae1up0aqzhvyofp93">
               <w:r>
                 <w:rPr>
                   <w:rFonts w:ascii="Arial" w:cs="Arial" w:eastAsia="Arial" w:hAnsi="Arial"/>
@@ -38543,7 +38543,7 @@
               <w:spacing w:after="10" w:before="0"/>
               <w:ind w:left="120"/>
             </w:pPr>
-            <w:hyperlink w:history="1" r:id="rIdoholra1eiufc1lka_4se5">
+            <w:hyperlink w:history="1" r:id="rId2d0qdw2mfazzvws6sxqtv">
               <w:r>
                 <w:rPr>
                   <w:rFonts w:ascii="Arial" w:cs="Arial" w:eastAsia="Arial" w:hAnsi="Arial"/>
@@ -38588,7 +38588,7 @@
             <w:pPr>
               <w:spacing w:after="20" w:before="0"/>
             </w:pPr>
-            <w:hyperlink w:history="1" r:id="rIdhtjibqowtfq8flfipyh7h">
+            <w:hyperlink w:history="1" r:id="rIdfco-trhtspnk5wnwbcok8">
               <w:r>
                 <w:rPr>
                   <w:rFonts w:ascii="Arial" w:cs="Arial" w:eastAsia="Arial" w:hAnsi="Arial"/>
@@ -38637,7 +38637,7 @@
               <w:spacing w:after="10" w:before="0"/>
               <w:ind w:left="120"/>
             </w:pPr>
-            <w:hyperlink w:history="1" r:id="rIdrs9jhyxt7qzhkmqie5rdy">
+            <w:hyperlink w:history="1" r:id="rIdkv4wqpidmwq0anrdizsuy">
               <w:r>
                 <w:rPr>
                   <w:rFonts w:ascii="Arial" w:cs="Arial" w:eastAsia="Arial" w:hAnsi="Arial"/>
@@ -39079,7 +39079,7 @@
             <w:pPr>
               <w:spacing w:after="20" w:before="0"/>
             </w:pPr>
-            <w:hyperlink w:history="1" r:id="rIdu4do-oeckivx9fyxpemni">
+            <w:hyperlink w:history="1" r:id="rIdnf98dcdqjag5szi0bizwg">
               <w:r>
                 <w:rPr>
                   <w:rFonts w:ascii="Arial" w:cs="Arial" w:eastAsia="Arial" w:hAnsi="Arial"/>
@@ -39112,7 +39112,7 @@
               <w:spacing w:after="10" w:before="0"/>
               <w:ind w:left="120"/>
             </w:pPr>
-            <w:hyperlink w:history="1" r:id="rIdqfjkjnc2qfskvmpbjzj_p">
+            <w:hyperlink w:history="1" r:id="rIdqtuxi8flndmzzrzoet3vk">
               <w:r>
                 <w:rPr>
                   <w:rFonts w:ascii="Arial" w:cs="Arial" w:eastAsia="Arial" w:hAnsi="Arial"/>
@@ -39157,7 +39157,7 @@
             <w:pPr>
               <w:spacing w:after="20" w:before="0"/>
             </w:pPr>
-            <w:hyperlink w:history="1" r:id="rIdqk6iovzate7wg4ksmxnmc">
+            <w:hyperlink w:history="1" r:id="rIdt4bck6kcl_mdt1smr_i14">
               <w:r>
                 <w:rPr>
                   <w:rFonts w:ascii="Arial" w:cs="Arial" w:eastAsia="Arial" w:hAnsi="Arial"/>
@@ -39206,7 +39206,7 @@
               <w:spacing w:after="10" w:before="0"/>
               <w:ind w:left="120"/>
             </w:pPr>
-            <w:hyperlink w:history="1" r:id="rIdalifvhpg1itjy_bijbc1l">
+            <w:hyperlink w:history="1" r:id="rIdwjkts0tuaakbmlrjmwvuz">
               <w:r>
                 <w:rPr>
                   <w:rFonts w:ascii="Arial" w:cs="Arial" w:eastAsia="Arial" w:hAnsi="Arial"/>
@@ -39870,7 +39870,7 @@
         </w:rPr>
         <w:t xml:space="preserve">© 2026 SeaVuria and ARES. Aligned with KICD objectives. Developed by SeaVuria; technical implementation by ARES (with AI assistance from Claude). Licensed under </w:t>
       </w:r>
-      <w:hyperlink w:history="1" r:id="rIdzwuspurkdkk6fcvg4tayq">
+      <w:hyperlink w:history="1" r:id="rIdwozzsg-fzxfl6wssz6mbv">
         <w:r>
           <w:rPr>
             <w:rFonts w:ascii="Arial" w:cs="Arial" w:eastAsia="Arial" w:hAnsi="Arial"/>
@@ -39891,7 +39891,7 @@
         </w:rPr>
         <w:t xml:space="preserve"> (</w:t>
       </w:r>
-      <w:hyperlink w:history="1" r:id="rId6dotysjtgyopgpj3thmaq">
+      <w:hyperlink w:history="1" r:id="rIds9aehhmxx7iqwh-kvo9y_">
         <w:r>
           <w:rPr>
             <w:rFonts w:ascii="Arial" w:cs="Arial" w:eastAsia="Arial" w:hAnsi="Arial"/>

</xml_diff>

<commit_message>
Regenerate 8 worst sub-strands with fact sheet; science fixes; teacher list 207 -> 103
- Regenerated gensci_2_2, essmath_3_1, essmath_2_1, coremath_1_3, coremath_3_1,
  phys_2_1, math_2_1, bio_1_2 (batch, fact sheet + in-pipeline consistency pass):
  all 0 major lesson contradictions; ~$6.80 total.
- Science-fix pass in Claude Code (no API): 46 of 119 items fixed (124 edits),
  33 not real; independent check of every fix: 0 reverted, 7 adjusted, 7 extra
  errors fixed.
- Fix: generated file prefix for Mathematics (was Maths_*, duplicating existing
  Mathematics_* files); duplicates removed, _SUBJECT_FILE_PREFIX added.
- Links for regenerated sub-strands queried + judged; all 95 re-rendered, PDFs and
  index rebuilt (590, 0 failed). TEACHER_REVIEW_LIST_2026-10-04.md: 103 items.

Co-Authored-By: Claude Sonnet 5.5 <noreply@anthropic.com>
</commit_message>
<xml_diff>
--- a/data/outputs/v2/Biology/SS1.1_Cell_Structure/Biology_Cell_Structure_CBE_LessonSequence.docx
+++ b/data/outputs/v2/Biology/SS1.1_Cell_Structure/Biology_Cell_Structure_CBE_LessonSequence.docx
@@ -2596,7 +2596,7 @@
         </w:rPr>
         <w:t xml:space="preserve">© 2026 SeaVuria and ARES. This work is licensed under a </w:t>
       </w:r>
-      <w:hyperlink w:history="1" r:id="rIdxwlkwmg1vipblouigiy-i">
+      <w:hyperlink w:history="1" r:id="rId8rmiauvxrfq3ua9_gksqa">
         <w:r>
           <w:rPr>
             <w:rFonts w:ascii="Arial" w:cs="Arial" w:eastAsia="Arial" w:hAnsi="Arial"/>
@@ -2616,7 +2616,7 @@
         </w:rPr>
         <w:t xml:space="preserve"> (</w:t>
       </w:r>
-      <w:hyperlink w:history="1" r:id="rIdbzuic0q7vzsno7dvf9kjg">
+      <w:hyperlink w:history="1" r:id="rIdkyrh9qvaaq_eedfqyvkhr">
         <w:r>
           <w:rPr>
             <w:rFonts w:ascii="Arial" w:cs="Arial" w:eastAsia="Arial" w:hAnsi="Arial"/>
@@ -2636,7 +2636,7 @@
         </w:rPr>
         <w:t xml:space="preserve">). To view a copy of this license, visit </w:t>
       </w:r>
-      <w:hyperlink w:history="1" r:id="rIdv0cjzyxtyak7e5_boph55">
+      <w:hyperlink w:history="1" r:id="rIdixmyrsj_at_ujirdksnzx">
         <w:r>
           <w:rPr>
             <w:rFonts w:ascii="Arial" w:cs="Arial" w:eastAsia="Arial" w:hAnsi="Arial"/>
@@ -3648,7 +3648,7 @@
             <w:pPr>
               <w:spacing w:after="20" w:before="0"/>
             </w:pPr>
-            <w:hyperlink w:history="1" r:id="rId2vynzpm6h81zncq55jzw9">
+            <w:hyperlink w:history="1" r:id="rId3em_l1p7jolnx-rp2ps55">
               <w:r>
                 <w:rPr>
                   <w:rFonts w:ascii="Arial" w:cs="Arial" w:eastAsia="Arial" w:hAnsi="Arial"/>
@@ -3681,7 +3681,7 @@
               <w:spacing w:after="10" w:before="0"/>
               <w:ind w:left="120"/>
             </w:pPr>
-            <w:hyperlink w:history="1" r:id="rId1_yvpdoj92lywtlpkvgic">
+            <w:hyperlink w:history="1" r:id="rId91t4xnijtcvbffmrcyyzo">
               <w:r>
                 <w:rPr>
                   <w:rFonts w:ascii="Arial" w:cs="Arial" w:eastAsia="Arial" w:hAnsi="Arial"/>
@@ -3726,7 +3726,7 @@
             <w:pPr>
               <w:spacing w:after="20" w:before="0"/>
             </w:pPr>
-            <w:hyperlink w:history="1" r:id="rIdi4_f37vjefteapfhkowzn">
+            <w:hyperlink w:history="1" r:id="rIdpgugvr0ajegzdiuqw3oyr">
               <w:r>
                 <w:rPr>
                   <w:rFonts w:ascii="Arial" w:cs="Arial" w:eastAsia="Arial" w:hAnsi="Arial"/>
@@ -3759,7 +3759,7 @@
               <w:spacing w:after="10" w:before="0"/>
               <w:ind w:left="120"/>
             </w:pPr>
-            <w:hyperlink w:history="1" r:id="rId4wq0fdptzocatomlzx_zq">
+            <w:hyperlink w:history="1" r:id="rIdeqxfvwwb2rkpvz5zn64d-">
               <w:r>
                 <w:rPr>
                   <w:rFonts w:ascii="Arial" w:cs="Arial" w:eastAsia="Arial" w:hAnsi="Arial"/>
@@ -3954,7 +3954,7 @@
             <w:pPr>
               <w:spacing w:after="20" w:before="0"/>
             </w:pPr>
-            <w:hyperlink w:history="1" r:id="rId4oqb08dfswx_xhzkz0qvw">
+            <w:hyperlink w:history="1" r:id="rIdwgxgzaynzgwqaikov7lmm">
               <w:r>
                 <w:rPr>
                   <w:rFonts w:ascii="Arial" w:cs="Arial" w:eastAsia="Arial" w:hAnsi="Arial"/>
@@ -3987,7 +3987,7 @@
               <w:spacing w:after="10" w:before="0"/>
               <w:ind w:left="120"/>
             </w:pPr>
-            <w:hyperlink w:history="1" r:id="rIdeb4wp5i_doc-1myxwpumv">
+            <w:hyperlink w:history="1" r:id="rIdthruzpp11kk-0hajqljh8">
               <w:r>
                 <w:rPr>
                   <w:rFonts w:ascii="Arial" w:cs="Arial" w:eastAsia="Arial" w:hAnsi="Arial"/>
@@ -4032,7 +4032,7 @@
             <w:pPr>
               <w:spacing w:after="20" w:before="0"/>
             </w:pPr>
-            <w:hyperlink w:history="1" r:id="rIdueulhgage86ados77cynu">
+            <w:hyperlink w:history="1" r:id="rIdqf5sxzdutl_2k4kc7snem">
               <w:r>
                 <w:rPr>
                   <w:rFonts w:ascii="Arial" w:cs="Arial" w:eastAsia="Arial" w:hAnsi="Arial"/>
@@ -4065,7 +4065,7 @@
               <w:spacing w:after="10" w:before="0"/>
               <w:ind w:left="120"/>
             </w:pPr>
-            <w:hyperlink w:history="1" r:id="rIdrdhzs_jlzpmoduaa4m_pt">
+            <w:hyperlink w:history="1" r:id="rIdbh_nsq8x2bv5qcid1gjda">
               <w:r>
                 <w:rPr>
                   <w:rFonts w:ascii="Arial" w:cs="Arial" w:eastAsia="Arial" w:hAnsi="Arial"/>
@@ -4260,7 +4260,7 @@
             <w:pPr>
               <w:spacing w:after="20" w:before="0"/>
             </w:pPr>
-            <w:hyperlink w:history="1" r:id="rIducuypvc_zjlq00eaul-eg">
+            <w:hyperlink w:history="1" r:id="rIdaz5tyosu-n6-khgqslw82">
               <w:r>
                 <w:rPr>
                   <w:rFonts w:ascii="Arial" w:cs="Arial" w:eastAsia="Arial" w:hAnsi="Arial"/>
@@ -4309,7 +4309,7 @@
               <w:spacing w:after="10" w:before="0"/>
               <w:ind w:left="120"/>
             </w:pPr>
-            <w:hyperlink w:history="1" r:id="rId647b4jx3c8ehfkkhczzq6">
+            <w:hyperlink w:history="1" r:id="rIdlvl6f-9le6gpxidke4-4q">
               <w:r>
                 <w:rPr>
                   <w:rFonts w:ascii="Arial" w:cs="Arial" w:eastAsia="Arial" w:hAnsi="Arial"/>
@@ -4354,7 +4354,7 @@
             <w:pPr>
               <w:spacing w:after="20" w:before="0"/>
             </w:pPr>
-            <w:hyperlink w:history="1" r:id="rId16rwph-_zdopuyiza4f_c">
+            <w:hyperlink w:history="1" r:id="rIdpmocd0c2byubxcpagpjo_">
               <w:r>
                 <w:rPr>
                   <w:rFonts w:ascii="Arial" w:cs="Arial" w:eastAsia="Arial" w:hAnsi="Arial"/>
@@ -4403,7 +4403,7 @@
               <w:spacing w:after="10" w:before="0"/>
               <w:ind w:left="120"/>
             </w:pPr>
-            <w:hyperlink w:history="1" r:id="rIdviavcyhwg4oi-k_3bhcl4">
+            <w:hyperlink w:history="1" r:id="rId6t6pkepuq1qecxmgcvnu2">
               <w:r>
                 <w:rPr>
                   <w:rFonts w:ascii="Arial" w:cs="Arial" w:eastAsia="Arial" w:hAnsi="Arial"/>
@@ -4598,7 +4598,7 @@
             <w:pPr>
               <w:spacing w:after="20" w:before="0"/>
             </w:pPr>
-            <w:hyperlink w:history="1" r:id="rId6owbnija6a0cil55pq_qh">
+            <w:hyperlink w:history="1" r:id="rIdzy9rgvmm3iots0ezsohjq">
               <w:r>
                 <w:rPr>
                   <w:rFonts w:ascii="Arial" w:cs="Arial" w:eastAsia="Arial" w:hAnsi="Arial"/>
@@ -4647,7 +4647,7 @@
               <w:spacing w:after="10" w:before="0"/>
               <w:ind w:left="120"/>
             </w:pPr>
-            <w:hyperlink w:history="1" r:id="rId_vaaznwiwmhvz_9zgvizd">
+            <w:hyperlink w:history="1" r:id="rIddsnvcvbnjp2anhqgknjmv">
               <w:r>
                 <w:rPr>
                   <w:rFonts w:ascii="Arial" w:cs="Arial" w:eastAsia="Arial" w:hAnsi="Arial"/>
@@ -4692,7 +4692,7 @@
             <w:pPr>
               <w:spacing w:after="20" w:before="0"/>
             </w:pPr>
-            <w:hyperlink w:history="1" r:id="rIdjtucbne408ih5duwdzmmo">
+            <w:hyperlink w:history="1" r:id="rIded2obvyrmgocnfbqy8ing">
               <w:r>
                 <w:rPr>
                   <w:rFonts w:ascii="Arial" w:cs="Arial" w:eastAsia="Arial" w:hAnsi="Arial"/>
@@ -4741,7 +4741,7 @@
               <w:spacing w:after="10" w:before="0"/>
               <w:ind w:left="120"/>
             </w:pPr>
-            <w:hyperlink w:history="1" r:id="rId0vuxt7tekkrx6zgtgjjgl">
+            <w:hyperlink w:history="1" r:id="rIdiqa6h_ijf1ou017ggobry">
               <w:r>
                 <w:rPr>
                   <w:rFonts w:ascii="Arial" w:cs="Arial" w:eastAsia="Arial" w:hAnsi="Arial"/>
@@ -4936,7 +4936,7 @@
             <w:pPr>
               <w:spacing w:after="20" w:before="0"/>
             </w:pPr>
-            <w:hyperlink w:history="1" r:id="rIdwpnqi2ikqg7h01thbu-hw">
+            <w:hyperlink w:history="1" r:id="rIdortxxettp8_b3fmmoqeoa">
               <w:r>
                 <w:rPr>
                   <w:rFonts w:ascii="Arial" w:cs="Arial" w:eastAsia="Arial" w:hAnsi="Arial"/>
@@ -4985,7 +4985,7 @@
               <w:spacing w:after="10" w:before="0"/>
               <w:ind w:left="120"/>
             </w:pPr>
-            <w:hyperlink w:history="1" r:id="rIdda94ssb6jmreebrpzw21i">
+            <w:hyperlink w:history="1" r:id="rIdya_xe4j3el7a-ldve4ifu">
               <w:r>
                 <w:rPr>
                   <w:rFonts w:ascii="Arial" w:cs="Arial" w:eastAsia="Arial" w:hAnsi="Arial"/>
@@ -5030,7 +5030,7 @@
             <w:pPr>
               <w:spacing w:after="20" w:before="0"/>
             </w:pPr>
-            <w:hyperlink w:history="1" r:id="rId3avqryor-9aok8kzghywa">
+            <w:hyperlink w:history="1" r:id="rIdsaaej0y69f0chiatvfxfc">
               <w:r>
                 <w:rPr>
                   <w:rFonts w:ascii="Arial" w:cs="Arial" w:eastAsia="Arial" w:hAnsi="Arial"/>
@@ -5079,7 +5079,7 @@
               <w:spacing w:after="10" w:before="0"/>
               <w:ind w:left="120"/>
             </w:pPr>
-            <w:hyperlink w:history="1" r:id="rIdukamjwdnjco8qs3ultxwq">
+            <w:hyperlink w:history="1" r:id="rIdi9rzqviq5omm3nh3s-1pd">
               <w:r>
                 <w:rPr>
                   <w:rFonts w:ascii="Arial" w:cs="Arial" w:eastAsia="Arial" w:hAnsi="Arial"/>
@@ -5591,7 +5591,7 @@
         </w:rPr>
         <w:t xml:space="preserve">© 2026 SeaVuria and ARES. Aligned with KICD objectives. Developed by SeaVuria; technical implementation by ARES (with AI assistance from Claude). Licensed under </w:t>
       </w:r>
-      <w:hyperlink w:history="1" r:id="rIdjpj5gwpzd2by7prn17j_x">
+      <w:hyperlink w:history="1" r:id="rIdnswm0bd3eqgdiuedkbnvb">
         <w:r>
           <w:rPr>
             <w:rFonts w:ascii="Arial" w:cs="Arial" w:eastAsia="Arial" w:hAnsi="Arial"/>
@@ -5612,7 +5612,7 @@
         </w:rPr>
         <w:t xml:space="preserve"> (</w:t>
       </w:r>
-      <w:hyperlink w:history="1" r:id="rId-w_xtw8sf-tciepvgy7ux">
+      <w:hyperlink w:history="1" r:id="rId3q6r49bcx753vqqpckcis">
         <w:r>
           <w:rPr>
             <w:rFonts w:ascii="Arial" w:cs="Arial" w:eastAsia="Arial" w:hAnsi="Arial"/>
@@ -6625,7 +6625,7 @@
             <w:pPr>
               <w:spacing w:after="20" w:before="0"/>
             </w:pPr>
-            <w:hyperlink w:history="1" r:id="rIdmk56bi90ecq1luqgtdajx">
+            <w:hyperlink w:history="1" r:id="rId1xtvpzzgainfmlglr7xki">
               <w:r>
                 <w:rPr>
                   <w:rFonts w:ascii="Arial" w:cs="Arial" w:eastAsia="Arial" w:hAnsi="Arial"/>
@@ -6658,7 +6658,7 @@
               <w:spacing w:after="10" w:before="0"/>
               <w:ind w:left="120"/>
             </w:pPr>
-            <w:hyperlink w:history="1" r:id="rIdpcildyk9rmoi4g9nwiwfz">
+            <w:hyperlink w:history="1" r:id="rId-rzm9ydji24tixmv38z0x">
               <w:r>
                 <w:rPr>
                   <w:rFonts w:ascii="Arial" w:cs="Arial" w:eastAsia="Arial" w:hAnsi="Arial"/>
@@ -6703,7 +6703,7 @@
             <w:pPr>
               <w:spacing w:after="20" w:before="0"/>
             </w:pPr>
-            <w:hyperlink w:history="1" r:id="rId38zuddh4d550hi875yvcv">
+            <w:hyperlink w:history="1" r:id="rIdhcpjgqr_q6r9vqfmmbrdd">
               <w:r>
                 <w:rPr>
                   <w:rFonts w:ascii="Arial" w:cs="Arial" w:eastAsia="Arial" w:hAnsi="Arial"/>
@@ -6736,7 +6736,7 @@
               <w:spacing w:after="10" w:before="0"/>
               <w:ind w:left="120"/>
             </w:pPr>
-            <w:hyperlink w:history="1" r:id="rIdcj1rlnjdkflbvzlnxlqah">
+            <w:hyperlink w:history="1" r:id="rIdisizflv-jjczxhohlw01m">
               <w:r>
                 <w:rPr>
                   <w:rFonts w:ascii="Arial" w:cs="Arial" w:eastAsia="Arial" w:hAnsi="Arial"/>
@@ -6931,7 +6931,7 @@
             <w:pPr>
               <w:spacing w:after="20" w:before="0"/>
             </w:pPr>
-            <w:hyperlink w:history="1" r:id="rIdxm2hqqrmx_sz15n-lexfo">
+            <w:hyperlink w:history="1" r:id="rIdrnx32awttiqviqmfmf2y3">
               <w:r>
                 <w:rPr>
                   <w:rFonts w:ascii="Arial" w:cs="Arial" w:eastAsia="Arial" w:hAnsi="Arial"/>
@@ -6964,7 +6964,7 @@
               <w:spacing w:after="10" w:before="0"/>
               <w:ind w:left="120"/>
             </w:pPr>
-            <w:hyperlink w:history="1" r:id="rId6fr3mcdwkm5gcyl3o2n6w">
+            <w:hyperlink w:history="1" r:id="rIdgl4etgnww2scj2c0cpl7c">
               <w:r>
                 <w:rPr>
                   <w:rFonts w:ascii="Arial" w:cs="Arial" w:eastAsia="Arial" w:hAnsi="Arial"/>
@@ -7009,7 +7009,7 @@
             <w:pPr>
               <w:spacing w:after="20" w:before="0"/>
             </w:pPr>
-            <w:hyperlink w:history="1" r:id="rIdysph3pd6j1ysngfp5yq3m">
+            <w:hyperlink w:history="1" r:id="rIdvfgdqoxqrmpy3xjjg_vya">
               <w:r>
                 <w:rPr>
                   <w:rFonts w:ascii="Arial" w:cs="Arial" w:eastAsia="Arial" w:hAnsi="Arial"/>
@@ -7042,7 +7042,7 @@
               <w:spacing w:after="10" w:before="0"/>
               <w:ind w:left="120"/>
             </w:pPr>
-            <w:hyperlink w:history="1" r:id="rId7s3fa4xmqmjtuguw3bxic">
+            <w:hyperlink w:history="1" r:id="rIdcwd6kvn_ycoyuzhkvi-1b">
               <w:r>
                 <w:rPr>
                   <w:rFonts w:ascii="Arial" w:cs="Arial" w:eastAsia="Arial" w:hAnsi="Arial"/>
@@ -7237,7 +7237,7 @@
             <w:pPr>
               <w:spacing w:after="20" w:before="0"/>
             </w:pPr>
-            <w:hyperlink w:history="1" r:id="rIda06oknasnmbvafg_5zu5s">
+            <w:hyperlink w:history="1" r:id="rId6x2giglnmifuqz3-pmkam">
               <w:r>
                 <w:rPr>
                   <w:rFonts w:ascii="Arial" w:cs="Arial" w:eastAsia="Arial" w:hAnsi="Arial"/>
@@ -7286,7 +7286,7 @@
               <w:spacing w:after="10" w:before="0"/>
               <w:ind w:left="120"/>
             </w:pPr>
-            <w:hyperlink w:history="1" r:id="rId5jdb2uum9jk_v3zqki7c3">
+            <w:hyperlink w:history="1" r:id="rIdnhgcwretngk4tsboz9x9i">
               <w:r>
                 <w:rPr>
                   <w:rFonts w:ascii="Arial" w:cs="Arial" w:eastAsia="Arial" w:hAnsi="Arial"/>
@@ -7331,7 +7331,7 @@
             <w:pPr>
               <w:spacing w:after="20" w:before="0"/>
             </w:pPr>
-            <w:hyperlink w:history="1" r:id="rIdvjvoqa1rqjooqlj7v5i8r">
+            <w:hyperlink w:history="1" r:id="rId4udfpiahrq--hgclrseaa">
               <w:r>
                 <w:rPr>
                   <w:rFonts w:ascii="Arial" w:cs="Arial" w:eastAsia="Arial" w:hAnsi="Arial"/>
@@ -7364,7 +7364,7 @@
               <w:spacing w:after="10" w:before="0"/>
               <w:ind w:left="120"/>
             </w:pPr>
-            <w:hyperlink w:history="1" r:id="rIdzeof59r3jliul489spf9b">
+            <w:hyperlink w:history="1" r:id="rIdnnjbzp-vjn0rifnlsu7me">
               <w:r>
                 <w:rPr>
                   <w:rFonts w:ascii="Arial" w:cs="Arial" w:eastAsia="Arial" w:hAnsi="Arial"/>
@@ -7559,7 +7559,7 @@
             <w:pPr>
               <w:spacing w:after="20" w:before="0"/>
             </w:pPr>
-            <w:hyperlink w:history="1" r:id="rIdawwoms9fxonwiunuh-bfi">
+            <w:hyperlink w:history="1" r:id="rId58gpa4gywot6d393k98cx">
               <w:r>
                 <w:rPr>
                   <w:rFonts w:ascii="Arial" w:cs="Arial" w:eastAsia="Arial" w:hAnsi="Arial"/>
@@ -7608,7 +7608,7 @@
               <w:spacing w:after="10" w:before="0"/>
               <w:ind w:left="120"/>
             </w:pPr>
-            <w:hyperlink w:history="1" r:id="rIdw4phrgcrswsyfv5sgziwc">
+            <w:hyperlink w:history="1" r:id="rIdwhh7qkukp3kwcw1lqcqbz">
               <w:r>
                 <w:rPr>
                   <w:rFonts w:ascii="Arial" w:cs="Arial" w:eastAsia="Arial" w:hAnsi="Arial"/>
@@ -7653,7 +7653,7 @@
             <w:pPr>
               <w:spacing w:after="20" w:before="0"/>
             </w:pPr>
-            <w:hyperlink w:history="1" r:id="rIdjvfblzrkhrvgshwnd4odu">
+            <w:hyperlink w:history="1" r:id="rId3cprl5yjowe1kbytehtke">
               <w:r>
                 <w:rPr>
                   <w:rFonts w:ascii="Arial" w:cs="Arial" w:eastAsia="Arial" w:hAnsi="Arial"/>
@@ -7686,7 +7686,7 @@
               <w:spacing w:after="10" w:before="0"/>
               <w:ind w:left="120"/>
             </w:pPr>
-            <w:hyperlink w:history="1" r:id="rIdepiwv4ddfvcyaz2alwrc9">
+            <w:hyperlink w:history="1" r:id="rIdmyvyc39ivwpydq8shiikt">
               <w:r>
                 <w:rPr>
                   <w:rFonts w:ascii="Arial" w:cs="Arial" w:eastAsia="Arial" w:hAnsi="Arial"/>
@@ -7881,7 +7881,7 @@
             <w:pPr>
               <w:spacing w:after="20" w:before="0"/>
             </w:pPr>
-            <w:hyperlink w:history="1" r:id="rId80dtebvwjaolmkrrxripq">
+            <w:hyperlink w:history="1" r:id="rIdwne4oe_cb0doou1qsrpgs">
               <w:r>
                 <w:rPr>
                   <w:rFonts w:ascii="Arial" w:cs="Arial" w:eastAsia="Arial" w:hAnsi="Arial"/>
@@ -7930,7 +7930,7 @@
               <w:spacing w:after="10" w:before="0"/>
               <w:ind w:left="120"/>
             </w:pPr>
-            <w:hyperlink w:history="1" r:id="rId6z_yu2hydlxbr6t8ni-zl">
+            <w:hyperlink w:history="1" r:id="rIdyyg6_sa0q86xsol_y_4mp">
               <w:r>
                 <w:rPr>
                   <w:rFonts w:ascii="Arial" w:cs="Arial" w:eastAsia="Arial" w:hAnsi="Arial"/>
@@ -7975,7 +7975,7 @@
             <w:pPr>
               <w:spacing w:after="20" w:before="0"/>
             </w:pPr>
-            <w:hyperlink w:history="1" r:id="rIdgxwsgwty47k2ejy8zlmac">
+            <w:hyperlink w:history="1" r:id="rIdpb9vktqvtc-1wp_yyy-at">
               <w:r>
                 <w:rPr>
                   <w:rFonts w:ascii="Arial" w:cs="Arial" w:eastAsia="Arial" w:hAnsi="Arial"/>
@@ -8008,7 +8008,7 @@
               <w:spacing w:after="10" w:before="0"/>
               <w:ind w:left="120"/>
             </w:pPr>
-            <w:hyperlink w:history="1" r:id="rIdxfeqqmr07tubsbeaqsfhr">
+            <w:hyperlink w:history="1" r:id="rIdbygz_liu3pvkt99woxl0j">
               <w:r>
                 <w:rPr>
                   <w:rFonts w:ascii="Arial" w:cs="Arial" w:eastAsia="Arial" w:hAnsi="Arial"/>
@@ -8520,7 +8520,7 @@
         </w:rPr>
         <w:t xml:space="preserve">© 2026 SeaVuria and ARES. Aligned with KICD objectives. Developed by SeaVuria; technical implementation by ARES (with AI assistance from Claude). Licensed under </w:t>
       </w:r>
-      <w:hyperlink w:history="1" r:id="rIdufidnm9cyy30cdmlh5mul">
+      <w:hyperlink w:history="1" r:id="rId40wk7jlg3lbe0jz-ihumj">
         <w:r>
           <w:rPr>
             <w:rFonts w:ascii="Arial" w:cs="Arial" w:eastAsia="Arial" w:hAnsi="Arial"/>
@@ -8541,7 +8541,7 @@
         </w:rPr>
         <w:t xml:space="preserve"> (</w:t>
       </w:r>
-      <w:hyperlink w:history="1" r:id="rIdre8q15dvwidyir5vypkv-">
+      <w:hyperlink w:history="1" r:id="rIdicigo3qsz4bafb722nljt">
         <w:r>
           <w:rPr>
             <w:rFonts w:ascii="Arial" w:cs="Arial" w:eastAsia="Arial" w:hAnsi="Arial"/>
@@ -9554,7 +9554,7 @@
             <w:pPr>
               <w:spacing w:after="20" w:before="0"/>
             </w:pPr>
-            <w:hyperlink w:history="1" r:id="rIdwjbhzig_phcmdy5nawrqp">
+            <w:hyperlink w:history="1" r:id="rId1q_c7uoykhhhds-j4gn3f">
               <w:r>
                 <w:rPr>
                   <w:rFonts w:ascii="Arial" w:cs="Arial" w:eastAsia="Arial" w:hAnsi="Arial"/>
@@ -9587,7 +9587,7 @@
               <w:spacing w:after="10" w:before="0"/>
               <w:ind w:left="120"/>
             </w:pPr>
-            <w:hyperlink w:history="1" r:id="rId6f5t1xqb4jugl4lmzoa6f">
+            <w:hyperlink w:history="1" r:id="rIdwl0vephwglmi-l7y3in-t">
               <w:r>
                 <w:rPr>
                   <w:rFonts w:ascii="Arial" w:cs="Arial" w:eastAsia="Arial" w:hAnsi="Arial"/>
@@ -9632,7 +9632,7 @@
             <w:pPr>
               <w:spacing w:after="20" w:before="0"/>
             </w:pPr>
-            <w:hyperlink w:history="1" r:id="rIdjhvppw_-sf0r5pkig9mtx">
+            <w:hyperlink w:history="1" r:id="rIdey3abb_wx64txqafbe-vl">
               <w:r>
                 <w:rPr>
                   <w:rFonts w:ascii="Arial" w:cs="Arial" w:eastAsia="Arial" w:hAnsi="Arial"/>
@@ -9665,7 +9665,7 @@
               <w:spacing w:after="10" w:before="0"/>
               <w:ind w:left="120"/>
             </w:pPr>
-            <w:hyperlink w:history="1" r:id="rIdv2h5yb7wmfvor5nv5eplg">
+            <w:hyperlink w:history="1" r:id="rIdkcnd_zmxsyt_vayv87hq8">
               <w:r>
                 <w:rPr>
                   <w:rFonts w:ascii="Arial" w:cs="Arial" w:eastAsia="Arial" w:hAnsi="Arial"/>
@@ -9860,7 +9860,7 @@
             <w:pPr>
               <w:spacing w:after="20" w:before="0"/>
             </w:pPr>
-            <w:hyperlink w:history="1" r:id="rId3fnjrqxmvbdtnhbif8esk">
+            <w:hyperlink w:history="1" r:id="rId2dvzmgvf-hxoev-kp4m9h">
               <w:r>
                 <w:rPr>
                   <w:rFonts w:ascii="Arial" w:cs="Arial" w:eastAsia="Arial" w:hAnsi="Arial"/>
@@ -9893,7 +9893,7 @@
               <w:spacing w:after="10" w:before="0"/>
               <w:ind w:left="120"/>
             </w:pPr>
-            <w:hyperlink w:history="1" r:id="rIdvzf3xn0lhiz2uwyc7dsdn">
+            <w:hyperlink w:history="1" r:id="rIdexgyichgt44mfrpak4zx8">
               <w:r>
                 <w:rPr>
                   <w:rFonts w:ascii="Arial" w:cs="Arial" w:eastAsia="Arial" w:hAnsi="Arial"/>
@@ -9938,7 +9938,7 @@
             <w:pPr>
               <w:spacing w:after="20" w:before="0"/>
             </w:pPr>
-            <w:hyperlink w:history="1" r:id="rIdytjwuaumxl-6isfiiz_lp">
+            <w:hyperlink w:history="1" r:id="rId0bx_60hbrvntd4nvnys0e">
               <w:r>
                 <w:rPr>
                   <w:rFonts w:ascii="Arial" w:cs="Arial" w:eastAsia="Arial" w:hAnsi="Arial"/>
@@ -9971,7 +9971,7 @@
               <w:spacing w:after="10" w:before="0"/>
               <w:ind w:left="120"/>
             </w:pPr>
-            <w:hyperlink w:history="1" r:id="rIdma9ori4lforlwlesh4tya">
+            <w:hyperlink w:history="1" r:id="rIdxbqaglznyjrmfuf4beu4x">
               <w:r>
                 <w:rPr>
                   <w:rFonts w:ascii="Arial" w:cs="Arial" w:eastAsia="Arial" w:hAnsi="Arial"/>
@@ -10166,7 +10166,7 @@
             <w:pPr>
               <w:spacing w:after="20" w:before="0"/>
             </w:pPr>
-            <w:hyperlink w:history="1" r:id="rId-vbmjijpg-nxkljhjwwqc">
+            <w:hyperlink w:history="1" r:id="rId5fqhwgbxemxhv0xqbuty_">
               <w:r>
                 <w:rPr>
                   <w:rFonts w:ascii="Arial" w:cs="Arial" w:eastAsia="Arial" w:hAnsi="Arial"/>
@@ -10215,7 +10215,7 @@
               <w:spacing w:after="10" w:before="0"/>
               <w:ind w:left="120"/>
             </w:pPr>
-            <w:hyperlink w:history="1" r:id="rIdqut91aj7h3bziyps1lxnz">
+            <w:hyperlink w:history="1" r:id="rIdkj6qvhkmlau7g5-zdcjvj">
               <w:r>
                 <w:rPr>
                   <w:rFonts w:ascii="Arial" w:cs="Arial" w:eastAsia="Arial" w:hAnsi="Arial"/>
@@ -10260,7 +10260,7 @@
             <w:pPr>
               <w:spacing w:after="20" w:before="0"/>
             </w:pPr>
-            <w:hyperlink w:history="1" r:id="rIdt9arcs4uq4yuc6ayibt3y">
+            <w:hyperlink w:history="1" r:id="rId3ds3vewyzvvitu48vwvnd">
               <w:r>
                 <w:rPr>
                   <w:rFonts w:ascii="Arial" w:cs="Arial" w:eastAsia="Arial" w:hAnsi="Arial"/>
@@ -10293,7 +10293,7 @@
               <w:spacing w:after="10" w:before="0"/>
               <w:ind w:left="120"/>
             </w:pPr>
-            <w:hyperlink w:history="1" r:id="rIddlbhrbf8w-opo3h6ppmzi">
+            <w:hyperlink w:history="1" r:id="rIdobtcrtoj-x-km89zywgzy">
               <w:r>
                 <w:rPr>
                   <w:rFonts w:ascii="Arial" w:cs="Arial" w:eastAsia="Arial" w:hAnsi="Arial"/>
@@ -10488,7 +10488,7 @@
             <w:pPr>
               <w:spacing w:after="20" w:before="0"/>
             </w:pPr>
-            <w:hyperlink w:history="1" r:id="rIdo8mpv48g0hhyoleuzkixx">
+            <w:hyperlink w:history="1" r:id="rIdszslxi5zxvyh6mqvnrps1">
               <w:r>
                 <w:rPr>
                   <w:rFonts w:ascii="Arial" w:cs="Arial" w:eastAsia="Arial" w:hAnsi="Arial"/>
@@ -10537,7 +10537,7 @@
               <w:spacing w:after="10" w:before="0"/>
               <w:ind w:left="120"/>
             </w:pPr>
-            <w:hyperlink w:history="1" r:id="rId0vsb2pp4stt5ds4hxa3p5">
+            <w:hyperlink w:history="1" r:id="rIdopymlvpbwtvvrjdvnnpyd">
               <w:r>
                 <w:rPr>
                   <w:rFonts w:ascii="Arial" w:cs="Arial" w:eastAsia="Arial" w:hAnsi="Arial"/>
@@ -10582,7 +10582,7 @@
             <w:pPr>
               <w:spacing w:after="20" w:before="0"/>
             </w:pPr>
-            <w:hyperlink w:history="1" r:id="rIdyxcpbiksb6mrbypdiojbo">
+            <w:hyperlink w:history="1" r:id="rIdv-tjsd_pub5jredx1v8ot">
               <w:r>
                 <w:rPr>
                   <w:rFonts w:ascii="Arial" w:cs="Arial" w:eastAsia="Arial" w:hAnsi="Arial"/>
@@ -10615,7 +10615,7 @@
               <w:spacing w:after="10" w:before="0"/>
               <w:ind w:left="120"/>
             </w:pPr>
-            <w:hyperlink w:history="1" r:id="rIdezn7mfnfrlzgl362wu5mc">
+            <w:hyperlink w:history="1" r:id="rIdexzwoaso-fosmb5beqc2p">
               <w:r>
                 <w:rPr>
                   <w:rFonts w:ascii="Arial" w:cs="Arial" w:eastAsia="Arial" w:hAnsi="Arial"/>
@@ -10810,7 +10810,7 @@
             <w:pPr>
               <w:spacing w:after="20" w:before="0"/>
             </w:pPr>
-            <w:hyperlink w:history="1" r:id="rIdklnlwfcpo9d1eqwjdnlf7">
+            <w:hyperlink w:history="1" r:id="rIdsq8kvjbyqssxtc29zbu4x">
               <w:r>
                 <w:rPr>
                   <w:rFonts w:ascii="Arial" w:cs="Arial" w:eastAsia="Arial" w:hAnsi="Arial"/>
@@ -10859,7 +10859,7 @@
               <w:spacing w:after="10" w:before="0"/>
               <w:ind w:left="120"/>
             </w:pPr>
-            <w:hyperlink w:history="1" r:id="rIdae4wq_sxwuadctxuitwxl">
+            <w:hyperlink w:history="1" r:id="rIdqw57u_ajfahqkrchdmgvf">
               <w:r>
                 <w:rPr>
                   <w:rFonts w:ascii="Arial" w:cs="Arial" w:eastAsia="Arial" w:hAnsi="Arial"/>
@@ -10904,7 +10904,7 @@
             <w:pPr>
               <w:spacing w:after="20" w:before="0"/>
             </w:pPr>
-            <w:hyperlink w:history="1" r:id="rId7ek76kyfmoe9fay3njoeu">
+            <w:hyperlink w:history="1" r:id="rIdlhy9j1d7u89bjdzb5mxxg">
               <w:r>
                 <w:rPr>
                   <w:rFonts w:ascii="Arial" w:cs="Arial" w:eastAsia="Arial" w:hAnsi="Arial"/>
@@ -10937,7 +10937,7 @@
               <w:spacing w:after="10" w:before="0"/>
               <w:ind w:left="120"/>
             </w:pPr>
-            <w:hyperlink w:history="1" r:id="rIdgobngcnl6wuel7pycf-zk">
+            <w:hyperlink w:history="1" r:id="rIdzyk7ocwcjhcsh07at6rsu">
               <w:r>
                 <w:rPr>
                   <w:rFonts w:ascii="Arial" w:cs="Arial" w:eastAsia="Arial" w:hAnsi="Arial"/>
@@ -11449,7 +11449,7 @@
         </w:rPr>
         <w:t xml:space="preserve">© 2026 SeaVuria and ARES. Aligned with KICD objectives. Developed by SeaVuria; technical implementation by ARES (with AI assistance from Claude). Licensed under </w:t>
       </w:r>
-      <w:hyperlink w:history="1" r:id="rIdhwcakvosai8uwsf-dh1me">
+      <w:hyperlink w:history="1" r:id="rIduie-2qoixdxcypbfqoram">
         <w:r>
           <w:rPr>
             <w:rFonts w:ascii="Arial" w:cs="Arial" w:eastAsia="Arial" w:hAnsi="Arial"/>
@@ -11470,7 +11470,7 @@
         </w:rPr>
         <w:t xml:space="preserve"> (</w:t>
       </w:r>
-      <w:hyperlink w:history="1" r:id="rIdmrh_upnbzuqmemq4ifi-q">
+      <w:hyperlink w:history="1" r:id="rIdm_j7u_vfziulvvltqf0uq">
         <w:r>
           <w:rPr>
             <w:rFonts w:ascii="Arial" w:cs="Arial" w:eastAsia="Arial" w:hAnsi="Arial"/>
@@ -12483,7 +12483,7 @@
             <w:pPr>
               <w:spacing w:after="20" w:before="0"/>
             </w:pPr>
-            <w:hyperlink w:history="1" r:id="rIdermg5wfxkvqgh3timboyg">
+            <w:hyperlink w:history="1" r:id="rIdxnydqxtvjqx9f_n1qscyk">
               <w:r>
                 <w:rPr>
                   <w:rFonts w:ascii="Arial" w:cs="Arial" w:eastAsia="Arial" w:hAnsi="Arial"/>
@@ -12516,7 +12516,7 @@
               <w:spacing w:after="10" w:before="0"/>
               <w:ind w:left="120"/>
             </w:pPr>
-            <w:hyperlink w:history="1" r:id="rIdgaylbctf0vtlnzp2ir1yb">
+            <w:hyperlink w:history="1" r:id="rIdl-km-84ym7mjktfusdwir">
               <w:r>
                 <w:rPr>
                   <w:rFonts w:ascii="Arial" w:cs="Arial" w:eastAsia="Arial" w:hAnsi="Arial"/>
@@ -12561,7 +12561,7 @@
             <w:pPr>
               <w:spacing w:after="20" w:before="0"/>
             </w:pPr>
-            <w:hyperlink w:history="1" r:id="rIdy2lfzxnyjk4leqltgsaoe">
+            <w:hyperlink w:history="1" r:id="rIdxr2odahkjaj9ldncxf5sd">
               <w:r>
                 <w:rPr>
                   <w:rFonts w:ascii="Arial" w:cs="Arial" w:eastAsia="Arial" w:hAnsi="Arial"/>
@@ -12594,7 +12594,7 @@
               <w:spacing w:after="10" w:before="0"/>
               <w:ind w:left="120"/>
             </w:pPr>
-            <w:hyperlink w:history="1" r:id="rIdoc-9qlveg_buodafc_cwb">
+            <w:hyperlink w:history="1" r:id="rIdhkygjan5b_vq7tusifrti">
               <w:r>
                 <w:rPr>
                   <w:rFonts w:ascii="Arial" w:cs="Arial" w:eastAsia="Arial" w:hAnsi="Arial"/>
@@ -12789,7 +12789,7 @@
             <w:pPr>
               <w:spacing w:after="20" w:before="0"/>
             </w:pPr>
-            <w:hyperlink w:history="1" r:id="rIdy5ko-45dsnwqtkxpg7vup">
+            <w:hyperlink w:history="1" r:id="rIdivbiw67sjz94vdnwpabyp">
               <w:r>
                 <w:rPr>
                   <w:rFonts w:ascii="Arial" w:cs="Arial" w:eastAsia="Arial" w:hAnsi="Arial"/>
@@ -12822,7 +12822,7 @@
               <w:spacing w:after="10" w:before="0"/>
               <w:ind w:left="120"/>
             </w:pPr>
-            <w:hyperlink w:history="1" r:id="rIdwyvtlwl0wrzx-thhreoip">
+            <w:hyperlink w:history="1" r:id="rIdipkfoe53rs_2wplka69rf">
               <w:r>
                 <w:rPr>
                   <w:rFonts w:ascii="Arial" w:cs="Arial" w:eastAsia="Arial" w:hAnsi="Arial"/>
@@ -12867,7 +12867,7 @@
             <w:pPr>
               <w:spacing w:after="20" w:before="0"/>
             </w:pPr>
-            <w:hyperlink w:history="1" r:id="rIdtivi7higi9f6l7o-dkw3i">
+            <w:hyperlink w:history="1" r:id="rIdsr_zanadkjeetljp3dgiq">
               <w:r>
                 <w:rPr>
                   <w:rFonts w:ascii="Arial" w:cs="Arial" w:eastAsia="Arial" w:hAnsi="Arial"/>
@@ -12900,7 +12900,7 @@
               <w:spacing w:after="10" w:before="0"/>
               <w:ind w:left="120"/>
             </w:pPr>
-            <w:hyperlink w:history="1" r:id="rIdkjab6nchci3btcc2iwqgh">
+            <w:hyperlink w:history="1" r:id="rIdmvp8gc_mek9yt8bdz6mem">
               <w:r>
                 <w:rPr>
                   <w:rFonts w:ascii="Arial" w:cs="Arial" w:eastAsia="Arial" w:hAnsi="Arial"/>
@@ -13095,7 +13095,7 @@
             <w:pPr>
               <w:spacing w:after="20" w:before="0"/>
             </w:pPr>
-            <w:hyperlink w:history="1" r:id="rIdde-ebezewhvui9dkl_nsd">
+            <w:hyperlink w:history="1" r:id="rIdjmy_1wn3mt56dk_3wfqn8">
               <w:r>
                 <w:rPr>
                   <w:rFonts w:ascii="Arial" w:cs="Arial" w:eastAsia="Arial" w:hAnsi="Arial"/>
@@ -13128,7 +13128,7 @@
               <w:spacing w:after="10" w:before="0"/>
               <w:ind w:left="120"/>
             </w:pPr>
-            <w:hyperlink w:history="1" r:id="rIdsd1e5akkeizgzqnpimfqq">
+            <w:hyperlink w:history="1" r:id="rIduj1qr7keaipx8w-hk8lca">
               <w:r>
                 <w:rPr>
                   <w:rFonts w:ascii="Arial" w:cs="Arial" w:eastAsia="Arial" w:hAnsi="Arial"/>
@@ -13173,7 +13173,7 @@
             <w:pPr>
               <w:spacing w:after="20" w:before="0"/>
             </w:pPr>
-            <w:hyperlink w:history="1" r:id="rIdtj6nmgp2h9rhrvtwlc1jr">
+            <w:hyperlink w:history="1" r:id="rIdme2jgxqhgih4qzxzwwymr">
               <w:r>
                 <w:rPr>
                   <w:rFonts w:ascii="Arial" w:cs="Arial" w:eastAsia="Arial" w:hAnsi="Arial"/>
@@ -13206,7 +13206,7 @@
               <w:spacing w:after="10" w:before="0"/>
               <w:ind w:left="120"/>
             </w:pPr>
-            <w:hyperlink w:history="1" r:id="rIds7nyopcw4cvxtm_bzjh0k">
+            <w:hyperlink w:history="1" r:id="rIdkxr5fywclayc6xgenizlc">
               <w:r>
                 <w:rPr>
                   <w:rFonts w:ascii="Arial" w:cs="Arial" w:eastAsia="Arial" w:hAnsi="Arial"/>
@@ -13790,7 +13790,7 @@
             <w:pPr>
               <w:spacing w:after="20" w:before="0"/>
             </w:pPr>
-            <w:hyperlink w:history="1" r:id="rIdit7env6n5lv2a9pshxu02">
+            <w:hyperlink w:history="1" r:id="rIdbtz_vxzcciwwueyrn-l2k">
               <w:r>
                 <w:rPr>
                   <w:rFonts w:ascii="Arial" w:cs="Arial" w:eastAsia="Arial" w:hAnsi="Arial"/>
@@ -13823,7 +13823,7 @@
               <w:spacing w:after="10" w:before="0"/>
               <w:ind w:left="120"/>
             </w:pPr>
-            <w:hyperlink w:history="1" r:id="rIdygup8dckabb2fisx30mew">
+            <w:hyperlink w:history="1" r:id="rIdepgfeyq-slxwiwwf_qoxu">
               <w:r>
                 <w:rPr>
                   <w:rFonts w:ascii="Arial" w:cs="Arial" w:eastAsia="Arial" w:hAnsi="Arial"/>
@@ -13868,7 +13868,7 @@
             <w:pPr>
               <w:spacing w:after="20" w:before="0"/>
             </w:pPr>
-            <w:hyperlink w:history="1" r:id="rId_di0s9epurldm3isfvomd">
+            <w:hyperlink w:history="1" r:id="rIdpokzqcdgj1io4gumk1mdf">
               <w:r>
                 <w:rPr>
                   <w:rFonts w:ascii="Arial" w:cs="Arial" w:eastAsia="Arial" w:hAnsi="Arial"/>
@@ -13901,7 +13901,7 @@
               <w:spacing w:after="10" w:before="0"/>
               <w:ind w:left="120"/>
             </w:pPr>
-            <w:hyperlink w:history="1" r:id="rIdlkiwx5v0tpp4uascmmqle">
+            <w:hyperlink w:history="1" r:id="rId463ihbmpqgg-muinehs72">
               <w:r>
                 <w:rPr>
                   <w:rFonts w:ascii="Arial" w:cs="Arial" w:eastAsia="Arial" w:hAnsi="Arial"/>
@@ -14096,7 +14096,7 @@
             <w:pPr>
               <w:spacing w:after="20" w:before="0"/>
             </w:pPr>
-            <w:hyperlink w:history="1" r:id="rIdon0b1lxg75nozfzcfbkum">
+            <w:hyperlink w:history="1" r:id="rIdlw6n4wqerpggjvg9w9aay">
               <w:r>
                 <w:rPr>
                   <w:rFonts w:ascii="Arial" w:cs="Arial" w:eastAsia="Arial" w:hAnsi="Arial"/>
@@ -14129,7 +14129,7 @@
               <w:spacing w:after="10" w:before="0"/>
               <w:ind w:left="120"/>
             </w:pPr>
-            <w:hyperlink w:history="1" r:id="rIdhbl-tfb4x4qvwiicnibxq">
+            <w:hyperlink w:history="1" r:id="rIdzskjwytahc7ejba8vp2u7">
               <w:r>
                 <w:rPr>
                   <w:rFonts w:ascii="Arial" w:cs="Arial" w:eastAsia="Arial" w:hAnsi="Arial"/>
@@ -14174,7 +14174,7 @@
             <w:pPr>
               <w:spacing w:after="20" w:before="0"/>
             </w:pPr>
-            <w:hyperlink w:history="1" r:id="rIdpsldz7s14n4mhhcnnyt93">
+            <w:hyperlink w:history="1" r:id="rId2julwdexkpmrelieygl7z">
               <w:r>
                 <w:rPr>
                   <w:rFonts w:ascii="Arial" w:cs="Arial" w:eastAsia="Arial" w:hAnsi="Arial"/>
@@ -14207,7 +14207,7 @@
               <w:spacing w:after="10" w:before="0"/>
               <w:ind w:left="120"/>
             </w:pPr>
-            <w:hyperlink w:history="1" r:id="rIdtasushm7rb-qpgq4tbrfy">
+            <w:hyperlink w:history="1" r:id="rIde-j-t-g7twvhev0ysiels">
               <w:r>
                 <w:rPr>
                   <w:rFonts w:ascii="Arial" w:cs="Arial" w:eastAsia="Arial" w:hAnsi="Arial"/>
@@ -14719,7 +14719,7 @@
         </w:rPr>
         <w:t xml:space="preserve">© 2026 SeaVuria and ARES. Aligned with KICD objectives. Developed by SeaVuria; technical implementation by ARES (with AI assistance from Claude). Licensed under </w:t>
       </w:r>
-      <w:hyperlink w:history="1" r:id="rIdoekjn5jgtwgr-zwwqyyty">
+      <w:hyperlink w:history="1" r:id="rIdtl1u2hnwys5kkbxvdsrbu">
         <w:r>
           <w:rPr>
             <w:rFonts w:ascii="Arial" w:cs="Arial" w:eastAsia="Arial" w:hAnsi="Arial"/>
@@ -14740,7 +14740,7 @@
         </w:rPr>
         <w:t xml:space="preserve"> (</w:t>
       </w:r>
-      <w:hyperlink w:history="1" r:id="rIdbtq-nkw1vkdu3nxlvbren">
+      <w:hyperlink w:history="1" r:id="rIdvrcpu_kdb610r4ferpm2x">
         <w:r>
           <w:rPr>
             <w:rFonts w:ascii="Arial" w:cs="Arial" w:eastAsia="Arial" w:hAnsi="Arial"/>
@@ -15753,7 +15753,7 @@
             <w:pPr>
               <w:spacing w:after="20" w:before="0"/>
             </w:pPr>
-            <w:hyperlink w:history="1" r:id="rIdzf-4cvp2-qzsblcv7ah4t">
+            <w:hyperlink w:history="1" r:id="rIdpw8_8jqebuqiozpup4lva">
               <w:r>
                 <w:rPr>
                   <w:rFonts w:ascii="Arial" w:cs="Arial" w:eastAsia="Arial" w:hAnsi="Arial"/>
@@ -15786,7 +15786,7 @@
               <w:spacing w:after="10" w:before="0"/>
               <w:ind w:left="120"/>
             </w:pPr>
-            <w:hyperlink w:history="1" r:id="rIdmsenaw8kqixtijbijv8n0">
+            <w:hyperlink w:history="1" r:id="rIdpem5ivl8hxmucapmquyfo">
               <w:r>
                 <w:rPr>
                   <w:rFonts w:ascii="Arial" w:cs="Arial" w:eastAsia="Arial" w:hAnsi="Arial"/>
@@ -15831,7 +15831,7 @@
             <w:pPr>
               <w:spacing w:after="20" w:before="0"/>
             </w:pPr>
-            <w:hyperlink w:history="1" r:id="rId2uku6k6sf_tax6fz9t-yr">
+            <w:hyperlink w:history="1" r:id="rIdxyq-itwpuiytqqfet2s9h">
               <w:r>
                 <w:rPr>
                   <w:rFonts w:ascii="Arial" w:cs="Arial" w:eastAsia="Arial" w:hAnsi="Arial"/>
@@ -15864,7 +15864,7 @@
               <w:spacing w:after="10" w:before="0"/>
               <w:ind w:left="120"/>
             </w:pPr>
-            <w:hyperlink w:history="1" r:id="rIdv_1w0kcrhde2zr8swdixe">
+            <w:hyperlink w:history="1" r:id="rIdipyhvndioev0veuinrpba">
               <w:r>
                 <w:rPr>
                   <w:rFonts w:ascii="Arial" w:cs="Arial" w:eastAsia="Arial" w:hAnsi="Arial"/>
@@ -16059,7 +16059,7 @@
             <w:pPr>
               <w:spacing w:after="20" w:before="0"/>
             </w:pPr>
-            <w:hyperlink w:history="1" r:id="rIdvjce1pqviyt5mulwew6mq">
+            <w:hyperlink w:history="1" r:id="rId98rqs8cqrwprg7q5kgkkg">
               <w:r>
                 <w:rPr>
                   <w:rFonts w:ascii="Arial" w:cs="Arial" w:eastAsia="Arial" w:hAnsi="Arial"/>
@@ -16092,7 +16092,7 @@
               <w:spacing w:after="10" w:before="0"/>
               <w:ind w:left="120"/>
             </w:pPr>
-            <w:hyperlink w:history="1" r:id="rIdv2owytwl8sxaevja31dml">
+            <w:hyperlink w:history="1" r:id="rIdguhwb0g0cxz6oeg34go4t">
               <w:r>
                 <w:rPr>
                   <w:rFonts w:ascii="Arial" w:cs="Arial" w:eastAsia="Arial" w:hAnsi="Arial"/>
@@ -16137,7 +16137,7 @@
             <w:pPr>
               <w:spacing w:after="20" w:before="0"/>
             </w:pPr>
-            <w:hyperlink w:history="1" r:id="rIdq2hy1eltdhrri1tqsugqn">
+            <w:hyperlink w:history="1" r:id="rIdjnoz9oz1sgiw8u5qq9f4-">
               <w:r>
                 <w:rPr>
                   <w:rFonts w:ascii="Arial" w:cs="Arial" w:eastAsia="Arial" w:hAnsi="Arial"/>
@@ -16170,7 +16170,7 @@
               <w:spacing w:after="10" w:before="0"/>
               <w:ind w:left="120"/>
             </w:pPr>
-            <w:hyperlink w:history="1" r:id="rIdapblq_br74gjq5md-2-ct">
+            <w:hyperlink w:history="1" r:id="rIdhhxvqrze6up_x0f4itk2a">
               <w:r>
                 <w:rPr>
                   <w:rFonts w:ascii="Arial" w:cs="Arial" w:eastAsia="Arial" w:hAnsi="Arial"/>
@@ -16365,7 +16365,7 @@
             <w:pPr>
               <w:spacing w:after="20" w:before="0"/>
             </w:pPr>
-            <w:hyperlink w:history="1" r:id="rIdx7d3sb41z1_xy5kwahha6">
+            <w:hyperlink w:history="1" r:id="rIdcac1fpzxxuuvdlblpem9l">
               <w:r>
                 <w:rPr>
                   <w:rFonts w:ascii="Arial" w:cs="Arial" w:eastAsia="Arial" w:hAnsi="Arial"/>
@@ -16398,7 +16398,7 @@
               <w:spacing w:after="10" w:before="0"/>
               <w:ind w:left="120"/>
             </w:pPr>
-            <w:hyperlink w:history="1" r:id="rIdshjh52h19d9rkpkdhmluz">
+            <w:hyperlink w:history="1" r:id="rIdvia2_8ifp4ls7gzbjuibl">
               <w:r>
                 <w:rPr>
                   <w:rFonts w:ascii="Arial" w:cs="Arial" w:eastAsia="Arial" w:hAnsi="Arial"/>
@@ -16443,7 +16443,7 @@
             <w:pPr>
               <w:spacing w:after="20" w:before="0"/>
             </w:pPr>
-            <w:hyperlink w:history="1" r:id="rIdbpc3nsedqxn91ohawim6f">
+            <w:hyperlink w:history="1" r:id="rIdjx55usnxefysfmws1zou0">
               <w:r>
                 <w:rPr>
                   <w:rFonts w:ascii="Arial" w:cs="Arial" w:eastAsia="Arial" w:hAnsi="Arial"/>
@@ -16492,7 +16492,7 @@
               <w:spacing w:after="10" w:before="0"/>
               <w:ind w:left="120"/>
             </w:pPr>
-            <w:hyperlink w:history="1" r:id="rIdzy6yl_bbu4l--hum1nufj">
+            <w:hyperlink w:history="1" r:id="rIdxofrgnrgcikohybwrcisr">
               <w:r>
                 <w:rPr>
                   <w:rFonts w:ascii="Arial" w:cs="Arial" w:eastAsia="Arial" w:hAnsi="Arial"/>
@@ -16687,7 +16687,7 @@
             <w:pPr>
               <w:spacing w:after="20" w:before="0"/>
             </w:pPr>
-            <w:hyperlink w:history="1" r:id="rIdqw-k0hjhftqwoi0qixw8n">
+            <w:hyperlink w:history="1" r:id="rIdewre0tvzpcbve9w0ffhvn">
               <w:r>
                 <w:rPr>
                   <w:rFonts w:ascii="Arial" w:cs="Arial" w:eastAsia="Arial" w:hAnsi="Arial"/>
@@ -16720,7 +16720,7 @@
               <w:spacing w:after="10" w:before="0"/>
               <w:ind w:left="120"/>
             </w:pPr>
-            <w:hyperlink w:history="1" r:id="rIdtqo99bkij2jwhcwq0rwcu">
+            <w:hyperlink w:history="1" r:id="rIdipniyrywoc087t_xegr-k">
               <w:r>
                 <w:rPr>
                   <w:rFonts w:ascii="Arial" w:cs="Arial" w:eastAsia="Arial" w:hAnsi="Arial"/>
@@ -16765,7 +16765,7 @@
             <w:pPr>
               <w:spacing w:after="20" w:before="0"/>
             </w:pPr>
-            <w:hyperlink w:history="1" r:id="rIdm-rihmfgvdzlgzqy9spow">
+            <w:hyperlink w:history="1" r:id="rIdch4bjswsssr9k-g1unee2">
               <w:r>
                 <w:rPr>
                   <w:rFonts w:ascii="Arial" w:cs="Arial" w:eastAsia="Arial" w:hAnsi="Arial"/>
@@ -16814,7 +16814,7 @@
               <w:spacing w:after="10" w:before="0"/>
               <w:ind w:left="120"/>
             </w:pPr>
-            <w:hyperlink w:history="1" r:id="rIdkpazhoktn23m3eif6ilff">
+            <w:hyperlink w:history="1" r:id="rIdl4_lk8s2cias62d4yepx_">
               <w:r>
                 <w:rPr>
                   <w:rFonts w:ascii="Arial" w:cs="Arial" w:eastAsia="Arial" w:hAnsi="Arial"/>
@@ -17009,7 +17009,7 @@
             <w:pPr>
               <w:spacing w:after="20" w:before="0"/>
             </w:pPr>
-            <w:hyperlink w:history="1" r:id="rIduz51trxrijzfymsgadv7d">
+            <w:hyperlink w:history="1" r:id="rIdi5yqfxaixg2jgbmz7h3_t">
               <w:r>
                 <w:rPr>
                   <w:rFonts w:ascii="Arial" w:cs="Arial" w:eastAsia="Arial" w:hAnsi="Arial"/>
@@ -17058,7 +17058,7 @@
               <w:spacing w:after="10" w:before="0"/>
               <w:ind w:left="120"/>
             </w:pPr>
-            <w:hyperlink w:history="1" r:id="rId0q3escn05vqwsvujgdy5c">
+            <w:hyperlink w:history="1" r:id="rIdh8ssiofw2zx3jczcevvsp">
               <w:r>
                 <w:rPr>
                   <w:rFonts w:ascii="Arial" w:cs="Arial" w:eastAsia="Arial" w:hAnsi="Arial"/>
@@ -17103,7 +17103,7 @@
             <w:pPr>
               <w:spacing w:after="20" w:before="0"/>
             </w:pPr>
-            <w:hyperlink w:history="1" r:id="rIdvyud0iu9583hcnbxga9qr">
+            <w:hyperlink w:history="1" r:id="rIdj4pujsckvsxlk0dfodenq">
               <w:r>
                 <w:rPr>
                   <w:rFonts w:ascii="Arial" w:cs="Arial" w:eastAsia="Arial" w:hAnsi="Arial"/>
@@ -17152,7 +17152,7 @@
               <w:spacing w:after="10" w:before="0"/>
               <w:ind w:left="120"/>
             </w:pPr>
-            <w:hyperlink w:history="1" r:id="rIdlbpn8jwjijjqoce9esmam">
+            <w:hyperlink w:history="1" r:id="rIde0ubuficxfhy5opbh0zi1">
               <w:r>
                 <w:rPr>
                   <w:rFonts w:ascii="Arial" w:cs="Arial" w:eastAsia="Arial" w:hAnsi="Arial"/>
@@ -17664,7 +17664,7 @@
         </w:rPr>
         <w:t xml:space="preserve">© 2026 SeaVuria and ARES. Aligned with KICD objectives. Developed by SeaVuria; technical implementation by ARES (with AI assistance from Claude). Licensed under </w:t>
       </w:r>
-      <w:hyperlink w:history="1" r:id="rId-xjq_o-8kabdf7w61ednc">
+      <w:hyperlink w:history="1" r:id="rId_kxk540-ohhckzsmhsmf7">
         <w:r>
           <w:rPr>
             <w:rFonts w:ascii="Arial" w:cs="Arial" w:eastAsia="Arial" w:hAnsi="Arial"/>
@@ -17685,7 +17685,7 @@
         </w:rPr>
         <w:t xml:space="preserve"> (</w:t>
       </w:r>
-      <w:hyperlink w:history="1" r:id="rIdlaldp2sic2snf3v0pgpm8">
+      <w:hyperlink w:history="1" r:id="rIdbu5afewfw_zh1nsmi2a4v">
         <w:r>
           <w:rPr>
             <w:rFonts w:ascii="Arial" w:cs="Arial" w:eastAsia="Arial" w:hAnsi="Arial"/>
@@ -18698,7 +18698,7 @@
             <w:pPr>
               <w:spacing w:after="20" w:before="0"/>
             </w:pPr>
-            <w:hyperlink w:history="1" r:id="rIdxl_yjy0bqa4d56bbnm0hn">
+            <w:hyperlink w:history="1" r:id="rIdei9pit94_jla5kiijyti8">
               <w:r>
                 <w:rPr>
                   <w:rFonts w:ascii="Arial" w:cs="Arial" w:eastAsia="Arial" w:hAnsi="Arial"/>
@@ -18747,7 +18747,7 @@
               <w:spacing w:after="10" w:before="0"/>
               <w:ind w:left="120"/>
             </w:pPr>
-            <w:hyperlink w:history="1" r:id="rIdy7s0gvwexxj-gnrcpeafh">
+            <w:hyperlink w:history="1" r:id="rIdsuovmd0q04yb1fhve3xvr">
               <w:r>
                 <w:rPr>
                   <w:rFonts w:ascii="Arial" w:cs="Arial" w:eastAsia="Arial" w:hAnsi="Arial"/>
@@ -18792,7 +18792,7 @@
             <w:pPr>
               <w:spacing w:after="20" w:before="0"/>
             </w:pPr>
-            <w:hyperlink w:history="1" r:id="rIdtsc4csscoulwryve94cee">
+            <w:hyperlink w:history="1" r:id="rIddngoq6xrhbuei3kqvalxt">
               <w:r>
                 <w:rPr>
                   <w:rFonts w:ascii="Arial" w:cs="Arial" w:eastAsia="Arial" w:hAnsi="Arial"/>
@@ -18825,7 +18825,7 @@
               <w:spacing w:after="10" w:before="0"/>
               <w:ind w:left="120"/>
             </w:pPr>
-            <w:hyperlink w:history="1" r:id="rIdjslgwgu_7ojyz-amlr6a5">
+            <w:hyperlink w:history="1" r:id="rIdmpyw-r0q6avh_sdqj3xao">
               <w:r>
                 <w:rPr>
                   <w:rFonts w:ascii="Arial" w:cs="Arial" w:eastAsia="Arial" w:hAnsi="Arial"/>
@@ -19020,7 +19020,7 @@
             <w:pPr>
               <w:spacing w:after="20" w:before="0"/>
             </w:pPr>
-            <w:hyperlink w:history="1" r:id="rIdcvpugx3ija2pvbxgoowen">
+            <w:hyperlink w:history="1" r:id="rIdrt2bejd2m3ols-vkcp5ot">
               <w:r>
                 <w:rPr>
                   <w:rFonts w:ascii="Arial" w:cs="Arial" w:eastAsia="Arial" w:hAnsi="Arial"/>
@@ -19069,7 +19069,7 @@
               <w:spacing w:after="10" w:before="0"/>
               <w:ind w:left="120"/>
             </w:pPr>
-            <w:hyperlink w:history="1" r:id="rIdz7eantenwqgsgzmnsscsd">
+            <w:hyperlink w:history="1" r:id="rIdxz38t01qibgcgcum3m9ii">
               <w:r>
                 <w:rPr>
                   <w:rFonts w:ascii="Arial" w:cs="Arial" w:eastAsia="Arial" w:hAnsi="Arial"/>
@@ -19114,7 +19114,7 @@
             <w:pPr>
               <w:spacing w:after="20" w:before="0"/>
             </w:pPr>
-            <w:hyperlink w:history="1" r:id="rIdcb57mikradv_nh-o-3bng">
+            <w:hyperlink w:history="1" r:id="rIdulnv9kooke9u9hgnwe_0e">
               <w:r>
                 <w:rPr>
                   <w:rFonts w:ascii="Arial" w:cs="Arial" w:eastAsia="Arial" w:hAnsi="Arial"/>
@@ -19147,7 +19147,7 @@
               <w:spacing w:after="10" w:before="0"/>
               <w:ind w:left="120"/>
             </w:pPr>
-            <w:hyperlink w:history="1" r:id="rIdjedpq_-4jgnn_updyqnjh">
+            <w:hyperlink w:history="1" r:id="rIdn-yoxaz6rzh-qmaax28re">
               <w:r>
                 <w:rPr>
                   <w:rFonts w:ascii="Arial" w:cs="Arial" w:eastAsia="Arial" w:hAnsi="Arial"/>
@@ -19342,7 +19342,7 @@
             <w:pPr>
               <w:spacing w:after="20" w:before="0"/>
             </w:pPr>
-            <w:hyperlink w:history="1" r:id="rIdil8lae0ltzyzzs_izhnpp">
+            <w:hyperlink w:history="1" r:id="rIdn0nyg7bcj9mpy1v6nkczg">
               <w:r>
                 <w:rPr>
                   <w:rFonts w:ascii="Arial" w:cs="Arial" w:eastAsia="Arial" w:hAnsi="Arial"/>
@@ -19391,7 +19391,7 @@
               <w:spacing w:after="10" w:before="0"/>
               <w:ind w:left="120"/>
             </w:pPr>
-            <w:hyperlink w:history="1" r:id="rIdkazxgv8gyr-ccoatiqqtt">
+            <w:hyperlink w:history="1" r:id="rIdn_q6tw358x5sjwfrfw6xm">
               <w:r>
                 <w:rPr>
                   <w:rFonts w:ascii="Arial" w:cs="Arial" w:eastAsia="Arial" w:hAnsi="Arial"/>
@@ -19436,7 +19436,7 @@
             <w:pPr>
               <w:spacing w:after="20" w:before="0"/>
             </w:pPr>
-            <w:hyperlink w:history="1" r:id="rId5jc98bgbun1yl_tiptcnn">
+            <w:hyperlink w:history="1" r:id="rIdsxwzfs_amx1xft0b7l2ws">
               <w:r>
                 <w:rPr>
                   <w:rFonts w:ascii="Arial" w:cs="Arial" w:eastAsia="Arial" w:hAnsi="Arial"/>
@@ -19469,7 +19469,7 @@
               <w:spacing w:after="10" w:before="0"/>
               <w:ind w:left="120"/>
             </w:pPr>
-            <w:hyperlink w:history="1" r:id="rIdqhurfbmuc9pe8w8kkzorg">
+            <w:hyperlink w:history="1" r:id="rIdaq1yb7f2103n4i6afhqyd">
               <w:r>
                 <w:rPr>
                   <w:rFonts w:ascii="Arial" w:cs="Arial" w:eastAsia="Arial" w:hAnsi="Arial"/>
@@ -19664,7 +19664,7 @@
             <w:pPr>
               <w:spacing w:after="20" w:before="0"/>
             </w:pPr>
-            <w:hyperlink w:history="1" r:id="rId89ehys5v_c0mjdyghsbk-">
+            <w:hyperlink w:history="1" r:id="rIde5xi7syvy3jqaugho6tkz">
               <w:r>
                 <w:rPr>
                   <w:rFonts w:ascii="Arial" w:cs="Arial" w:eastAsia="Arial" w:hAnsi="Arial"/>
@@ -19713,7 +19713,7 @@
               <w:spacing w:after="10" w:before="0"/>
               <w:ind w:left="120"/>
             </w:pPr>
-            <w:hyperlink w:history="1" r:id="rIdl5ky-icypzlqetot8y6c4">
+            <w:hyperlink w:history="1" r:id="rId9ql1lrhpjg5h2n6birrtc">
               <w:r>
                 <w:rPr>
                   <w:rFonts w:ascii="Arial" w:cs="Arial" w:eastAsia="Arial" w:hAnsi="Arial"/>
@@ -19758,7 +19758,7 @@
             <w:pPr>
               <w:spacing w:after="20" w:before="0"/>
             </w:pPr>
-            <w:hyperlink w:history="1" r:id="rIdccmc0hvh51qx1ohcwdrti">
+            <w:hyperlink w:history="1" r:id="rId1melctk9x2-xm7k1z6gqb">
               <w:r>
                 <w:rPr>
                   <w:rFonts w:ascii="Arial" w:cs="Arial" w:eastAsia="Arial" w:hAnsi="Arial"/>
@@ -19791,7 +19791,7 @@
               <w:spacing w:after="10" w:before="0"/>
               <w:ind w:left="120"/>
             </w:pPr>
-            <w:hyperlink w:history="1" r:id="rId11mddrrrdadnqkhwz7iyh">
+            <w:hyperlink w:history="1" r:id="rId2ht31znvbqlu_nywecinb">
               <w:r>
                 <w:rPr>
                   <w:rFonts w:ascii="Arial" w:cs="Arial" w:eastAsia="Arial" w:hAnsi="Arial"/>
@@ -19986,7 +19986,7 @@
             <w:pPr>
               <w:spacing w:after="20" w:before="0"/>
             </w:pPr>
-            <w:hyperlink w:history="1" r:id="rIdhjogyduzlhttq1yfvgpkl">
+            <w:hyperlink w:history="1" r:id="rIdbnpv7_mogw1a_mptg6zuu">
               <w:r>
                 <w:rPr>
                   <w:rFonts w:ascii="Arial" w:cs="Arial" w:eastAsia="Arial" w:hAnsi="Arial"/>
@@ -20035,7 +20035,7 @@
               <w:spacing w:after="10" w:before="0"/>
               <w:ind w:left="120"/>
             </w:pPr>
-            <w:hyperlink w:history="1" r:id="rIdbkvqsrymh6q2x_bmsmhjc">
+            <w:hyperlink w:history="1" r:id="rIdhebwzhu3pbjxeojphuoin">
               <w:r>
                 <w:rPr>
                   <w:rFonts w:ascii="Arial" w:cs="Arial" w:eastAsia="Arial" w:hAnsi="Arial"/>
@@ -20080,7 +20080,7 @@
             <w:pPr>
               <w:spacing w:after="20" w:before="0"/>
             </w:pPr>
-            <w:hyperlink w:history="1" r:id="rIdbwx1t-kvqtgmgdalsc5kw">
+            <w:hyperlink w:history="1" r:id="rIdb9p1x6lwibqsljjx5rnjk">
               <w:r>
                 <w:rPr>
                   <w:rFonts w:ascii="Arial" w:cs="Arial" w:eastAsia="Arial" w:hAnsi="Arial"/>
@@ -20113,7 +20113,7 @@
               <w:spacing w:after="10" w:before="0"/>
               <w:ind w:left="120"/>
             </w:pPr>
-            <w:hyperlink w:history="1" r:id="rIdsfuwzkczxaffan9jwkbf1">
+            <w:hyperlink w:history="1" r:id="rIdrept4lvxetrgaeybx2yf2">
               <w:r>
                 <w:rPr>
                   <w:rFonts w:ascii="Arial" w:cs="Arial" w:eastAsia="Arial" w:hAnsi="Arial"/>
@@ -20720,7 +20720,7 @@
         </w:rPr>
         <w:t xml:space="preserve">© 2026 SeaVuria and ARES. Aligned with KICD objectives. Developed by SeaVuria; technical implementation by ARES (with AI assistance from Claude). Licensed under </w:t>
       </w:r>
-      <w:hyperlink w:history="1" r:id="rIdisrhepgewrtn3krd3btrq">
+      <w:hyperlink w:history="1" r:id="rId1aoyam6cjdtoh42fjqa0x">
         <w:r>
           <w:rPr>
             <w:rFonts w:ascii="Arial" w:cs="Arial" w:eastAsia="Arial" w:hAnsi="Arial"/>
@@ -20741,7 +20741,7 @@
         </w:rPr>
         <w:t xml:space="preserve"> (</w:t>
       </w:r>
-      <w:hyperlink w:history="1" r:id="rIdk07kqq-4-vxb9c1buhpk4">
+      <w:hyperlink w:history="1" r:id="rIdtj6pjxewzt3gveyicrbuo">
         <w:r>
           <w:rPr>
             <w:rFonts w:ascii="Arial" w:cs="Arial" w:eastAsia="Arial" w:hAnsi="Arial"/>
@@ -21754,7 +21754,7 @@
             <w:pPr>
               <w:spacing w:after="20" w:before="0"/>
             </w:pPr>
-            <w:hyperlink w:history="1" r:id="rIdz4wtp1zlki-rapdwahmun">
+            <w:hyperlink w:history="1" r:id="rIdojk8o3xx6pmgj_f7duzns">
               <w:r>
                 <w:rPr>
                   <w:rFonts w:ascii="Arial" w:cs="Arial" w:eastAsia="Arial" w:hAnsi="Arial"/>
@@ -21787,7 +21787,7 @@
               <w:spacing w:after="10" w:before="0"/>
               <w:ind w:left="120"/>
             </w:pPr>
-            <w:hyperlink w:history="1" r:id="rIdyh-qzip56eibahae-spsp">
+            <w:hyperlink w:history="1" r:id="rIdngqdlsyb3osct4uhyxzh1">
               <w:r>
                 <w:rPr>
                   <w:rFonts w:ascii="Arial" w:cs="Arial" w:eastAsia="Arial" w:hAnsi="Arial"/>
@@ -21832,7 +21832,7 @@
             <w:pPr>
               <w:spacing w:after="20" w:before="0"/>
             </w:pPr>
-            <w:hyperlink w:history="1" r:id="rId3i-ecuqs6lvtsqmwwdtrt">
+            <w:hyperlink w:history="1" r:id="rId82vhlpgkikkmuck4vprm1">
               <w:r>
                 <w:rPr>
                   <w:rFonts w:ascii="Arial" w:cs="Arial" w:eastAsia="Arial" w:hAnsi="Arial"/>
@@ -21865,7 +21865,7 @@
               <w:spacing w:after="10" w:before="0"/>
               <w:ind w:left="120"/>
             </w:pPr>
-            <w:hyperlink w:history="1" r:id="rIddlwbxiljadey7treuo1fa">
+            <w:hyperlink w:history="1" r:id="rIddyokbw1h7pxc6np8v-vyh">
               <w:r>
                 <w:rPr>
                   <w:rFonts w:ascii="Arial" w:cs="Arial" w:eastAsia="Arial" w:hAnsi="Arial"/>
@@ -22060,7 +22060,7 @@
             <w:pPr>
               <w:spacing w:after="20" w:before="0"/>
             </w:pPr>
-            <w:hyperlink w:history="1" r:id="rIdhqa5cvyswu-ufdhm8vjsr">
+            <w:hyperlink w:history="1" r:id="rIdn5ndnprykzqhs0_ik2zik">
               <w:r>
                 <w:rPr>
                   <w:rFonts w:ascii="Arial" w:cs="Arial" w:eastAsia="Arial" w:hAnsi="Arial"/>
@@ -22093,7 +22093,7 @@
               <w:spacing w:after="10" w:before="0"/>
               <w:ind w:left="120"/>
             </w:pPr>
-            <w:hyperlink w:history="1" r:id="rId2xvwh6i0alaqksx413v15">
+            <w:hyperlink w:history="1" r:id="rIdhjyn-qqan652x08aues1q">
               <w:r>
                 <w:rPr>
                   <w:rFonts w:ascii="Arial" w:cs="Arial" w:eastAsia="Arial" w:hAnsi="Arial"/>
@@ -22138,7 +22138,7 @@
             <w:pPr>
               <w:spacing w:after="20" w:before="0"/>
             </w:pPr>
-            <w:hyperlink w:history="1" r:id="rIdftovpcsbrj11resjvqeof">
+            <w:hyperlink w:history="1" r:id="rIdvz5jtlevnteuvibg92iaa">
               <w:r>
                 <w:rPr>
                   <w:rFonts w:ascii="Arial" w:cs="Arial" w:eastAsia="Arial" w:hAnsi="Arial"/>
@@ -22171,7 +22171,7 @@
               <w:spacing w:after="10" w:before="0"/>
               <w:ind w:left="120"/>
             </w:pPr>
-            <w:hyperlink w:history="1" r:id="rIdzgblq9gib-bozhspriiqs">
+            <w:hyperlink w:history="1" r:id="rIdlmynrsrjhyfxoyx3it4jh">
               <w:r>
                 <w:rPr>
                   <w:rFonts w:ascii="Arial" w:cs="Arial" w:eastAsia="Arial" w:hAnsi="Arial"/>
@@ -22366,7 +22366,7 @@
             <w:pPr>
               <w:spacing w:after="20" w:before="0"/>
             </w:pPr>
-            <w:hyperlink w:history="1" r:id="rIdmll0xo4enj2jlv3qxafzy">
+            <w:hyperlink w:history="1" r:id="rIdqeigl8ujjr8cv_6ftzsuz">
               <w:r>
                 <w:rPr>
                   <w:rFonts w:ascii="Arial" w:cs="Arial" w:eastAsia="Arial" w:hAnsi="Arial"/>
@@ -22415,7 +22415,7 @@
               <w:spacing w:after="10" w:before="0"/>
               <w:ind w:left="120"/>
             </w:pPr>
-            <w:hyperlink w:history="1" r:id="rIdbt3sqnsxbwxn_49s3eohl">
+            <w:hyperlink w:history="1" r:id="rIdn6gyb6z2wn8xvuglikcky">
               <w:r>
                 <w:rPr>
                   <w:rFonts w:ascii="Arial" w:cs="Arial" w:eastAsia="Arial" w:hAnsi="Arial"/>
@@ -22460,7 +22460,7 @@
             <w:pPr>
               <w:spacing w:after="20" w:before="0"/>
             </w:pPr>
-            <w:hyperlink w:history="1" r:id="rIdkr7crspmfcqlpk3ys4n58">
+            <w:hyperlink w:history="1" r:id="rIdu2l2zkrvv-v8ezpzzu-d0">
               <w:r>
                 <w:rPr>
                   <w:rFonts w:ascii="Arial" w:cs="Arial" w:eastAsia="Arial" w:hAnsi="Arial"/>
@@ -22509,7 +22509,7 @@
               <w:spacing w:after="10" w:before="0"/>
               <w:ind w:left="120"/>
             </w:pPr>
-            <w:hyperlink w:history="1" r:id="rId_njwnoxhwk22chnfry0zu">
+            <w:hyperlink w:history="1" r:id="rIdjieejegtq9ghadarv6qt1">
               <w:r>
                 <w:rPr>
                   <w:rFonts w:ascii="Arial" w:cs="Arial" w:eastAsia="Arial" w:hAnsi="Arial"/>
@@ -22704,7 +22704,7 @@
             <w:pPr>
               <w:spacing w:after="20" w:before="0"/>
             </w:pPr>
-            <w:hyperlink w:history="1" r:id="rIdun61cyshy8ay4pgry_c5z">
+            <w:hyperlink w:history="1" r:id="rIdee2vdpixaimbbijmw5fby">
               <w:r>
                 <w:rPr>
                   <w:rFonts w:ascii="Arial" w:cs="Arial" w:eastAsia="Arial" w:hAnsi="Arial"/>
@@ -22753,7 +22753,7 @@
               <w:spacing w:after="10" w:before="0"/>
               <w:ind w:left="120"/>
             </w:pPr>
-            <w:hyperlink w:history="1" r:id="rIdlya2tec-qiicuud0didpm">
+            <w:hyperlink w:history="1" r:id="rIdaidyewqoesmqffytv2gne">
               <w:r>
                 <w:rPr>
                   <w:rFonts w:ascii="Arial" w:cs="Arial" w:eastAsia="Arial" w:hAnsi="Arial"/>
@@ -22798,7 +22798,7 @@
             <w:pPr>
               <w:spacing w:after="20" w:before="0"/>
             </w:pPr>
-            <w:hyperlink w:history="1" r:id="rIdzck3wxremfor6sbyem120">
+            <w:hyperlink w:history="1" r:id="rIdjsnxafc4ff6rbvtavez79">
               <w:r>
                 <w:rPr>
                   <w:rFonts w:ascii="Arial" w:cs="Arial" w:eastAsia="Arial" w:hAnsi="Arial"/>
@@ -22847,7 +22847,7 @@
               <w:spacing w:after="10" w:before="0"/>
               <w:ind w:left="120"/>
             </w:pPr>
-            <w:hyperlink w:history="1" r:id="rId-yxexkwace1z3nwf9ehvl">
+            <w:hyperlink w:history="1" r:id="rIdcboy_ak57doxgbdzxlcdl">
               <w:r>
                 <w:rPr>
                   <w:rFonts w:ascii="Arial" w:cs="Arial" w:eastAsia="Arial" w:hAnsi="Arial"/>
@@ -23042,7 +23042,7 @@
             <w:pPr>
               <w:spacing w:after="20" w:before="0"/>
             </w:pPr>
-            <w:hyperlink w:history="1" r:id="rId_4ytdmwmivtjkypys8e-m">
+            <w:hyperlink w:history="1" r:id="rIdfzcb4nee2irrytty7l_sa">
               <w:r>
                 <w:rPr>
                   <w:rFonts w:ascii="Arial" w:cs="Arial" w:eastAsia="Arial" w:hAnsi="Arial"/>
@@ -23091,7 +23091,7 @@
               <w:spacing w:after="10" w:before="0"/>
               <w:ind w:left="120"/>
             </w:pPr>
-            <w:hyperlink w:history="1" r:id="rId43twvicemzaaqqxuklumd">
+            <w:hyperlink w:history="1" r:id="rIdexd7j1skxi08am0yrmzam">
               <w:r>
                 <w:rPr>
                   <w:rFonts w:ascii="Arial" w:cs="Arial" w:eastAsia="Arial" w:hAnsi="Arial"/>
@@ -23136,7 +23136,7 @@
             <w:pPr>
               <w:spacing w:after="20" w:before="0"/>
             </w:pPr>
-            <w:hyperlink w:history="1" r:id="rIdxpvnholio8c-ebpe-dwqu">
+            <w:hyperlink w:history="1" r:id="rIdll9jcxyk9vf6tudvk36tv">
               <w:r>
                 <w:rPr>
                   <w:rFonts w:ascii="Arial" w:cs="Arial" w:eastAsia="Arial" w:hAnsi="Arial"/>
@@ -23185,7 +23185,7 @@
               <w:spacing w:after="10" w:before="0"/>
               <w:ind w:left="120"/>
             </w:pPr>
-            <w:hyperlink w:history="1" r:id="rIdc0qwavcq638tblk85qqsr">
+            <w:hyperlink w:history="1" r:id="rIdctmed_cvdeu5vabzdau08">
               <w:r>
                 <w:rPr>
                   <w:rFonts w:ascii="Arial" w:cs="Arial" w:eastAsia="Arial" w:hAnsi="Arial"/>
@@ -23811,7 +23811,7 @@
         </w:rPr>
         <w:t xml:space="preserve">© 2026 SeaVuria and ARES. Aligned with KICD objectives. Developed by SeaVuria; technical implementation by ARES (with AI assistance from Claude). Licensed under </w:t>
       </w:r>
-      <w:hyperlink w:history="1" r:id="rIdwfhi2wmhssu7ldskzsfp-">
+      <w:hyperlink w:history="1" r:id="rIdpvzp9tdaii4efnz00zmih">
         <w:r>
           <w:rPr>
             <w:rFonts w:ascii="Arial" w:cs="Arial" w:eastAsia="Arial" w:hAnsi="Arial"/>
@@ -23832,7 +23832,7 @@
         </w:rPr>
         <w:t xml:space="preserve"> (</w:t>
       </w:r>
-      <w:hyperlink w:history="1" r:id="rIds1ii-ipug968qm0pda7sz">
+      <w:hyperlink w:history="1" r:id="rIdnho8_gd4rrjnzk7fpihp0">
         <w:r>
           <w:rPr>
             <w:rFonts w:ascii="Arial" w:cs="Arial" w:eastAsia="Arial" w:hAnsi="Arial"/>
@@ -24845,7 +24845,7 @@
             <w:pPr>
               <w:spacing w:after="20" w:before="0"/>
             </w:pPr>
-            <w:hyperlink w:history="1" r:id="rIdxb2iqfumn1q_bvkjslvrx">
+            <w:hyperlink w:history="1" r:id="rIdx7sivez8sgg_adice2chw">
               <w:r>
                 <w:rPr>
                   <w:rFonts w:ascii="Arial" w:cs="Arial" w:eastAsia="Arial" w:hAnsi="Arial"/>
@@ -24878,7 +24878,7 @@
               <w:spacing w:after="10" w:before="0"/>
               <w:ind w:left="120"/>
             </w:pPr>
-            <w:hyperlink w:history="1" r:id="rId-wceeswws0m66j8f9ukyh">
+            <w:hyperlink w:history="1" r:id="rId-jg0lizerrrzki-fwcvyl">
               <w:r>
                 <w:rPr>
                   <w:rFonts w:ascii="Arial" w:cs="Arial" w:eastAsia="Arial" w:hAnsi="Arial"/>
@@ -24923,7 +24923,7 @@
             <w:pPr>
               <w:spacing w:after="20" w:before="0"/>
             </w:pPr>
-            <w:hyperlink w:history="1" r:id="rIdldcpxsl0r9fc02ql4faof">
+            <w:hyperlink w:history="1" r:id="rIdilzrz-jvmanadxn1rnjsk">
               <w:r>
                 <w:rPr>
                   <w:rFonts w:ascii="Arial" w:cs="Arial" w:eastAsia="Arial" w:hAnsi="Arial"/>
@@ -24956,7 +24956,7 @@
               <w:spacing w:after="10" w:before="0"/>
               <w:ind w:left="120"/>
             </w:pPr>
-            <w:hyperlink w:history="1" r:id="rIdm45ecqvervzavdir6uox2">
+            <w:hyperlink w:history="1" r:id="rIdhaufa4d6wd99fwipa_8fn">
               <w:r>
                 <w:rPr>
                   <w:rFonts w:ascii="Arial" w:cs="Arial" w:eastAsia="Arial" w:hAnsi="Arial"/>
@@ -25151,7 +25151,7 @@
             <w:pPr>
               <w:spacing w:after="20" w:before="0"/>
             </w:pPr>
-            <w:hyperlink w:history="1" r:id="rId2fuh_lcy0gsw2lufztjg3">
+            <w:hyperlink w:history="1" r:id="rIdpeza6ba5gia4obu8lhmkk">
               <w:r>
                 <w:rPr>
                   <w:rFonts w:ascii="Arial" w:cs="Arial" w:eastAsia="Arial" w:hAnsi="Arial"/>
@@ -25184,7 +25184,7 @@
               <w:spacing w:after="10" w:before="0"/>
               <w:ind w:left="120"/>
             </w:pPr>
-            <w:hyperlink w:history="1" r:id="rId0yqi9oopcu7aebt5q7wym">
+            <w:hyperlink w:history="1" r:id="rIdorxiweqr5_xauknvzrpdn">
               <w:r>
                 <w:rPr>
                   <w:rFonts w:ascii="Arial" w:cs="Arial" w:eastAsia="Arial" w:hAnsi="Arial"/>
@@ -25229,7 +25229,7 @@
             <w:pPr>
               <w:spacing w:after="20" w:before="0"/>
             </w:pPr>
-            <w:hyperlink w:history="1" r:id="rIdxsq9luji_ht6_rgf4x0kk">
+            <w:hyperlink w:history="1" r:id="rId2sczyulvoikuu0mqksvha">
               <w:r>
                 <w:rPr>
                   <w:rFonts w:ascii="Arial" w:cs="Arial" w:eastAsia="Arial" w:hAnsi="Arial"/>
@@ -25262,7 +25262,7 @@
               <w:spacing w:after="10" w:before="0"/>
               <w:ind w:left="120"/>
             </w:pPr>
-            <w:hyperlink w:history="1" r:id="rIdkbhrlrsbrzr33q0xsd3fr">
+            <w:hyperlink w:history="1" r:id="rIdisidmbf8xuualomsdbno9">
               <w:r>
                 <w:rPr>
                   <w:rFonts w:ascii="Arial" w:cs="Arial" w:eastAsia="Arial" w:hAnsi="Arial"/>
@@ -25457,7 +25457,7 @@
             <w:pPr>
               <w:spacing w:after="20" w:before="0"/>
             </w:pPr>
-            <w:hyperlink w:history="1" r:id="rIdrykvtqthr5on75fiod5zm">
+            <w:hyperlink w:history="1" r:id="rId2lapmfvhpsez6naiofxhn">
               <w:r>
                 <w:rPr>
                   <w:rFonts w:ascii="Arial" w:cs="Arial" w:eastAsia="Arial" w:hAnsi="Arial"/>
@@ -25490,7 +25490,7 @@
               <w:spacing w:after="10" w:before="0"/>
               <w:ind w:left="120"/>
             </w:pPr>
-            <w:hyperlink w:history="1" r:id="rIdcrvj1l5onmjgdgwbkdwfb">
+            <w:hyperlink w:history="1" r:id="rId5nxdxhkcuwmxxuxtqg1bu">
               <w:r>
                 <w:rPr>
                   <w:rFonts w:ascii="Arial" w:cs="Arial" w:eastAsia="Arial" w:hAnsi="Arial"/>
@@ -25535,7 +25535,7 @@
             <w:pPr>
               <w:spacing w:after="20" w:before="0"/>
             </w:pPr>
-            <w:hyperlink w:history="1" r:id="rIdypl2xxoty4nhsj19bhcvf">
+            <w:hyperlink w:history="1" r:id="rIdf5idq8q3idqm6i-mwpanx">
               <w:r>
                 <w:rPr>
                   <w:rFonts w:ascii="Arial" w:cs="Arial" w:eastAsia="Arial" w:hAnsi="Arial"/>
@@ -25568,7 +25568,7 @@
               <w:spacing w:after="10" w:before="0"/>
               <w:ind w:left="120"/>
             </w:pPr>
-            <w:hyperlink w:history="1" r:id="rIddq61fyqxha9vfcy91kmq-">
+            <w:hyperlink w:history="1" r:id="rId1m4awwuuspdydc3thw4vb">
               <w:r>
                 <w:rPr>
                   <w:rFonts w:ascii="Arial" w:cs="Arial" w:eastAsia="Arial" w:hAnsi="Arial"/>
@@ -25763,7 +25763,7 @@
             <w:pPr>
               <w:spacing w:after="20" w:before="0"/>
             </w:pPr>
-            <w:hyperlink w:history="1" r:id="rIdectofetmjqogcancpewzw">
+            <w:hyperlink w:history="1" r:id="rIddfs33ulct1n784h-zhzcs">
               <w:r>
                 <w:rPr>
                   <w:rFonts w:ascii="Arial" w:cs="Arial" w:eastAsia="Arial" w:hAnsi="Arial"/>
@@ -25796,7 +25796,7 @@
               <w:spacing w:after="10" w:before="0"/>
               <w:ind w:left="120"/>
             </w:pPr>
-            <w:hyperlink w:history="1" r:id="rIdwcn_d-gso0vmzcmgbkfqz">
+            <w:hyperlink w:history="1" r:id="rId2-bp6tfhfoj74qt50ylxk">
               <w:r>
                 <w:rPr>
                   <w:rFonts w:ascii="Arial" w:cs="Arial" w:eastAsia="Arial" w:hAnsi="Arial"/>
@@ -25841,7 +25841,7 @@
             <w:pPr>
               <w:spacing w:after="20" w:before="0"/>
             </w:pPr>
-            <w:hyperlink w:history="1" r:id="rIdk1hwj6o1faiisi3nm2lin">
+            <w:hyperlink w:history="1" r:id="rIda5kxxb238fb172ovipup5">
               <w:r>
                 <w:rPr>
                   <w:rFonts w:ascii="Arial" w:cs="Arial" w:eastAsia="Arial" w:hAnsi="Arial"/>
@@ -25874,7 +25874,7 @@
               <w:spacing w:after="10" w:before="0"/>
               <w:ind w:left="120"/>
             </w:pPr>
-            <w:hyperlink w:history="1" r:id="rIdowmzbcnsuogz_reaavnkb">
+            <w:hyperlink w:history="1" r:id="rIdwgmx9uncvhxghcmzu8m8v">
               <w:r>
                 <w:rPr>
                   <w:rFonts w:ascii="Arial" w:cs="Arial" w:eastAsia="Arial" w:hAnsi="Arial"/>
@@ -26069,7 +26069,7 @@
             <w:pPr>
               <w:spacing w:after="20" w:before="0"/>
             </w:pPr>
-            <w:hyperlink w:history="1" r:id="rIdas68hsxy84idzfeff3qsj">
+            <w:hyperlink w:history="1" r:id="rId8zc5pepb_g_-cukdmgdrq">
               <w:r>
                 <w:rPr>
                   <w:rFonts w:ascii="Arial" w:cs="Arial" w:eastAsia="Arial" w:hAnsi="Arial"/>
@@ -26102,7 +26102,7 @@
               <w:spacing w:after="10" w:before="0"/>
               <w:ind w:left="120"/>
             </w:pPr>
-            <w:hyperlink w:history="1" r:id="rIdxzhgjejlpxtohu75ju00v">
+            <w:hyperlink w:history="1" r:id="rIdu274jbuuvqo_e52tmmllx">
               <w:r>
                 <w:rPr>
                   <w:rFonts w:ascii="Arial" w:cs="Arial" w:eastAsia="Arial" w:hAnsi="Arial"/>
@@ -26147,7 +26147,7 @@
             <w:pPr>
               <w:spacing w:after="20" w:before="0"/>
             </w:pPr>
-            <w:hyperlink w:history="1" r:id="rIdr0fjqsv5mvuyqradycets">
+            <w:hyperlink w:history="1" r:id="rIdsk3a4zh69cjs7v9snhysr">
               <w:r>
                 <w:rPr>
                   <w:rFonts w:ascii="Arial" w:cs="Arial" w:eastAsia="Arial" w:hAnsi="Arial"/>
@@ -26196,7 +26196,7 @@
               <w:spacing w:after="10" w:before="0"/>
               <w:ind w:left="120"/>
             </w:pPr>
-            <w:hyperlink w:history="1" r:id="rIdugcpa1exr7phz9yywndtp">
+            <w:hyperlink w:history="1" r:id="rIdkw96jhyxuqqqvus0auzdm">
               <w:r>
                 <w:rPr>
                   <w:rFonts w:ascii="Arial" w:cs="Arial" w:eastAsia="Arial" w:hAnsi="Arial"/>
@@ -26803,7 +26803,7 @@
         </w:rPr>
         <w:t xml:space="preserve">© 2026 SeaVuria and ARES. Aligned with KICD objectives. Developed by SeaVuria; technical implementation by ARES (with AI assistance from Claude). Licensed under </w:t>
       </w:r>
-      <w:hyperlink w:history="1" r:id="rIdbmdwd7eh8je8k80gn7x-b">
+      <w:hyperlink w:history="1" r:id="rIden3dkvr0ereqdxajqthow">
         <w:r>
           <w:rPr>
             <w:rFonts w:ascii="Arial" w:cs="Arial" w:eastAsia="Arial" w:hAnsi="Arial"/>
@@ -26824,7 +26824,7 @@
         </w:rPr>
         <w:t xml:space="preserve"> (</w:t>
       </w:r>
-      <w:hyperlink w:history="1" r:id="rIdmgk114nhvqjaxcczzx4ef">
+      <w:hyperlink w:history="1" r:id="rIdgkxlhnu8nkyueqesnv0kv">
         <w:r>
           <w:rPr>
             <w:rFonts w:ascii="Arial" w:cs="Arial" w:eastAsia="Arial" w:hAnsi="Arial"/>
@@ -27837,7 +27837,7 @@
             <w:pPr>
               <w:spacing w:after="20" w:before="0"/>
             </w:pPr>
-            <w:hyperlink w:history="1" r:id="rIdqtfhckw28vbgvjkhekjil">
+            <w:hyperlink w:history="1" r:id="rIdd7totsxsxobbzoagzuyrb">
               <w:r>
                 <w:rPr>
                   <w:rFonts w:ascii="Arial" w:cs="Arial" w:eastAsia="Arial" w:hAnsi="Arial"/>
@@ -27886,7 +27886,7 @@
               <w:spacing w:after="10" w:before="0"/>
               <w:ind w:left="120"/>
             </w:pPr>
-            <w:hyperlink w:history="1" r:id="rIdplkjav3dr28x3zun5e9cs">
+            <w:hyperlink w:history="1" r:id="rId-bfj4haa4tvt6euctvmnr">
               <w:r>
                 <w:rPr>
                   <w:rFonts w:ascii="Arial" w:cs="Arial" w:eastAsia="Arial" w:hAnsi="Arial"/>
@@ -27931,7 +27931,7 @@
             <w:pPr>
               <w:spacing w:after="20" w:before="0"/>
             </w:pPr>
-            <w:hyperlink w:history="1" r:id="rIdyvk49dchxis_gvmnl6gqs">
+            <w:hyperlink w:history="1" r:id="rId5pkfifljtylhybutas2zv">
               <w:r>
                 <w:rPr>
                   <w:rFonts w:ascii="Arial" w:cs="Arial" w:eastAsia="Arial" w:hAnsi="Arial"/>
@@ -27980,7 +27980,7 @@
               <w:spacing w:after="10" w:before="0"/>
               <w:ind w:left="120"/>
             </w:pPr>
-            <w:hyperlink w:history="1" r:id="rIdiostib0fzwubc586jloph">
+            <w:hyperlink w:history="1" r:id="rIdze_paaq76aw4fptt_kfp5">
               <w:r>
                 <w:rPr>
                   <w:rFonts w:ascii="Arial" w:cs="Arial" w:eastAsia="Arial" w:hAnsi="Arial"/>
@@ -28175,7 +28175,7 @@
             <w:pPr>
               <w:spacing w:after="20" w:before="0"/>
             </w:pPr>
-            <w:hyperlink w:history="1" r:id="rIdfnauscwtvuf7ymqphuoko">
+            <w:hyperlink w:history="1" r:id="rId-buy8kn0chgvrqkcjrmln">
               <w:r>
                 <w:rPr>
                   <w:rFonts w:ascii="Arial" w:cs="Arial" w:eastAsia="Arial" w:hAnsi="Arial"/>
@@ -28224,7 +28224,7 @@
               <w:spacing w:after="10" w:before="0"/>
               <w:ind w:left="120"/>
             </w:pPr>
-            <w:hyperlink w:history="1" r:id="rIdn9k-hbram4rj0k5x0rq2z">
+            <w:hyperlink w:history="1" r:id="rId54s91ysdzmuzphh5cn55j">
               <w:r>
                 <w:rPr>
                   <w:rFonts w:ascii="Arial" w:cs="Arial" w:eastAsia="Arial" w:hAnsi="Arial"/>
@@ -28269,7 +28269,7 @@
             <w:pPr>
               <w:spacing w:after="20" w:before="0"/>
             </w:pPr>
-            <w:hyperlink w:history="1" r:id="rIdbiwgvuc5r75rhgi18f9d7">
+            <w:hyperlink w:history="1" r:id="rIdj6gyxpzwmf0c__rqwxird">
               <w:r>
                 <w:rPr>
                   <w:rFonts w:ascii="Arial" w:cs="Arial" w:eastAsia="Arial" w:hAnsi="Arial"/>
@@ -28318,7 +28318,7 @@
               <w:spacing w:after="10" w:before="0"/>
               <w:ind w:left="120"/>
             </w:pPr>
-            <w:hyperlink w:history="1" r:id="rIdrqi73ai2kqnaa-sijm3gk">
+            <w:hyperlink w:history="1" r:id="rIdreestbcskzngfs0ak66nl">
               <w:r>
                 <w:rPr>
                   <w:rFonts w:ascii="Arial" w:cs="Arial" w:eastAsia="Arial" w:hAnsi="Arial"/>
@@ -28513,7 +28513,7 @@
             <w:pPr>
               <w:spacing w:after="20" w:before="0"/>
             </w:pPr>
-            <w:hyperlink w:history="1" r:id="rIdnhlqec_tx6sqx81ynevqa">
+            <w:hyperlink w:history="1" r:id="rId9a2d9xuv7rmodprupeekl">
               <w:r>
                 <w:rPr>
                   <w:rFonts w:ascii="Arial" w:cs="Arial" w:eastAsia="Arial" w:hAnsi="Arial"/>
@@ -28562,7 +28562,7 @@
               <w:spacing w:after="10" w:before="0"/>
               <w:ind w:left="120"/>
             </w:pPr>
-            <w:hyperlink w:history="1" r:id="rId_di9fzpzayyuvnklbwsdb">
+            <w:hyperlink w:history="1" r:id="rIdqbgk84ypfy_707-p3tfyd">
               <w:r>
                 <w:rPr>
                   <w:rFonts w:ascii="Arial" w:cs="Arial" w:eastAsia="Arial" w:hAnsi="Arial"/>
@@ -28607,7 +28607,7 @@
             <w:pPr>
               <w:spacing w:after="20" w:before="0"/>
             </w:pPr>
-            <w:hyperlink w:history="1" r:id="rIdtnvjl4wwcs8vb0fiiig9z">
+            <w:hyperlink w:history="1" r:id="rIdxtzrpqei8yk6fck52gvk1">
               <w:r>
                 <w:rPr>
                   <w:rFonts w:ascii="Arial" w:cs="Arial" w:eastAsia="Arial" w:hAnsi="Arial"/>
@@ -28656,7 +28656,7 @@
               <w:spacing w:after="10" w:before="0"/>
               <w:ind w:left="120"/>
             </w:pPr>
-            <w:hyperlink w:history="1" r:id="rIdceho61l-eucwtaeldeiuz">
+            <w:hyperlink w:history="1" r:id="rIdhaklcbeu36dxhcfsqpnra">
               <w:r>
                 <w:rPr>
                   <w:rFonts w:ascii="Arial" w:cs="Arial" w:eastAsia="Arial" w:hAnsi="Arial"/>
@@ -28851,7 +28851,7 @@
             <w:pPr>
               <w:spacing w:after="20" w:before="0"/>
             </w:pPr>
-            <w:hyperlink w:history="1" r:id="rIdubz06m4ppjhugwlft-_ut">
+            <w:hyperlink w:history="1" r:id="rIdqio3mgiyuugihyofmnvat">
               <w:r>
                 <w:rPr>
                   <w:rFonts w:ascii="Arial" w:cs="Arial" w:eastAsia="Arial" w:hAnsi="Arial"/>
@@ -28900,7 +28900,7 @@
               <w:spacing w:after="10" w:before="0"/>
               <w:ind w:left="120"/>
             </w:pPr>
-            <w:hyperlink w:history="1" r:id="rIdfn0plcw31bwfcx4vhwwqf">
+            <w:hyperlink w:history="1" r:id="rIdnvxc3oglhdacqup0d7hth">
               <w:r>
                 <w:rPr>
                   <w:rFonts w:ascii="Arial" w:cs="Arial" w:eastAsia="Arial" w:hAnsi="Arial"/>
@@ -28945,7 +28945,7 @@
             <w:pPr>
               <w:spacing w:after="20" w:before="0"/>
             </w:pPr>
-            <w:hyperlink w:history="1" r:id="rId4yv5p4491wslldqwkydgj">
+            <w:hyperlink w:history="1" r:id="rId5rgyrlplbjckphymppp4o">
               <w:r>
                 <w:rPr>
                   <w:rFonts w:ascii="Arial" w:cs="Arial" w:eastAsia="Arial" w:hAnsi="Arial"/>
@@ -28994,7 +28994,7 @@
               <w:spacing w:after="10" w:before="0"/>
               <w:ind w:left="120"/>
             </w:pPr>
-            <w:hyperlink w:history="1" r:id="rIdkkszpvhooakbeldliheti">
+            <w:hyperlink w:history="1" r:id="rIdhdhmbsqeh8atuzucs4jh2">
               <w:r>
                 <w:rPr>
                   <w:rFonts w:ascii="Arial" w:cs="Arial" w:eastAsia="Arial" w:hAnsi="Arial"/>
@@ -29189,7 +29189,7 @@
             <w:pPr>
               <w:spacing w:after="20" w:before="0"/>
             </w:pPr>
-            <w:hyperlink w:history="1" r:id="rIdjejwa9lzzlapmjnuaw4-i">
+            <w:hyperlink w:history="1" r:id="rIdir5lq2gxds53tbiaojt36">
               <w:r>
                 <w:rPr>
                   <w:rFonts w:ascii="Arial" w:cs="Arial" w:eastAsia="Arial" w:hAnsi="Arial"/>
@@ -29238,7 +29238,7 @@
               <w:spacing w:after="10" w:before="0"/>
               <w:ind w:left="120"/>
             </w:pPr>
-            <w:hyperlink w:history="1" r:id="rIdbko1bhycfv3mb4rvn_ebh">
+            <w:hyperlink w:history="1" r:id="rIdlgbhycfspzsrb37r16ntr">
               <w:r>
                 <w:rPr>
                   <w:rFonts w:ascii="Arial" w:cs="Arial" w:eastAsia="Arial" w:hAnsi="Arial"/>
@@ -29283,7 +29283,7 @@
             <w:pPr>
               <w:spacing w:after="20" w:before="0"/>
             </w:pPr>
-            <w:hyperlink w:history="1" r:id="rIdexfqltsh5l58gfnka6ivl">
+            <w:hyperlink w:history="1" r:id="rIdwnqvqef4wimzrhulzxruc">
               <w:r>
                 <w:rPr>
                   <w:rFonts w:ascii="Arial" w:cs="Arial" w:eastAsia="Arial" w:hAnsi="Arial"/>
@@ -29332,7 +29332,7 @@
               <w:spacing w:after="10" w:before="0"/>
               <w:ind w:left="120"/>
             </w:pPr>
-            <w:hyperlink w:history="1" r:id="rIdlaqxqoisgopwhzcxubll-">
+            <w:hyperlink w:history="1" r:id="rId9ctruxpwd6meo6kioemn4">
               <w:r>
                 <w:rPr>
                   <w:rFonts w:ascii="Arial" w:cs="Arial" w:eastAsia="Arial" w:hAnsi="Arial"/>
@@ -29844,7 +29844,7 @@
         </w:rPr>
         <w:t xml:space="preserve">© 2026 SeaVuria and ARES. Aligned with KICD objectives. Developed by SeaVuria; technical implementation by ARES (with AI assistance from Claude). Licensed under </w:t>
       </w:r>
-      <w:hyperlink w:history="1" r:id="rId4ts4bmnvuxstja94xfun8">
+      <w:hyperlink w:history="1" r:id="rIdmvtlclcmeutwu2vgwcngc">
         <w:r>
           <w:rPr>
             <w:rFonts w:ascii="Arial" w:cs="Arial" w:eastAsia="Arial" w:hAnsi="Arial"/>
@@ -29865,7 +29865,7 @@
         </w:rPr>
         <w:t xml:space="preserve"> (</w:t>
       </w:r>
-      <w:hyperlink w:history="1" r:id="rIduhn9tqo_cihn_s65r4cdt">
+      <w:hyperlink w:history="1" r:id="rIdt6qh421zk89ho8aazcrjf">
         <w:r>
           <w:rPr>
             <w:rFonts w:ascii="Arial" w:cs="Arial" w:eastAsia="Arial" w:hAnsi="Arial"/>
@@ -30878,7 +30878,7 @@
             <w:pPr>
               <w:spacing w:after="20" w:before="0"/>
             </w:pPr>
-            <w:hyperlink w:history="1" r:id="rIdyoyprgfxbcknjgmzsff74">
+            <w:hyperlink w:history="1" r:id="rIdsy45jvfhhlucqw2em0-pq">
               <w:r>
                 <w:rPr>
                   <w:rFonts w:ascii="Arial" w:cs="Arial" w:eastAsia="Arial" w:hAnsi="Arial"/>
@@ -30911,7 +30911,7 @@
               <w:spacing w:after="10" w:before="0"/>
               <w:ind w:left="120"/>
             </w:pPr>
-            <w:hyperlink w:history="1" r:id="rId6vd4wxg_euzc-xqky9cty">
+            <w:hyperlink w:history="1" r:id="rId6stoxytwr08jhsqi4ciuj">
               <w:r>
                 <w:rPr>
                   <w:rFonts w:ascii="Arial" w:cs="Arial" w:eastAsia="Arial" w:hAnsi="Arial"/>
@@ -30956,7 +30956,7 @@
             <w:pPr>
               <w:spacing w:after="20" w:before="0"/>
             </w:pPr>
-            <w:hyperlink w:history="1" r:id="rIdh-4idsm57qfitghzoj5ze">
+            <w:hyperlink w:history="1" r:id="rId-s04-ywzuwmwni5zc4fhy">
               <w:r>
                 <w:rPr>
                   <w:rFonts w:ascii="Arial" w:cs="Arial" w:eastAsia="Arial" w:hAnsi="Arial"/>
@@ -31005,7 +31005,7 @@
               <w:spacing w:after="10" w:before="0"/>
               <w:ind w:left="120"/>
             </w:pPr>
-            <w:hyperlink w:history="1" r:id="rIdhx-vufmpeicwdjo-zcusr">
+            <w:hyperlink w:history="1" r:id="rIdj1zbxwebempajp-bzxnqe">
               <w:r>
                 <w:rPr>
                   <w:rFonts w:ascii="Arial" w:cs="Arial" w:eastAsia="Arial" w:hAnsi="Arial"/>
@@ -31200,7 +31200,7 @@
             <w:pPr>
               <w:spacing w:after="20" w:before="0"/>
             </w:pPr>
-            <w:hyperlink w:history="1" r:id="rIdzof3gabkw8l0kqob3kbop">
+            <w:hyperlink w:history="1" r:id="rIdqnbz4idhkwznwifg1-nns">
               <w:r>
                 <w:rPr>
                   <w:rFonts w:ascii="Arial" w:cs="Arial" w:eastAsia="Arial" w:hAnsi="Arial"/>
@@ -31233,7 +31233,7 @@
               <w:spacing w:after="10" w:before="0"/>
               <w:ind w:left="120"/>
             </w:pPr>
-            <w:hyperlink w:history="1" r:id="rIdgrws4vsxvn1njgmjgrxqo">
+            <w:hyperlink w:history="1" r:id="rIdo5ugvc45mesvfx5rvp0pc">
               <w:r>
                 <w:rPr>
                   <w:rFonts w:ascii="Arial" w:cs="Arial" w:eastAsia="Arial" w:hAnsi="Arial"/>
@@ -31278,7 +31278,7 @@
             <w:pPr>
               <w:spacing w:after="20" w:before="0"/>
             </w:pPr>
-            <w:hyperlink w:history="1" r:id="rIdplephai1hgkewztwtg_x4">
+            <w:hyperlink w:history="1" r:id="rIdvtm5lkouk2soffjrucnoq">
               <w:r>
                 <w:rPr>
                   <w:rFonts w:ascii="Arial" w:cs="Arial" w:eastAsia="Arial" w:hAnsi="Arial"/>
@@ -31327,7 +31327,7 @@
               <w:spacing w:after="10" w:before="0"/>
               <w:ind w:left="120"/>
             </w:pPr>
-            <w:hyperlink w:history="1" r:id="rIdyiz-2i8ybqpd2cl4q72td">
+            <w:hyperlink w:history="1" r:id="rId7wuvlnqhy3tbnr3jix6kx">
               <w:r>
                 <w:rPr>
                   <w:rFonts w:ascii="Arial" w:cs="Arial" w:eastAsia="Arial" w:hAnsi="Arial"/>
@@ -31522,7 +31522,7 @@
             <w:pPr>
               <w:spacing w:after="20" w:before="0"/>
             </w:pPr>
-            <w:hyperlink w:history="1" r:id="rId10lhytyoodem73nccptjm">
+            <w:hyperlink w:history="1" r:id="rId80p8lq7lglugop3ras45j">
               <w:r>
                 <w:rPr>
                   <w:rFonts w:ascii="Arial" w:cs="Arial" w:eastAsia="Arial" w:hAnsi="Arial"/>
@@ -31571,7 +31571,7 @@
               <w:spacing w:after="10" w:before="0"/>
               <w:ind w:left="120"/>
             </w:pPr>
-            <w:hyperlink w:history="1" r:id="rIdo3bhdjabws5_ogqtkashi">
+            <w:hyperlink w:history="1" r:id="rIdhdbtacvlmcy8wpm7ltql2">
               <w:r>
                 <w:rPr>
                   <w:rFonts w:ascii="Arial" w:cs="Arial" w:eastAsia="Arial" w:hAnsi="Arial"/>
@@ -31616,7 +31616,7 @@
             <w:pPr>
               <w:spacing w:after="20" w:before="0"/>
             </w:pPr>
-            <w:hyperlink w:history="1" r:id="rIdw8it-lfiarur-gf7akukg">
+            <w:hyperlink w:history="1" r:id="rIdi15wwijmwafewlglxp9-o">
               <w:r>
                 <w:rPr>
                   <w:rFonts w:ascii="Arial" w:cs="Arial" w:eastAsia="Arial" w:hAnsi="Arial"/>
@@ -31665,7 +31665,7 @@
               <w:spacing w:after="10" w:before="0"/>
               <w:ind w:left="120"/>
             </w:pPr>
-            <w:hyperlink w:history="1" r:id="rId82quydno2sdzhk_pahrnn">
+            <w:hyperlink w:history="1" r:id="rIdlczv6nim8x-strrr3phfg">
               <w:r>
                 <w:rPr>
                   <w:rFonts w:ascii="Arial" w:cs="Arial" w:eastAsia="Arial" w:hAnsi="Arial"/>
@@ -31860,7 +31860,7 @@
             <w:pPr>
               <w:spacing w:after="20" w:before="0"/>
             </w:pPr>
-            <w:hyperlink w:history="1" r:id="rIdppzx6_czqj2s1-srz0tnt">
+            <w:hyperlink w:history="1" r:id="rIdsi_npto5mjqcnyc78veau">
               <w:r>
                 <w:rPr>
                   <w:rFonts w:ascii="Arial" w:cs="Arial" w:eastAsia="Arial" w:hAnsi="Arial"/>
@@ -31909,7 +31909,7 @@
               <w:spacing w:after="10" w:before="0"/>
               <w:ind w:left="120"/>
             </w:pPr>
-            <w:hyperlink w:history="1" r:id="rIddno3zqu_mbj5gebu-2vus">
+            <w:hyperlink w:history="1" r:id="rIdtrekdbracmyzdwvakuakh">
               <w:r>
                 <w:rPr>
                   <w:rFonts w:ascii="Arial" w:cs="Arial" w:eastAsia="Arial" w:hAnsi="Arial"/>
@@ -31954,7 +31954,7 @@
             <w:pPr>
               <w:spacing w:after="20" w:before="0"/>
             </w:pPr>
-            <w:hyperlink w:history="1" r:id="rIdwemfkt8nupnz4-zfvyl0m">
+            <w:hyperlink w:history="1" r:id="rIdieqmy14nkq0ogi0jqi4jg">
               <w:r>
                 <w:rPr>
                   <w:rFonts w:ascii="Arial" w:cs="Arial" w:eastAsia="Arial" w:hAnsi="Arial"/>
@@ -32003,7 +32003,7 @@
               <w:spacing w:after="10" w:before="0"/>
               <w:ind w:left="120"/>
             </w:pPr>
-            <w:hyperlink w:history="1" r:id="rIdxi2ikhgtm4kpiohunpolx">
+            <w:hyperlink w:history="1" r:id="rId_g9rqcpow63oddt7zjpsk">
               <w:r>
                 <w:rPr>
                   <w:rFonts w:ascii="Arial" w:cs="Arial" w:eastAsia="Arial" w:hAnsi="Arial"/>
@@ -32198,7 +32198,7 @@
             <w:pPr>
               <w:spacing w:after="20" w:before="0"/>
             </w:pPr>
-            <w:hyperlink w:history="1" r:id="rIdtpnm_c3j-frimiqxtfmvp">
+            <w:hyperlink w:history="1" r:id="rId5nixhewen-tsuz_baqnkj">
               <w:r>
                 <w:rPr>
                   <w:rFonts w:ascii="Arial" w:cs="Arial" w:eastAsia="Arial" w:hAnsi="Arial"/>
@@ -32247,7 +32247,7 @@
               <w:spacing w:after="10" w:before="0"/>
               <w:ind w:left="120"/>
             </w:pPr>
-            <w:hyperlink w:history="1" r:id="rIdkirhxvsjs35uco8qceid8">
+            <w:hyperlink w:history="1" r:id="rIdwz6am0axjjziwxvcghw-6">
               <w:r>
                 <w:rPr>
                   <w:rFonts w:ascii="Arial" w:cs="Arial" w:eastAsia="Arial" w:hAnsi="Arial"/>
@@ -32292,7 +32292,7 @@
             <w:pPr>
               <w:spacing w:after="20" w:before="0"/>
             </w:pPr>
-            <w:hyperlink w:history="1" r:id="rIdn_v8db1dnxmub0iczpja9">
+            <w:hyperlink w:history="1" r:id="rIdg3oudgyhaklhmreacsqua">
               <w:r>
                 <w:rPr>
                   <w:rFonts w:ascii="Arial" w:cs="Arial" w:eastAsia="Arial" w:hAnsi="Arial"/>
@@ -32341,7 +32341,7 @@
               <w:spacing w:after="10" w:before="0"/>
               <w:ind w:left="120"/>
             </w:pPr>
-            <w:hyperlink w:history="1" r:id="rIdjmqe3tevjkjhuucjbippa">
+            <w:hyperlink w:history="1" r:id="rIdgun7u37htnmudn437c_tm">
               <w:r>
                 <w:rPr>
                   <w:rFonts w:ascii="Arial" w:cs="Arial" w:eastAsia="Arial" w:hAnsi="Arial"/>
@@ -32948,7 +32948,7 @@
         </w:rPr>
         <w:t xml:space="preserve">© 2026 SeaVuria and ARES. Aligned with KICD objectives. Developed by SeaVuria; technical implementation by ARES (with AI assistance from Claude). Licensed under </w:t>
       </w:r>
-      <w:hyperlink w:history="1" r:id="rIdo3xofkz9nlshap5tf3v8k">
+      <w:hyperlink w:history="1" r:id="rIdok9ech6tyxt-sc8j55r96">
         <w:r>
           <w:rPr>
             <w:rFonts w:ascii="Arial" w:cs="Arial" w:eastAsia="Arial" w:hAnsi="Arial"/>
@@ -32969,7 +32969,7 @@
         </w:rPr>
         <w:t xml:space="preserve"> (</w:t>
       </w:r>
-      <w:hyperlink w:history="1" r:id="rIdqpm1mti4iodk8pnjeas3j">
+      <w:hyperlink w:history="1" r:id="rId15uykspzc1dud1jmu0osm">
         <w:r>
           <w:rPr>
             <w:rFonts w:ascii="Arial" w:cs="Arial" w:eastAsia="Arial" w:hAnsi="Arial"/>
@@ -33982,7 +33982,7 @@
             <w:pPr>
               <w:spacing w:after="20" w:before="0"/>
             </w:pPr>
-            <w:hyperlink w:history="1" r:id="rIdvt9buma-albj051j57z7e">
+            <w:hyperlink w:history="1" r:id="rIddqouikruu3fq1tw5mkv7s">
               <w:r>
                 <w:rPr>
                   <w:rFonts w:ascii="Arial" w:cs="Arial" w:eastAsia="Arial" w:hAnsi="Arial"/>
@@ -34015,7 +34015,7 @@
               <w:spacing w:after="10" w:before="0"/>
               <w:ind w:left="120"/>
             </w:pPr>
-            <w:hyperlink w:history="1" r:id="rIdziyicpo6v3fr7ihpz852z">
+            <w:hyperlink w:history="1" r:id="rId8ta_tshuuq20x_gzpooy9">
               <w:r>
                 <w:rPr>
                   <w:rFonts w:ascii="Arial" w:cs="Arial" w:eastAsia="Arial" w:hAnsi="Arial"/>
@@ -34060,7 +34060,7 @@
             <w:pPr>
               <w:spacing w:after="20" w:before="0"/>
             </w:pPr>
-            <w:hyperlink w:history="1" r:id="rId32z1jnnregwyvf7yd7d7a">
+            <w:hyperlink w:history="1" r:id="rIdsrr_8pb3yxnrzlzurbces">
               <w:r>
                 <w:rPr>
                   <w:rFonts w:ascii="Arial" w:cs="Arial" w:eastAsia="Arial" w:hAnsi="Arial"/>
@@ -34093,7 +34093,7 @@
               <w:spacing w:after="10" w:before="0"/>
               <w:ind w:left="120"/>
             </w:pPr>
-            <w:hyperlink w:history="1" r:id="rIdljx62bv2khucu71cgowpv">
+            <w:hyperlink w:history="1" r:id="rIdr0_l41m9j5smqqj4bzkw4">
               <w:r>
                 <w:rPr>
                   <w:rFonts w:ascii="Arial" w:cs="Arial" w:eastAsia="Arial" w:hAnsi="Arial"/>
@@ -34288,7 +34288,7 @@
             <w:pPr>
               <w:spacing w:after="20" w:before="0"/>
             </w:pPr>
-            <w:hyperlink w:history="1" r:id="rIdzudseqmt__rloq7fdmx9i">
+            <w:hyperlink w:history="1" r:id="rIdrxn-8k0cdu8-niptwefnn">
               <w:r>
                 <w:rPr>
                   <w:rFonts w:ascii="Arial" w:cs="Arial" w:eastAsia="Arial" w:hAnsi="Arial"/>
@@ -34321,7 +34321,7 @@
               <w:spacing w:after="10" w:before="0"/>
               <w:ind w:left="120"/>
             </w:pPr>
-            <w:hyperlink w:history="1" r:id="rIdsbsfhpibp1bmojeevovrz">
+            <w:hyperlink w:history="1" r:id="rIdmv5llkiuncv9fysdx1fz9">
               <w:r>
                 <w:rPr>
                   <w:rFonts w:ascii="Arial" w:cs="Arial" w:eastAsia="Arial" w:hAnsi="Arial"/>
@@ -34366,7 +34366,7 @@
             <w:pPr>
               <w:spacing w:after="20" w:before="0"/>
             </w:pPr>
-            <w:hyperlink w:history="1" r:id="rIdgkjvyjcp91jiuucejm-7x">
+            <w:hyperlink w:history="1" r:id="rId2qftdtx3jrnenmndbtr5h">
               <w:r>
                 <w:rPr>
                   <w:rFonts w:ascii="Arial" w:cs="Arial" w:eastAsia="Arial" w:hAnsi="Arial"/>
@@ -34399,7 +34399,7 @@
               <w:spacing w:after="10" w:before="0"/>
               <w:ind w:left="120"/>
             </w:pPr>
-            <w:hyperlink w:history="1" r:id="rId2f9oy2fqt-_hxs67fthd7">
+            <w:hyperlink w:history="1" r:id="rIdfgfd7ugdlyjtm9p4q-lzj">
               <w:r>
                 <w:rPr>
                   <w:rFonts w:ascii="Arial" w:cs="Arial" w:eastAsia="Arial" w:hAnsi="Arial"/>
@@ -34594,7 +34594,7 @@
             <w:pPr>
               <w:spacing w:after="20" w:before="0"/>
             </w:pPr>
-            <w:hyperlink w:history="1" r:id="rIduevaogbglhlxyxzbtbzhm">
+            <w:hyperlink w:history="1" r:id="rIdznkzt1bm0ntz1mwpvscj8">
               <w:r>
                 <w:rPr>
                   <w:rFonts w:ascii="Arial" w:cs="Arial" w:eastAsia="Arial" w:hAnsi="Arial"/>
@@ -34627,7 +34627,7 @@
               <w:spacing w:after="10" w:before="0"/>
               <w:ind w:left="120"/>
             </w:pPr>
-            <w:hyperlink w:history="1" r:id="rIdrjpg6gexxmvyfzhojglm_">
+            <w:hyperlink w:history="1" r:id="rIdg9lcpwrcvd7d-rceuyjoo">
               <w:r>
                 <w:rPr>
                   <w:rFonts w:ascii="Arial" w:cs="Arial" w:eastAsia="Arial" w:hAnsi="Arial"/>
@@ -34672,7 +34672,7 @@
             <w:pPr>
               <w:spacing w:after="20" w:before="0"/>
             </w:pPr>
-            <w:hyperlink w:history="1" r:id="rIdukrjttz0nobmt6u0dv2ds">
+            <w:hyperlink w:history="1" r:id="rId8atll1w-xbepupgpepwd6">
               <w:r>
                 <w:rPr>
                   <w:rFonts w:ascii="Arial" w:cs="Arial" w:eastAsia="Arial" w:hAnsi="Arial"/>
@@ -34721,7 +34721,7 @@
               <w:spacing w:after="10" w:before="0"/>
               <w:ind w:left="120"/>
             </w:pPr>
-            <w:hyperlink w:history="1" r:id="rIdrr5ecpdvidl6gslczvgbe">
+            <w:hyperlink w:history="1" r:id="rIdjtwltuslnfdem1y0pzpwl">
               <w:r>
                 <w:rPr>
                   <w:rFonts w:ascii="Arial" w:cs="Arial" w:eastAsia="Arial" w:hAnsi="Arial"/>
@@ -34916,7 +34916,7 @@
             <w:pPr>
               <w:spacing w:after="20" w:before="0"/>
             </w:pPr>
-            <w:hyperlink w:history="1" r:id="rIdvdcydrqe91fhzlogsebuw">
+            <w:hyperlink w:history="1" r:id="rId0n6r8jjongq2vumv2gsha">
               <w:r>
                 <w:rPr>
                   <w:rFonts w:ascii="Arial" w:cs="Arial" w:eastAsia="Arial" w:hAnsi="Arial"/>
@@ -34949,7 +34949,7 @@
               <w:spacing w:after="10" w:before="0"/>
               <w:ind w:left="120"/>
             </w:pPr>
-            <w:hyperlink w:history="1" r:id="rIdp2esiso8-9lvp4cdw7e9z">
+            <w:hyperlink w:history="1" r:id="rIdtapmtjht3t7o2svazamj7">
               <w:r>
                 <w:rPr>
                   <w:rFonts w:ascii="Arial" w:cs="Arial" w:eastAsia="Arial" w:hAnsi="Arial"/>
@@ -34994,7 +34994,7 @@
             <w:pPr>
               <w:spacing w:after="20" w:before="0"/>
             </w:pPr>
-            <w:hyperlink w:history="1" r:id="rIdzhoqpbsjgpbliol3hg4rt">
+            <w:hyperlink w:history="1" r:id="rIdddf1cxyjo7hokqov7hoyn">
               <w:r>
                 <w:rPr>
                   <w:rFonts w:ascii="Arial" w:cs="Arial" w:eastAsia="Arial" w:hAnsi="Arial"/>
@@ -35043,7 +35043,7 @@
               <w:spacing w:after="10" w:before="0"/>
               <w:ind w:left="120"/>
             </w:pPr>
-            <w:hyperlink w:history="1" r:id="rIddj1myio3zzw_abuvnowei">
+            <w:hyperlink w:history="1" r:id="rId-gq9k0p7drf5_azstllbt">
               <w:r>
                 <w:rPr>
                   <w:rFonts w:ascii="Arial" w:cs="Arial" w:eastAsia="Arial" w:hAnsi="Arial"/>
@@ -35238,7 +35238,7 @@
             <w:pPr>
               <w:spacing w:after="20" w:before="0"/>
             </w:pPr>
-            <w:hyperlink w:history="1" r:id="rIdm2rf5i3vqy7n2qpvfc1i7">
+            <w:hyperlink w:history="1" r:id="rId6ekdns7t-kkcwxbjrxnas">
               <w:r>
                 <w:rPr>
                   <w:rFonts w:ascii="Arial" w:cs="Arial" w:eastAsia="Arial" w:hAnsi="Arial"/>
@@ -35271,7 +35271,7 @@
               <w:spacing w:after="10" w:before="0"/>
               <w:ind w:left="120"/>
             </w:pPr>
-            <w:hyperlink w:history="1" r:id="rIdo_eqy0ua6p0cybkhnumuq">
+            <w:hyperlink w:history="1" r:id="rId_2crg4rqr1yyswcsgwgrd">
               <w:r>
                 <w:rPr>
                   <w:rFonts w:ascii="Arial" w:cs="Arial" w:eastAsia="Arial" w:hAnsi="Arial"/>
@@ -35316,7 +35316,7 @@
             <w:pPr>
               <w:spacing w:after="20" w:before="0"/>
             </w:pPr>
-            <w:hyperlink w:history="1" r:id="rIdykqg1vvl6x_ec1o7k7dy4">
+            <w:hyperlink w:history="1" r:id="rIdytzbqtm2bsrzo2bi5xioy">
               <w:r>
                 <w:rPr>
                   <w:rFonts w:ascii="Arial" w:cs="Arial" w:eastAsia="Arial" w:hAnsi="Arial"/>
@@ -35365,7 +35365,7 @@
               <w:spacing w:after="10" w:before="0"/>
               <w:ind w:left="120"/>
             </w:pPr>
-            <w:hyperlink w:history="1" r:id="rIdwc_vcywvehl_3odi_kaj6">
+            <w:hyperlink w:history="1" r:id="rId1d4qx3iw7rosg7uc-drym">
               <w:r>
                 <w:rPr>
                   <w:rFonts w:ascii="Arial" w:cs="Arial" w:eastAsia="Arial" w:hAnsi="Arial"/>
@@ -35877,7 +35877,7 @@
         </w:rPr>
         <w:t xml:space="preserve">© 2026 SeaVuria and ARES. Aligned with KICD objectives. Developed by SeaVuria; technical implementation by ARES (with AI assistance from Claude). Licensed under </w:t>
       </w:r>
-      <w:hyperlink w:history="1" r:id="rId9egujj7-v07lxufdlcjg2">
+      <w:hyperlink w:history="1" r:id="rIdxw0gi0qibtvzdhnvvkfee">
         <w:r>
           <w:rPr>
             <w:rFonts w:ascii="Arial" w:cs="Arial" w:eastAsia="Arial" w:hAnsi="Arial"/>
@@ -35898,7 +35898,7 @@
         </w:rPr>
         <w:t xml:space="preserve"> (</w:t>
       </w:r>
-      <w:hyperlink w:history="1" r:id="rId4mndsl1jenykxom6nfjuq">
+      <w:hyperlink w:history="1" r:id="rIduee-4d6au_s2wu5klkpch">
         <w:r>
           <w:rPr>
             <w:rFonts w:ascii="Arial" w:cs="Arial" w:eastAsia="Arial" w:hAnsi="Arial"/>
@@ -36911,7 +36911,7 @@
             <w:pPr>
               <w:spacing w:after="20" w:before="0"/>
             </w:pPr>
-            <w:hyperlink w:history="1" r:id="rId58p3fbcqfwddalt20pic-">
+            <w:hyperlink w:history="1" r:id="rIds0ychwtzhy_e8-b_w4m3l">
               <w:r>
                 <w:rPr>
                   <w:rFonts w:ascii="Arial" w:cs="Arial" w:eastAsia="Arial" w:hAnsi="Arial"/>
@@ -36944,7 +36944,7 @@
               <w:spacing w:after="10" w:before="0"/>
               <w:ind w:left="120"/>
             </w:pPr>
-            <w:hyperlink w:history="1" r:id="rIdbjqz8bbhi0sva9cz9mvtu">
+            <w:hyperlink w:history="1" r:id="rIds9hfro8eqnbcftafcz-ph">
               <w:r>
                 <w:rPr>
                   <w:rFonts w:ascii="Arial" w:cs="Arial" w:eastAsia="Arial" w:hAnsi="Arial"/>
@@ -36989,7 +36989,7 @@
             <w:pPr>
               <w:spacing w:after="20" w:before="0"/>
             </w:pPr>
-            <w:hyperlink w:history="1" r:id="rIda8c8fk1usj2xp0hwqb7jv">
+            <w:hyperlink w:history="1" r:id="rIdvup9w7sh0tuaj3uawqaas">
               <w:r>
                 <w:rPr>
                   <w:rFonts w:ascii="Arial" w:cs="Arial" w:eastAsia="Arial" w:hAnsi="Arial"/>
@@ -37022,7 +37022,7 @@
               <w:spacing w:after="10" w:before="0"/>
               <w:ind w:left="120"/>
             </w:pPr>
-            <w:hyperlink w:history="1" r:id="rIdyyqb2p9ykga8rmgoy_nu-">
+            <w:hyperlink w:history="1" r:id="rIdglovifof_r6z2om90mr7k">
               <w:r>
                 <w:rPr>
                   <w:rFonts w:ascii="Arial" w:cs="Arial" w:eastAsia="Arial" w:hAnsi="Arial"/>
@@ -37369,7 +37369,7 @@
             <w:pPr>
               <w:spacing w:after="20" w:before="0"/>
             </w:pPr>
-            <w:hyperlink w:history="1" r:id="rIdkyvljdgbhcvg06dgtl7de">
+            <w:hyperlink w:history="1" r:id="rIdlxbuj48ubea3ugglnqc9x">
               <w:r>
                 <w:rPr>
                   <w:rFonts w:ascii="Arial" w:cs="Arial" w:eastAsia="Arial" w:hAnsi="Arial"/>
@@ -37402,7 +37402,7 @@
               <w:spacing w:after="10" w:before="0"/>
               <w:ind w:left="120"/>
             </w:pPr>
-            <w:hyperlink w:history="1" r:id="rIdcyc-snzbzelxoqtq6dk0b">
+            <w:hyperlink w:history="1" r:id="rIdgrix5sbusekmpmzo7zsx1">
               <w:r>
                 <w:rPr>
                   <w:rFonts w:ascii="Arial" w:cs="Arial" w:eastAsia="Arial" w:hAnsi="Arial"/>
@@ -37447,7 +37447,7 @@
             <w:pPr>
               <w:spacing w:after="20" w:before="0"/>
             </w:pPr>
-            <w:hyperlink w:history="1" r:id="rIdwpzlz_ornuvknggfqnpe4">
+            <w:hyperlink w:history="1" r:id="rIdzve1tbhezwallhhrgq9ya">
               <w:r>
                 <w:rPr>
                   <w:rFonts w:ascii="Arial" w:cs="Arial" w:eastAsia="Arial" w:hAnsi="Arial"/>
@@ -37480,7 +37480,7 @@
               <w:spacing w:after="10" w:before="0"/>
               <w:ind w:left="120"/>
             </w:pPr>
-            <w:hyperlink w:history="1" r:id="rIdqin4ec6dzpo77ejkdxd6k">
+            <w:hyperlink w:history="1" r:id="rIdbv-itesjotc87hgabnkak">
               <w:r>
                 <w:rPr>
                   <w:rFonts w:ascii="Arial" w:cs="Arial" w:eastAsia="Arial" w:hAnsi="Arial"/>
@@ -37979,7 +37979,7 @@
             <w:pPr>
               <w:spacing w:after="20" w:before="0"/>
             </w:pPr>
-            <w:hyperlink w:history="1" r:id="rId96zgqgu4cyph4stqrnrgs">
+            <w:hyperlink w:history="1" r:id="rIdu67kfxflmnnrqigpz0j1n">
               <w:r>
                 <w:rPr>
                   <w:rFonts w:ascii="Arial" w:cs="Arial" w:eastAsia="Arial" w:hAnsi="Arial"/>
@@ -38012,7 +38012,7 @@
               <w:spacing w:after="10" w:before="0"/>
               <w:ind w:left="120"/>
             </w:pPr>
-            <w:hyperlink w:history="1" r:id="rIdjyhalkalty37tw3cp5ldp">
+            <w:hyperlink w:history="1" r:id="rIdtlb73zkn4m55ahyxwmmtn">
               <w:r>
                 <w:rPr>
                   <w:rFonts w:ascii="Arial" w:cs="Arial" w:eastAsia="Arial" w:hAnsi="Arial"/>
@@ -38057,7 +38057,7 @@
             <w:pPr>
               <w:spacing w:after="20" w:before="0"/>
             </w:pPr>
-            <w:hyperlink w:history="1" r:id="rIduwm6fhcvj3wcosyf5alju">
+            <w:hyperlink w:history="1" r:id="rId9dmgidnjbel8vggcaxvsy">
               <w:r>
                 <w:rPr>
                   <w:rFonts w:ascii="Arial" w:cs="Arial" w:eastAsia="Arial" w:hAnsi="Arial"/>
@@ -38106,7 +38106,7 @@
               <w:spacing w:after="10" w:before="0"/>
               <w:ind w:left="120"/>
             </w:pPr>
-            <w:hyperlink w:history="1" r:id="rId4behc-fzkg3-htvcp3amk">
+            <w:hyperlink w:history="1" r:id="rIdbhbpzj80yu_xlip3oyphi">
               <w:r>
                 <w:rPr>
                   <w:rFonts w:ascii="Arial" w:cs="Arial" w:eastAsia="Arial" w:hAnsi="Arial"/>
@@ -38510,7 +38510,7 @@
             <w:pPr>
               <w:spacing w:after="20" w:before="0"/>
             </w:pPr>
-            <w:hyperlink w:history="1" r:id="rId8jvfae1up0aqzhvyofp93">
+            <w:hyperlink w:history="1" r:id="rId-cedx76jsgq5aexl5dlbo">
               <w:r>
                 <w:rPr>
                   <w:rFonts w:ascii="Arial" w:cs="Arial" w:eastAsia="Arial" w:hAnsi="Arial"/>
@@ -38543,7 +38543,7 @@
               <w:spacing w:after="10" w:before="0"/>
               <w:ind w:left="120"/>
             </w:pPr>
-            <w:hyperlink w:history="1" r:id="rId2d0qdw2mfazzvws6sxqtv">
+            <w:hyperlink w:history="1" r:id="rId2gsicocuyr6bfvneapbtr">
               <w:r>
                 <w:rPr>
                   <w:rFonts w:ascii="Arial" w:cs="Arial" w:eastAsia="Arial" w:hAnsi="Arial"/>
@@ -38588,7 +38588,7 @@
             <w:pPr>
               <w:spacing w:after="20" w:before="0"/>
             </w:pPr>
-            <w:hyperlink w:history="1" r:id="rIdfco-trhtspnk5wnwbcok8">
+            <w:hyperlink w:history="1" r:id="rIdbly4vzuzarylzom5udm3a">
               <w:r>
                 <w:rPr>
                   <w:rFonts w:ascii="Arial" w:cs="Arial" w:eastAsia="Arial" w:hAnsi="Arial"/>
@@ -38637,7 +38637,7 @@
               <w:spacing w:after="10" w:before="0"/>
               <w:ind w:left="120"/>
             </w:pPr>
-            <w:hyperlink w:history="1" r:id="rIdkv4wqpidmwq0anrdizsuy">
+            <w:hyperlink w:history="1" r:id="rIdlxu2xk8d1lxy3i6otl-gk">
               <w:r>
                 <w:rPr>
                   <w:rFonts w:ascii="Arial" w:cs="Arial" w:eastAsia="Arial" w:hAnsi="Arial"/>
@@ -39079,7 +39079,7 @@
             <w:pPr>
               <w:spacing w:after="20" w:before="0"/>
             </w:pPr>
-            <w:hyperlink w:history="1" r:id="rIdnf98dcdqjag5szi0bizwg">
+            <w:hyperlink w:history="1" r:id="rIdnswhhk3b4q11fnvx_p3ne">
               <w:r>
                 <w:rPr>
                   <w:rFonts w:ascii="Arial" w:cs="Arial" w:eastAsia="Arial" w:hAnsi="Arial"/>
@@ -39112,7 +39112,7 @@
               <w:spacing w:after="10" w:before="0"/>
               <w:ind w:left="120"/>
             </w:pPr>
-            <w:hyperlink w:history="1" r:id="rIdqtuxi8flndmzzrzoet3vk">
+            <w:hyperlink w:history="1" r:id="rIdz6afi3wqv-ynzk5aw9kik">
               <w:r>
                 <w:rPr>
                   <w:rFonts w:ascii="Arial" w:cs="Arial" w:eastAsia="Arial" w:hAnsi="Arial"/>
@@ -39157,7 +39157,7 @@
             <w:pPr>
               <w:spacing w:after="20" w:before="0"/>
             </w:pPr>
-            <w:hyperlink w:history="1" r:id="rIdt4bck6kcl_mdt1smr_i14">
+            <w:hyperlink w:history="1" r:id="rId_udgyr-t25gg508x2lztu">
               <w:r>
                 <w:rPr>
                   <w:rFonts w:ascii="Arial" w:cs="Arial" w:eastAsia="Arial" w:hAnsi="Arial"/>
@@ -39206,7 +39206,7 @@
               <w:spacing w:after="10" w:before="0"/>
               <w:ind w:left="120"/>
             </w:pPr>
-            <w:hyperlink w:history="1" r:id="rIdwjkts0tuaakbmlrjmwvuz">
+            <w:hyperlink w:history="1" r:id="rId_c6cabqshmuyrgr2kbuii">
               <w:r>
                 <w:rPr>
                   <w:rFonts w:ascii="Arial" w:cs="Arial" w:eastAsia="Arial" w:hAnsi="Arial"/>
@@ -39870,7 +39870,7 @@
         </w:rPr>
         <w:t xml:space="preserve">© 2026 SeaVuria and ARES. Aligned with KICD objectives. Developed by SeaVuria; technical implementation by ARES (with AI assistance from Claude). Licensed under </w:t>
       </w:r>
-      <w:hyperlink w:history="1" r:id="rIdwozzsg-fzxfl6wssz6mbv">
+      <w:hyperlink w:history="1" r:id="rIdwithhegacjcfm2sjyzyrh">
         <w:r>
           <w:rPr>
             <w:rFonts w:ascii="Arial" w:cs="Arial" w:eastAsia="Arial" w:hAnsi="Arial"/>
@@ -39891,7 +39891,7 @@
         </w:rPr>
         <w:t xml:space="preserve"> (</w:t>
       </w:r>
-      <w:hyperlink w:history="1" r:id="rIds9aehhmxx7iqwh-kvo9y_">
+      <w:hyperlink w:history="1" r:id="rIdr3w5u-ibsnv3mjc2gltbp">
         <w:r>
           <w:rPr>
             <w:rFonts w:ascii="Arial" w:cs="Arial" w:eastAsia="Arial" w:hAnsi="Arial"/>

</xml_diff>

<commit_message>
Lesson tables: print full-width under the phase row instead of nesting in narrow columns
Co-Authored-By: Claude Sonnet 5.5 <noreply@anthropic.com>
</commit_message>
<xml_diff>
--- a/data/outputs/v2/Biology/SS1.1_Cell_Structure/Biology_Cell_Structure_CBE_LessonSequence.docx
+++ b/data/outputs/v2/Biology/SS1.1_Cell_Structure/Biology_Cell_Structure_CBE_LessonSequence.docx
@@ -2658,7 +2658,7 @@
         </w:rPr>
         <w:t xml:space="preserve">© 2026 SeaVuria and ARES. This work is licensed under a </w:t>
       </w:r>
-      <w:hyperlink w:history="1" r:id="rIdxu6rdcgqarygmawywywk4">
+      <w:hyperlink w:history="1" r:id="rId7c9cjvhy9nlwt3zsqzabq">
         <w:r>
           <w:rPr>
             <w:rFonts w:ascii="Arial" w:cs="Arial" w:eastAsia="Arial" w:hAnsi="Arial"/>
@@ -2678,7 +2678,7 @@
         </w:rPr>
         <w:t xml:space="preserve"> (</w:t>
       </w:r>
-      <w:hyperlink w:history="1" r:id="rIdvsxlkitgnwiojxf1fnvhv">
+      <w:hyperlink w:history="1" r:id="rIdn1eips_4_i3lqbi5gjsvv">
         <w:r>
           <w:rPr>
             <w:rFonts w:ascii="Arial" w:cs="Arial" w:eastAsia="Arial" w:hAnsi="Arial"/>
@@ -2698,7 +2698,7 @@
         </w:rPr>
         <w:t xml:space="preserve">). To view a copy of this license, visit </w:t>
       </w:r>
-      <w:hyperlink w:history="1" r:id="rIdzr25shuv2_ycxhnbh892_">
+      <w:hyperlink w:history="1" r:id="rIdklimblvi_03xqq8lioxqk">
         <w:r>
           <w:rPr>
             <w:rFonts w:ascii="Arial" w:cs="Arial" w:eastAsia="Arial" w:hAnsi="Arial"/>
@@ -3737,7 +3737,7 @@
             <w:pPr>
               <w:spacing w:after="20" w:before="0"/>
             </w:pPr>
-            <w:hyperlink w:history="1" r:id="rIdlddlhhfbvd8qdmjxfc1pq">
+            <w:hyperlink w:history="1" r:id="rIdbmhcrl7q5fcss7rojppi6">
               <w:r>
                 <w:rPr>
                   <w:rFonts w:ascii="Arial" w:cs="Arial" w:eastAsia="Arial" w:hAnsi="Arial"/>
@@ -3770,7 +3770,7 @@
               <w:spacing w:after="10" w:before="0"/>
               <w:ind w:left="120"/>
             </w:pPr>
-            <w:hyperlink w:history="1" r:id="rIdgmummp4is987d4x51uzsz">
+            <w:hyperlink w:history="1" r:id="rIdktwecaup0vi9pswl8coiq">
               <w:r>
                 <w:rPr>
                   <w:rFonts w:ascii="Arial" w:cs="Arial" w:eastAsia="Arial" w:hAnsi="Arial"/>
@@ -3815,7 +3815,7 @@
             <w:pPr>
               <w:spacing w:after="20" w:before="0"/>
             </w:pPr>
-            <w:hyperlink w:history="1" r:id="rIdj56mysf_iricc7ytooapz">
+            <w:hyperlink w:history="1" r:id="rIdie9rvygkdq2-zci1omqco">
               <w:r>
                 <w:rPr>
                   <w:rFonts w:ascii="Arial" w:cs="Arial" w:eastAsia="Arial" w:hAnsi="Arial"/>
@@ -3848,7 +3848,7 @@
               <w:spacing w:after="10" w:before="0"/>
               <w:ind w:left="120"/>
             </w:pPr>
-            <w:hyperlink w:history="1" r:id="rId3oyhqs4r0jlxrgecl8hua">
+            <w:hyperlink w:history="1" r:id="rIdjh9-ebr4k8vixelouqwwz">
               <w:r>
                 <w:rPr>
                   <w:rFonts w:ascii="Arial" w:cs="Arial" w:eastAsia="Arial" w:hAnsi="Arial"/>
@@ -4048,7 +4048,7 @@
             <w:pPr>
               <w:spacing w:after="20" w:before="0"/>
             </w:pPr>
-            <w:hyperlink w:history="1" r:id="rIdu7jhoxnwu2udccruwxf9f">
+            <w:hyperlink w:history="1" r:id="rIdm7i_53sf9l2upkwiww5px">
               <w:r>
                 <w:rPr>
                   <w:rFonts w:ascii="Arial" w:cs="Arial" w:eastAsia="Arial" w:hAnsi="Arial"/>
@@ -4081,7 +4081,7 @@
               <w:spacing w:after="10" w:before="0"/>
               <w:ind w:left="120"/>
             </w:pPr>
-            <w:hyperlink w:history="1" r:id="rIdxpkvr7gbgg1mrphs4dmoz">
+            <w:hyperlink w:history="1" r:id="rIdgq5lbeu-y5esgj5qrgpvm">
               <w:r>
                 <w:rPr>
                   <w:rFonts w:ascii="Arial" w:cs="Arial" w:eastAsia="Arial" w:hAnsi="Arial"/>
@@ -4126,7 +4126,7 @@
             <w:pPr>
               <w:spacing w:after="20" w:before="0"/>
             </w:pPr>
-            <w:hyperlink w:history="1" r:id="rIdgitwtv_k5nxcfccj-o9qh">
+            <w:hyperlink w:history="1" r:id="rId9jbkwrronv_x5mk9pnzxn">
               <w:r>
                 <w:rPr>
                   <w:rFonts w:ascii="Arial" w:cs="Arial" w:eastAsia="Arial" w:hAnsi="Arial"/>
@@ -4159,7 +4159,7 @@
               <w:spacing w:after="10" w:before="0"/>
               <w:ind w:left="120"/>
             </w:pPr>
-            <w:hyperlink w:history="1" r:id="rId_giaw_ivmbd9mgdxvhxar">
+            <w:hyperlink w:history="1" r:id="rIdk4okaxcrig5kdn6fvazxc">
               <w:r>
                 <w:rPr>
                   <w:rFonts w:ascii="Arial" w:cs="Arial" w:eastAsia="Arial" w:hAnsi="Arial"/>
@@ -4359,7 +4359,7 @@
             <w:pPr>
               <w:spacing w:after="20" w:before="0"/>
             </w:pPr>
-            <w:hyperlink w:history="1" r:id="rIdy5qdgxaqrxu0mgd6ilm3v">
+            <w:hyperlink w:history="1" r:id="rId4nq4ffzx9bu_jeceqcix_">
               <w:r>
                 <w:rPr>
                   <w:rFonts w:ascii="Arial" w:cs="Arial" w:eastAsia="Arial" w:hAnsi="Arial"/>
@@ -4408,7 +4408,7 @@
               <w:spacing w:after="10" w:before="0"/>
               <w:ind w:left="120"/>
             </w:pPr>
-            <w:hyperlink w:history="1" r:id="rIdq0niph0ajglcwjxwz43py">
+            <w:hyperlink w:history="1" r:id="rIdxbr0jufznqmypmfrgfybd">
               <w:r>
                 <w:rPr>
                   <w:rFonts w:ascii="Arial" w:cs="Arial" w:eastAsia="Arial" w:hAnsi="Arial"/>
@@ -4453,7 +4453,7 @@
             <w:pPr>
               <w:spacing w:after="20" w:before="0"/>
             </w:pPr>
-            <w:hyperlink w:history="1" r:id="rIdkxezvvcee2jf1t3otw1lb">
+            <w:hyperlink w:history="1" r:id="rIdg_xeywlip_mza5sd8tfl-">
               <w:r>
                 <w:rPr>
                   <w:rFonts w:ascii="Arial" w:cs="Arial" w:eastAsia="Arial" w:hAnsi="Arial"/>
@@ -4502,7 +4502,7 @@
               <w:spacing w:after="10" w:before="0"/>
               <w:ind w:left="120"/>
             </w:pPr>
-            <w:hyperlink w:history="1" r:id="rId5vacy4qsogcu81ijsbegu">
+            <w:hyperlink w:history="1" r:id="rIdwlh0tl30opjicwktwiyid">
               <w:r>
                 <w:rPr>
                   <w:rFonts w:ascii="Arial" w:cs="Arial" w:eastAsia="Arial" w:hAnsi="Arial"/>
@@ -4702,7 +4702,7 @@
             <w:pPr>
               <w:spacing w:after="20" w:before="0"/>
             </w:pPr>
-            <w:hyperlink w:history="1" r:id="rIds1gjgvf-gefjivpuqrcrs">
+            <w:hyperlink w:history="1" r:id="rIdsbbspfuj5knj-tsiig1fp">
               <w:r>
                 <w:rPr>
                   <w:rFonts w:ascii="Arial" w:cs="Arial" w:eastAsia="Arial" w:hAnsi="Arial"/>
@@ -4751,7 +4751,7 @@
               <w:spacing w:after="10" w:before="0"/>
               <w:ind w:left="120"/>
             </w:pPr>
-            <w:hyperlink w:history="1" r:id="rIdlwawvm9gd6xpeejmm9cqm">
+            <w:hyperlink w:history="1" r:id="rIdxz_pocjx-4kupadnafikj">
               <w:r>
                 <w:rPr>
                   <w:rFonts w:ascii="Arial" w:cs="Arial" w:eastAsia="Arial" w:hAnsi="Arial"/>
@@ -4796,7 +4796,7 @@
             <w:pPr>
               <w:spacing w:after="20" w:before="0"/>
             </w:pPr>
-            <w:hyperlink w:history="1" r:id="rId4x5q6eunaexlsh_64ssu0">
+            <w:hyperlink w:history="1" r:id="rIdur5oahn0hj9hi-ybtftgz">
               <w:r>
                 <w:rPr>
                   <w:rFonts w:ascii="Arial" w:cs="Arial" w:eastAsia="Arial" w:hAnsi="Arial"/>
@@ -4845,7 +4845,7 @@
               <w:spacing w:after="10" w:before="0"/>
               <w:ind w:left="120"/>
             </w:pPr>
-            <w:hyperlink w:history="1" r:id="rIdhl9pbqyfvqsnfxt-ksxam">
+            <w:hyperlink w:history="1" r:id="rId3zqfz6d5jklat0j268xxp">
               <w:r>
                 <w:rPr>
                   <w:rFonts w:ascii="Arial" w:cs="Arial" w:eastAsia="Arial" w:hAnsi="Arial"/>
@@ -5045,7 +5045,7 @@
             <w:pPr>
               <w:spacing w:after="20" w:before="0"/>
             </w:pPr>
-            <w:hyperlink w:history="1" r:id="rIdcmxh3ikzwyxunvuim8zma">
+            <w:hyperlink w:history="1" r:id="rId4xh0tu3qvqqontfbs7okq">
               <w:r>
                 <w:rPr>
                   <w:rFonts w:ascii="Arial" w:cs="Arial" w:eastAsia="Arial" w:hAnsi="Arial"/>
@@ -5094,7 +5094,7 @@
               <w:spacing w:after="10" w:before="0"/>
               <w:ind w:left="120"/>
             </w:pPr>
-            <w:hyperlink w:history="1" r:id="rId9k55653nksg8hrxvodqa7">
+            <w:hyperlink w:history="1" r:id="rIdabxivtbsb5japuqt_ltog">
               <w:r>
                 <w:rPr>
                   <w:rFonts w:ascii="Arial" w:cs="Arial" w:eastAsia="Arial" w:hAnsi="Arial"/>
@@ -5139,7 +5139,7 @@
             <w:pPr>
               <w:spacing w:after="20" w:before="0"/>
             </w:pPr>
-            <w:hyperlink w:history="1" r:id="rIdyzmhh9vxff3pxvcgk39mv">
+            <w:hyperlink w:history="1" r:id="rId2gey71uxhuzqnsnojyypa">
               <w:r>
                 <w:rPr>
                   <w:rFonts w:ascii="Arial" w:cs="Arial" w:eastAsia="Arial" w:hAnsi="Arial"/>
@@ -5188,7 +5188,7 @@
               <w:spacing w:after="10" w:before="0"/>
               <w:ind w:left="120"/>
             </w:pPr>
-            <w:hyperlink w:history="1" r:id="rIdcbypj2lbokcosjs-shpcf">
+            <w:hyperlink w:history="1" r:id="rId1ekgusi4fo7zssscmalqm">
               <w:r>
                 <w:rPr>
                   <w:rFonts w:ascii="Arial" w:cs="Arial" w:eastAsia="Arial" w:hAnsi="Arial"/>
@@ -5713,7 +5713,7 @@
         </w:rPr>
         <w:t xml:space="preserve">© 2026 SeaVuria and ARES. Aligned with KICD objectives. Developed by SeaVuria; technical implementation by ARES (with AI assistance from Claude). Licensed under </w:t>
       </w:r>
-      <w:hyperlink w:history="1" r:id="rIdhxuue6pow0ftnkd90uxxw">
+      <w:hyperlink w:history="1" r:id="rIdd-qc3mq9m3fp2w9htxcmw">
         <w:r>
           <w:rPr>
             <w:rFonts w:ascii="Arial" w:cs="Arial" w:eastAsia="Arial" w:hAnsi="Arial"/>
@@ -5734,7 +5734,7 @@
         </w:rPr>
         <w:t xml:space="preserve"> (</w:t>
       </w:r>
-      <w:hyperlink w:history="1" r:id="rIdbfrsjfsdgtzzeardgktaf">
+      <w:hyperlink w:history="1" r:id="rIdlirmvishsq03tj5sy_voa">
         <w:r>
           <w:rPr>
             <w:rFonts w:ascii="Arial" w:cs="Arial" w:eastAsia="Arial" w:hAnsi="Arial"/>
@@ -6774,7 +6774,7 @@
             <w:pPr>
               <w:spacing w:after="20" w:before="0"/>
             </w:pPr>
-            <w:hyperlink w:history="1" r:id="rIdjr6dczknobxyb6ceyv2ds">
+            <w:hyperlink w:history="1" r:id="rIdyfbhncn3xwsqv3fvvlcaw">
               <w:r>
                 <w:rPr>
                   <w:rFonts w:ascii="Arial" w:cs="Arial" w:eastAsia="Arial" w:hAnsi="Arial"/>
@@ -6807,7 +6807,7 @@
               <w:spacing w:after="10" w:before="0"/>
               <w:ind w:left="120"/>
             </w:pPr>
-            <w:hyperlink w:history="1" r:id="rIdromowdop2k4ukew6_kmcn">
+            <w:hyperlink w:history="1" r:id="rIdcvv8zzqcqe4da37-l8yjw">
               <w:r>
                 <w:rPr>
                   <w:rFonts w:ascii="Arial" w:cs="Arial" w:eastAsia="Arial" w:hAnsi="Arial"/>
@@ -6852,7 +6852,7 @@
             <w:pPr>
               <w:spacing w:after="20" w:before="0"/>
             </w:pPr>
-            <w:hyperlink w:history="1" r:id="rIdwkrdbcxcldykc3sa4e9uq">
+            <w:hyperlink w:history="1" r:id="rId8jqmbydbw12ecz5nysedj">
               <w:r>
                 <w:rPr>
                   <w:rFonts w:ascii="Arial" w:cs="Arial" w:eastAsia="Arial" w:hAnsi="Arial"/>
@@ -6885,7 +6885,7 @@
               <w:spacing w:after="10" w:before="0"/>
               <w:ind w:left="120"/>
             </w:pPr>
-            <w:hyperlink w:history="1" r:id="rIdit-nquipavrt1v-vuuokw">
+            <w:hyperlink w:history="1" r:id="rId-tst62jmr4sdcdj-fsrek">
               <w:r>
                 <w:rPr>
                   <w:rFonts w:ascii="Arial" w:cs="Arial" w:eastAsia="Arial" w:hAnsi="Arial"/>
@@ -7085,7 +7085,7 @@
             <w:pPr>
               <w:spacing w:after="20" w:before="0"/>
             </w:pPr>
-            <w:hyperlink w:history="1" r:id="rIddibiw4tzr1e8ipjjx-ijb">
+            <w:hyperlink w:history="1" r:id="rIdaxsnn7gcaszwbfrvqm1es">
               <w:r>
                 <w:rPr>
                   <w:rFonts w:ascii="Arial" w:cs="Arial" w:eastAsia="Arial" w:hAnsi="Arial"/>
@@ -7118,7 +7118,7 @@
               <w:spacing w:after="10" w:before="0"/>
               <w:ind w:left="120"/>
             </w:pPr>
-            <w:hyperlink w:history="1" r:id="rIdazjjsabb8zvhib9qomtrk">
+            <w:hyperlink w:history="1" r:id="rIdahnmtw0c4vdguiuorpn_7">
               <w:r>
                 <w:rPr>
                   <w:rFonts w:ascii="Arial" w:cs="Arial" w:eastAsia="Arial" w:hAnsi="Arial"/>
@@ -7163,7 +7163,7 @@
             <w:pPr>
               <w:spacing w:after="20" w:before="0"/>
             </w:pPr>
-            <w:hyperlink w:history="1" r:id="rIdz9pomyle4oba-dgrwnwlf">
+            <w:hyperlink w:history="1" r:id="rIdyhgougxqoz2jx6arf5zjf">
               <w:r>
                 <w:rPr>
                   <w:rFonts w:ascii="Arial" w:cs="Arial" w:eastAsia="Arial" w:hAnsi="Arial"/>
@@ -7196,7 +7196,7 @@
               <w:spacing w:after="10" w:before="0"/>
               <w:ind w:left="120"/>
             </w:pPr>
-            <w:hyperlink w:history="1" r:id="rIdximtrprnwnlpnk4vu_9hy">
+            <w:hyperlink w:history="1" r:id="rIdiluuotgyrpjxqnshh23hp">
               <w:r>
                 <w:rPr>
                   <w:rFonts w:ascii="Arial" w:cs="Arial" w:eastAsia="Arial" w:hAnsi="Arial"/>
@@ -7396,7 +7396,7 @@
             <w:pPr>
               <w:spacing w:after="20" w:before="0"/>
             </w:pPr>
-            <w:hyperlink w:history="1" r:id="rId1y-q0_gpjjn6gt9vum0tl">
+            <w:hyperlink w:history="1" r:id="rIdm3ctxsef5ms7m7fgrgul-">
               <w:r>
                 <w:rPr>
                   <w:rFonts w:ascii="Arial" w:cs="Arial" w:eastAsia="Arial" w:hAnsi="Arial"/>
@@ -7445,7 +7445,7 @@
               <w:spacing w:after="10" w:before="0"/>
               <w:ind w:left="120"/>
             </w:pPr>
-            <w:hyperlink w:history="1" r:id="rIdetjkhuah7a7hu3iblwrya">
+            <w:hyperlink w:history="1" r:id="rIdnposmtkw8gv5b0a5zdbyl">
               <w:r>
                 <w:rPr>
                   <w:rFonts w:ascii="Arial" w:cs="Arial" w:eastAsia="Arial" w:hAnsi="Arial"/>
@@ -7490,7 +7490,7 @@
             <w:pPr>
               <w:spacing w:after="20" w:before="0"/>
             </w:pPr>
-            <w:hyperlink w:history="1" r:id="rIdczisjwnrl9k03xn3osir5">
+            <w:hyperlink w:history="1" r:id="rIdlxr5ymtfpdmqvdl5da1tu">
               <w:r>
                 <w:rPr>
                   <w:rFonts w:ascii="Arial" w:cs="Arial" w:eastAsia="Arial" w:hAnsi="Arial"/>
@@ -7523,7 +7523,7 @@
               <w:spacing w:after="10" w:before="0"/>
               <w:ind w:left="120"/>
             </w:pPr>
-            <w:hyperlink w:history="1" r:id="rIdtczqxp_nadl6rujt7f0pv">
+            <w:hyperlink w:history="1" r:id="rIdiokvq-wgpar_brxmguxoq">
               <w:r>
                 <w:rPr>
                   <w:rFonts w:ascii="Arial" w:cs="Arial" w:eastAsia="Arial" w:hAnsi="Arial"/>
@@ -7723,7 +7723,7 @@
             <w:pPr>
               <w:spacing w:after="20" w:before="0"/>
             </w:pPr>
-            <w:hyperlink w:history="1" r:id="rIdywdqj3ro_rltbk7oqabag">
+            <w:hyperlink w:history="1" r:id="rId1yy2eeoqyg_qsirpswulq">
               <w:r>
                 <w:rPr>
                   <w:rFonts w:ascii="Arial" w:cs="Arial" w:eastAsia="Arial" w:hAnsi="Arial"/>
@@ -7772,7 +7772,7 @@
               <w:spacing w:after="10" w:before="0"/>
               <w:ind w:left="120"/>
             </w:pPr>
-            <w:hyperlink w:history="1" r:id="rId4wnlc5k3feuapcs_xeijc">
+            <w:hyperlink w:history="1" r:id="rIdvchr3fat9eysmfasmcc9y">
               <w:r>
                 <w:rPr>
                   <w:rFonts w:ascii="Arial" w:cs="Arial" w:eastAsia="Arial" w:hAnsi="Arial"/>
@@ -7817,7 +7817,7 @@
             <w:pPr>
               <w:spacing w:after="20" w:before="0"/>
             </w:pPr>
-            <w:hyperlink w:history="1" r:id="rIdohwwhld0czhlmogjqg2cr">
+            <w:hyperlink w:history="1" r:id="rIdccb1b1p1bn5aj6_an2sdk">
               <w:r>
                 <w:rPr>
                   <w:rFonts w:ascii="Arial" w:cs="Arial" w:eastAsia="Arial" w:hAnsi="Arial"/>
@@ -7850,7 +7850,7 @@
               <w:spacing w:after="10" w:before="0"/>
               <w:ind w:left="120"/>
             </w:pPr>
-            <w:hyperlink w:history="1" r:id="rIdvdibdrpb6a3fcbjx9xosw">
+            <w:hyperlink w:history="1" r:id="rIdwwo4fngvou_uhao33kqri">
               <w:r>
                 <w:rPr>
                   <w:rFonts w:ascii="Arial" w:cs="Arial" w:eastAsia="Arial" w:hAnsi="Arial"/>
@@ -8050,7 +8050,7 @@
             <w:pPr>
               <w:spacing w:after="20" w:before="0"/>
             </w:pPr>
-            <w:hyperlink w:history="1" r:id="rIdlpkujj5fro8jhnlwwkvjc">
+            <w:hyperlink w:history="1" r:id="rIdkeesimmfbobw-ojzyvmkm">
               <w:r>
                 <w:rPr>
                   <w:rFonts w:ascii="Arial" w:cs="Arial" w:eastAsia="Arial" w:hAnsi="Arial"/>
@@ -8099,7 +8099,7 @@
               <w:spacing w:after="10" w:before="0"/>
               <w:ind w:left="120"/>
             </w:pPr>
-            <w:hyperlink w:history="1" r:id="rIdkykajzeicsjogxgyubizz">
+            <w:hyperlink w:history="1" r:id="rIdulnz8wpmj-wu9qgaclv0s">
               <w:r>
                 <w:rPr>
                   <w:rFonts w:ascii="Arial" w:cs="Arial" w:eastAsia="Arial" w:hAnsi="Arial"/>
@@ -8144,7 +8144,7 @@
             <w:pPr>
               <w:spacing w:after="20" w:before="0"/>
             </w:pPr>
-            <w:hyperlink w:history="1" r:id="rIdpx7hy7zuokvh7liwtslf6">
+            <w:hyperlink w:history="1" r:id="rIdc1ivazejojcestbqp-8xp">
               <w:r>
                 <w:rPr>
                   <w:rFonts w:ascii="Arial" w:cs="Arial" w:eastAsia="Arial" w:hAnsi="Arial"/>
@@ -8177,7 +8177,7 @@
               <w:spacing w:after="10" w:before="0"/>
               <w:ind w:left="120"/>
             </w:pPr>
-            <w:hyperlink w:history="1" r:id="rIdxweldlugpbvn4ug9t8sk7">
+            <w:hyperlink w:history="1" r:id="rIdibpuidebjrj_vbqzieexx">
               <w:r>
                 <w:rPr>
                   <w:rFonts w:ascii="Arial" w:cs="Arial" w:eastAsia="Arial" w:hAnsi="Arial"/>
@@ -8702,7 +8702,7 @@
         </w:rPr>
         <w:t xml:space="preserve">© 2026 SeaVuria and ARES. Aligned with KICD objectives. Developed by SeaVuria; technical implementation by ARES (with AI assistance from Claude). Licensed under </w:t>
       </w:r>
-      <w:hyperlink w:history="1" r:id="rIdqrglgecuqm33upzfrazga">
+      <w:hyperlink w:history="1" r:id="rIdylw1witk8mwvxv27t111e">
         <w:r>
           <w:rPr>
             <w:rFonts w:ascii="Arial" w:cs="Arial" w:eastAsia="Arial" w:hAnsi="Arial"/>
@@ -8723,7 +8723,7 @@
         </w:rPr>
         <w:t xml:space="preserve"> (</w:t>
       </w:r>
-      <w:hyperlink w:history="1" r:id="rIdz4ictkgro99wwypcqkiaa">
+      <w:hyperlink w:history="1" r:id="rIdfpsdkasn91ftvollllpuo">
         <w:r>
           <w:rPr>
             <w:rFonts w:ascii="Arial" w:cs="Arial" w:eastAsia="Arial" w:hAnsi="Arial"/>
@@ -9763,7 +9763,7 @@
             <w:pPr>
               <w:spacing w:after="20" w:before="0"/>
             </w:pPr>
-            <w:hyperlink w:history="1" r:id="rIdiepx7x_ly-fscuz2fj0qz">
+            <w:hyperlink w:history="1" r:id="rIdjmlhxhwhkpmaf_i9sfqwa">
               <w:r>
                 <w:rPr>
                   <w:rFonts w:ascii="Arial" w:cs="Arial" w:eastAsia="Arial" w:hAnsi="Arial"/>
@@ -9796,7 +9796,7 @@
               <w:spacing w:after="10" w:before="0"/>
               <w:ind w:left="120"/>
             </w:pPr>
-            <w:hyperlink w:history="1" r:id="rIdn3cydfckp-yxjxthceklg">
+            <w:hyperlink w:history="1" r:id="rIdjefvobjmp8v2qzrba-xa-">
               <w:r>
                 <w:rPr>
                   <w:rFonts w:ascii="Arial" w:cs="Arial" w:eastAsia="Arial" w:hAnsi="Arial"/>
@@ -9841,7 +9841,7 @@
             <w:pPr>
               <w:spacing w:after="20" w:before="0"/>
             </w:pPr>
-            <w:hyperlink w:history="1" r:id="rIdgvlbka1fi9ngqmcscp_1c">
+            <w:hyperlink w:history="1" r:id="rId12my0nieiq5wpcj5zyfxg">
               <w:r>
                 <w:rPr>
                   <w:rFonts w:ascii="Arial" w:cs="Arial" w:eastAsia="Arial" w:hAnsi="Arial"/>
@@ -9874,7 +9874,7 @@
               <w:spacing w:after="10" w:before="0"/>
               <w:ind w:left="120"/>
             </w:pPr>
-            <w:hyperlink w:history="1" r:id="rIdwf4jddcyqcblijcct89dy">
+            <w:hyperlink w:history="1" r:id="rId8vyv_xbbvt9qzq9guapsc">
               <w:r>
                 <w:rPr>
                   <w:rFonts w:ascii="Arial" w:cs="Arial" w:eastAsia="Arial" w:hAnsi="Arial"/>
@@ -10074,7 +10074,7 @@
             <w:pPr>
               <w:spacing w:after="20" w:before="0"/>
             </w:pPr>
-            <w:hyperlink w:history="1" r:id="rIdllnyw6ey_glw-a0wce2xa">
+            <w:hyperlink w:history="1" r:id="rIdj8ma3m9qwuhxsgfxnadbf">
               <w:r>
                 <w:rPr>
                   <w:rFonts w:ascii="Arial" w:cs="Arial" w:eastAsia="Arial" w:hAnsi="Arial"/>
@@ -10107,7 +10107,7 @@
               <w:spacing w:after="10" w:before="0"/>
               <w:ind w:left="120"/>
             </w:pPr>
-            <w:hyperlink w:history="1" r:id="rIdb37puhxh5wnzbx-3s4kw1">
+            <w:hyperlink w:history="1" r:id="rIdvodzsovne-5svgqdw6jtz">
               <w:r>
                 <w:rPr>
                   <w:rFonts w:ascii="Arial" w:cs="Arial" w:eastAsia="Arial" w:hAnsi="Arial"/>
@@ -10152,7 +10152,7 @@
             <w:pPr>
               <w:spacing w:after="20" w:before="0"/>
             </w:pPr>
-            <w:hyperlink w:history="1" r:id="rIdfh6cbzgblhuw4b_fiex20">
+            <w:hyperlink w:history="1" r:id="rIdefn1cq5_tbiqdyzzfkrmw">
               <w:r>
                 <w:rPr>
                   <w:rFonts w:ascii="Arial" w:cs="Arial" w:eastAsia="Arial" w:hAnsi="Arial"/>
@@ -10185,7 +10185,7 @@
               <w:spacing w:after="10" w:before="0"/>
               <w:ind w:left="120"/>
             </w:pPr>
-            <w:hyperlink w:history="1" r:id="rIdu3wygfcgogtqb-l7ckaj_">
+            <w:hyperlink w:history="1" r:id="rIdl22p55_ebfppglr2pvb5i">
               <w:r>
                 <w:rPr>
                   <w:rFonts w:ascii="Arial" w:cs="Arial" w:eastAsia="Arial" w:hAnsi="Arial"/>
@@ -10385,7 +10385,7 @@
             <w:pPr>
               <w:spacing w:after="20" w:before="0"/>
             </w:pPr>
-            <w:hyperlink w:history="1" r:id="rIdln5bmgugthtnvxdrueifm">
+            <w:hyperlink w:history="1" r:id="rIdhhpoanvk4blj63mjsm_ub">
               <w:r>
                 <w:rPr>
                   <w:rFonts w:ascii="Arial" w:cs="Arial" w:eastAsia="Arial" w:hAnsi="Arial"/>
@@ -10434,7 +10434,7 @@
               <w:spacing w:after="10" w:before="0"/>
               <w:ind w:left="120"/>
             </w:pPr>
-            <w:hyperlink w:history="1" r:id="rIdvjqg0bam5nprzwl9nzxes">
+            <w:hyperlink w:history="1" r:id="rId6upln-pyvm-jtya--henv">
               <w:r>
                 <w:rPr>
                   <w:rFonts w:ascii="Arial" w:cs="Arial" w:eastAsia="Arial" w:hAnsi="Arial"/>
@@ -10479,7 +10479,7 @@
             <w:pPr>
               <w:spacing w:after="20" w:before="0"/>
             </w:pPr>
-            <w:hyperlink w:history="1" r:id="rIdz-xdtd7pd6q08y2kley1p">
+            <w:hyperlink w:history="1" r:id="rIdxb9kd1kn2slll9cwz8bpp">
               <w:r>
                 <w:rPr>
                   <w:rFonts w:ascii="Arial" w:cs="Arial" w:eastAsia="Arial" w:hAnsi="Arial"/>
@@ -10512,7 +10512,7 @@
               <w:spacing w:after="10" w:before="0"/>
               <w:ind w:left="120"/>
             </w:pPr>
-            <w:hyperlink w:history="1" r:id="rIdd_fzoq-a3wzfdbtmoftc8">
+            <w:hyperlink w:history="1" r:id="rIdclnt7afv-qe0fmq8dzzfo">
               <w:r>
                 <w:rPr>
                   <w:rFonts w:ascii="Arial" w:cs="Arial" w:eastAsia="Arial" w:hAnsi="Arial"/>
@@ -10712,7 +10712,7 @@
             <w:pPr>
               <w:spacing w:after="20" w:before="0"/>
             </w:pPr>
-            <w:hyperlink w:history="1" r:id="rIds_ck9od59g6yl7auiw_ms">
+            <w:hyperlink w:history="1" r:id="rIdbr8mtvvleduo4e00oek-a">
               <w:r>
                 <w:rPr>
                   <w:rFonts w:ascii="Arial" w:cs="Arial" w:eastAsia="Arial" w:hAnsi="Arial"/>
@@ -10761,7 +10761,7 @@
               <w:spacing w:after="10" w:before="0"/>
               <w:ind w:left="120"/>
             </w:pPr>
-            <w:hyperlink w:history="1" r:id="rId4xyo0kbnatf3abiab42ye">
+            <w:hyperlink w:history="1" r:id="rIdthsviyna6ksq9z_h5bget">
               <w:r>
                 <w:rPr>
                   <w:rFonts w:ascii="Arial" w:cs="Arial" w:eastAsia="Arial" w:hAnsi="Arial"/>
@@ -10806,7 +10806,7 @@
             <w:pPr>
               <w:spacing w:after="20" w:before="0"/>
             </w:pPr>
-            <w:hyperlink w:history="1" r:id="rIdrb8m0nujmh2bo-ksipfta">
+            <w:hyperlink w:history="1" r:id="rId1fwm8g-shokvcyu_bcv2q">
               <w:r>
                 <w:rPr>
                   <w:rFonts w:ascii="Arial" w:cs="Arial" w:eastAsia="Arial" w:hAnsi="Arial"/>
@@ -10839,7 +10839,7 @@
               <w:spacing w:after="10" w:before="0"/>
               <w:ind w:left="120"/>
             </w:pPr>
-            <w:hyperlink w:history="1" r:id="rId-rlfnagfkvl7k6faqctcd">
+            <w:hyperlink w:history="1" r:id="rIdkns1wofxfwizfzxsluque">
               <w:r>
                 <w:rPr>
                   <w:rFonts w:ascii="Arial" w:cs="Arial" w:eastAsia="Arial" w:hAnsi="Arial"/>
@@ -11039,7 +11039,7 @@
             <w:pPr>
               <w:spacing w:after="20" w:before="0"/>
             </w:pPr>
-            <w:hyperlink w:history="1" r:id="rIdpltjukgxa-rblxt6herr_">
+            <w:hyperlink w:history="1" r:id="rIde2gbobhneedmevtznc3kj">
               <w:r>
                 <w:rPr>
                   <w:rFonts w:ascii="Arial" w:cs="Arial" w:eastAsia="Arial" w:hAnsi="Arial"/>
@@ -11088,7 +11088,7 @@
               <w:spacing w:after="10" w:before="0"/>
               <w:ind w:left="120"/>
             </w:pPr>
-            <w:hyperlink w:history="1" r:id="rIdmn4zhbamzuvzwa9o6vkyp">
+            <w:hyperlink w:history="1" r:id="rIdrpryz_u-iuzp2oe3jhyjo">
               <w:r>
                 <w:rPr>
                   <w:rFonts w:ascii="Arial" w:cs="Arial" w:eastAsia="Arial" w:hAnsi="Arial"/>
@@ -11133,7 +11133,7 @@
             <w:pPr>
               <w:spacing w:after="20" w:before="0"/>
             </w:pPr>
-            <w:hyperlink w:history="1" r:id="rIdbyr9tnfu62dyveyg0zbtv">
+            <w:hyperlink w:history="1" r:id="rIdhyfrtmwxxyenfbkoz25tr">
               <w:r>
                 <w:rPr>
                   <w:rFonts w:ascii="Arial" w:cs="Arial" w:eastAsia="Arial" w:hAnsi="Arial"/>
@@ -11166,7 +11166,7 @@
               <w:spacing w:after="10" w:before="0"/>
               <w:ind w:left="120"/>
             </w:pPr>
-            <w:hyperlink w:history="1" r:id="rIdx92clabueuz5g0aqv5wgv">
+            <w:hyperlink w:history="1" r:id="rIdjkogrkuatqp4_xbam5wqf">
               <w:r>
                 <w:rPr>
                   <w:rFonts w:ascii="Arial" w:cs="Arial" w:eastAsia="Arial" w:hAnsi="Arial"/>
@@ -11691,7 +11691,7 @@
         </w:rPr>
         <w:t xml:space="preserve">© 2026 SeaVuria and ARES. Aligned with KICD objectives. Developed by SeaVuria; technical implementation by ARES (with AI assistance from Claude). Licensed under </w:t>
       </w:r>
-      <w:hyperlink w:history="1" r:id="rIdjhn6a9xj3aopxl_hkyleu">
+      <w:hyperlink w:history="1" r:id="rIdtdwckj83p8fbcltjztajs">
         <w:r>
           <w:rPr>
             <w:rFonts w:ascii="Arial" w:cs="Arial" w:eastAsia="Arial" w:hAnsi="Arial"/>
@@ -11712,7 +11712,7 @@
         </w:rPr>
         <w:t xml:space="preserve"> (</w:t>
       </w:r>
-      <w:hyperlink w:history="1" r:id="rIdgmkikaipb22bbkznvz-cn">
+      <w:hyperlink w:history="1" r:id="rIdprttdn50xywl-0k3goue_">
         <w:r>
           <w:rPr>
             <w:rFonts w:ascii="Arial" w:cs="Arial" w:eastAsia="Arial" w:hAnsi="Arial"/>
@@ -12752,7 +12752,7 @@
             <w:pPr>
               <w:spacing w:after="20" w:before="0"/>
             </w:pPr>
-            <w:hyperlink w:history="1" r:id="rIdn7pqjrmemhnykwmvcepvu">
+            <w:hyperlink w:history="1" r:id="rId9uworypzq--ld3yiib1g6">
               <w:r>
                 <w:rPr>
                   <w:rFonts w:ascii="Arial" w:cs="Arial" w:eastAsia="Arial" w:hAnsi="Arial"/>
@@ -12785,7 +12785,7 @@
               <w:spacing w:after="10" w:before="0"/>
               <w:ind w:left="120"/>
             </w:pPr>
-            <w:hyperlink w:history="1" r:id="rIdzkxqubljfukw2mnidfsgn">
+            <w:hyperlink w:history="1" r:id="rIduwd4sxsy4ta4fdhllqcds">
               <w:r>
                 <w:rPr>
                   <w:rFonts w:ascii="Arial" w:cs="Arial" w:eastAsia="Arial" w:hAnsi="Arial"/>
@@ -12830,7 +12830,7 @@
             <w:pPr>
               <w:spacing w:after="20" w:before="0"/>
             </w:pPr>
-            <w:hyperlink w:history="1" r:id="rIdehgad-lkbe0mdh3di7tvx">
+            <w:hyperlink w:history="1" r:id="rIdxrrrl2r9cznhamfnoowet">
               <w:r>
                 <w:rPr>
                   <w:rFonts w:ascii="Arial" w:cs="Arial" w:eastAsia="Arial" w:hAnsi="Arial"/>
@@ -12863,7 +12863,7 @@
               <w:spacing w:after="10" w:before="0"/>
               <w:ind w:left="120"/>
             </w:pPr>
-            <w:hyperlink w:history="1" r:id="rIdenw8nfgnhlm78pcivnmma">
+            <w:hyperlink w:history="1" r:id="rIdzbpw-wmvso8bumdrggiz9">
               <w:r>
                 <w:rPr>
                   <w:rFonts w:ascii="Arial" w:cs="Arial" w:eastAsia="Arial" w:hAnsi="Arial"/>
@@ -13063,7 +13063,7 @@
             <w:pPr>
               <w:spacing w:after="20" w:before="0"/>
             </w:pPr>
-            <w:hyperlink w:history="1" r:id="rIdoilhl3ri06mtvcw2yb8lb">
+            <w:hyperlink w:history="1" r:id="rIdkevv6dr2xfmknqyu80hoh">
               <w:r>
                 <w:rPr>
                   <w:rFonts w:ascii="Arial" w:cs="Arial" w:eastAsia="Arial" w:hAnsi="Arial"/>
@@ -13096,7 +13096,7 @@
               <w:spacing w:after="10" w:before="0"/>
               <w:ind w:left="120"/>
             </w:pPr>
-            <w:hyperlink w:history="1" r:id="rIdkrsyzm8-q015bgfagj8ts">
+            <w:hyperlink w:history="1" r:id="rIduigetwygeg2lixlow2otq">
               <w:r>
                 <w:rPr>
                   <w:rFonts w:ascii="Arial" w:cs="Arial" w:eastAsia="Arial" w:hAnsi="Arial"/>
@@ -13141,7 +13141,7 @@
             <w:pPr>
               <w:spacing w:after="20" w:before="0"/>
             </w:pPr>
-            <w:hyperlink w:history="1" r:id="rIdpvvuxlswopoc-kaisy_bc">
+            <w:hyperlink w:history="1" r:id="rIdmz3pgq2bulouz9yywkzes">
               <w:r>
                 <w:rPr>
                   <w:rFonts w:ascii="Arial" w:cs="Arial" w:eastAsia="Arial" w:hAnsi="Arial"/>
@@ -13174,7 +13174,7 @@
               <w:spacing w:after="10" w:before="0"/>
               <w:ind w:left="120"/>
             </w:pPr>
-            <w:hyperlink w:history="1" r:id="rIdsrb00tsjjpoqvuiz3ajde">
+            <w:hyperlink w:history="1" r:id="rIdqd2eahfyoh8irkqqsgmmu">
               <w:r>
                 <w:rPr>
                   <w:rFonts w:ascii="Arial" w:cs="Arial" w:eastAsia="Arial" w:hAnsi="Arial"/>
@@ -13374,7 +13374,7 @@
             <w:pPr>
               <w:spacing w:after="20" w:before="0"/>
             </w:pPr>
-            <w:hyperlink w:history="1" r:id="rId2tdjsk68ppdcl8vx9e5rg">
+            <w:hyperlink w:history="1" r:id="rIdkaawqka6l-v-erggzjrcv">
               <w:r>
                 <w:rPr>
                   <w:rFonts w:ascii="Arial" w:cs="Arial" w:eastAsia="Arial" w:hAnsi="Arial"/>
@@ -13407,7 +13407,7 @@
               <w:spacing w:after="10" w:before="0"/>
               <w:ind w:left="120"/>
             </w:pPr>
-            <w:hyperlink w:history="1" r:id="rIdo_85ucunsalkcqkdt2qkn">
+            <w:hyperlink w:history="1" r:id="rIda4qn6wqdhd6biugx5f9wr">
               <w:r>
                 <w:rPr>
                   <w:rFonts w:ascii="Arial" w:cs="Arial" w:eastAsia="Arial" w:hAnsi="Arial"/>
@@ -13452,7 +13452,7 @@
             <w:pPr>
               <w:spacing w:after="20" w:before="0"/>
             </w:pPr>
-            <w:hyperlink w:history="1" r:id="rIdaicdpbrme57brfd313lre">
+            <w:hyperlink w:history="1" r:id="rIdk14gqqj-bfgz1kirigjrz">
               <w:r>
                 <w:rPr>
                   <w:rFonts w:ascii="Arial" w:cs="Arial" w:eastAsia="Arial" w:hAnsi="Arial"/>
@@ -13485,7 +13485,7 @@
               <w:spacing w:after="10" w:before="0"/>
               <w:ind w:left="120"/>
             </w:pPr>
-            <w:hyperlink w:history="1" r:id="rIdmnlwiqqkxkiabcbyrzvah">
+            <w:hyperlink w:history="1" r:id="rIdlssisxvugqm5dgymfftcz">
               <w:r>
                 <w:rPr>
                   <w:rFonts w:ascii="Arial" w:cs="Arial" w:eastAsia="Arial" w:hAnsi="Arial"/>
@@ -14085,7 +14085,7 @@
             <w:pPr>
               <w:spacing w:after="20" w:before="0"/>
             </w:pPr>
-            <w:hyperlink w:history="1" r:id="rIdaszbynrzun-tcds8vw5__">
+            <w:hyperlink w:history="1" r:id="rIdmrfqh85xgnm-qzrw47thf">
               <w:r>
                 <w:rPr>
                   <w:rFonts w:ascii="Arial" w:cs="Arial" w:eastAsia="Arial" w:hAnsi="Arial"/>
@@ -14118,7 +14118,7 @@
               <w:spacing w:after="10" w:before="0"/>
               <w:ind w:left="120"/>
             </w:pPr>
-            <w:hyperlink w:history="1" r:id="rIdubpxiagq9ap-xaft1rl8p">
+            <w:hyperlink w:history="1" r:id="rIdlvb9ouc5mrvzclbblahsa">
               <w:r>
                 <w:rPr>
                   <w:rFonts w:ascii="Arial" w:cs="Arial" w:eastAsia="Arial" w:hAnsi="Arial"/>
@@ -14163,7 +14163,7 @@
             <w:pPr>
               <w:spacing w:after="20" w:before="0"/>
             </w:pPr>
-            <w:hyperlink w:history="1" r:id="rIdkl_uyzkre9xbpq4vq2jh2">
+            <w:hyperlink w:history="1" r:id="rIdvwuzrg8fntlldkkfvpr7n">
               <w:r>
                 <w:rPr>
                   <w:rFonts w:ascii="Arial" w:cs="Arial" w:eastAsia="Arial" w:hAnsi="Arial"/>
@@ -14196,7 +14196,7 @@
               <w:spacing w:after="10" w:before="0"/>
               <w:ind w:left="120"/>
             </w:pPr>
-            <w:hyperlink w:history="1" r:id="rIdyg5xc11rnbjkvnfaulink">
+            <w:hyperlink w:history="1" r:id="rIdvhy92yxyuxq5do353vpju">
               <w:r>
                 <w:rPr>
                   <w:rFonts w:ascii="Arial" w:cs="Arial" w:eastAsia="Arial" w:hAnsi="Arial"/>
@@ -14396,7 +14396,7 @@
             <w:pPr>
               <w:spacing w:after="20" w:before="0"/>
             </w:pPr>
-            <w:hyperlink w:history="1" r:id="rIddzisaic4gy7cqz5kdybcu">
+            <w:hyperlink w:history="1" r:id="rIdfqilbgykfli6i5m5glp19">
               <w:r>
                 <w:rPr>
                   <w:rFonts w:ascii="Arial" w:cs="Arial" w:eastAsia="Arial" w:hAnsi="Arial"/>
@@ -14429,7 +14429,7 @@
               <w:spacing w:after="10" w:before="0"/>
               <w:ind w:left="120"/>
             </w:pPr>
-            <w:hyperlink w:history="1" r:id="rIdvlqm5jk5vff5kpt2xxeqf">
+            <w:hyperlink w:history="1" r:id="rIdmzk-jzhmnxht8wu6ztkrf">
               <w:r>
                 <w:rPr>
                   <w:rFonts w:ascii="Arial" w:cs="Arial" w:eastAsia="Arial" w:hAnsi="Arial"/>
@@ -14474,7 +14474,7 @@
             <w:pPr>
               <w:spacing w:after="20" w:before="0"/>
             </w:pPr>
-            <w:hyperlink w:history="1" r:id="rIdy_objnmku7ajh2xdeiyw0">
+            <w:hyperlink w:history="1" r:id="rIdpa6-gpxvtbwzxl8qfqsb1">
               <w:r>
                 <w:rPr>
                   <w:rFonts w:ascii="Arial" w:cs="Arial" w:eastAsia="Arial" w:hAnsi="Arial"/>
@@ -14507,7 +14507,7 @@
               <w:spacing w:after="10" w:before="0"/>
               <w:ind w:left="120"/>
             </w:pPr>
-            <w:hyperlink w:history="1" r:id="rId5khhmlsloqw54-lir93du">
+            <w:hyperlink w:history="1" r:id="rIdtio46wqk7dyra50miqk5_">
               <w:r>
                 <w:rPr>
                   <w:rFonts w:ascii="Arial" w:cs="Arial" w:eastAsia="Arial" w:hAnsi="Arial"/>
@@ -15032,7 +15032,7 @@
         </w:rPr>
         <w:t xml:space="preserve">© 2026 SeaVuria and ARES. Aligned with KICD objectives. Developed by SeaVuria; technical implementation by ARES (with AI assistance from Claude). Licensed under </w:t>
       </w:r>
-      <w:hyperlink w:history="1" r:id="rIdqzj4oumhzsl8mdwc5_bla">
+      <w:hyperlink w:history="1" r:id="rId3ooi3zun3kk3_-i25p2hk">
         <w:r>
           <w:rPr>
             <w:rFonts w:ascii="Arial" w:cs="Arial" w:eastAsia="Arial" w:hAnsi="Arial"/>
@@ -15053,7 +15053,7 @@
         </w:rPr>
         <w:t xml:space="preserve"> (</w:t>
       </w:r>
-      <w:hyperlink w:history="1" r:id="rId1dxodzp1qhqgl8t2tmpnx">
+      <w:hyperlink w:history="1" r:id="rIdoot-zluphgdnkxxgmvrjo">
         <w:r>
           <w:rPr>
             <w:rFonts w:ascii="Arial" w:cs="Arial" w:eastAsia="Arial" w:hAnsi="Arial"/>
@@ -16093,7 +16093,7 @@
             <w:pPr>
               <w:spacing w:after="20" w:before="0"/>
             </w:pPr>
-            <w:hyperlink w:history="1" r:id="rIdypzm8tpqmaq4io530z9al">
+            <w:hyperlink w:history="1" r:id="rIdkbm1usxwwojiyxx9k-3q1">
               <w:r>
                 <w:rPr>
                   <w:rFonts w:ascii="Arial" w:cs="Arial" w:eastAsia="Arial" w:hAnsi="Arial"/>
@@ -16126,7 +16126,7 @@
               <w:spacing w:after="10" w:before="0"/>
               <w:ind w:left="120"/>
             </w:pPr>
-            <w:hyperlink w:history="1" r:id="rIdk4kqvbj-hxnfzpownv_db">
+            <w:hyperlink w:history="1" r:id="rIdjwdkyg9ubdwdrewpvc4r7">
               <w:r>
                 <w:rPr>
                   <w:rFonts w:ascii="Arial" w:cs="Arial" w:eastAsia="Arial" w:hAnsi="Arial"/>
@@ -16171,7 +16171,7 @@
             <w:pPr>
               <w:spacing w:after="20" w:before="0"/>
             </w:pPr>
-            <w:hyperlink w:history="1" r:id="rIdseecz2nqlidq2zpgyhxbc">
+            <w:hyperlink w:history="1" r:id="rIdlson3avuxrcnlvoptyvss">
               <w:r>
                 <w:rPr>
                   <w:rFonts w:ascii="Arial" w:cs="Arial" w:eastAsia="Arial" w:hAnsi="Arial"/>
@@ -16204,7 +16204,7 @@
               <w:spacing w:after="10" w:before="0"/>
               <w:ind w:left="120"/>
             </w:pPr>
-            <w:hyperlink w:history="1" r:id="rIdrwzfoqxzbivpkjpui_vv5">
+            <w:hyperlink w:history="1" r:id="rIddht7kibfo2avuwcbvhjhf">
               <w:r>
                 <w:rPr>
                   <w:rFonts w:ascii="Arial" w:cs="Arial" w:eastAsia="Arial" w:hAnsi="Arial"/>
@@ -16404,7 +16404,7 @@
             <w:pPr>
               <w:spacing w:after="20" w:before="0"/>
             </w:pPr>
-            <w:hyperlink w:history="1" r:id="rId28etpdotwn3rskanlmqrh">
+            <w:hyperlink w:history="1" r:id="rIdkbaett90_r4usqqdlfzkh">
               <w:r>
                 <w:rPr>
                   <w:rFonts w:ascii="Arial" w:cs="Arial" w:eastAsia="Arial" w:hAnsi="Arial"/>
@@ -16437,7 +16437,7 @@
               <w:spacing w:after="10" w:before="0"/>
               <w:ind w:left="120"/>
             </w:pPr>
-            <w:hyperlink w:history="1" r:id="rId9dzgbsarzwi4vhfc4fzuc">
+            <w:hyperlink w:history="1" r:id="rIds8un6b7evw6le-053dr_d">
               <w:r>
                 <w:rPr>
                   <w:rFonts w:ascii="Arial" w:cs="Arial" w:eastAsia="Arial" w:hAnsi="Arial"/>
@@ -16482,7 +16482,7 @@
             <w:pPr>
               <w:spacing w:after="20" w:before="0"/>
             </w:pPr>
-            <w:hyperlink w:history="1" r:id="rIdqnl9b0qbrmchjw9noa5xc">
+            <w:hyperlink w:history="1" r:id="rIddtsfixxzxktq-fivlsf4e">
               <w:r>
                 <w:rPr>
                   <w:rFonts w:ascii="Arial" w:cs="Arial" w:eastAsia="Arial" w:hAnsi="Arial"/>
@@ -16515,7 +16515,7 @@
               <w:spacing w:after="10" w:before="0"/>
               <w:ind w:left="120"/>
             </w:pPr>
-            <w:hyperlink w:history="1" r:id="rIdjbslknroxuuffghn6kpsv">
+            <w:hyperlink w:history="1" r:id="rIdhk-g3jbwru2mjt-72cjs4">
               <w:r>
                 <w:rPr>
                   <w:rFonts w:ascii="Arial" w:cs="Arial" w:eastAsia="Arial" w:hAnsi="Arial"/>
@@ -16715,7 +16715,7 @@
             <w:pPr>
               <w:spacing w:after="20" w:before="0"/>
             </w:pPr>
-            <w:hyperlink w:history="1" r:id="rId1ykqjegu5mhe4um6jmgbz">
+            <w:hyperlink w:history="1" r:id="rId1s2acrkncctlz4c_2yogv">
               <w:r>
                 <w:rPr>
                   <w:rFonts w:ascii="Arial" w:cs="Arial" w:eastAsia="Arial" w:hAnsi="Arial"/>
@@ -16748,7 +16748,7 @@
               <w:spacing w:after="10" w:before="0"/>
               <w:ind w:left="120"/>
             </w:pPr>
-            <w:hyperlink w:history="1" r:id="rIdfzd5_wsnwchdfhiwowlx6">
+            <w:hyperlink w:history="1" r:id="rIdpjmqmhba-e2k8gf0trabf">
               <w:r>
                 <w:rPr>
                   <w:rFonts w:ascii="Arial" w:cs="Arial" w:eastAsia="Arial" w:hAnsi="Arial"/>
@@ -16793,7 +16793,7 @@
             <w:pPr>
               <w:spacing w:after="20" w:before="0"/>
             </w:pPr>
-            <w:hyperlink w:history="1" r:id="rIdrp9n7rrrmoo7exiqmvvod">
+            <w:hyperlink w:history="1" r:id="rId0nwqk6yb2e2_qtzc8qsmo">
               <w:r>
                 <w:rPr>
                   <w:rFonts w:ascii="Arial" w:cs="Arial" w:eastAsia="Arial" w:hAnsi="Arial"/>
@@ -16842,7 +16842,7 @@
               <w:spacing w:after="10" w:before="0"/>
               <w:ind w:left="120"/>
             </w:pPr>
-            <w:hyperlink w:history="1" r:id="rIdex8jlkvu6lh7k5z1dihod">
+            <w:hyperlink w:history="1" r:id="rId5uofvhvkckjfpmduppawf">
               <w:r>
                 <w:rPr>
                   <w:rFonts w:ascii="Arial" w:cs="Arial" w:eastAsia="Arial" w:hAnsi="Arial"/>
@@ -17042,7 +17042,7 @@
             <w:pPr>
               <w:spacing w:after="20" w:before="0"/>
             </w:pPr>
-            <w:hyperlink w:history="1" r:id="rIdoglpxmpe_mgfet7rsxgut">
+            <w:hyperlink w:history="1" r:id="rIdf6njhjxl7cn5_tycq_rsb">
               <w:r>
                 <w:rPr>
                   <w:rFonts w:ascii="Arial" w:cs="Arial" w:eastAsia="Arial" w:hAnsi="Arial"/>
@@ -17075,7 +17075,7 @@
               <w:spacing w:after="10" w:before="0"/>
               <w:ind w:left="120"/>
             </w:pPr>
-            <w:hyperlink w:history="1" r:id="rId3ytgyrpwpgvfobkjvknpr">
+            <w:hyperlink w:history="1" r:id="rIdlxx2q7hijikeppq52k8ma">
               <w:r>
                 <w:rPr>
                   <w:rFonts w:ascii="Arial" w:cs="Arial" w:eastAsia="Arial" w:hAnsi="Arial"/>
@@ -17120,7 +17120,7 @@
             <w:pPr>
               <w:spacing w:after="20" w:before="0"/>
             </w:pPr>
-            <w:hyperlink w:history="1" r:id="rIdnsnwvoptp8iqfw1k9jge1">
+            <w:hyperlink w:history="1" r:id="rIdkjfk34e2kaddrbuxptr0y">
               <w:r>
                 <w:rPr>
                   <w:rFonts w:ascii="Arial" w:cs="Arial" w:eastAsia="Arial" w:hAnsi="Arial"/>
@@ -17169,7 +17169,7 @@
               <w:spacing w:after="10" w:before="0"/>
               <w:ind w:left="120"/>
             </w:pPr>
-            <w:hyperlink w:history="1" r:id="rIdkhqwkoop4wc8ucpmkoll3">
+            <w:hyperlink w:history="1" r:id="rIdl8znlgy_dtkls_avkeqx9">
               <w:r>
                 <w:rPr>
                   <w:rFonts w:ascii="Arial" w:cs="Arial" w:eastAsia="Arial" w:hAnsi="Arial"/>
@@ -17369,7 +17369,7 @@
             <w:pPr>
               <w:spacing w:after="20" w:before="0"/>
             </w:pPr>
-            <w:hyperlink w:history="1" r:id="rIdns5cn6nmbxp0ypfkpvedn">
+            <w:hyperlink w:history="1" r:id="rIdol_bcn8ewedrm81ralrse">
               <w:r>
                 <w:rPr>
                   <w:rFonts w:ascii="Arial" w:cs="Arial" w:eastAsia="Arial" w:hAnsi="Arial"/>
@@ -17418,7 +17418,7 @@
               <w:spacing w:after="10" w:before="0"/>
               <w:ind w:left="120"/>
             </w:pPr>
-            <w:hyperlink w:history="1" r:id="rId27gk1w78uy8ahjtdeacm_">
+            <w:hyperlink w:history="1" r:id="rId6g4slrm54pubxqdfroheb">
               <w:r>
                 <w:rPr>
                   <w:rFonts w:ascii="Arial" w:cs="Arial" w:eastAsia="Arial" w:hAnsi="Arial"/>
@@ -17463,7 +17463,7 @@
             <w:pPr>
               <w:spacing w:after="20" w:before="0"/>
             </w:pPr>
-            <w:hyperlink w:history="1" r:id="rId77lrkaa8wrg1fl2ewyarj">
+            <w:hyperlink w:history="1" r:id="rIde9uqb4t2iyqvkelvkzzs3">
               <w:r>
                 <w:rPr>
                   <w:rFonts w:ascii="Arial" w:cs="Arial" w:eastAsia="Arial" w:hAnsi="Arial"/>
@@ -17512,7 +17512,7 @@
               <w:spacing w:after="10" w:before="0"/>
               <w:ind w:left="120"/>
             </w:pPr>
-            <w:hyperlink w:history="1" r:id="rIdyuq3vxucyrlnqshrbas7x">
+            <w:hyperlink w:history="1" r:id="rIdatfodyooixh17frcamjoi">
               <w:r>
                 <w:rPr>
                   <w:rFonts w:ascii="Arial" w:cs="Arial" w:eastAsia="Arial" w:hAnsi="Arial"/>
@@ -18037,7 +18037,7 @@
         </w:rPr>
         <w:t xml:space="preserve">© 2026 SeaVuria and ARES. Aligned with KICD objectives. Developed by SeaVuria; technical implementation by ARES (with AI assistance from Claude). Licensed under </w:t>
       </w:r>
-      <w:hyperlink w:history="1" r:id="rIddz3iiaqurjfl3cfz6oxot">
+      <w:hyperlink w:history="1" r:id="rIdunnedfurhi362nciqvt5a">
         <w:r>
           <w:rPr>
             <w:rFonts w:ascii="Arial" w:cs="Arial" w:eastAsia="Arial" w:hAnsi="Arial"/>
@@ -18058,7 +18058,7 @@
         </w:rPr>
         <w:t xml:space="preserve"> (</w:t>
       </w:r>
-      <w:hyperlink w:history="1" r:id="rIdnswohutajtf-4lk-gecwi">
+      <w:hyperlink w:history="1" r:id="rIdtzxkizsahnzunt9hprpo2">
         <w:r>
           <w:rPr>
             <w:rFonts w:ascii="Arial" w:cs="Arial" w:eastAsia="Arial" w:hAnsi="Arial"/>
@@ -19098,7 +19098,7 @@
             <w:pPr>
               <w:spacing w:after="20" w:before="0"/>
             </w:pPr>
-            <w:hyperlink w:history="1" r:id="rId3wmgdowakewlewz76dwts">
+            <w:hyperlink w:history="1" r:id="rIdkfsta8b2kcmno8ho-8abr">
               <w:r>
                 <w:rPr>
                   <w:rFonts w:ascii="Arial" w:cs="Arial" w:eastAsia="Arial" w:hAnsi="Arial"/>
@@ -19147,7 +19147,7 @@
               <w:spacing w:after="10" w:before="0"/>
               <w:ind w:left="120"/>
             </w:pPr>
-            <w:hyperlink w:history="1" r:id="rIdcrv0s90kashquhmd9mscw">
+            <w:hyperlink w:history="1" r:id="rIduygj_mhdjv0_4cu5gvtga">
               <w:r>
                 <w:rPr>
                   <w:rFonts w:ascii="Arial" w:cs="Arial" w:eastAsia="Arial" w:hAnsi="Arial"/>
@@ -19192,7 +19192,7 @@
             <w:pPr>
               <w:spacing w:after="20" w:before="0"/>
             </w:pPr>
-            <w:hyperlink w:history="1" r:id="rIdwr0dndtnpb9axarjnynk1">
+            <w:hyperlink w:history="1" r:id="rIduy6edjwnjohfsukcao6mq">
               <w:r>
                 <w:rPr>
                   <w:rFonts w:ascii="Arial" w:cs="Arial" w:eastAsia="Arial" w:hAnsi="Arial"/>
@@ -19225,7 +19225,7 @@
               <w:spacing w:after="10" w:before="0"/>
               <w:ind w:left="120"/>
             </w:pPr>
-            <w:hyperlink w:history="1" r:id="rIdglohdamfwkd9huildry2l">
+            <w:hyperlink w:history="1" r:id="rIdudser_ylhybojjsprcrap">
               <w:r>
                 <w:rPr>
                   <w:rFonts w:ascii="Arial" w:cs="Arial" w:eastAsia="Arial" w:hAnsi="Arial"/>
@@ -19425,7 +19425,7 @@
             <w:pPr>
               <w:spacing w:after="20" w:before="0"/>
             </w:pPr>
-            <w:hyperlink w:history="1" r:id="rId6s_hx_yqmaa8kxxj2v3c5">
+            <w:hyperlink w:history="1" r:id="rIdbhja0054bwopfoflnmtm7">
               <w:r>
                 <w:rPr>
                   <w:rFonts w:ascii="Arial" w:cs="Arial" w:eastAsia="Arial" w:hAnsi="Arial"/>
@@ -19474,7 +19474,7 @@
               <w:spacing w:after="10" w:before="0"/>
               <w:ind w:left="120"/>
             </w:pPr>
-            <w:hyperlink w:history="1" r:id="rIdkarfgsn_cnbjoaaev1oov">
+            <w:hyperlink w:history="1" r:id="rIdc_rt2n5qybjek45czioll">
               <w:r>
                 <w:rPr>
                   <w:rFonts w:ascii="Arial" w:cs="Arial" w:eastAsia="Arial" w:hAnsi="Arial"/>
@@ -19519,7 +19519,7 @@
             <w:pPr>
               <w:spacing w:after="20" w:before="0"/>
             </w:pPr>
-            <w:hyperlink w:history="1" r:id="rIdbvyyjcuaqbncjfz9my24n">
+            <w:hyperlink w:history="1" r:id="rIdqf2vmgdjxstew_b-l6lsy">
               <w:r>
                 <w:rPr>
                   <w:rFonts w:ascii="Arial" w:cs="Arial" w:eastAsia="Arial" w:hAnsi="Arial"/>
@@ -19552,7 +19552,7 @@
               <w:spacing w:after="10" w:before="0"/>
               <w:ind w:left="120"/>
             </w:pPr>
-            <w:hyperlink w:history="1" r:id="rIdofyddixmlyu28eir3ejet">
+            <w:hyperlink w:history="1" r:id="rIduknrlza8arnzkz2xgmnfw">
               <w:r>
                 <w:rPr>
                   <w:rFonts w:ascii="Arial" w:cs="Arial" w:eastAsia="Arial" w:hAnsi="Arial"/>
@@ -19752,7 +19752,7 @@
             <w:pPr>
               <w:spacing w:after="20" w:before="0"/>
             </w:pPr>
-            <w:hyperlink w:history="1" r:id="rIdskxuze3449ay0imewhnxn">
+            <w:hyperlink w:history="1" r:id="rIdvts5ci-defsotdtmrweoy">
               <w:r>
                 <w:rPr>
                   <w:rFonts w:ascii="Arial" w:cs="Arial" w:eastAsia="Arial" w:hAnsi="Arial"/>
@@ -19801,7 +19801,7 @@
               <w:spacing w:after="10" w:before="0"/>
               <w:ind w:left="120"/>
             </w:pPr>
-            <w:hyperlink w:history="1" r:id="rIddm8-hqkoil44xoptvm5qg">
+            <w:hyperlink w:history="1" r:id="rIdymu_mmxxb_q2gsygbddvl">
               <w:r>
                 <w:rPr>
                   <w:rFonts w:ascii="Arial" w:cs="Arial" w:eastAsia="Arial" w:hAnsi="Arial"/>
@@ -19846,7 +19846,7 @@
             <w:pPr>
               <w:spacing w:after="20" w:before="0"/>
             </w:pPr>
-            <w:hyperlink w:history="1" r:id="rIdbbgprvkfsukdtehifq_tf">
+            <w:hyperlink w:history="1" r:id="rId7_pofasz_ttsuhgjusz5j">
               <w:r>
                 <w:rPr>
                   <w:rFonts w:ascii="Arial" w:cs="Arial" w:eastAsia="Arial" w:hAnsi="Arial"/>
@@ -19879,7 +19879,7 @@
               <w:spacing w:after="10" w:before="0"/>
               <w:ind w:left="120"/>
             </w:pPr>
-            <w:hyperlink w:history="1" r:id="rIdtbn35q4kord8bqm8or8tl">
+            <w:hyperlink w:history="1" r:id="rIdooczejvjhj46pr3trm-iu">
               <w:r>
                 <w:rPr>
                   <w:rFonts w:ascii="Arial" w:cs="Arial" w:eastAsia="Arial" w:hAnsi="Arial"/>
@@ -20079,7 +20079,7 @@
             <w:pPr>
               <w:spacing w:after="20" w:before="0"/>
             </w:pPr>
-            <w:hyperlink w:history="1" r:id="rIdlihvdjhlpgqb75md-us2i">
+            <w:hyperlink w:history="1" r:id="rIdwhi5jdnpumvfb5qrky6lh">
               <w:r>
                 <w:rPr>
                   <w:rFonts w:ascii="Arial" w:cs="Arial" w:eastAsia="Arial" w:hAnsi="Arial"/>
@@ -20128,7 +20128,7 @@
               <w:spacing w:after="10" w:before="0"/>
               <w:ind w:left="120"/>
             </w:pPr>
-            <w:hyperlink w:history="1" r:id="rIdinlohob0me56jjo8aazur">
+            <w:hyperlink w:history="1" r:id="rIdb440-pssf1mzw5cxns7r7">
               <w:r>
                 <w:rPr>
                   <w:rFonts w:ascii="Arial" w:cs="Arial" w:eastAsia="Arial" w:hAnsi="Arial"/>
@@ -20173,7 +20173,7 @@
             <w:pPr>
               <w:spacing w:after="20" w:before="0"/>
             </w:pPr>
-            <w:hyperlink w:history="1" r:id="rIdqfykvuvn1sf7ccf1v3aaw">
+            <w:hyperlink w:history="1" r:id="rIdqhcei1k7terobhgnaek5t">
               <w:r>
                 <w:rPr>
                   <w:rFonts w:ascii="Arial" w:cs="Arial" w:eastAsia="Arial" w:hAnsi="Arial"/>
@@ -20206,7 +20206,7 @@
               <w:spacing w:after="10" w:before="0"/>
               <w:ind w:left="120"/>
             </w:pPr>
-            <w:hyperlink w:history="1" r:id="rIdgklpkork_b5eeahglqgmu">
+            <w:hyperlink w:history="1" r:id="rId6wak5uoa2o4n21z7klwyr">
               <w:r>
                 <w:rPr>
                   <w:rFonts w:ascii="Arial" w:cs="Arial" w:eastAsia="Arial" w:hAnsi="Arial"/>
@@ -20406,7 +20406,7 @@
             <w:pPr>
               <w:spacing w:after="20" w:before="0"/>
             </w:pPr>
-            <w:hyperlink w:history="1" r:id="rIdpx7rnafgujqwmeilchrgp">
+            <w:hyperlink w:history="1" r:id="rIdkbz1cqxqg1tvktj9rwjw2">
               <w:r>
                 <w:rPr>
                   <w:rFonts w:ascii="Arial" w:cs="Arial" w:eastAsia="Arial" w:hAnsi="Arial"/>
@@ -20455,7 +20455,7 @@
               <w:spacing w:after="10" w:before="0"/>
               <w:ind w:left="120"/>
             </w:pPr>
-            <w:hyperlink w:history="1" r:id="rId7k5gx3bp1zo4zk9pa4zbf">
+            <w:hyperlink w:history="1" r:id="rIdb4vsfok-v3o0n_32ogpia">
               <w:r>
                 <w:rPr>
                   <w:rFonts w:ascii="Arial" w:cs="Arial" w:eastAsia="Arial" w:hAnsi="Arial"/>
@@ -20500,7 +20500,7 @@
             <w:pPr>
               <w:spacing w:after="20" w:before="0"/>
             </w:pPr>
-            <w:hyperlink w:history="1" r:id="rId2kqohvrir_wd0tddhqajr">
+            <w:hyperlink w:history="1" r:id="rIdjl3na31zgakijhqt_kack">
               <w:r>
                 <w:rPr>
                   <w:rFonts w:ascii="Arial" w:cs="Arial" w:eastAsia="Arial" w:hAnsi="Arial"/>
@@ -20533,7 +20533,7 @@
               <w:spacing w:after="10" w:before="0"/>
               <w:ind w:left="120"/>
             </w:pPr>
-            <w:hyperlink w:history="1" r:id="rIdxr9r7e25vck51oyhs_ejb">
+            <w:hyperlink w:history="1" r:id="rIdxo7naczuu-pwpknvo5fbq">
               <w:r>
                 <w:rPr>
                   <w:rFonts w:ascii="Arial" w:cs="Arial" w:eastAsia="Arial" w:hAnsi="Arial"/>
@@ -21158,7 +21158,7 @@
         </w:rPr>
         <w:t xml:space="preserve">© 2026 SeaVuria and ARES. Aligned with KICD objectives. Developed by SeaVuria; technical implementation by ARES (with AI assistance from Claude). Licensed under </w:t>
       </w:r>
-      <w:hyperlink w:history="1" r:id="rIdiky0o2myn-m6lhwid3zno">
+      <w:hyperlink w:history="1" r:id="rIdju50ulj9isomdr3brzn4p">
         <w:r>
           <w:rPr>
             <w:rFonts w:ascii="Arial" w:cs="Arial" w:eastAsia="Arial" w:hAnsi="Arial"/>
@@ -21179,7 +21179,7 @@
         </w:rPr>
         <w:t xml:space="preserve"> (</w:t>
       </w:r>
-      <w:hyperlink w:history="1" r:id="rIdnobyeuemc3nhwbebh9mkl">
+      <w:hyperlink w:history="1" r:id="rIdloh2ihds7rloklelrcjny">
         <w:r>
           <w:rPr>
             <w:rFonts w:ascii="Arial" w:cs="Arial" w:eastAsia="Arial" w:hAnsi="Arial"/>
@@ -22219,7 +22219,7 @@
             <w:pPr>
               <w:spacing w:after="20" w:before="0"/>
             </w:pPr>
-            <w:hyperlink w:history="1" r:id="rIdseo_ccalb8ijtcu2xwbaa">
+            <w:hyperlink w:history="1" r:id="rIdabvflkykvbgajmvy2-r-_">
               <w:r>
                 <w:rPr>
                   <w:rFonts w:ascii="Arial" w:cs="Arial" w:eastAsia="Arial" w:hAnsi="Arial"/>
@@ -22252,7 +22252,7 @@
               <w:spacing w:after="10" w:before="0"/>
               <w:ind w:left="120"/>
             </w:pPr>
-            <w:hyperlink w:history="1" r:id="rId1gyhxdezkjbrpacn-7o4v">
+            <w:hyperlink w:history="1" r:id="rIdcgmwg-4zntgslmx1bco0w">
               <w:r>
                 <w:rPr>
                   <w:rFonts w:ascii="Arial" w:cs="Arial" w:eastAsia="Arial" w:hAnsi="Arial"/>
@@ -22297,7 +22297,7 @@
             <w:pPr>
               <w:spacing w:after="20" w:before="0"/>
             </w:pPr>
-            <w:hyperlink w:history="1" r:id="rIdxlb1t6zupe98wmxufxdkd">
+            <w:hyperlink w:history="1" r:id="rIddy1b4lrx-soefiqsm-qfs">
               <w:r>
                 <w:rPr>
                   <w:rFonts w:ascii="Arial" w:cs="Arial" w:eastAsia="Arial" w:hAnsi="Arial"/>
@@ -22330,7 +22330,7 @@
               <w:spacing w:after="10" w:before="0"/>
               <w:ind w:left="120"/>
             </w:pPr>
-            <w:hyperlink w:history="1" r:id="rId2dgfc0hh471dmfg6samta">
+            <w:hyperlink w:history="1" r:id="rIdk7phif_zclvtzok4rtxx7">
               <w:r>
                 <w:rPr>
                   <w:rFonts w:ascii="Arial" w:cs="Arial" w:eastAsia="Arial" w:hAnsi="Arial"/>
@@ -22530,7 +22530,7 @@
             <w:pPr>
               <w:spacing w:after="20" w:before="0"/>
             </w:pPr>
-            <w:hyperlink w:history="1" r:id="rIdo7m8tui_yz9mfgkk2orcp">
+            <w:hyperlink w:history="1" r:id="rIdwzy9wfldzdsnv7vfojqbj">
               <w:r>
                 <w:rPr>
                   <w:rFonts w:ascii="Arial" w:cs="Arial" w:eastAsia="Arial" w:hAnsi="Arial"/>
@@ -22563,7 +22563,7 @@
               <w:spacing w:after="10" w:before="0"/>
               <w:ind w:left="120"/>
             </w:pPr>
-            <w:hyperlink w:history="1" r:id="rId8kvrxuc7sogsdmnhby0gm">
+            <w:hyperlink w:history="1" r:id="rIdwzjkngomzestqf9qb9frw">
               <w:r>
                 <w:rPr>
                   <w:rFonts w:ascii="Arial" w:cs="Arial" w:eastAsia="Arial" w:hAnsi="Arial"/>
@@ -22608,7 +22608,7 @@
             <w:pPr>
               <w:spacing w:after="20" w:before="0"/>
             </w:pPr>
-            <w:hyperlink w:history="1" r:id="rIdlvudl_vsmrr-xepwlln0x">
+            <w:hyperlink w:history="1" r:id="rId9d9iz9m5yrbecfmqmdntm">
               <w:r>
                 <w:rPr>
                   <w:rFonts w:ascii="Arial" w:cs="Arial" w:eastAsia="Arial" w:hAnsi="Arial"/>
@@ -22641,7 +22641,7 @@
               <w:spacing w:after="10" w:before="0"/>
               <w:ind w:left="120"/>
             </w:pPr>
-            <w:hyperlink w:history="1" r:id="rIdudvrkuk-aq1ffkchszlg7">
+            <w:hyperlink w:history="1" r:id="rIdw3m2-hgnkwoopgrzyq9-e">
               <w:r>
                 <w:rPr>
                   <w:rFonts w:ascii="Arial" w:cs="Arial" w:eastAsia="Arial" w:hAnsi="Arial"/>
@@ -22841,7 +22841,7 @@
             <w:pPr>
               <w:spacing w:after="20" w:before="0"/>
             </w:pPr>
-            <w:hyperlink w:history="1" r:id="rIdg35lu48nz6jlihdo0ffuf">
+            <w:hyperlink w:history="1" r:id="rIdnopdvnzu3t6ik54tqml_5">
               <w:r>
                 <w:rPr>
                   <w:rFonts w:ascii="Arial" w:cs="Arial" w:eastAsia="Arial" w:hAnsi="Arial"/>
@@ -22890,7 +22890,7 @@
               <w:spacing w:after="10" w:before="0"/>
               <w:ind w:left="120"/>
             </w:pPr>
-            <w:hyperlink w:history="1" r:id="rId3mbtnoqbkjgr1l_gw51-u">
+            <w:hyperlink w:history="1" r:id="rIdaefamk7it5qmm3zauwuvj">
               <w:r>
                 <w:rPr>
                   <w:rFonts w:ascii="Arial" w:cs="Arial" w:eastAsia="Arial" w:hAnsi="Arial"/>
@@ -22935,7 +22935,7 @@
             <w:pPr>
               <w:spacing w:after="20" w:before="0"/>
             </w:pPr>
-            <w:hyperlink w:history="1" r:id="rIdhafaymzytdixksav5pald">
+            <w:hyperlink w:history="1" r:id="rIdkobop-vv1mbnjm1s4xgvd">
               <w:r>
                 <w:rPr>
                   <w:rFonts w:ascii="Arial" w:cs="Arial" w:eastAsia="Arial" w:hAnsi="Arial"/>
@@ -22984,7 +22984,7 @@
               <w:spacing w:after="10" w:before="0"/>
               <w:ind w:left="120"/>
             </w:pPr>
-            <w:hyperlink w:history="1" r:id="rIdkshcronoakbzmlriz9d0k">
+            <w:hyperlink w:history="1" r:id="rIdpgqdhoacxqa9d3gpfvuhy">
               <w:r>
                 <w:rPr>
                   <w:rFonts w:ascii="Arial" w:cs="Arial" w:eastAsia="Arial" w:hAnsi="Arial"/>
@@ -23184,7 +23184,7 @@
             <w:pPr>
               <w:spacing w:after="20" w:before="0"/>
             </w:pPr>
-            <w:hyperlink w:history="1" r:id="rIduhuhtur-uooi1elrbsbgo">
+            <w:hyperlink w:history="1" r:id="rId_7yl0vyafmntwulsccxoc">
               <w:r>
                 <w:rPr>
                   <w:rFonts w:ascii="Arial" w:cs="Arial" w:eastAsia="Arial" w:hAnsi="Arial"/>
@@ -23233,7 +23233,7 @@
               <w:spacing w:after="10" w:before="0"/>
               <w:ind w:left="120"/>
             </w:pPr>
-            <w:hyperlink w:history="1" r:id="rIdpvandpk-g2astefjkf_t2">
+            <w:hyperlink w:history="1" r:id="rIdup4-jcbz7exqjt05zpg0p">
               <w:r>
                 <w:rPr>
                   <w:rFonts w:ascii="Arial" w:cs="Arial" w:eastAsia="Arial" w:hAnsi="Arial"/>
@@ -23278,7 +23278,7 @@
             <w:pPr>
               <w:spacing w:after="20" w:before="0"/>
             </w:pPr>
-            <w:hyperlink w:history="1" r:id="rIdohh74kkxhw2rlegy_vane">
+            <w:hyperlink w:history="1" r:id="rIdvwfg2lyvrmgvxxt7lrpc7">
               <w:r>
                 <w:rPr>
                   <w:rFonts w:ascii="Arial" w:cs="Arial" w:eastAsia="Arial" w:hAnsi="Arial"/>
@@ -23327,7 +23327,7 @@
               <w:spacing w:after="10" w:before="0"/>
               <w:ind w:left="120"/>
             </w:pPr>
-            <w:hyperlink w:history="1" r:id="rId0jckffhckvfcq6x8mhky3">
+            <w:hyperlink w:history="1" r:id="rIdpjp7t6w2b4ps9bxtmqjhu">
               <w:r>
                 <w:rPr>
                   <w:rFonts w:ascii="Arial" w:cs="Arial" w:eastAsia="Arial" w:hAnsi="Arial"/>
@@ -23527,7 +23527,7 @@
             <w:pPr>
               <w:spacing w:after="20" w:before="0"/>
             </w:pPr>
-            <w:hyperlink w:history="1" r:id="rIdfwi2yywdn8mhtxmw0_cph">
+            <w:hyperlink w:history="1" r:id="rIdswazgahvfz7mu0sddl-dx">
               <w:r>
                 <w:rPr>
                   <w:rFonts w:ascii="Arial" w:cs="Arial" w:eastAsia="Arial" w:hAnsi="Arial"/>
@@ -23576,7 +23576,7 @@
               <w:spacing w:after="10" w:before="0"/>
               <w:ind w:left="120"/>
             </w:pPr>
-            <w:hyperlink w:history="1" r:id="rIdyw0ui-aaunnaitoy3y1rp">
+            <w:hyperlink w:history="1" r:id="rIdxkkbvy85ahzuozchrovzi">
               <w:r>
                 <w:rPr>
                   <w:rFonts w:ascii="Arial" w:cs="Arial" w:eastAsia="Arial" w:hAnsi="Arial"/>
@@ -23621,7 +23621,7 @@
             <w:pPr>
               <w:spacing w:after="20" w:before="0"/>
             </w:pPr>
-            <w:hyperlink w:history="1" r:id="rIdydrhucq8oqauihjcmc3fq">
+            <w:hyperlink w:history="1" r:id="rId1ig7kaohcbf692d8q4vin">
               <w:r>
                 <w:rPr>
                   <w:rFonts w:ascii="Arial" w:cs="Arial" w:eastAsia="Arial" w:hAnsi="Arial"/>
@@ -23670,7 +23670,7 @@
               <w:spacing w:after="10" w:before="0"/>
               <w:ind w:left="120"/>
             </w:pPr>
-            <w:hyperlink w:history="1" r:id="rId733sx7d5e7iwq432nyaov">
+            <w:hyperlink w:history="1" r:id="rIdd47tlsrbvuw2sf8opiyyy">
               <w:r>
                 <w:rPr>
                   <w:rFonts w:ascii="Arial" w:cs="Arial" w:eastAsia="Arial" w:hAnsi="Arial"/>
@@ -24315,7 +24315,7 @@
         </w:rPr>
         <w:t xml:space="preserve">© 2026 SeaVuria and ARES. Aligned with KICD objectives. Developed by SeaVuria; technical implementation by ARES (with AI assistance from Claude). Licensed under </w:t>
       </w:r>
-      <w:hyperlink w:history="1" r:id="rIdemyyphi3xx4bvdkdsizdz">
+      <w:hyperlink w:history="1" r:id="rId0ivjap9isrhdnlc1ti1ch">
         <w:r>
           <w:rPr>
             <w:rFonts w:ascii="Arial" w:cs="Arial" w:eastAsia="Arial" w:hAnsi="Arial"/>
@@ -24336,7 +24336,7 @@
         </w:rPr>
         <w:t xml:space="preserve"> (</w:t>
       </w:r>
-      <w:hyperlink w:history="1" r:id="rIdduskypdtqvw4tsqqtf_u6">
+      <w:hyperlink w:history="1" r:id="rId9aeyc8rwpqjmrv9qat0sy">
         <w:r>
           <w:rPr>
             <w:rFonts w:ascii="Arial" w:cs="Arial" w:eastAsia="Arial" w:hAnsi="Arial"/>
@@ -25376,7 +25376,7 @@
             <w:pPr>
               <w:spacing w:after="20" w:before="0"/>
             </w:pPr>
-            <w:hyperlink w:history="1" r:id="rIdk5siwahffamv3faewvp-v">
+            <w:hyperlink w:history="1" r:id="rId_gianbn7ckisdwf74znsv">
               <w:r>
                 <w:rPr>
                   <w:rFonts w:ascii="Arial" w:cs="Arial" w:eastAsia="Arial" w:hAnsi="Arial"/>
@@ -25409,7 +25409,7 @@
               <w:spacing w:after="10" w:before="0"/>
               <w:ind w:left="120"/>
             </w:pPr>
-            <w:hyperlink w:history="1" r:id="rIdulzekcbuktuvyfbvx4cyx">
+            <w:hyperlink w:history="1" r:id="rIdd_leg_hp3agxt6xdgfuqw">
               <w:r>
                 <w:rPr>
                   <w:rFonts w:ascii="Arial" w:cs="Arial" w:eastAsia="Arial" w:hAnsi="Arial"/>
@@ -25454,7 +25454,7 @@
             <w:pPr>
               <w:spacing w:after="20" w:before="0"/>
             </w:pPr>
-            <w:hyperlink w:history="1" r:id="rIdd5kegxpzfiyjpokjjelr6">
+            <w:hyperlink w:history="1" r:id="rIdbvtsuevcaez6y1crpxty3">
               <w:r>
                 <w:rPr>
                   <w:rFonts w:ascii="Arial" w:cs="Arial" w:eastAsia="Arial" w:hAnsi="Arial"/>
@@ -25487,7 +25487,7 @@
               <w:spacing w:after="10" w:before="0"/>
               <w:ind w:left="120"/>
             </w:pPr>
-            <w:hyperlink w:history="1" r:id="rId0ipzzjeexzepi2kfij7wu">
+            <w:hyperlink w:history="1" r:id="rIdtw8vcsvqaixax1bj8f999">
               <w:r>
                 <w:rPr>
                   <w:rFonts w:ascii="Arial" w:cs="Arial" w:eastAsia="Arial" w:hAnsi="Arial"/>
@@ -25687,7 +25687,7 @@
             <w:pPr>
               <w:spacing w:after="20" w:before="0"/>
             </w:pPr>
-            <w:hyperlink w:history="1" r:id="rIdcg6h7vzvyidp2hbeecvt-">
+            <w:hyperlink w:history="1" r:id="rIddc6iyv-k5fm7bv06mo_7x">
               <w:r>
                 <w:rPr>
                   <w:rFonts w:ascii="Arial" w:cs="Arial" w:eastAsia="Arial" w:hAnsi="Arial"/>
@@ -25720,7 +25720,7 @@
               <w:spacing w:after="10" w:before="0"/>
               <w:ind w:left="120"/>
             </w:pPr>
-            <w:hyperlink w:history="1" r:id="rIdujd6kdbsyu__uqn6zirdf">
+            <w:hyperlink w:history="1" r:id="rIdjweh8lnnbu-4ga6rkummw">
               <w:r>
                 <w:rPr>
                   <w:rFonts w:ascii="Arial" w:cs="Arial" w:eastAsia="Arial" w:hAnsi="Arial"/>
@@ -25765,7 +25765,7 @@
             <w:pPr>
               <w:spacing w:after="20" w:before="0"/>
             </w:pPr>
-            <w:hyperlink w:history="1" r:id="rIdf7r2wllgpyfrqr6grstre">
+            <w:hyperlink w:history="1" r:id="rIdg8kwe_e6fkrftgmwjbq0c">
               <w:r>
                 <w:rPr>
                   <w:rFonts w:ascii="Arial" w:cs="Arial" w:eastAsia="Arial" w:hAnsi="Arial"/>
@@ -25798,7 +25798,7 @@
               <w:spacing w:after="10" w:before="0"/>
               <w:ind w:left="120"/>
             </w:pPr>
-            <w:hyperlink w:history="1" r:id="rIdzjqfrktff4cfnz9ysmure">
+            <w:hyperlink w:history="1" r:id="rId3_fflk2gdxqus2rky7hqb">
               <w:r>
                 <w:rPr>
                   <w:rFonts w:ascii="Arial" w:cs="Arial" w:eastAsia="Arial" w:hAnsi="Arial"/>
@@ -25998,7 +25998,7 @@
             <w:pPr>
               <w:spacing w:after="20" w:before="0"/>
             </w:pPr>
-            <w:hyperlink w:history="1" r:id="rIdsvimme0j8wv2n4zt7xooa">
+            <w:hyperlink w:history="1" r:id="rIdeu_pxozr9dwgweeltlycy">
               <w:r>
                 <w:rPr>
                   <w:rFonts w:ascii="Arial" w:cs="Arial" w:eastAsia="Arial" w:hAnsi="Arial"/>
@@ -26031,7 +26031,7 @@
               <w:spacing w:after="10" w:before="0"/>
               <w:ind w:left="120"/>
             </w:pPr>
-            <w:hyperlink w:history="1" r:id="rIdwmrjoyalap-hycsrc5hlt">
+            <w:hyperlink w:history="1" r:id="rIdyfdwjsj7fy9jpbflocz3v">
               <w:r>
                 <w:rPr>
                   <w:rFonts w:ascii="Arial" w:cs="Arial" w:eastAsia="Arial" w:hAnsi="Arial"/>
@@ -26076,7 +26076,7 @@
             <w:pPr>
               <w:spacing w:after="20" w:before="0"/>
             </w:pPr>
-            <w:hyperlink w:history="1" r:id="rIddtgu4yoqfcb_mamrbcdlt">
+            <w:hyperlink w:history="1" r:id="rIdxqzbjthgg9y5xyyqovkp_">
               <w:r>
                 <w:rPr>
                   <w:rFonts w:ascii="Arial" w:cs="Arial" w:eastAsia="Arial" w:hAnsi="Arial"/>
@@ -26109,7 +26109,7 @@
               <w:spacing w:after="10" w:before="0"/>
               <w:ind w:left="120"/>
             </w:pPr>
-            <w:hyperlink w:history="1" r:id="rIdshlpaxx7abpbr6-mvjzr9">
+            <w:hyperlink w:history="1" r:id="rIdigjxwzpxryywyupy8j6ep">
               <w:r>
                 <w:rPr>
                   <w:rFonts w:ascii="Arial" w:cs="Arial" w:eastAsia="Arial" w:hAnsi="Arial"/>
@@ -26309,7 +26309,7 @@
             <w:pPr>
               <w:spacing w:after="20" w:before="0"/>
             </w:pPr>
-            <w:hyperlink w:history="1" r:id="rIdvte4ldacsybtxe4q9tspx">
+            <w:hyperlink w:history="1" r:id="rIdlc4k7igmqe86kojivoz0d">
               <w:r>
                 <w:rPr>
                   <w:rFonts w:ascii="Arial" w:cs="Arial" w:eastAsia="Arial" w:hAnsi="Arial"/>
@@ -26342,7 +26342,7 @@
               <w:spacing w:after="10" w:before="0"/>
               <w:ind w:left="120"/>
             </w:pPr>
-            <w:hyperlink w:history="1" r:id="rId8kwxfgn73bxb1uqm7l8ho">
+            <w:hyperlink w:history="1" r:id="rId7cron8nkpzqok44_tbrhs">
               <w:r>
                 <w:rPr>
                   <w:rFonts w:ascii="Arial" w:cs="Arial" w:eastAsia="Arial" w:hAnsi="Arial"/>
@@ -26387,7 +26387,7 @@
             <w:pPr>
               <w:spacing w:after="20" w:before="0"/>
             </w:pPr>
-            <w:hyperlink w:history="1" r:id="rIdgfdnvqkjvpqggpspp8lls">
+            <w:hyperlink w:history="1" r:id="rIdyuzjpyppwsiguvhj3xg58">
               <w:r>
                 <w:rPr>
                   <w:rFonts w:ascii="Arial" w:cs="Arial" w:eastAsia="Arial" w:hAnsi="Arial"/>
@@ -26420,7 +26420,7 @@
               <w:spacing w:after="10" w:before="0"/>
               <w:ind w:left="120"/>
             </w:pPr>
-            <w:hyperlink w:history="1" r:id="rIdkhblgxd0qbqxqu5zhjru0">
+            <w:hyperlink w:history="1" r:id="rIdxyihde_zh7enfsmae5-iz">
               <w:r>
                 <w:rPr>
                   <w:rFonts w:ascii="Arial" w:cs="Arial" w:eastAsia="Arial" w:hAnsi="Arial"/>
@@ -26620,7 +26620,7 @@
             <w:pPr>
               <w:spacing w:after="20" w:before="0"/>
             </w:pPr>
-            <w:hyperlink w:history="1" r:id="rIdr2lcevfg109ryed_-_ad4">
+            <w:hyperlink w:history="1" r:id="rIdolsqcwfsrn3xm9zdl5af0">
               <w:r>
                 <w:rPr>
                   <w:rFonts w:ascii="Arial" w:cs="Arial" w:eastAsia="Arial" w:hAnsi="Arial"/>
@@ -26653,7 +26653,7 @@
               <w:spacing w:after="10" w:before="0"/>
               <w:ind w:left="120"/>
             </w:pPr>
-            <w:hyperlink w:history="1" r:id="rIds_f-bhjelmjavuz7zix1q">
+            <w:hyperlink w:history="1" r:id="rIdqosjmiptr4nerjnpygfxg">
               <w:r>
                 <w:rPr>
                   <w:rFonts w:ascii="Arial" w:cs="Arial" w:eastAsia="Arial" w:hAnsi="Arial"/>
@@ -26698,7 +26698,7 @@
             <w:pPr>
               <w:spacing w:after="20" w:before="0"/>
             </w:pPr>
-            <w:hyperlink w:history="1" r:id="rId5gdg79ilcgkrfth77i6bl">
+            <w:hyperlink w:history="1" r:id="rIdtbktzjav3v8hq4ooya1hl">
               <w:r>
                 <w:rPr>
                   <w:rFonts w:ascii="Arial" w:cs="Arial" w:eastAsia="Arial" w:hAnsi="Arial"/>
@@ -26747,7 +26747,7 @@
               <w:spacing w:after="10" w:before="0"/>
               <w:ind w:left="120"/>
             </w:pPr>
-            <w:hyperlink w:history="1" r:id="rIdkncqjeyzwdcv4iqvde9q-">
+            <w:hyperlink w:history="1" r:id="rIdhffmy7en-ntao08n-lclr">
               <w:r>
                 <w:rPr>
                   <w:rFonts w:ascii="Arial" w:cs="Arial" w:eastAsia="Arial" w:hAnsi="Arial"/>
@@ -27372,7 +27372,7 @@
         </w:rPr>
         <w:t xml:space="preserve">© 2026 SeaVuria and ARES. Aligned with KICD objectives. Developed by SeaVuria; technical implementation by ARES (with AI assistance from Claude). Licensed under </w:t>
       </w:r>
-      <w:hyperlink w:history="1" r:id="rIdvrqaicb_neyembpw-c8vj">
+      <w:hyperlink w:history="1" r:id="rIdtgwckg76udrwevz1m3w7v">
         <w:r>
           <w:rPr>
             <w:rFonts w:ascii="Arial" w:cs="Arial" w:eastAsia="Arial" w:hAnsi="Arial"/>
@@ -27393,7 +27393,7 @@
         </w:rPr>
         <w:t xml:space="preserve"> (</w:t>
       </w:r>
-      <w:hyperlink w:history="1" r:id="rId_rtjiawrutlxlc6-7a2fx">
+      <w:hyperlink w:history="1" r:id="rIdrcghqhl2xzlyoqbofs7x2">
         <w:r>
           <w:rPr>
             <w:rFonts w:ascii="Arial" w:cs="Arial" w:eastAsia="Arial" w:hAnsi="Arial"/>
@@ -28433,7 +28433,7 @@
             <w:pPr>
               <w:spacing w:after="20" w:before="0"/>
             </w:pPr>
-            <w:hyperlink w:history="1" r:id="rId-ibddv7kendwgyfl9myaj">
+            <w:hyperlink w:history="1" r:id="rIdlmqaip7kslcynghqdseev">
               <w:r>
                 <w:rPr>
                   <w:rFonts w:ascii="Arial" w:cs="Arial" w:eastAsia="Arial" w:hAnsi="Arial"/>
@@ -28482,7 +28482,7 @@
               <w:spacing w:after="10" w:before="0"/>
               <w:ind w:left="120"/>
             </w:pPr>
-            <w:hyperlink w:history="1" r:id="rIdyafo8z5kbrwtufbaq4wrm">
+            <w:hyperlink w:history="1" r:id="rIdb9yevljo_ff_td-taj-wo">
               <w:r>
                 <w:rPr>
                   <w:rFonts w:ascii="Arial" w:cs="Arial" w:eastAsia="Arial" w:hAnsi="Arial"/>
@@ -28527,7 +28527,7 @@
             <w:pPr>
               <w:spacing w:after="20" w:before="0"/>
             </w:pPr>
-            <w:hyperlink w:history="1" r:id="rId0cwc7ttczeau0viigoflv">
+            <w:hyperlink w:history="1" r:id="rIde-vnue5pbnuael4pd9x-r">
               <w:r>
                 <w:rPr>
                   <w:rFonts w:ascii="Arial" w:cs="Arial" w:eastAsia="Arial" w:hAnsi="Arial"/>
@@ -28576,7 +28576,7 @@
               <w:spacing w:after="10" w:before="0"/>
               <w:ind w:left="120"/>
             </w:pPr>
-            <w:hyperlink w:history="1" r:id="rIdj3d7ztesgbt_dcx4cfn33">
+            <w:hyperlink w:history="1" r:id="rIdj93sdd0ojsby0s3qitmvs">
               <w:r>
                 <w:rPr>
                   <w:rFonts w:ascii="Arial" w:cs="Arial" w:eastAsia="Arial" w:hAnsi="Arial"/>
@@ -28776,7 +28776,7 @@
             <w:pPr>
               <w:spacing w:after="20" w:before="0"/>
             </w:pPr>
-            <w:hyperlink w:history="1" r:id="rIdoazc-z8zwx_kpcim5xlww">
+            <w:hyperlink w:history="1" r:id="rIdw2o_yji0zgzidaqvlrs6_">
               <w:r>
                 <w:rPr>
                   <w:rFonts w:ascii="Arial" w:cs="Arial" w:eastAsia="Arial" w:hAnsi="Arial"/>
@@ -28825,7 +28825,7 @@
               <w:spacing w:after="10" w:before="0"/>
               <w:ind w:left="120"/>
             </w:pPr>
-            <w:hyperlink w:history="1" r:id="rId8nxenwfkxmo01ypsnbdew">
+            <w:hyperlink w:history="1" r:id="rIdk3_j6ditnx92uoeltm31i">
               <w:r>
                 <w:rPr>
                   <w:rFonts w:ascii="Arial" w:cs="Arial" w:eastAsia="Arial" w:hAnsi="Arial"/>
@@ -28870,7 +28870,7 @@
             <w:pPr>
               <w:spacing w:after="20" w:before="0"/>
             </w:pPr>
-            <w:hyperlink w:history="1" r:id="rIdddqnnkv-eiqhynglpnw_e">
+            <w:hyperlink w:history="1" r:id="rId2djdknklu0sc1gzi737we">
               <w:r>
                 <w:rPr>
                   <w:rFonts w:ascii="Arial" w:cs="Arial" w:eastAsia="Arial" w:hAnsi="Arial"/>
@@ -28919,7 +28919,7 @@
               <w:spacing w:after="10" w:before="0"/>
               <w:ind w:left="120"/>
             </w:pPr>
-            <w:hyperlink w:history="1" r:id="rIdsslt2ox0qxxgq73gyvudm">
+            <w:hyperlink w:history="1" r:id="rIdxz8pmom90qfmnqri6fezv">
               <w:r>
                 <w:rPr>
                   <w:rFonts w:ascii="Arial" w:cs="Arial" w:eastAsia="Arial" w:hAnsi="Arial"/>
@@ -29119,7 +29119,7 @@
             <w:pPr>
               <w:spacing w:after="20" w:before="0"/>
             </w:pPr>
-            <w:hyperlink w:history="1" r:id="rIdxpmnyykf-xv9htjtidtxx">
+            <w:hyperlink w:history="1" r:id="rIdownol9toofqencbtgmtqm">
               <w:r>
                 <w:rPr>
                   <w:rFonts w:ascii="Arial" w:cs="Arial" w:eastAsia="Arial" w:hAnsi="Arial"/>
@@ -29168,7 +29168,7 @@
               <w:spacing w:after="10" w:before="0"/>
               <w:ind w:left="120"/>
             </w:pPr>
-            <w:hyperlink w:history="1" r:id="rIdnq6irvjonmeswf6xfixku">
+            <w:hyperlink w:history="1" r:id="rIdwmtcanoskn28kqpcjc9ip">
               <w:r>
                 <w:rPr>
                   <w:rFonts w:ascii="Arial" w:cs="Arial" w:eastAsia="Arial" w:hAnsi="Arial"/>
@@ -29213,7 +29213,7 @@
             <w:pPr>
               <w:spacing w:after="20" w:before="0"/>
             </w:pPr>
-            <w:hyperlink w:history="1" r:id="rIdzarcjgyvp2ax0fdzqazlc">
+            <w:hyperlink w:history="1" r:id="rIdtbbtlhuqcbkf1fxirfivq">
               <w:r>
                 <w:rPr>
                   <w:rFonts w:ascii="Arial" w:cs="Arial" w:eastAsia="Arial" w:hAnsi="Arial"/>
@@ -29262,7 +29262,7 @@
               <w:spacing w:after="10" w:before="0"/>
               <w:ind w:left="120"/>
             </w:pPr>
-            <w:hyperlink w:history="1" r:id="rIdu0aol88tzpnfziydfvyyg">
+            <w:hyperlink w:history="1" r:id="rIdzdjnqzdhemd7gknr5n_ym">
               <w:r>
                 <w:rPr>
                   <w:rFonts w:ascii="Arial" w:cs="Arial" w:eastAsia="Arial" w:hAnsi="Arial"/>
@@ -29462,7 +29462,7 @@
             <w:pPr>
               <w:spacing w:after="20" w:before="0"/>
             </w:pPr>
-            <w:hyperlink w:history="1" r:id="rIdlhl5elxk_mjm_uo_clxy_">
+            <w:hyperlink w:history="1" r:id="rIdk2ud5b3ortwrjv6hrkjcp">
               <w:r>
                 <w:rPr>
                   <w:rFonts w:ascii="Arial" w:cs="Arial" w:eastAsia="Arial" w:hAnsi="Arial"/>
@@ -29511,7 +29511,7 @@
               <w:spacing w:after="10" w:before="0"/>
               <w:ind w:left="120"/>
             </w:pPr>
-            <w:hyperlink w:history="1" r:id="rIdsohikp70lwoisjoc1y9wc">
+            <w:hyperlink w:history="1" r:id="rId_9rfoqzvn0rlg-hm7xy8f">
               <w:r>
                 <w:rPr>
                   <w:rFonts w:ascii="Arial" w:cs="Arial" w:eastAsia="Arial" w:hAnsi="Arial"/>
@@ -29556,7 +29556,7 @@
             <w:pPr>
               <w:spacing w:after="20" w:before="0"/>
             </w:pPr>
-            <w:hyperlink w:history="1" r:id="rIdnfac0ri0wnxatpnurmqt_">
+            <w:hyperlink w:history="1" r:id="rIdirebl1lf65ru7werti5ol">
               <w:r>
                 <w:rPr>
                   <w:rFonts w:ascii="Arial" w:cs="Arial" w:eastAsia="Arial" w:hAnsi="Arial"/>
@@ -29605,7 +29605,7 @@
               <w:spacing w:after="10" w:before="0"/>
               <w:ind w:left="120"/>
             </w:pPr>
-            <w:hyperlink w:history="1" r:id="rIdrpqbhigtmnbgawcfivfea">
+            <w:hyperlink w:history="1" r:id="rIdn-d2rr2hqdnzpi6iircy5">
               <w:r>
                 <w:rPr>
                   <w:rFonts w:ascii="Arial" w:cs="Arial" w:eastAsia="Arial" w:hAnsi="Arial"/>
@@ -29805,7 +29805,7 @@
             <w:pPr>
               <w:spacing w:after="20" w:before="0"/>
             </w:pPr>
-            <w:hyperlink w:history="1" r:id="rIdkvkzzycwtbjajqwqtjxsi">
+            <w:hyperlink w:history="1" r:id="rId66_vvalnsuh1hnzu6o2_s">
               <w:r>
                 <w:rPr>
                   <w:rFonts w:ascii="Arial" w:cs="Arial" w:eastAsia="Arial" w:hAnsi="Arial"/>
@@ -29854,7 +29854,7 @@
               <w:spacing w:after="10" w:before="0"/>
               <w:ind w:left="120"/>
             </w:pPr>
-            <w:hyperlink w:history="1" r:id="rIdgiq0chjymzlizheoauf1g">
+            <w:hyperlink w:history="1" r:id="rIdkwr4ic3rf6njs8bmdew08">
               <w:r>
                 <w:rPr>
                   <w:rFonts w:ascii="Arial" w:cs="Arial" w:eastAsia="Arial" w:hAnsi="Arial"/>
@@ -29899,7 +29899,7 @@
             <w:pPr>
               <w:spacing w:after="20" w:before="0"/>
             </w:pPr>
-            <w:hyperlink w:history="1" r:id="rId4bvkxy3oxly7wwa7oc63v">
+            <w:hyperlink w:history="1" r:id="rIdtz_dkkwapow9iv6ubfrdo">
               <w:r>
                 <w:rPr>
                   <w:rFonts w:ascii="Arial" w:cs="Arial" w:eastAsia="Arial" w:hAnsi="Arial"/>
@@ -29948,7 +29948,7 @@
               <w:spacing w:after="10" w:before="0"/>
               <w:ind w:left="120"/>
             </w:pPr>
-            <w:hyperlink w:history="1" r:id="rIdg6ianl7zvl1a4qkipzqzx">
+            <w:hyperlink w:history="1" r:id="rId2o1ss2gfisnjenxl3ufa1">
               <w:r>
                 <w:rPr>
                   <w:rFonts w:ascii="Arial" w:cs="Arial" w:eastAsia="Arial" w:hAnsi="Arial"/>
@@ -30473,7 +30473,7 @@
         </w:rPr>
         <w:t xml:space="preserve">© 2026 SeaVuria and ARES. Aligned with KICD objectives. Developed by SeaVuria; technical implementation by ARES (with AI assistance from Claude). Licensed under </w:t>
       </w:r>
-      <w:hyperlink w:history="1" r:id="rIdj9e7c5rjndkm0o5brnab6">
+      <w:hyperlink w:history="1" r:id="rIdznqwgxyxywfr1qyhed9fj">
         <w:r>
           <w:rPr>
             <w:rFonts w:ascii="Arial" w:cs="Arial" w:eastAsia="Arial" w:hAnsi="Arial"/>
@@ -30494,7 +30494,7 @@
         </w:rPr>
         <w:t xml:space="preserve"> (</w:t>
       </w:r>
-      <w:hyperlink w:history="1" r:id="rIdyhy4tx-tk8qukfq1ieyhw">
+      <w:hyperlink w:history="1" r:id="rIdrxjjmhlatq7sgfulrwedr">
         <w:r>
           <w:rPr>
             <w:rFonts w:ascii="Arial" w:cs="Arial" w:eastAsia="Arial" w:hAnsi="Arial"/>
@@ -31534,7 +31534,7 @@
             <w:pPr>
               <w:spacing w:after="20" w:before="0"/>
             </w:pPr>
-            <w:hyperlink w:history="1" r:id="rIdyjk5qqis6s8nmxopoob6h">
+            <w:hyperlink w:history="1" r:id="rIdcczqz9aujcguzrpnovftx">
               <w:r>
                 <w:rPr>
                   <w:rFonts w:ascii="Arial" w:cs="Arial" w:eastAsia="Arial" w:hAnsi="Arial"/>
@@ -31567,7 +31567,7 @@
               <w:spacing w:after="10" w:before="0"/>
               <w:ind w:left="120"/>
             </w:pPr>
-            <w:hyperlink w:history="1" r:id="rIdh_is_h9rp4m6qomem121i">
+            <w:hyperlink w:history="1" r:id="rIdvulwaz3hy8vtznqtnkj-m">
               <w:r>
                 <w:rPr>
                   <w:rFonts w:ascii="Arial" w:cs="Arial" w:eastAsia="Arial" w:hAnsi="Arial"/>
@@ -31612,7 +31612,7 @@
             <w:pPr>
               <w:spacing w:after="20" w:before="0"/>
             </w:pPr>
-            <w:hyperlink w:history="1" r:id="rIdlovlvavjhw5fnbzan9he7">
+            <w:hyperlink w:history="1" r:id="rIdlllb5or7g_vaj1efsztf7">
               <w:r>
                 <w:rPr>
                   <w:rFonts w:ascii="Arial" w:cs="Arial" w:eastAsia="Arial" w:hAnsi="Arial"/>
@@ -31661,7 +31661,7 @@
               <w:spacing w:after="10" w:before="0"/>
               <w:ind w:left="120"/>
             </w:pPr>
-            <w:hyperlink w:history="1" r:id="rIdqvcilm7migpjace4o7kti">
+            <w:hyperlink w:history="1" r:id="rIdzwfk8if0mqrzwglqazkg9">
               <w:r>
                 <w:rPr>
                   <w:rFonts w:ascii="Arial" w:cs="Arial" w:eastAsia="Arial" w:hAnsi="Arial"/>
@@ -31861,7 +31861,7 @@
             <w:pPr>
               <w:spacing w:after="20" w:before="0"/>
             </w:pPr>
-            <w:hyperlink w:history="1" r:id="rIdbn-anm3stchlvlbqjx-d_">
+            <w:hyperlink w:history="1" r:id="rIdteygdddcjc5q1vs6jrk1n">
               <w:r>
                 <w:rPr>
                   <w:rFonts w:ascii="Arial" w:cs="Arial" w:eastAsia="Arial" w:hAnsi="Arial"/>
@@ -31894,7 +31894,7 @@
               <w:spacing w:after="10" w:before="0"/>
               <w:ind w:left="120"/>
             </w:pPr>
-            <w:hyperlink w:history="1" r:id="rId9jwkc7rparnqz5zudaqi9">
+            <w:hyperlink w:history="1" r:id="rIdujx4bws0kaacnwvcyh5hn">
               <w:r>
                 <w:rPr>
                   <w:rFonts w:ascii="Arial" w:cs="Arial" w:eastAsia="Arial" w:hAnsi="Arial"/>
@@ -31939,7 +31939,7 @@
             <w:pPr>
               <w:spacing w:after="20" w:before="0"/>
             </w:pPr>
-            <w:hyperlink w:history="1" r:id="rIdb7sip0_ovgpyjayrifzrn">
+            <w:hyperlink w:history="1" r:id="rIdjdjkyvdzyyyj3fba0jbrn">
               <w:r>
                 <w:rPr>
                   <w:rFonts w:ascii="Arial" w:cs="Arial" w:eastAsia="Arial" w:hAnsi="Arial"/>
@@ -31988,7 +31988,7 @@
               <w:spacing w:after="10" w:before="0"/>
               <w:ind w:left="120"/>
             </w:pPr>
-            <w:hyperlink w:history="1" r:id="rIdslu-u4jtwb8x1pfixdbaa">
+            <w:hyperlink w:history="1" r:id="rIdtwxtfcpkl4j7ut8t6byl4">
               <w:r>
                 <w:rPr>
                   <w:rFonts w:ascii="Arial" w:cs="Arial" w:eastAsia="Arial" w:hAnsi="Arial"/>
@@ -32188,7 +32188,7 @@
             <w:pPr>
               <w:spacing w:after="20" w:before="0"/>
             </w:pPr>
-            <w:hyperlink w:history="1" r:id="rIdu-vo7r5hublgighdbidbq">
+            <w:hyperlink w:history="1" r:id="rIdc82dlhdcqfbm-hgbhprpx">
               <w:r>
                 <w:rPr>
                   <w:rFonts w:ascii="Arial" w:cs="Arial" w:eastAsia="Arial" w:hAnsi="Arial"/>
@@ -32237,7 +32237,7 @@
               <w:spacing w:after="10" w:before="0"/>
               <w:ind w:left="120"/>
             </w:pPr>
-            <w:hyperlink w:history="1" r:id="rIdqlfb7wp3g_hwkdc1peslh">
+            <w:hyperlink w:history="1" r:id="rIdzc_griumkpynxom0apeaj">
               <w:r>
                 <w:rPr>
                   <w:rFonts w:ascii="Arial" w:cs="Arial" w:eastAsia="Arial" w:hAnsi="Arial"/>
@@ -32282,7 +32282,7 @@
             <w:pPr>
               <w:spacing w:after="20" w:before="0"/>
             </w:pPr>
-            <w:hyperlink w:history="1" r:id="rIdutvnjnd-cdjpmodv3pnwy">
+            <w:hyperlink w:history="1" r:id="rIdxi_fnbbkzum5cimeagmon">
               <w:r>
                 <w:rPr>
                   <w:rFonts w:ascii="Arial" w:cs="Arial" w:eastAsia="Arial" w:hAnsi="Arial"/>
@@ -32331,7 +32331,7 @@
               <w:spacing w:after="10" w:before="0"/>
               <w:ind w:left="120"/>
             </w:pPr>
-            <w:hyperlink w:history="1" r:id="rIdtkktabczmcwifd1iinse9">
+            <w:hyperlink w:history="1" r:id="rIdq5zvl0uibegicqmrrfbwm">
               <w:r>
                 <w:rPr>
                   <w:rFonts w:ascii="Arial" w:cs="Arial" w:eastAsia="Arial" w:hAnsi="Arial"/>
@@ -32531,7 +32531,7 @@
             <w:pPr>
               <w:spacing w:after="20" w:before="0"/>
             </w:pPr>
-            <w:hyperlink w:history="1" r:id="rIdi6_i04ad-xwpbmotpue3m">
+            <w:hyperlink w:history="1" r:id="rIdax_suy-lsfjbaw23pyyx_">
               <w:r>
                 <w:rPr>
                   <w:rFonts w:ascii="Arial" w:cs="Arial" w:eastAsia="Arial" w:hAnsi="Arial"/>
@@ -32580,7 +32580,7 @@
               <w:spacing w:after="10" w:before="0"/>
               <w:ind w:left="120"/>
             </w:pPr>
-            <w:hyperlink w:history="1" r:id="rId1-eentbey748dsde9kp3p">
+            <w:hyperlink w:history="1" r:id="rId2nqjvwepdf5n3ukxzpsoo">
               <w:r>
                 <w:rPr>
                   <w:rFonts w:ascii="Arial" w:cs="Arial" w:eastAsia="Arial" w:hAnsi="Arial"/>
@@ -32625,7 +32625,7 @@
             <w:pPr>
               <w:spacing w:after="20" w:before="0"/>
             </w:pPr>
-            <w:hyperlink w:history="1" r:id="rIdbk9ij80egzqz3q3fpoyep">
+            <w:hyperlink w:history="1" r:id="rIdxmv6ydvky1x_3mc6cs1jl">
               <w:r>
                 <w:rPr>
                   <w:rFonts w:ascii="Arial" w:cs="Arial" w:eastAsia="Arial" w:hAnsi="Arial"/>
@@ -32674,7 +32674,7 @@
               <w:spacing w:after="10" w:before="0"/>
               <w:ind w:left="120"/>
             </w:pPr>
-            <w:hyperlink w:history="1" r:id="rIdyg8raz3uolzjylbh5fgfz">
+            <w:hyperlink w:history="1" r:id="rId_8fcxe2t7rpsqwmnd0un7">
               <w:r>
                 <w:rPr>
                   <w:rFonts w:ascii="Arial" w:cs="Arial" w:eastAsia="Arial" w:hAnsi="Arial"/>
@@ -32874,7 +32874,7 @@
             <w:pPr>
               <w:spacing w:after="20" w:before="0"/>
             </w:pPr>
-            <w:hyperlink w:history="1" r:id="rIdmo8ehwdhuapyvz9ukplsq">
+            <w:hyperlink w:history="1" r:id="rIdbrbnf9fpmevt695il7j5b">
               <w:r>
                 <w:rPr>
                   <w:rFonts w:ascii="Arial" w:cs="Arial" w:eastAsia="Arial" w:hAnsi="Arial"/>
@@ -32923,7 +32923,7 @@
               <w:spacing w:after="10" w:before="0"/>
               <w:ind w:left="120"/>
             </w:pPr>
-            <w:hyperlink w:history="1" r:id="rIdx0rqapcpnhhw_njeexbli">
+            <w:hyperlink w:history="1" r:id="rIdycrulqua-b2arunxalu9s">
               <w:r>
                 <w:rPr>
                   <w:rFonts w:ascii="Arial" w:cs="Arial" w:eastAsia="Arial" w:hAnsi="Arial"/>
@@ -32968,7 +32968,7 @@
             <w:pPr>
               <w:spacing w:after="20" w:before="0"/>
             </w:pPr>
-            <w:hyperlink w:history="1" r:id="rIdtdgrzf5bei9mberykttp0">
+            <w:hyperlink w:history="1" r:id="rIdmufk8wl3l6npczm1rbbns">
               <w:r>
                 <w:rPr>
                   <w:rFonts w:ascii="Arial" w:cs="Arial" w:eastAsia="Arial" w:hAnsi="Arial"/>
@@ -33017,7 +33017,7 @@
               <w:spacing w:after="10" w:before="0"/>
               <w:ind w:left="120"/>
             </w:pPr>
-            <w:hyperlink w:history="1" r:id="rIdr8nuqp3kxm-lpta86ftqx">
+            <w:hyperlink w:history="1" r:id="rIdpeqxjlzo8av7q_jkjeof5">
               <w:r>
                 <w:rPr>
                   <w:rFonts w:ascii="Arial" w:cs="Arial" w:eastAsia="Arial" w:hAnsi="Arial"/>
@@ -33642,7 +33642,7 @@
         </w:rPr>
         <w:t xml:space="preserve">© 2026 SeaVuria and ARES. Aligned with KICD objectives. Developed by SeaVuria; technical implementation by ARES (with AI assistance from Claude). Licensed under </w:t>
       </w:r>
-      <w:hyperlink w:history="1" r:id="rIdtx5ki_kqyjcnhsxh8hyc6">
+      <w:hyperlink w:history="1" r:id="rId9mz7v54w7g2iimk0r4cqi">
         <w:r>
           <w:rPr>
             <w:rFonts w:ascii="Arial" w:cs="Arial" w:eastAsia="Arial" w:hAnsi="Arial"/>
@@ -33663,7 +33663,7 @@
         </w:rPr>
         <w:t xml:space="preserve"> (</w:t>
       </w:r>
-      <w:hyperlink w:history="1" r:id="rId8ypz6pkxrh7yah-rr2r3j">
+      <w:hyperlink w:history="1" r:id="rIdhndodoq9bxpgf_k12show">
         <w:r>
           <w:rPr>
             <w:rFonts w:ascii="Arial" w:cs="Arial" w:eastAsia="Arial" w:hAnsi="Arial"/>
@@ -34703,7 +34703,7 @@
             <w:pPr>
               <w:spacing w:after="20" w:before="0"/>
             </w:pPr>
-            <w:hyperlink w:history="1" r:id="rId4xpiqpeqjttfnkp3ypcic">
+            <w:hyperlink w:history="1" r:id="rIdggof5_ufjmhx6u-dbm9bb">
               <w:r>
                 <w:rPr>
                   <w:rFonts w:ascii="Arial" w:cs="Arial" w:eastAsia="Arial" w:hAnsi="Arial"/>
@@ -34736,7 +34736,7 @@
               <w:spacing w:after="10" w:before="0"/>
               <w:ind w:left="120"/>
             </w:pPr>
-            <w:hyperlink w:history="1" r:id="rIdp6itbmyrgm4mpafvlq6e4">
+            <w:hyperlink w:history="1" r:id="rIdctulq6jecvgdquysutelc">
               <w:r>
                 <w:rPr>
                   <w:rFonts w:ascii="Arial" w:cs="Arial" w:eastAsia="Arial" w:hAnsi="Arial"/>
@@ -34781,7 +34781,7 @@
             <w:pPr>
               <w:spacing w:after="20" w:before="0"/>
             </w:pPr>
-            <w:hyperlink w:history="1" r:id="rId3g9gcmkxppxa3rtntwi0t">
+            <w:hyperlink w:history="1" r:id="rIdjxzo1xmpxx6xo-ynanilm">
               <w:r>
                 <w:rPr>
                   <w:rFonts w:ascii="Arial" w:cs="Arial" w:eastAsia="Arial" w:hAnsi="Arial"/>
@@ -34814,7 +34814,7 @@
               <w:spacing w:after="10" w:before="0"/>
               <w:ind w:left="120"/>
             </w:pPr>
-            <w:hyperlink w:history="1" r:id="rIdef3wa4jvhi0hzcwad3gym">
+            <w:hyperlink w:history="1" r:id="rIdsktb6gcu77w9y8mnlizcm">
               <w:r>
                 <w:rPr>
                   <w:rFonts w:ascii="Arial" w:cs="Arial" w:eastAsia="Arial" w:hAnsi="Arial"/>
@@ -35014,7 +35014,7 @@
             <w:pPr>
               <w:spacing w:after="20" w:before="0"/>
             </w:pPr>
-            <w:hyperlink w:history="1" r:id="rId5trknzk10plkrfs3jpl4l">
+            <w:hyperlink w:history="1" r:id="rIdcmtktqmvtyb12n9ecc3dc">
               <w:r>
                 <w:rPr>
                   <w:rFonts w:ascii="Arial" w:cs="Arial" w:eastAsia="Arial" w:hAnsi="Arial"/>
@@ -35047,7 +35047,7 @@
               <w:spacing w:after="10" w:before="0"/>
               <w:ind w:left="120"/>
             </w:pPr>
-            <w:hyperlink w:history="1" r:id="rIdawquriyxsqjqdeznddyg3">
+            <w:hyperlink w:history="1" r:id="rIdkhjdmqxzkvp-impqqdvdk">
               <w:r>
                 <w:rPr>
                   <w:rFonts w:ascii="Arial" w:cs="Arial" w:eastAsia="Arial" w:hAnsi="Arial"/>
@@ -35092,7 +35092,7 @@
             <w:pPr>
               <w:spacing w:after="20" w:before="0"/>
             </w:pPr>
-            <w:hyperlink w:history="1" r:id="rIdtwkkksgaauyjawew-hu3n">
+            <w:hyperlink w:history="1" r:id="rIdk5bwqnjq9qice64ifb6hp">
               <w:r>
                 <w:rPr>
                   <w:rFonts w:ascii="Arial" w:cs="Arial" w:eastAsia="Arial" w:hAnsi="Arial"/>
@@ -35125,7 +35125,7 @@
               <w:spacing w:after="10" w:before="0"/>
               <w:ind w:left="120"/>
             </w:pPr>
-            <w:hyperlink w:history="1" r:id="rId7perh4lpeddycmpokf456">
+            <w:hyperlink w:history="1" r:id="rIdwys6no765sr4jphkp3gv4">
               <w:r>
                 <w:rPr>
                   <w:rFonts w:ascii="Arial" w:cs="Arial" w:eastAsia="Arial" w:hAnsi="Arial"/>
@@ -35325,7 +35325,7 @@
             <w:pPr>
               <w:spacing w:after="20" w:before="0"/>
             </w:pPr>
-            <w:hyperlink w:history="1" r:id="rId9eb3cfzgurhkc2pjltszr">
+            <w:hyperlink w:history="1" r:id="rIdoke4exoqrc4skmmokjpzy">
               <w:r>
                 <w:rPr>
                   <w:rFonts w:ascii="Arial" w:cs="Arial" w:eastAsia="Arial" w:hAnsi="Arial"/>
@@ -35358,7 +35358,7 @@
               <w:spacing w:after="10" w:before="0"/>
               <w:ind w:left="120"/>
             </w:pPr>
-            <w:hyperlink w:history="1" r:id="rIdcuuudbkjzsmunwlkj1ad6">
+            <w:hyperlink w:history="1" r:id="rIdqbknq3fp3x1vfjceencrl">
               <w:r>
                 <w:rPr>
                   <w:rFonts w:ascii="Arial" w:cs="Arial" w:eastAsia="Arial" w:hAnsi="Arial"/>
@@ -35403,7 +35403,7 @@
             <w:pPr>
               <w:spacing w:after="20" w:before="0"/>
             </w:pPr>
-            <w:hyperlink w:history="1" r:id="rIdceuolk8cep6ijfttixkvd">
+            <w:hyperlink w:history="1" r:id="rIdogf_c1g7enzgtupt2pi5n">
               <w:r>
                 <w:rPr>
                   <w:rFonts w:ascii="Arial" w:cs="Arial" w:eastAsia="Arial" w:hAnsi="Arial"/>
@@ -35452,7 +35452,7 @@
               <w:spacing w:after="10" w:before="0"/>
               <w:ind w:left="120"/>
             </w:pPr>
-            <w:hyperlink w:history="1" r:id="rIdebz3hhdcqv9br41c-z-kr">
+            <w:hyperlink w:history="1" r:id="rIdls7mnlhpht2nb_xpl1zgr">
               <w:r>
                 <w:rPr>
                   <w:rFonts w:ascii="Arial" w:cs="Arial" w:eastAsia="Arial" w:hAnsi="Arial"/>
@@ -35652,7 +35652,7 @@
             <w:pPr>
               <w:spacing w:after="20" w:before="0"/>
             </w:pPr>
-            <w:hyperlink w:history="1" r:id="rIdr3lk_w2lh1i_s8rjxx0mt">
+            <w:hyperlink w:history="1" r:id="rId7dnqjh40ty_0e6lzmnl8j">
               <w:r>
                 <w:rPr>
                   <w:rFonts w:ascii="Arial" w:cs="Arial" w:eastAsia="Arial" w:hAnsi="Arial"/>
@@ -35685,7 +35685,7 @@
               <w:spacing w:after="10" w:before="0"/>
               <w:ind w:left="120"/>
             </w:pPr>
-            <w:hyperlink w:history="1" r:id="rIds8jojtor90gwsqqpargzx">
+            <w:hyperlink w:history="1" r:id="rIdcvxk1jtxf0wjdggbrxarm">
               <w:r>
                 <w:rPr>
                   <w:rFonts w:ascii="Arial" w:cs="Arial" w:eastAsia="Arial" w:hAnsi="Arial"/>
@@ -35730,7 +35730,7 @@
             <w:pPr>
               <w:spacing w:after="20" w:before="0"/>
             </w:pPr>
-            <w:hyperlink w:history="1" r:id="rId1y4bryepcfgifvcqguzb5">
+            <w:hyperlink w:history="1" r:id="rIdsadvaf8yct4pooeh9p6jm">
               <w:r>
                 <w:rPr>
                   <w:rFonts w:ascii="Arial" w:cs="Arial" w:eastAsia="Arial" w:hAnsi="Arial"/>
@@ -35779,7 +35779,7 @@
               <w:spacing w:after="10" w:before="0"/>
               <w:ind w:left="120"/>
             </w:pPr>
-            <w:hyperlink w:history="1" r:id="rIdiaktlzhqbpqcx9kjbd_ck">
+            <w:hyperlink w:history="1" r:id="rIdoifsooh_ixmxrf40lwxqz">
               <w:r>
                 <w:rPr>
                   <w:rFonts w:ascii="Arial" w:cs="Arial" w:eastAsia="Arial" w:hAnsi="Arial"/>
@@ -35979,7 +35979,7 @@
             <w:pPr>
               <w:spacing w:after="20" w:before="0"/>
             </w:pPr>
-            <w:hyperlink w:history="1" r:id="rIdhxdbvc2k-md3hhmqba7lm">
+            <w:hyperlink w:history="1" r:id="rId5c1wgu_ocxou5zwrtrbfc">
               <w:r>
                 <w:rPr>
                   <w:rFonts w:ascii="Arial" w:cs="Arial" w:eastAsia="Arial" w:hAnsi="Arial"/>
@@ -36012,7 +36012,7 @@
               <w:spacing w:after="10" w:before="0"/>
               <w:ind w:left="120"/>
             </w:pPr>
-            <w:hyperlink w:history="1" r:id="rId3mimorovxd70249vyie2m">
+            <w:hyperlink w:history="1" r:id="rIdybshctrgkwnpxgshhzurb">
               <w:r>
                 <w:rPr>
                   <w:rFonts w:ascii="Arial" w:cs="Arial" w:eastAsia="Arial" w:hAnsi="Arial"/>
@@ -36057,7 +36057,7 @@
             <w:pPr>
               <w:spacing w:after="20" w:before="0"/>
             </w:pPr>
-            <w:hyperlink w:history="1" r:id="rIdhlsoj44mxac6tixw48fv6">
+            <w:hyperlink w:history="1" r:id="rIdufqlaubzfieos-xs8ouyh">
               <w:r>
                 <w:rPr>
                   <w:rFonts w:ascii="Arial" w:cs="Arial" w:eastAsia="Arial" w:hAnsi="Arial"/>
@@ -36106,7 +36106,7 @@
               <w:spacing w:after="10" w:before="0"/>
               <w:ind w:left="120"/>
             </w:pPr>
-            <w:hyperlink w:history="1" r:id="rIdwa0_nzclxhj8ecvjz-78w">
+            <w:hyperlink w:history="1" r:id="rId4qo9h95ttxmkci2qis6jw">
               <w:r>
                 <w:rPr>
                   <w:rFonts w:ascii="Arial" w:cs="Arial" w:eastAsia="Arial" w:hAnsi="Arial"/>
@@ -36631,7 +36631,7 @@
         </w:rPr>
         <w:t xml:space="preserve">© 2026 SeaVuria and ARES. Aligned with KICD objectives. Developed by SeaVuria; technical implementation by ARES (with AI assistance from Claude). Licensed under </w:t>
       </w:r>
-      <w:hyperlink w:history="1" r:id="rId3oysgjcmcdrks4odvni6m">
+      <w:hyperlink w:history="1" r:id="rId-rqks6idlhva6th100_z6">
         <w:r>
           <w:rPr>
             <w:rFonts w:ascii="Arial" w:cs="Arial" w:eastAsia="Arial" w:hAnsi="Arial"/>
@@ -36652,7 +36652,7 @@
         </w:rPr>
         <w:t xml:space="preserve"> (</w:t>
       </w:r>
-      <w:hyperlink w:history="1" r:id="rIdjezf_z73mphhzoc1v43sw">
+      <w:hyperlink w:history="1" r:id="rId2sxm4svpbt6lrftdgotno">
         <w:r>
           <w:rPr>
             <w:rFonts w:ascii="Arial" w:cs="Arial" w:eastAsia="Arial" w:hAnsi="Arial"/>
@@ -37692,7 +37692,7 @@
             <w:pPr>
               <w:spacing w:after="20" w:before="0"/>
             </w:pPr>
-            <w:hyperlink w:history="1" r:id="rId-qgafkytag-roouthrmvw">
+            <w:hyperlink w:history="1" r:id="rId21g8ek0mv4p36zx993syp">
               <w:r>
                 <w:rPr>
                   <w:rFonts w:ascii="Arial" w:cs="Arial" w:eastAsia="Arial" w:hAnsi="Arial"/>
@@ -37725,7 +37725,7 @@
               <w:spacing w:after="10" w:before="0"/>
               <w:ind w:left="120"/>
             </w:pPr>
-            <w:hyperlink w:history="1" r:id="rIdkx-ng5qkykeuix4jhrief">
+            <w:hyperlink w:history="1" r:id="rIdbnsc5p6apxq0pmhk9dxc-">
               <w:r>
                 <w:rPr>
                   <w:rFonts w:ascii="Arial" w:cs="Arial" w:eastAsia="Arial" w:hAnsi="Arial"/>
@@ -37770,7 +37770,7 @@
             <w:pPr>
               <w:spacing w:after="20" w:before="0"/>
             </w:pPr>
-            <w:hyperlink w:history="1" r:id="rIdzef6cu1klr10guiqfzluh">
+            <w:hyperlink w:history="1" r:id="rId0k_edakzza1dmgau-eqov">
               <w:r>
                 <w:rPr>
                   <w:rFonts w:ascii="Arial" w:cs="Arial" w:eastAsia="Arial" w:hAnsi="Arial"/>
@@ -37803,7 +37803,7 @@
               <w:spacing w:after="10" w:before="0"/>
               <w:ind w:left="120"/>
             </w:pPr>
-            <w:hyperlink w:history="1" r:id="rIdsyaeuaxwaqpuuzmtxtv0_">
+            <w:hyperlink w:history="1" r:id="rIdxhjcjy8zbz5my_do6imu1">
               <w:r>
                 <w:rPr>
                   <w:rFonts w:ascii="Arial" w:cs="Arial" w:eastAsia="Arial" w:hAnsi="Arial"/>
@@ -38163,7 +38163,7 @@
             <w:pPr>
               <w:spacing w:after="20" w:before="0"/>
             </w:pPr>
-            <w:hyperlink w:history="1" r:id="rIdfgq0kewhzuvyfywk_heya">
+            <w:hyperlink w:history="1" r:id="rIdumzk9o84ipfvh-2hlvbk1">
               <w:r>
                 <w:rPr>
                   <w:rFonts w:ascii="Arial" w:cs="Arial" w:eastAsia="Arial" w:hAnsi="Arial"/>
@@ -38196,7 +38196,7 @@
               <w:spacing w:after="10" w:before="0"/>
               <w:ind w:left="120"/>
             </w:pPr>
-            <w:hyperlink w:history="1" r:id="rIdwekizfchhzrf2oslnizgr">
+            <w:hyperlink w:history="1" r:id="rIdrgnb-vsdldlkn6_0dpao1">
               <w:r>
                 <w:rPr>
                   <w:rFonts w:ascii="Arial" w:cs="Arial" w:eastAsia="Arial" w:hAnsi="Arial"/>
@@ -38241,7 +38241,7 @@
             <w:pPr>
               <w:spacing w:after="20" w:before="0"/>
             </w:pPr>
-            <w:hyperlink w:history="1" r:id="rId3retscq5fe6nb6-rtaudy">
+            <w:hyperlink w:history="1" r:id="rIdfyknxh10qhmhht52f3z4x">
               <w:r>
                 <w:rPr>
                   <w:rFonts w:ascii="Arial" w:cs="Arial" w:eastAsia="Arial" w:hAnsi="Arial"/>
@@ -38274,7 +38274,7 @@
               <w:spacing w:after="10" w:before="0"/>
               <w:ind w:left="120"/>
             </w:pPr>
-            <w:hyperlink w:history="1" r:id="rIdw9upwizg6wyvdi-spwenr">
+            <w:hyperlink w:history="1" r:id="rIdvh36_3q84hcu3q4vrpwnm">
               <w:r>
                 <w:rPr>
                   <w:rFonts w:ascii="Arial" w:cs="Arial" w:eastAsia="Arial" w:hAnsi="Arial"/>
@@ -38794,7 +38794,7 @@
             <w:pPr>
               <w:spacing w:after="20" w:before="0"/>
             </w:pPr>
-            <w:hyperlink w:history="1" r:id="rId5jsxb5x2je3v4jiuqwmfj">
+            <w:hyperlink w:history="1" r:id="rIdrslxpvwrsp4qztkuu1_t1">
               <w:r>
                 <w:rPr>
                   <w:rFonts w:ascii="Arial" w:cs="Arial" w:eastAsia="Arial" w:hAnsi="Arial"/>
@@ -38827,7 +38827,7 @@
               <w:spacing w:after="10" w:before="0"/>
               <w:ind w:left="120"/>
             </w:pPr>
-            <w:hyperlink w:history="1" r:id="rIdgnceheuog6phtaspuw3je">
+            <w:hyperlink w:history="1" r:id="rId2x-vlblshj1672tztbxcs">
               <w:r>
                 <w:rPr>
                   <w:rFonts w:ascii="Arial" w:cs="Arial" w:eastAsia="Arial" w:hAnsi="Arial"/>
@@ -38872,7 +38872,7 @@
             <w:pPr>
               <w:spacing w:after="20" w:before="0"/>
             </w:pPr>
-            <w:hyperlink w:history="1" r:id="rIdkt7dzbqnwxubhxgyzut30">
+            <w:hyperlink w:history="1" r:id="rId4b_7qwk7mebhnf0ulpyxd">
               <w:r>
                 <w:rPr>
                   <w:rFonts w:ascii="Arial" w:cs="Arial" w:eastAsia="Arial" w:hAnsi="Arial"/>
@@ -38921,7 +38921,7 @@
               <w:spacing w:after="10" w:before="0"/>
               <w:ind w:left="120"/>
             </w:pPr>
-            <w:hyperlink w:history="1" r:id="rIdywzvsqw8heyc-8wyh1kb_">
+            <w:hyperlink w:history="1" r:id="rIdmehw1s_rlrbl5mdolsvoj">
               <w:r>
                 <w:rPr>
                   <w:rFonts w:ascii="Arial" w:cs="Arial" w:eastAsia="Arial" w:hAnsi="Arial"/>
@@ -39341,7 +39341,7 @@
             <w:pPr>
               <w:spacing w:after="20" w:before="0"/>
             </w:pPr>
-            <w:hyperlink w:history="1" r:id="rIdpgx5barid05q-9l99grb7">
+            <w:hyperlink w:history="1" r:id="rId9uxnpb_md42hwnt-0i6ji">
               <w:r>
                 <w:rPr>
                   <w:rFonts w:ascii="Arial" w:cs="Arial" w:eastAsia="Arial" w:hAnsi="Arial"/>
@@ -39374,7 +39374,7 @@
               <w:spacing w:after="10" w:before="0"/>
               <w:ind w:left="120"/>
             </w:pPr>
-            <w:hyperlink w:history="1" r:id="rIdpgdi7bmh6fi9sl4jpgjct">
+            <w:hyperlink w:history="1" r:id="rId5d0xnaypngmpnswz0a0fh">
               <w:r>
                 <w:rPr>
                   <w:rFonts w:ascii="Arial" w:cs="Arial" w:eastAsia="Arial" w:hAnsi="Arial"/>
@@ -39419,7 +39419,7 @@
             <w:pPr>
               <w:spacing w:after="20" w:before="0"/>
             </w:pPr>
-            <w:hyperlink w:history="1" r:id="rIdy0o5xmdqpb8-ehpt7ieh6">
+            <w:hyperlink w:history="1" r:id="rIdcz6obxvisnxwe9sn9f-bx">
               <w:r>
                 <w:rPr>
                   <w:rFonts w:ascii="Arial" w:cs="Arial" w:eastAsia="Arial" w:hAnsi="Arial"/>
@@ -39468,7 +39468,7 @@
               <w:spacing w:after="10" w:before="0"/>
               <w:ind w:left="120"/>
             </w:pPr>
-            <w:hyperlink w:history="1" r:id="rIda49xehovnpsmrof_xpzap">
+            <w:hyperlink w:history="1" r:id="rIdkx_hfh7phmn_7l_obje23">
               <w:r>
                 <w:rPr>
                   <w:rFonts w:ascii="Arial" w:cs="Arial" w:eastAsia="Arial" w:hAnsi="Arial"/>
@@ -39928,7 +39928,7 @@
             <w:pPr>
               <w:spacing w:after="20" w:before="0"/>
             </w:pPr>
-            <w:hyperlink w:history="1" r:id="rIdywg0t4ohiydwofq913wjn">
+            <w:hyperlink w:history="1" r:id="rIdvwjeyz4k7bi4bmekpkav3">
               <w:r>
                 <w:rPr>
                   <w:rFonts w:ascii="Arial" w:cs="Arial" w:eastAsia="Arial" w:hAnsi="Arial"/>
@@ -39961,7 +39961,7 @@
               <w:spacing w:after="10" w:before="0"/>
               <w:ind w:left="120"/>
             </w:pPr>
-            <w:hyperlink w:history="1" r:id="rIdvdaw2bjyc5bdbkter5ypr">
+            <w:hyperlink w:history="1" r:id="rId4gy8kemubwjkggxu4uuk8">
               <w:r>
                 <w:rPr>
                   <w:rFonts w:ascii="Arial" w:cs="Arial" w:eastAsia="Arial" w:hAnsi="Arial"/>
@@ -40006,7 +40006,7 @@
             <w:pPr>
               <w:spacing w:after="20" w:before="0"/>
             </w:pPr>
-            <w:hyperlink w:history="1" r:id="rIdwfq8iixoqdnuzrh0gwajt">
+            <w:hyperlink w:history="1" r:id="rIdse5lzk7zcbfrqjnvdrjcj">
               <w:r>
                 <w:rPr>
                   <w:rFonts w:ascii="Arial" w:cs="Arial" w:eastAsia="Arial" w:hAnsi="Arial"/>
@@ -40055,7 +40055,7 @@
               <w:spacing w:after="10" w:before="0"/>
               <w:ind w:left="120"/>
             </w:pPr>
-            <w:hyperlink w:history="1" r:id="rId8_dwxvifeztz8k_0hkxmx">
+            <w:hyperlink w:history="1" r:id="rId_twykwaeonwsgeu49qca9">
               <w:r>
                 <w:rPr>
                   <w:rFonts w:ascii="Arial" w:cs="Arial" w:eastAsia="Arial" w:hAnsi="Arial"/>
@@ -40740,7 +40740,7 @@
         </w:rPr>
         <w:t xml:space="preserve">© 2026 SeaVuria and ARES. Aligned with KICD objectives. Developed by SeaVuria; technical implementation by ARES (with AI assistance from Claude). Licensed under </w:t>
       </w:r>
-      <w:hyperlink w:history="1" r:id="rIdoevwuh9tiuy-ts0xxn-ym">
+      <w:hyperlink w:history="1" r:id="rIdijigyqauvo5dn3jdxcugd">
         <w:r>
           <w:rPr>
             <w:rFonts w:ascii="Arial" w:cs="Arial" w:eastAsia="Arial" w:hAnsi="Arial"/>
@@ -40761,7 +40761,7 @@
         </w:rPr>
         <w:t xml:space="preserve"> (</w:t>
       </w:r>
-      <w:hyperlink w:history="1" r:id="rIdkg63h8_giguizj9xnkrai">
+      <w:hyperlink w:history="1" r:id="rIdhfiqvwizz6kvcn88b3s8c">
         <w:r>
           <w:rPr>
             <w:rFonts w:ascii="Arial" w:cs="Arial" w:eastAsia="Arial" w:hAnsi="Arial"/>

</xml_diff>